<commit_message>
deleted verifier_doublons et verifier_dataframe_vide
</commit_message>
<xml_diff>
--- a/man/Plan de travail pour Caro_janv 2025.docx
+++ b/man/Plan de travail pour Caro_janv 2025.docx
@@ -2044,13 +2044,15 @@
               <w:rPr>
                 <w:sz w:val="20"/>
                 <w:szCs w:val="20"/>
-              </w:rPr>
-            </w:pPr>
-            <w:proofErr w:type="spellStart"/>
-            <w:r>
-              <w:rPr>
-                <w:sz w:val="20"/>
-                <w:szCs w:val="20"/>
+                <w:highlight w:val="green"/>
+              </w:rPr>
+            </w:pPr>
+            <w:proofErr w:type="spellStart"/>
+            <w:r>
+              <w:rPr>
+                <w:sz w:val="20"/>
+                <w:szCs w:val="20"/>
+                <w:highlight w:val="green"/>
                 <w:shd w:val="clear" w:color="auto" w:fill="FFFFFF"/>
               </w:rPr>
               <w:t>User_guide.rmd</w:t>
@@ -2069,40 +2071,75 @@
             </w:tcBorders>
           </w:tcPr>
           <w:p>
-            <w:r>
+            <w:pPr>
+              <w:rPr>
+                <w:highlight w:val="green"/>
+              </w:rPr>
+            </w:pPr>
+            <w:r>
+              <w:rPr>
+                <w:highlight w:val="green"/>
+              </w:rPr>
               <w:t>Ajouter Version 1.0</w:t>
             </w:r>
           </w:p>
           <w:p>
-            <w:r>
+            <w:pPr>
+              <w:rPr>
+                <w:highlight w:val="green"/>
+              </w:rPr>
+            </w:pPr>
+            <w:r>
+              <w:rPr>
+                <w:highlight w:val="green"/>
+              </w:rPr>
               <w:t xml:space="preserve">Ajouter dans les références : Mainguy J, Bélanger M, Ouellet-Cauchon G et Moral R. </w:t>
             </w:r>
             <w:r>
+              <w:rPr>
+                <w:highlight w:val="green"/>
+              </w:rPr>
               <w:t>2024</w:t>
             </w:r>
             <w:r>
+              <w:rPr>
+                <w:highlight w:val="green"/>
+              </w:rPr>
               <w:t xml:space="preserve">. </w:t>
             </w:r>
             <w:r>
               <w:rPr>
+                <w:highlight w:val="green"/>
                 <w:lang w:val="en-CA"/>
               </w:rPr>
               <w:t xml:space="preserve">Monitoring reproduction in fish: assessing the adequacy of ogives and the predicted uncertainty of their L50 estimates for more reliable biological inferences. </w:t>
             </w:r>
             <w:proofErr w:type="spellStart"/>
             <w:r>
+              <w:rPr>
+                <w:highlight w:val="green"/>
+              </w:rPr>
               <w:t>Fisheries</w:t>
             </w:r>
             <w:proofErr w:type="spellEnd"/>
             <w:r>
+              <w:rPr>
+                <w:highlight w:val="green"/>
+              </w:rPr>
               <w:t xml:space="preserve"> </w:t>
             </w:r>
             <w:proofErr w:type="spellStart"/>
             <w:r>
+              <w:rPr>
+                <w:highlight w:val="green"/>
+              </w:rPr>
               <w:t>Research</w:t>
             </w:r>
             <w:proofErr w:type="spellEnd"/>
             <w:r>
+              <w:rPr>
+                <w:highlight w:val="green"/>
+              </w:rPr>
               <w:t>. 269. 106863. 10.1016/j.fishres.2023.106863.</w:t>
             </w:r>
           </w:p>

</xml_diff>

<commit_message>
modifications tel que demandé
</commit_message>
<xml_diff>
--- a/man/Plan de travail pour Caro_janv 2025.docx
+++ b/man/Plan de travail pour Caro_janv 2025.docx
@@ -1270,6 +1270,7 @@
               <w:rPr>
                 <w:sz w:val="20"/>
                 <w:szCs w:val="20"/>
+                <w:highlight w:val="green"/>
               </w:rPr>
               <w:t>l. 256 à corriger «</w:t>
             </w:r>
@@ -1279,9 +1280,21 @@
                 <w:color w:val="333333"/>
                 <w:sz w:val="21"/>
                 <w:szCs w:val="21"/>
+                <w:highlight w:val="green"/>
                 <w:shd w:val="clear" w:color="auto" w:fill="FFFFFF"/>
               </w:rPr>
-              <w:t> Voici</w:t>
+              <w:t xml:space="preserve"> Voici un rappel du graphique de la structure d'âge, avec </w:t>
+            </w:r>
+            <w:r>
+              <w:rPr>
+                <w:rFonts w:ascii="Helvetica" w:hAnsi="Helvetica" w:cs="Helvetica"/>
+                <w:color w:val="FF0000"/>
+                <w:sz w:val="21"/>
+                <w:szCs w:val="21"/>
+                <w:highlight w:val="green"/>
+                <w:shd w:val="clear" w:color="auto" w:fill="FFFFFF"/>
+              </w:rPr>
+              <w:t>le</w:t>
             </w:r>
             <w:r>
               <w:rPr>
@@ -1289,9 +1302,32 @@
                 <w:color w:val="333333"/>
                 <w:sz w:val="21"/>
                 <w:szCs w:val="21"/>
+                <w:highlight w:val="green"/>
                 <w:shd w:val="clear" w:color="auto" w:fill="FFFFFF"/>
               </w:rPr>
-              <w:t xml:space="preserve"> un rappel du graphique de la structure d'âge, avec </w:t>
+              <w:t xml:space="preserve"> </w:t>
+            </w:r>
+            <w:r>
+              <w:rPr>
+                <w:rFonts w:ascii="Helvetica" w:hAnsi="Helvetica" w:cs="Helvetica"/>
+                <w:color w:val="333333"/>
+                <w:sz w:val="21"/>
+                <w:szCs w:val="21"/>
+                <w:highlight w:val="green"/>
+                <w:shd w:val="clear" w:color="auto" w:fill="FFFFFF"/>
+              </w:rPr>
+              <w:t>Peak Plus mis en évidence.</w:t>
+            </w:r>
+            <w:r>
+              <w:rPr>
+                <w:rFonts w:ascii="Helvetica" w:hAnsi="Helvetica" w:cs="Helvetica"/>
+                <w:color w:val="333333"/>
+                <w:sz w:val="21"/>
+                <w:szCs w:val="21"/>
+                <w:highlight w:val="green"/>
+                <w:shd w:val="clear" w:color="auto" w:fill="FFFFFF"/>
+              </w:rPr>
+              <w:t xml:space="preserve"> </w:t>
             </w:r>
             <w:r>
               <w:rPr>
@@ -1299,9 +1335,10 @@
                 <w:color w:val="FF0000"/>
                 <w:sz w:val="21"/>
                 <w:szCs w:val="21"/>
+                <w:highlight w:val="green"/>
                 <w:shd w:val="clear" w:color="auto" w:fill="FFFFFF"/>
               </w:rPr>
-              <w:t>le</w:t>
+              <w:t>Le</w:t>
             </w:r>
             <w:r>
               <w:rPr>
@@ -1309,6 +1346,7 @@
                 <w:color w:val="333333"/>
                 <w:sz w:val="21"/>
                 <w:szCs w:val="21"/>
+                <w:highlight w:val="green"/>
                 <w:shd w:val="clear" w:color="auto" w:fill="FFFFFF"/>
               </w:rPr>
               <w:t xml:space="preserve"> </w:t>
@@ -1319,9 +1357,10 @@
                 <w:color w:val="333333"/>
                 <w:sz w:val="21"/>
                 <w:szCs w:val="21"/>
+                <w:highlight w:val="green"/>
                 <w:shd w:val="clear" w:color="auto" w:fill="FFFFFF"/>
               </w:rPr>
-              <w:t>Peak Plus mis en évidence.</w:t>
+              <w:t>Peak Plus représente l'âge à partir duquel les indicateurs de mortalité devraient être estimés.</w:t>
             </w:r>
             <w:r>
               <w:rPr>
@@ -1329,19 +1368,10 @@
                 <w:color w:val="333333"/>
                 <w:sz w:val="21"/>
                 <w:szCs w:val="21"/>
+                <w:highlight w:val="green"/>
                 <w:shd w:val="clear" w:color="auto" w:fill="FFFFFF"/>
               </w:rPr>
               <w:t xml:space="preserve"> </w:t>
-            </w:r>
-            <w:r>
-              <w:rPr>
-                <w:rFonts w:ascii="Helvetica" w:hAnsi="Helvetica" w:cs="Helvetica"/>
-                <w:color w:val="FF0000"/>
-                <w:sz w:val="21"/>
-                <w:szCs w:val="21"/>
-                <w:shd w:val="clear" w:color="auto" w:fill="FFFFFF"/>
-              </w:rPr>
-              <w:t>Le</w:t>
             </w:r>
             <w:r>
               <w:rPr>
@@ -1349,36 +1379,7 @@
                 <w:color w:val="333333"/>
                 <w:sz w:val="21"/>
                 <w:szCs w:val="21"/>
-                <w:shd w:val="clear" w:color="auto" w:fill="FFFFFF"/>
-              </w:rPr>
-              <w:t xml:space="preserve"> </w:t>
-            </w:r>
-            <w:r>
-              <w:rPr>
-                <w:rFonts w:ascii="Helvetica" w:hAnsi="Helvetica" w:cs="Helvetica"/>
-                <w:color w:val="333333"/>
-                <w:sz w:val="21"/>
-                <w:szCs w:val="21"/>
-                <w:shd w:val="clear" w:color="auto" w:fill="FFFFFF"/>
-              </w:rPr>
-              <w:t>Peak Plus représente l'âge à partir duquel les indicateurs de mortalité devraient être estimés.</w:t>
-            </w:r>
-            <w:r>
-              <w:rPr>
-                <w:rFonts w:ascii="Helvetica" w:hAnsi="Helvetica" w:cs="Helvetica"/>
-                <w:color w:val="333333"/>
-                <w:sz w:val="21"/>
-                <w:szCs w:val="21"/>
-                <w:shd w:val="clear" w:color="auto" w:fill="FFFFFF"/>
-              </w:rPr>
-              <w:t xml:space="preserve"> </w:t>
-            </w:r>
-            <w:r>
-              <w:rPr>
-                <w:rFonts w:ascii="Helvetica" w:hAnsi="Helvetica" w:cs="Helvetica"/>
-                <w:color w:val="333333"/>
-                <w:sz w:val="21"/>
-                <w:szCs w:val="21"/>
+                <w:highlight w:val="green"/>
                 <w:shd w:val="clear" w:color="auto" w:fill="FFFFFF"/>
               </w:rPr>
               <w:t xml:space="preserve">Comme on souhaite avoir la meilleure représentation possible des classes d’âges pour estimer Z, il est </w:t>
@@ -1390,6 +1391,7 @@
                 <w:color w:val="FF0000"/>
                 <w:sz w:val="21"/>
                 <w:szCs w:val="21"/>
+                <w:highlight w:val="green"/>
                 <w:shd w:val="clear" w:color="auto" w:fill="FFFFFF"/>
               </w:rPr>
               <w:t xml:space="preserve">[...] </w:t>
@@ -1400,6 +1402,7 @@
                 <w:color w:val="333333"/>
                 <w:sz w:val="21"/>
                 <w:szCs w:val="21"/>
+                <w:highlight w:val="green"/>
                 <w:shd w:val="clear" w:color="auto" w:fill="FFFFFF"/>
               </w:rPr>
               <w:t>préférable d’utiliser la classe d’âge suivant le Peak observé (</w:t>
@@ -1410,6 +1413,7 @@
                 <w:color w:val="FF0000"/>
                 <w:sz w:val="21"/>
                 <w:szCs w:val="21"/>
+                <w:highlight w:val="green"/>
                 <w:shd w:val="clear" w:color="auto" w:fill="FFFFFF"/>
               </w:rPr>
               <w:t>Mainguy</w:t>
@@ -1420,6 +1424,7 @@
                 <w:color w:val="FF0000"/>
                 <w:sz w:val="21"/>
                 <w:szCs w:val="21"/>
+                <w:highlight w:val="green"/>
                 <w:shd w:val="clear" w:color="auto" w:fill="FFFFFF"/>
               </w:rPr>
               <w:t xml:space="preserve"> et Moral</w:t>
@@ -1430,6 +1435,7 @@
                 <w:color w:val="FF0000"/>
                 <w:sz w:val="21"/>
                 <w:szCs w:val="21"/>
+                <w:highlight w:val="green"/>
                 <w:shd w:val="clear" w:color="auto" w:fill="FFFFFF"/>
               </w:rPr>
               <w:t xml:space="preserve"> 202</w:t>
@@ -1440,6 +1446,7 @@
                 <w:color w:val="FF0000"/>
                 <w:sz w:val="21"/>
                 <w:szCs w:val="21"/>
+                <w:highlight w:val="green"/>
                 <w:shd w:val="clear" w:color="auto" w:fill="FFFFFF"/>
               </w:rPr>
               <w:t>1</w:t>
@@ -1450,6 +1457,7 @@
                 <w:color w:val="333333"/>
                 <w:sz w:val="21"/>
                 <w:szCs w:val="21"/>
+                <w:highlight w:val="green"/>
                 <w:shd w:val="clear" w:color="auto" w:fill="FFFFFF"/>
               </w:rPr>
               <w:t xml:space="preserve">), </w:t>
@@ -1459,6 +1467,7 @@
                 <w:rFonts w:ascii="Helvetica" w:hAnsi="Helvetica" w:cs="Helvetica"/>
                 <w:sz w:val="21"/>
                 <w:szCs w:val="21"/>
+                <w:highlight w:val="green"/>
                 <w:shd w:val="clear" w:color="auto" w:fill="FFFFFF"/>
               </w:rPr>
               <w:t>soit le Peak Plus</w:t>
@@ -1469,6 +1478,7 @@
                 <w:color w:val="333333"/>
                 <w:sz w:val="21"/>
                 <w:szCs w:val="21"/>
+                <w:highlight w:val="green"/>
                 <w:shd w:val="clear" w:color="auto" w:fill="FFFFFF"/>
               </w:rPr>
               <w:t>. »</w:t>
@@ -1572,6 +1582,7 @@
               <w:rPr>
                 <w:sz w:val="20"/>
                 <w:szCs w:val="20"/>
+                <w:highlight w:val="green"/>
                 <w:lang w:val="en-CA"/>
               </w:rPr>
             </w:pPr>
@@ -1581,6 +1592,7 @@
               <w:rPr>
                 <w:sz w:val="20"/>
                 <w:szCs w:val="20"/>
+                <w:highlight w:val="green"/>
               </w:rPr>
               <w:t>utils.R</w:t>
             </w:r>
@@ -1606,12 +1618,14 @@
               <w:rPr>
                 <w:sz w:val="20"/>
                 <w:szCs w:val="20"/>
-              </w:rPr>
-            </w:pPr>
-            <w:r>
-              <w:rPr>
-                <w:sz w:val="20"/>
-                <w:szCs w:val="20"/>
+                <w:highlight w:val="green"/>
+              </w:rPr>
+            </w:pPr>
+            <w:r>
+              <w:rPr>
+                <w:sz w:val="20"/>
+                <w:szCs w:val="20"/>
+                <w:highlight w:val="green"/>
               </w:rPr>
               <w:t>kable_psd1</w:t>
             </w:r>
@@ -1627,15 +1641,9 @@
               <w:rPr>
                 <w:sz w:val="20"/>
                 <w:szCs w:val="20"/>
-              </w:rPr>
-              <w:t xml:space="preserve">Corriger le </w:t>
-            </w:r>
-            <w:r>
-              <w:rPr>
-                <w:sz w:val="20"/>
-                <w:szCs w:val="20"/>
-              </w:rPr>
-              <w:t>Titre du tableau : « Nombre et fréquence relative (%) des classes de taille du PSD »</w:t>
+                <w:highlight w:val="green"/>
+              </w:rPr>
+              <w:t>Corriger le Titre du tableau : « Nombre et fréquence relative (%) des classes de taille du PSD »</w:t>
             </w:r>
           </w:p>
           <w:p>
@@ -1645,12 +1653,14 @@
               <w:rPr>
                 <w:sz w:val="20"/>
                 <w:szCs w:val="20"/>
-              </w:rPr>
-            </w:pPr>
-            <w:r>
-              <w:rPr>
-                <w:sz w:val="20"/>
-                <w:szCs w:val="20"/>
+                <w:highlight w:val="green"/>
+              </w:rPr>
+            </w:pPr>
+            <w:r>
+              <w:rPr>
+                <w:sz w:val="20"/>
+                <w:szCs w:val="20"/>
+                <w:highlight w:val="green"/>
               </w:rPr>
               <w:t>kable_mortalite1</w:t>
             </w:r>
@@ -1660,12 +1670,14 @@
               <w:rPr>
                 <w:sz w:val="20"/>
                 <w:szCs w:val="20"/>
-              </w:rPr>
-            </w:pPr>
-            <w:r>
-              <w:rPr>
-                <w:sz w:val="20"/>
-                <w:szCs w:val="20"/>
+                <w:highlight w:val="green"/>
+              </w:rPr>
+            </w:pPr>
+            <w:r>
+              <w:rPr>
+                <w:sz w:val="20"/>
+                <w:szCs w:val="20"/>
+                <w:highlight w:val="green"/>
               </w:rPr>
               <w:t xml:space="preserve">Titre du tableau : </w:t>
             </w:r>
@@ -1673,6 +1685,7 @@
               <w:rPr>
                 <w:sz w:val="20"/>
                 <w:szCs w:val="20"/>
+                <w:highlight w:val="green"/>
               </w:rPr>
               <w:t>« </w:t>
             </w:r>
@@ -1680,6 +1693,7 @@
               <w:rPr>
                 <w:sz w:val="20"/>
                 <w:szCs w:val="20"/>
+                <w:highlight w:val="green"/>
               </w:rPr>
               <w:t>Table de sélection des modèles de l’estimation de la mortalité</w:t>
             </w:r>
@@ -1687,6 +1701,7 @@
               <w:rPr>
                 <w:sz w:val="20"/>
                 <w:szCs w:val="20"/>
+                <w:highlight w:val="green"/>
               </w:rPr>
               <w:t> »</w:t>
             </w:r>
@@ -1698,12 +1713,14 @@
               <w:rPr>
                 <w:sz w:val="20"/>
                 <w:szCs w:val="20"/>
-              </w:rPr>
-            </w:pPr>
-            <w:r>
-              <w:rPr>
-                <w:sz w:val="20"/>
-                <w:szCs w:val="20"/>
+                <w:highlight w:val="green"/>
+              </w:rPr>
+            </w:pPr>
+            <w:r>
+              <w:rPr>
+                <w:sz w:val="20"/>
+                <w:szCs w:val="20"/>
+                <w:highlight w:val="green"/>
               </w:rPr>
               <w:t>kable_mortalite2</w:t>
             </w:r>
@@ -1719,6 +1736,7 @@
               <w:rPr>
                 <w:sz w:val="20"/>
                 <w:szCs w:val="20"/>
+                <w:highlight w:val="green"/>
               </w:rPr>
               <w:t>Titre du tableau : « Estimations obtenues à partir du modèle de Robson-Chapman (à titre comparatif seulement) »</w:t>
             </w:r>
@@ -1730,20 +1748,30 @@
               <w:rPr>
                 <w:sz w:val="20"/>
                 <w:szCs w:val="20"/>
-              </w:rPr>
-            </w:pPr>
-            <w:proofErr w:type="spellStart"/>
-            <w:r>
-              <w:rPr>
-                <w:sz w:val="20"/>
-                <w:szCs w:val="20"/>
+                <w:highlight w:val="green"/>
+              </w:rPr>
+            </w:pPr>
+            <w:proofErr w:type="spellStart"/>
+            <w:r>
+              <w:rPr>
+                <w:sz w:val="20"/>
+                <w:szCs w:val="20"/>
+                <w:highlight w:val="green"/>
               </w:rPr>
               <w:t>kable_CPUEtous</w:t>
             </w:r>
             <w:proofErr w:type="spellEnd"/>
           </w:p>
           <w:p>
-            <w:r>
+            <w:pPr>
+              <w:rPr>
+                <w:highlight w:val="green"/>
+              </w:rPr>
+            </w:pPr>
+            <w:r>
+              <w:rPr>
+                <w:highlight w:val="green"/>
+              </w:rPr>
               <w:t>Titre : « Comparaison des modèles : tous les spécimens »</w:t>
             </w:r>
           </w:p>
@@ -1754,33 +1782,31 @@
               <w:rPr>
                 <w:sz w:val="20"/>
                 <w:szCs w:val="20"/>
-              </w:rPr>
-            </w:pPr>
-            <w:proofErr w:type="spellStart"/>
-            <w:r>
-              <w:rPr>
-                <w:sz w:val="20"/>
-                <w:szCs w:val="20"/>
-              </w:rPr>
-              <w:t>kable_CPUE</w:t>
-            </w:r>
-            <w:r>
-              <w:rPr>
-                <w:sz w:val="20"/>
-                <w:szCs w:val="20"/>
-              </w:rPr>
-              <w:t>Fmature</w:t>
-            </w:r>
-            <w:proofErr w:type="spellEnd"/>
-          </w:p>
-          <w:p>
-            <w:pPr>
-              <w:rPr>
-                <w:sz w:val="20"/>
-                <w:szCs w:val="20"/>
-              </w:rPr>
-            </w:pPr>
-            <w:r>
+                <w:highlight w:val="green"/>
+              </w:rPr>
+            </w:pPr>
+            <w:proofErr w:type="spellStart"/>
+            <w:r>
+              <w:rPr>
+                <w:sz w:val="20"/>
+                <w:szCs w:val="20"/>
+                <w:highlight w:val="green"/>
+              </w:rPr>
+              <w:t>kable_CPUEFmature</w:t>
+            </w:r>
+            <w:proofErr w:type="spellEnd"/>
+          </w:p>
+          <w:p>
+            <w:pPr>
+              <w:rPr>
+                <w:sz w:val="20"/>
+                <w:szCs w:val="20"/>
+              </w:rPr>
+            </w:pPr>
+            <w:r>
+              <w:rPr>
+                <w:highlight w:val="green"/>
+              </w:rPr>
               <w:t>Titre : « Comparaison des modèles : femelles reproductrices actives ».</w:t>
             </w:r>
           </w:p>
@@ -2166,14 +2192,16 @@
               <w:rPr>
                 <w:sz w:val="20"/>
                 <w:szCs w:val="20"/>
-                <w:lang w:val="en-CA"/>
-              </w:rPr>
-            </w:pPr>
-            <w:proofErr w:type="spellStart"/>
-            <w:r>
-              <w:rPr>
-                <w:sz w:val="20"/>
-                <w:szCs w:val="20"/>
+                <w:highlight w:val="green"/>
+                <w:lang w:val="en-CA"/>
+              </w:rPr>
+            </w:pPr>
+            <w:proofErr w:type="spellStart"/>
+            <w:r>
+              <w:rPr>
+                <w:sz w:val="20"/>
+                <w:szCs w:val="20"/>
+                <w:highlight w:val="green"/>
                 <w:lang w:val="en-CA"/>
               </w:rPr>
               <w:t>Instructi</w:t>
@@ -2182,6 +2210,7 @@
               <w:rPr>
                 <w:sz w:val="20"/>
                 <w:szCs w:val="20"/>
+                <w:highlight w:val="green"/>
                 <w:lang w:val="en-CA"/>
               </w:rPr>
               <w:t>o</w:t>
@@ -2190,6 +2219,7 @@
               <w:rPr>
                 <w:sz w:val="20"/>
                 <w:szCs w:val="20"/>
+                <w:highlight w:val="green"/>
                 <w:lang w:val="en-CA"/>
               </w:rPr>
               <w:t>n_texte.rmd</w:t>
@@ -2212,7 +2242,13 @@
               <w:contextualSpacing/>
             </w:pPr>
             <w:r>
-              <w:t xml:space="preserve">Ce texte doit être visible directement sur la page téléchargement, par exemple au-dessus de « Téléchargez vos données ». </w:t>
+              <w:rPr>
+                <w:highlight w:val="green"/>
+              </w:rPr>
+              <w:t>Ce texte doit être visible directement sur la page téléchargement, par exemple au-dessus de « Téléchargez vos données ».</w:t>
+            </w:r>
+            <w:r>
+              <w:t xml:space="preserve"> </w:t>
             </w:r>
           </w:p>
         </w:tc>
@@ -2238,28 +2274,24 @@
               <w:rPr>
                 <w:sz w:val="20"/>
                 <w:szCs w:val="20"/>
-              </w:rPr>
-            </w:pPr>
-            <w:proofErr w:type="spellStart"/>
-            <w:r>
-              <w:rPr>
-                <w:sz w:val="20"/>
-                <w:szCs w:val="20"/>
+                <w:highlight w:val="green"/>
+              </w:rPr>
+            </w:pPr>
+            <w:proofErr w:type="spellStart"/>
+            <w:r>
+              <w:rPr>
+                <w:sz w:val="20"/>
+                <w:szCs w:val="20"/>
+                <w:highlight w:val="green"/>
               </w:rPr>
               <w:lastRenderedPageBreak/>
-              <w:t>B</w:t>
-            </w:r>
-            <w:r>
-              <w:rPr>
-                <w:sz w:val="20"/>
-                <w:szCs w:val="20"/>
-              </w:rPr>
-              <w:t>PUE_texte</w:t>
-            </w:r>
-            <w:r>
-              <w:rPr>
-                <w:sz w:val="20"/>
-                <w:szCs w:val="20"/>
+              <w:t>BPUE_texte</w:t>
+            </w:r>
+            <w:r>
+              <w:rPr>
+                <w:sz w:val="20"/>
+                <w:szCs w:val="20"/>
+                <w:highlight w:val="green"/>
                 <w:shd w:val="clear" w:color="auto" w:fill="FFFFFF"/>
               </w:rPr>
               <w:t>.rmd</w:t>
@@ -2290,12 +2322,14 @@
                 <w:color w:val="333333"/>
                 <w:sz w:val="21"/>
                 <w:szCs w:val="21"/>
-              </w:rPr>
-            </w:pPr>
-            <w:r>
-              <w:rPr>
-                <w:sz w:val="20"/>
-                <w:szCs w:val="20"/>
+                <w:highlight w:val="green"/>
+              </w:rPr>
+            </w:pPr>
+            <w:r>
+              <w:rPr>
+                <w:sz w:val="20"/>
+                <w:szCs w:val="20"/>
+                <w:highlight w:val="green"/>
               </w:rPr>
               <w:t>Actuellement</w:t>
             </w:r>
@@ -2303,6 +2337,7 @@
               <w:rPr>
                 <w:sz w:val="20"/>
                 <w:szCs w:val="20"/>
+                <w:highlight w:val="green"/>
               </w:rPr>
               <w:t>,</w:t>
             </w:r>
@@ -2310,20 +2345,15 @@
               <w:rPr>
                 <w:sz w:val="20"/>
                 <w:szCs w:val="20"/>
-              </w:rPr>
-              <w:t xml:space="preserve"> c’est le même texte que pour les CPUE. Il faudrait corriger par </w:t>
-            </w:r>
-            <w:r>
-              <w:rPr>
-                <w:sz w:val="20"/>
-                <w:szCs w:val="20"/>
-              </w:rPr>
-              <w:t>« </w:t>
-            </w:r>
-            <w:r>
-              <w:rPr>
-                <w:sz w:val="20"/>
-                <w:szCs w:val="20"/>
+                <w:highlight w:val="green"/>
+              </w:rPr>
+              <w:t xml:space="preserve"> c’est le même texte que pour les CPUE. Il faudrait corriger par « </w:t>
+            </w:r>
+            <w:r>
+              <w:rPr>
+                <w:sz w:val="20"/>
+                <w:szCs w:val="20"/>
+                <w:highlight w:val="green"/>
               </w:rPr>
               <w:t xml:space="preserve">Le tableau ci-dessous présente la répartition de la biomasse capturée selon la table </w:t>
             </w:r>
@@ -2333,6 +2363,7 @@
                 <w:iCs/>
                 <w:sz w:val="20"/>
                 <w:szCs w:val="20"/>
+                <w:highlight w:val="green"/>
               </w:rPr>
               <w:t>Spécimens »</w:t>
             </w:r>
@@ -2360,6 +2391,7 @@
               <w:rPr>
                 <w:sz w:val="20"/>
                 <w:szCs w:val="20"/>
+                <w:highlight w:val="green"/>
                 <w:shd w:val="clear" w:color="auto" w:fill="FFFFFF"/>
               </w:rPr>
             </w:pPr>
@@ -2368,6 +2400,7 @@
               <w:rPr>
                 <w:sz w:val="20"/>
                 <w:szCs w:val="20"/>
+                <w:highlight w:val="green"/>
               </w:rPr>
               <w:t>taillemasseage_texte.rmd</w:t>
             </w:r>
@@ -2385,23 +2418,43 @@
             </w:tcBorders>
           </w:tcPr>
           <w:p>
-            <w:r>
+            <w:pPr>
+              <w:rPr>
+                <w:highlight w:val="green"/>
+              </w:rPr>
+            </w:pPr>
+            <w:r>
+              <w:rPr>
+                <w:highlight w:val="green"/>
+              </w:rPr>
               <w:t>« Le tableau suivant reprend les statistiques descriptives, soit le nombre de spécimens mesurés/pesés/âgés (N) ainsi que la moyenne (</w:t>
             </w:r>
             <w:proofErr w:type="spellStart"/>
             <w:r>
+              <w:rPr>
+                <w:highlight w:val="green"/>
+              </w:rPr>
               <w:t>Moy</w:t>
             </w:r>
             <w:proofErr w:type="spellEnd"/>
             <w:r>
+              <w:rPr>
+                <w:highlight w:val="green"/>
+              </w:rPr>
               <w:t>.), l’écart-type (ET), les valeurs minimale (Min) et maximale (Max) de la longueur totale maximale (</w:t>
             </w:r>
             <w:proofErr w:type="spellStart"/>
             <w:r>
+              <w:rPr>
+                <w:highlight w:val="green"/>
+              </w:rPr>
               <w:t>LTMax</w:t>
             </w:r>
             <w:proofErr w:type="spellEnd"/>
             <w:r>
+              <w:rPr>
+                <w:highlight w:val="green"/>
+              </w:rPr>
               <w:t>), de la masse et de l’âge des poissons pour différents groupes. »</w:t>
             </w:r>
           </w:p>
@@ -2428,6 +2481,7 @@
               <w:rPr>
                 <w:sz w:val="20"/>
                 <w:szCs w:val="20"/>
+                <w:highlight w:val="green"/>
                 <w:shd w:val="clear" w:color="auto" w:fill="FFFFFF"/>
               </w:rPr>
             </w:pPr>
@@ -2436,6 +2490,7 @@
               <w:rPr>
                 <w:sz w:val="20"/>
                 <w:szCs w:val="20"/>
+                <w:highlight w:val="green"/>
                 <w:shd w:val="clear" w:color="auto" w:fill="FFFFFF"/>
               </w:rPr>
               <w:t>structuretaille_texte.rmd</w:t>
@@ -2454,25 +2509,51 @@
             </w:tcBorders>
           </w:tcPr>
           <w:p>
-            <w:r>
+            <w:pPr>
+              <w:rPr>
+                <w:highlight w:val="green"/>
+              </w:rPr>
+            </w:pPr>
+            <w:r>
+              <w:rPr>
+                <w:highlight w:val="green"/>
+              </w:rPr>
               <w:t xml:space="preserve">« L’histogramme de fréquence des longueurs permettant de caractériser la structure de taille de la population est réalisée avec la fonction </w:t>
             </w:r>
             <w:proofErr w:type="spellStart"/>
             <w:r>
+              <w:rPr>
+                <w:highlight w:val="green"/>
+              </w:rPr>
               <w:t>geom_histogram</w:t>
             </w:r>
             <w:proofErr w:type="spellEnd"/>
             <w:r>
+              <w:rPr>
+                <w:highlight w:val="green"/>
+              </w:rPr>
               <w:t xml:space="preserve"> de la librairie ggplot2 (Chang et al. 2021). La sélection des intervalles pour les classes de taille est basée sur les recommandations de Anderson et Neumann (1996) et Neumann et al. (2012). Ainsi, des intervalles de 20 mm sont utilisés pour l’omble de fontaine, alors qu’ils sont de 50 mm pour le doré jaune </w:t>
             </w:r>
             <w:r>
+              <w:rPr>
+                <w:highlight w:val="green"/>
+              </w:rPr>
               <w:t xml:space="preserve">et le </w:t>
             </w:r>
             <w:r>
+              <w:rPr>
+                <w:highlight w:val="green"/>
+              </w:rPr>
               <w:t>touladi.</w:t>
             </w:r>
           </w:p>
-          <w:p/>
+          <w:p>
+            <w:pPr>
+              <w:rPr>
+                <w:highlight w:val="green"/>
+              </w:rPr>
+            </w:pPr>
+          </w:p>
           <w:p>
             <w:pPr>
               <w:rPr>
@@ -2480,39 +2561,34 @@
                 <w:color w:val="333333"/>
                 <w:sz w:val="21"/>
                 <w:szCs w:val="21"/>
+                <w:highlight w:val="green"/>
                 <w:shd w:val="clear" w:color="auto" w:fill="FFFFFF"/>
               </w:rPr>
             </w:pPr>
             <w:r>
-              <w:t xml:space="preserve">La figure ci-dessous représente l’histogramme de fréquence des longueurs selon le filtre sélectionné à gauche. La valeur de la classe inscrite sur l’axe des abscisses indique </w:t>
-            </w:r>
-            <w:commentRangeStart w:id="1"/>
-            <w:r>
-              <w:t xml:space="preserve">la borne </w:t>
+              <w:rPr>
+                <w:highlight w:val="green"/>
+              </w:rPr>
+              <w:t xml:space="preserve">La figure ci-dessous représente l’histogramme de fréquence des longueurs selon le filtre sélectionné à gauche. La valeur de la classe inscrite sur l’axe des abscisses indique la borne </w:t>
             </w:r>
             <w:r>
               <w:rPr>
                 <w:color w:val="FF0000"/>
+                <w:highlight w:val="green"/>
               </w:rPr>
               <w:t xml:space="preserve">XXX </w:t>
             </w:r>
             <w:r>
+              <w:rPr>
+                <w:highlight w:val="green"/>
+              </w:rPr>
               <w:t>(</w:t>
             </w:r>
             <w:r>
-              <w:t>inférieure ou supérieure</w:t>
-            </w:r>
-            <w:commentRangeEnd w:id="1"/>
-            <w:r>
-              <w:rPr>
-                <w:rStyle w:val="Marquedecommentaire"/>
-                <w:kern w:val="0"/>
-                <w14:ligatures w14:val="none"/>
-              </w:rPr>
-              <w:commentReference w:id="1"/>
-            </w:r>
-            <w:r>
-              <w:t>) de la casse de longueur. »</w:t>
+              <w:rPr>
+                <w:highlight w:val="green"/>
+              </w:rPr>
+              <w:t>inférieure ou supérieure) de la casse de longueur. »</w:t>
             </w:r>
           </w:p>
         </w:tc>
@@ -2538,13 +2614,15 @@
               <w:rPr>
                 <w:sz w:val="20"/>
                 <w:szCs w:val="20"/>
-                <w:lang w:val="en-CA"/>
-              </w:rPr>
-            </w:pPr>
-            <w:r>
-              <w:rPr>
-                <w:sz w:val="20"/>
-                <w:szCs w:val="20"/>
+                <w:highlight w:val="green"/>
+                <w:lang w:val="en-CA"/>
+              </w:rPr>
+            </w:pPr>
+            <w:r>
+              <w:rPr>
+                <w:sz w:val="20"/>
+                <w:szCs w:val="20"/>
+                <w:highlight w:val="green"/>
                 <w:shd w:val="clear" w:color="auto" w:fill="FFFFFF"/>
               </w:rPr>
               <w:t>wri1_texte.rmd</w:t>
@@ -2569,26 +2647,42 @@
                 <w:color w:val="333333"/>
                 <w:sz w:val="21"/>
                 <w:szCs w:val="21"/>
+                <w:highlight w:val="green"/>
                 <w:shd w:val="clear" w:color="auto" w:fill="FFFFFF"/>
               </w:rPr>
             </w:pPr>
             <w:r>
+              <w:rPr>
+                <w:highlight w:val="green"/>
+              </w:rPr>
               <w:t>« Le tableau ci-dessous présente l’indice de masse relative (</w:t>
             </w:r>
             <w:proofErr w:type="spellStart"/>
             <w:r>
+              <w:rPr>
+                <w:highlight w:val="green"/>
+              </w:rPr>
               <w:t>Wr</w:t>
             </w:r>
             <w:proofErr w:type="spellEnd"/>
             <w:r>
+              <w:rPr>
+                <w:highlight w:val="green"/>
+              </w:rPr>
               <w:t xml:space="preserve">) et son intervalle de confiance à 95 % pour l’ensemble de la population, par sexe et par classe de PSD (classe selon </w:t>
             </w:r>
             <w:proofErr w:type="spellStart"/>
             <w:r>
+              <w:rPr>
+                <w:highlight w:val="green"/>
+              </w:rPr>
               <w:t>Gabelhouse</w:t>
             </w:r>
             <w:proofErr w:type="spellEnd"/>
             <w:r>
+              <w:rPr>
+                <w:highlight w:val="green"/>
+              </w:rPr>
               <w:t xml:space="preserve"> 1984). »</w:t>
             </w:r>
           </w:p>
@@ -2615,6 +2709,7 @@
               <w:rPr>
                 <w:sz w:val="20"/>
                 <w:szCs w:val="20"/>
+                <w:highlight w:val="green"/>
                 <w:shd w:val="clear" w:color="auto" w:fill="FFFFFF"/>
               </w:rPr>
             </w:pPr>
@@ -2622,6 +2717,7 @@
               <w:rPr>
                 <w:sz w:val="20"/>
                 <w:szCs w:val="20"/>
+                <w:highlight w:val="green"/>
               </w:rPr>
               <w:t>./texte/</w:t>
             </w:r>
@@ -2629,6 +2725,7 @@
               <w:rPr>
                 <w:sz w:val="20"/>
                 <w:szCs w:val="20"/>
+                <w:highlight w:val="green"/>
                 <w:shd w:val="clear" w:color="auto" w:fill="FFFFFF"/>
               </w:rPr>
               <w:t>wri2_texte.rmd</w:t>
@@ -2652,10 +2749,14 @@
                 <w:color w:val="333333"/>
                 <w:sz w:val="21"/>
                 <w:szCs w:val="21"/>
+                <w:highlight w:val="green"/>
                 <w:shd w:val="clear" w:color="auto" w:fill="FFFFFF"/>
               </w:rPr>
             </w:pPr>
             <w:r>
+              <w:rPr>
+                <w:highlight w:val="green"/>
+              </w:rPr>
               <w:t>« Le graphique suivant illustre, pour chaque spécimen capturé, l’indice de condition en fonction de la longueur totale maximale et du sexe. La valeur moyenne est indiquée par une ligne pointillée en rouge (tous), en bleu foncé (femelles) et en bleu pâle. La ligne en gris représente la référence standard pour l’espèce selon Hyatt &amp; Hubert 2011 (SAFO), Murphy et al. 1990 (SAVI) et Piccolo et al. 1993 (SANA). »</w:t>
             </w:r>
           </w:p>
@@ -2682,12 +2783,14 @@
               <w:rPr>
                 <w:sz w:val="20"/>
                 <w:szCs w:val="20"/>
-              </w:rPr>
-            </w:pPr>
-            <w:r>
-              <w:rPr>
-                <w:sz w:val="20"/>
-                <w:szCs w:val="20"/>
+                <w:highlight w:val="green"/>
+              </w:rPr>
+            </w:pPr>
+            <w:r>
+              <w:rPr>
+                <w:sz w:val="20"/>
+                <w:szCs w:val="20"/>
+                <w:highlight w:val="green"/>
               </w:rPr>
               <w:t>./texte/</w:t>
             </w:r>
@@ -2695,6 +2798,7 @@
               <w:rPr>
                 <w:sz w:val="20"/>
                 <w:szCs w:val="20"/>
+                <w:highlight w:val="green"/>
                 <w:shd w:val="clear" w:color="auto" w:fill="FFFFFF"/>
               </w:rPr>
               <w:t>wri3_texte.rmd</w:t>
@@ -2718,10 +2822,14 @@
                 <w:color w:val="333333"/>
                 <w:sz w:val="21"/>
                 <w:szCs w:val="21"/>
+                <w:highlight w:val="green"/>
                 <w:shd w:val="clear" w:color="auto" w:fill="FFFFFF"/>
               </w:rPr>
             </w:pPr>
             <w:r>
+              <w:rPr>
+                <w:highlight w:val="green"/>
+              </w:rPr>
               <w:t>Ce graphique présente la variation de l’indice de condition selon les classes de PSD. Les valeurs moyenne et les intervalles de confiance sont illustrés. »</w:t>
             </w:r>
           </w:p>
@@ -2748,13 +2856,15 @@
               <w:rPr>
                 <w:sz w:val="20"/>
                 <w:szCs w:val="20"/>
-              </w:rPr>
-            </w:pPr>
-            <w:proofErr w:type="spellStart"/>
-            <w:r>
-              <w:rPr>
-                <w:sz w:val="20"/>
-                <w:szCs w:val="20"/>
+                <w:highlight w:val="green"/>
+              </w:rPr>
+            </w:pPr>
+            <w:proofErr w:type="spellStart"/>
+            <w:r>
+              <w:rPr>
+                <w:sz w:val="20"/>
+                <w:szCs w:val="20"/>
+                <w:highlight w:val="green"/>
               </w:rPr>
               <w:t>CPUE_texte</w:t>
             </w:r>
@@ -2767,12 +2877,14 @@
               <w:rPr>
                 <w:sz w:val="20"/>
                 <w:szCs w:val="20"/>
-              </w:rPr>
-            </w:pPr>
-            <w:r>
-              <w:rPr>
-                <w:sz w:val="20"/>
-                <w:szCs w:val="20"/>
+                <w:highlight w:val="green"/>
+              </w:rPr>
+            </w:pPr>
+            <w:r>
+              <w:rPr>
+                <w:sz w:val="20"/>
+                <w:szCs w:val="20"/>
+                <w:highlight w:val="green"/>
               </w:rPr>
               <w:t>CPU</w:t>
             </w:r>
@@ -2780,6 +2892,7 @@
               <w:rPr>
                 <w:sz w:val="20"/>
                 <w:szCs w:val="20"/>
+                <w:highlight w:val="green"/>
               </w:rPr>
               <w:t>E</w:t>
             </w:r>
@@ -2787,15 +2900,9 @@
               <w:rPr>
                 <w:sz w:val="20"/>
                 <w:szCs w:val="20"/>
-              </w:rPr>
-              <w:t>_t</w:t>
-            </w:r>
-            <w:r>
-              <w:rPr>
-                <w:sz w:val="20"/>
-                <w:szCs w:val="20"/>
-              </w:rPr>
-              <w:t>exte2</w:t>
+                <w:highlight w:val="green"/>
+              </w:rPr>
+              <w:t>_texte2</w:t>
             </w:r>
           </w:p>
         </w:tc>
@@ -2812,51 +2919,73 @@
           <w:p>
             <w:pPr>
               <w:contextualSpacing/>
-            </w:pPr>
-            <w:r>
+              <w:rPr>
+                <w:highlight w:val="green"/>
+              </w:rPr>
+            </w:pPr>
+            <w:r>
+              <w:rPr>
+                <w:highlight w:val="green"/>
+              </w:rPr>
               <w:t>Pourrait être fusionné en haut du 1</w:t>
             </w:r>
             <w:r>
               <w:rPr>
+                <w:highlight w:val="green"/>
                 <w:vertAlign w:val="superscript"/>
               </w:rPr>
               <w:t>er</w:t>
             </w:r>
             <w:r>
+              <w:rPr>
+                <w:highlight w:val="green"/>
+              </w:rPr>
               <w:t xml:space="preserve"> tableau</w:t>
             </w:r>
             <w:r>
+              <w:rPr>
+                <w:highlight w:val="green"/>
+              </w:rPr>
               <w:t xml:space="preserve"> et corrigé</w:t>
             </w:r>
             <w:r>
-              <w:t xml:space="preserve"> : « </w:t>
-            </w:r>
-            <w:r>
-              <w:t xml:space="preserve">Le tableau ci-dessous présente le nombre de captures de l’espèce visée selon la table </w:t>
+              <w:rPr>
+                <w:highlight w:val="green"/>
+              </w:rPr>
+              <w:t xml:space="preserve"> : « Le tableau ci-dessous présente le nombre de captures de l’espèce visée selon la table </w:t>
             </w:r>
             <w:r>
               <w:rPr>
                 <w:i/>
                 <w:iCs/>
+                <w:highlight w:val="green"/>
               </w:rPr>
               <w:t>Récolte</w:t>
             </w:r>
             <w:r>
+              <w:rPr>
+                <w:highlight w:val="green"/>
+              </w:rPr>
               <w:t xml:space="preserve"> et le nombres d’individus dans la table </w:t>
             </w:r>
             <w:r>
               <w:rPr>
                 <w:i/>
                 <w:iCs/>
+                <w:highlight w:val="green"/>
               </w:rPr>
               <w:t>Spécimens</w:t>
             </w:r>
             <w:r>
+              <w:rPr>
+                <w:highlight w:val="green"/>
+              </w:rPr>
               <w:t xml:space="preserve">. </w:t>
             </w:r>
             <w:r>
               <w:rPr>
                 <w:strike/>
+                <w:highlight w:val="green"/>
               </w:rPr>
               <w:t>L’abondance est calculée fonction du nombre de captures indiqués dans la table Récolte.</w:t>
             </w:r>
@@ -2864,10 +2993,14 @@
           <w:p>
             <w:pPr>
               <w:contextualSpacing/>
+              <w:rPr>
+                <w:highlight w:val="green"/>
+              </w:rPr>
             </w:pPr>
             <w:r>
               <w:rPr>
                 <w:strike/>
+                <w:highlight w:val="green"/>
               </w:rPr>
               <w:t xml:space="preserve">Le nombre d’individus peut parfois </w:t>
             </w:r>
@@ -2875,6 +3008,7 @@
             <w:r>
               <w:rPr>
                 <w:strike/>
+                <w:highlight w:val="green"/>
               </w:rPr>
               <w:t>différé</w:t>
             </w:r>
@@ -2882,6 +3016,7 @@
             <w:r>
               <w:rPr>
                 <w:strike/>
+                <w:highlight w:val="green"/>
               </w:rPr>
               <w:t xml:space="preserve"> entre les tables </w:t>
             </w:r>
@@ -2890,12 +3025,14 @@
                 <w:i/>
                 <w:iCs/>
                 <w:strike/>
+                <w:highlight w:val="green"/>
               </w:rPr>
               <w:t>Récolte</w:t>
             </w:r>
             <w:r>
               <w:rPr>
                 <w:strike/>
+                <w:highlight w:val="green"/>
               </w:rPr>
               <w:t xml:space="preserve"> et</w:t>
             </w:r>
@@ -2904,46 +3041,60 @@
                 <w:i/>
                 <w:iCs/>
                 <w:strike/>
+                <w:highlight w:val="green"/>
               </w:rPr>
               <w:t xml:space="preserve"> Spécimens</w:t>
             </w:r>
             <w:r>
               <w:rPr>
                 <w:strike/>
+                <w:highlight w:val="green"/>
               </w:rPr>
               <w:t>.</w:t>
             </w:r>
             <w:r>
+              <w:rPr>
+                <w:highlight w:val="green"/>
+              </w:rPr>
               <w:t xml:space="preserve"> Si la récolte est plus élevé</w:t>
             </w:r>
             <w:r>
               <w:rPr>
                 <w:color w:val="FF0000"/>
+                <w:highlight w:val="green"/>
               </w:rPr>
               <w:t>e</w:t>
             </w:r>
             <w:r>
-              <w:t xml:space="preserve"> que le nombre de spécimens, il peut s’agir d’un poisson échappé</w:t>
-            </w:r>
-            <w:r>
-              <w:t xml:space="preserve"> </w:t>
+              <w:rPr>
+                <w:highlight w:val="green"/>
+              </w:rPr>
+              <w:t xml:space="preserve"> que le nombre de spécimens, il peut s’agir d’un poisson échappé </w:t>
             </w:r>
             <w:r>
               <w:rPr>
                 <w:color w:val="FF0000"/>
+                <w:highlight w:val="green"/>
               </w:rPr>
               <w:t>ou</w:t>
             </w:r>
             <w:r>
+              <w:rPr>
+                <w:highlight w:val="green"/>
+              </w:rPr>
               <w:t xml:space="preserve"> trop magané pour prendre des mesures, etc. Si le nombre de spécimens est plus élevé que la récolte, il y a erreur à corriger dans la base de donnée</w:t>
             </w:r>
             <w:r>
               <w:rPr>
                 <w:color w:val="FF0000"/>
+                <w:highlight w:val="green"/>
               </w:rPr>
               <w:t>s</w:t>
             </w:r>
             <w:r>
+              <w:rPr>
+                <w:highlight w:val="green"/>
+              </w:rPr>
               <w:t>.</w:t>
             </w:r>
           </w:p>
@@ -2955,6 +3106,7 @@
                 <w:color w:val="FF0000"/>
                 <w:sz w:val="21"/>
                 <w:szCs w:val="21"/>
+                <w:highlight w:val="green"/>
                 <w:shd w:val="clear" w:color="auto" w:fill="FFFFFF"/>
               </w:rPr>
             </w:pPr>
@@ -2964,6 +3116,7 @@
                 <w:color w:val="FF0000"/>
                 <w:sz w:val="21"/>
                 <w:szCs w:val="21"/>
+                <w:highlight w:val="green"/>
                 <w:shd w:val="clear" w:color="auto" w:fill="FFFFFF"/>
               </w:rPr>
               <w:t xml:space="preserve">Les modèles </w:t>
@@ -2974,6 +3127,7 @@
                 <w:color w:val="FF0000"/>
                 <w:sz w:val="21"/>
                 <w:szCs w:val="21"/>
+                <w:highlight w:val="green"/>
                 <w:shd w:val="clear" w:color="auto" w:fill="FFFFFF"/>
               </w:rPr>
               <w:t>d’abondance globale (</w:t>
@@ -2985,6 +3139,7 @@
                 <w:color w:val="FF0000"/>
                 <w:sz w:val="21"/>
                 <w:szCs w:val="21"/>
+                <w:highlight w:val="green"/>
                 <w:shd w:val="clear" w:color="auto" w:fill="FFFFFF"/>
               </w:rPr>
               <w:t>CPUE_tous</w:t>
@@ -2996,6 +3151,7 @@
                 <w:color w:val="FF0000"/>
                 <w:sz w:val="21"/>
                 <w:szCs w:val="21"/>
+                <w:highlight w:val="green"/>
                 <w:shd w:val="clear" w:color="auto" w:fill="FFFFFF"/>
               </w:rPr>
               <w:t xml:space="preserve">) sont calculés à partir du nombre de captures indiqués dans la </w:t>
@@ -3008,6 +3164,7 @@
                 <w:color w:val="FF0000"/>
                 <w:sz w:val="21"/>
                 <w:szCs w:val="21"/>
+                <w:highlight w:val="green"/>
                 <w:shd w:val="clear" w:color="auto" w:fill="FFFFFF"/>
               </w:rPr>
               <w:t>Récolte</w:t>
@@ -3018,19 +3175,10 @@
                 <w:color w:val="FF0000"/>
                 <w:sz w:val="21"/>
                 <w:szCs w:val="21"/>
+                <w:highlight w:val="green"/>
                 <w:shd w:val="clear" w:color="auto" w:fill="FFFFFF"/>
               </w:rPr>
-              <w:t xml:space="preserve"> </w:t>
-            </w:r>
-            <w:r>
-              <w:rPr>
-                <w:rFonts w:ascii="Helvetica" w:hAnsi="Helvetica" w:cs="Helvetica"/>
-                <w:color w:val="FF0000"/>
-                <w:sz w:val="21"/>
-                <w:szCs w:val="21"/>
-                <w:shd w:val="clear" w:color="auto" w:fill="FFFFFF"/>
-              </w:rPr>
-              <w:t xml:space="preserve">alors que le tableau récapitulatif est calculé à partir des données de la table </w:t>
+              <w:t xml:space="preserve"> alors que le tableau récapitulatif est calculé à partir des données de la table </w:t>
             </w:r>
             <w:r>
               <w:rPr>
@@ -3040,6 +3188,7 @@
                 <w:color w:val="FF0000"/>
                 <w:sz w:val="21"/>
                 <w:szCs w:val="21"/>
+                <w:highlight w:val="green"/>
                 <w:shd w:val="clear" w:color="auto" w:fill="FFFFFF"/>
               </w:rPr>
               <w:t>Spécimens</w:t>
@@ -3050,6 +3199,7 @@
                 <w:color w:val="FF0000"/>
                 <w:sz w:val="21"/>
                 <w:szCs w:val="21"/>
+                <w:highlight w:val="green"/>
                 <w:shd w:val="clear" w:color="auto" w:fill="FFFFFF"/>
               </w:rPr>
               <w:t>.</w:t>
@@ -3078,6 +3228,7 @@
               <w:rPr>
                 <w:sz w:val="20"/>
                 <w:szCs w:val="20"/>
+                <w:highlight w:val="green"/>
                 <w:shd w:val="clear" w:color="auto" w:fill="FFFFFF"/>
               </w:rPr>
             </w:pPr>
@@ -3086,6 +3237,7 @@
               <w:rPr>
                 <w:sz w:val="20"/>
                 <w:szCs w:val="20"/>
+                <w:highlight w:val="green"/>
                 <w:lang w:val="en-CA"/>
               </w:rPr>
               <w:t>biomasse_</w:t>
@@ -3095,17 +3247,10 @@
               <w:rPr>
                 <w:sz w:val="20"/>
                 <w:szCs w:val="20"/>
-                <w:lang w:val="en-CA"/>
-              </w:rPr>
-              <w:t>table</w:t>
-            </w:r>
-            <w:r>
-              <w:rPr>
-                <w:sz w:val="20"/>
-                <w:szCs w:val="20"/>
-                <w:lang w:val="en-CA"/>
-              </w:rPr>
-              <w:t>.R</w:t>
+                <w:highlight w:val="green"/>
+                <w:lang w:val="en-CA"/>
+              </w:rPr>
+              <w:t>table.R</w:t>
             </w:r>
             <w:proofErr w:type="spellEnd"/>
             <w:proofErr w:type="gramEnd"/>
@@ -3126,20 +3271,23 @@
               <w:rPr>
                 <w:sz w:val="20"/>
                 <w:szCs w:val="20"/>
-              </w:rPr>
-            </w:pPr>
-          </w:p>
-          <w:p>
-            <w:pPr>
-              <w:rPr>
-                <w:sz w:val="20"/>
-                <w:szCs w:val="20"/>
-              </w:rPr>
-            </w:pPr>
-            <w:r>
-              <w:rPr>
-                <w:sz w:val="20"/>
-                <w:szCs w:val="20"/>
+                <w:highlight w:val="green"/>
+              </w:rPr>
+            </w:pPr>
+          </w:p>
+          <w:p>
+            <w:pPr>
+              <w:rPr>
+                <w:sz w:val="20"/>
+                <w:szCs w:val="20"/>
+                <w:highlight w:val="green"/>
+              </w:rPr>
+            </w:pPr>
+            <w:r>
+              <w:rPr>
+                <w:sz w:val="20"/>
+                <w:szCs w:val="20"/>
+                <w:highlight w:val="green"/>
               </w:rPr>
               <w:t>Remplacer les symboles mâle et femelle par du texte.</w:t>
             </w:r>
@@ -3167,6 +3315,7 @@
               <w:rPr>
                 <w:sz w:val="20"/>
                 <w:szCs w:val="20"/>
+                <w:highlight w:val="green"/>
                 <w:shd w:val="clear" w:color="auto" w:fill="FFFFFF"/>
               </w:rPr>
             </w:pPr>
@@ -3175,6 +3324,7 @@
               <w:rPr>
                 <w:sz w:val="20"/>
                 <w:szCs w:val="20"/>
+                <w:highlight w:val="green"/>
                 <w:shd w:val="clear" w:color="auto" w:fill="FFFFFF"/>
               </w:rPr>
               <w:lastRenderedPageBreak/>
@@ -3194,10 +3344,16 @@
             </w:tcBorders>
           </w:tcPr>
           <w:p>
-            <w:r>
-              <w:rPr>
-                <w:sz w:val="20"/>
-                <w:szCs w:val="20"/>
+            <w:pPr>
+              <w:rPr>
+                <w:highlight w:val="green"/>
+              </w:rPr>
+            </w:pPr>
+            <w:r>
+              <w:rPr>
+                <w:sz w:val="20"/>
+                <w:szCs w:val="20"/>
+                <w:highlight w:val="green"/>
               </w:rPr>
               <w:t xml:space="preserve">Ligne 7, remplacer par </w:t>
             </w:r>
@@ -3205,6 +3361,7 @@
               <w:rPr>
                 <w:sz w:val="20"/>
                 <w:szCs w:val="20"/>
+                <w:highlight w:val="green"/>
               </w:rPr>
               <w:t xml:space="preserve">« Le premier tableau présente les résultats pour l’ensemble des modèles testés. Le modèle le mieux adapté aux données est celui avec le plus faible </w:t>
             </w:r>
@@ -3213,6 +3370,7 @@
               <w:rPr>
                 <w:sz w:val="20"/>
                 <w:szCs w:val="20"/>
+                <w:highlight w:val="green"/>
               </w:rPr>
               <w:t>AICc</w:t>
             </w:r>
@@ -3221,6 +3379,7 @@
               <w:rPr>
                 <w:sz w:val="20"/>
                 <w:szCs w:val="20"/>
+                <w:highlight w:val="green"/>
               </w:rPr>
               <w:t>.</w:t>
             </w:r>
@@ -3230,20 +3389,23 @@
               <w:rPr>
                 <w:sz w:val="20"/>
                 <w:szCs w:val="20"/>
-              </w:rPr>
-            </w:pPr>
-          </w:p>
-          <w:p>
-            <w:pPr>
-              <w:rPr>
-                <w:sz w:val="20"/>
-                <w:szCs w:val="20"/>
-              </w:rPr>
-            </w:pPr>
-            <w:r>
-              <w:rPr>
-                <w:sz w:val="20"/>
-                <w:szCs w:val="20"/>
+                <w:highlight w:val="green"/>
+              </w:rPr>
+            </w:pPr>
+          </w:p>
+          <w:p>
+            <w:pPr>
+              <w:rPr>
+                <w:sz w:val="20"/>
+                <w:szCs w:val="20"/>
+                <w:highlight w:val="green"/>
+              </w:rPr>
+            </w:pPr>
+            <w:r>
+              <w:rPr>
+                <w:sz w:val="20"/>
+                <w:szCs w:val="20"/>
+                <w:highlight w:val="green"/>
               </w:rPr>
               <w:t>La mortalité estimée selon le modèle de Chapman-Robson est présentée à titre comparatif seulement, car son utilisation n’est pas recommandée. »</w:t>
             </w:r>
@@ -3320,13 +3482,15 @@
               <w:rPr>
                 <w:sz w:val="20"/>
                 <w:szCs w:val="20"/>
-              </w:rPr>
-            </w:pPr>
-            <w:proofErr w:type="spellStart"/>
-            <w:r>
-              <w:rPr>
-                <w:sz w:val="20"/>
-                <w:szCs w:val="20"/>
+                <w:highlight w:val="green"/>
+              </w:rPr>
+            </w:pPr>
+            <w:proofErr w:type="spellStart"/>
+            <w:r>
+              <w:rPr>
+                <w:sz w:val="20"/>
+                <w:szCs w:val="20"/>
+                <w:highlight w:val="green"/>
                 <w:lang w:val="en-CA"/>
               </w:rPr>
               <w:t>load_</w:t>
@@ -3336,6 +3500,7 @@
               <w:rPr>
                 <w:sz w:val="20"/>
                 <w:szCs w:val="20"/>
+                <w:highlight w:val="green"/>
                 <w:lang w:val="en-CA"/>
               </w:rPr>
               <w:t>lac.R</w:t>
@@ -3361,13 +3526,15 @@
                 <w:rFonts w:cstheme="minorHAnsi"/>
                 <w:sz w:val="20"/>
                 <w:szCs w:val="20"/>
-              </w:rPr>
-            </w:pPr>
-            <w:r>
-              <w:rPr>
-                <w:rFonts w:cstheme="minorHAnsi"/>
-                <w:sz w:val="20"/>
-                <w:szCs w:val="20"/>
+                <w:highlight w:val="green"/>
+              </w:rPr>
+            </w:pPr>
+            <w:r>
+              <w:rPr>
+                <w:rFonts w:cstheme="minorHAnsi"/>
+                <w:sz w:val="20"/>
+                <w:szCs w:val="20"/>
+                <w:highlight w:val="green"/>
               </w:rPr>
               <w:t xml:space="preserve">Petite erreur à la ligne 66, devrait être « #transformer en </w:t>
             </w:r>
@@ -3377,6 +3544,7 @@
                 <w:rFonts w:cstheme="minorHAnsi"/>
                 <w:sz w:val="20"/>
                 <w:szCs w:val="20"/>
+                <w:highlight w:val="green"/>
               </w:rPr>
               <w:t>character</w:t>
             </w:r>
@@ -3386,6 +3554,7 @@
                 <w:rFonts w:cstheme="minorHAnsi"/>
                 <w:sz w:val="20"/>
                 <w:szCs w:val="20"/>
+                <w:highlight w:val="green"/>
               </w:rPr>
               <w:t> »</w:t>
             </w:r>
@@ -3410,13 +3579,15 @@
               <w:rPr>
                 <w:sz w:val="20"/>
                 <w:szCs w:val="20"/>
-              </w:rPr>
-            </w:pPr>
-            <w:proofErr w:type="spellStart"/>
-            <w:r>
-              <w:rPr>
-                <w:sz w:val="20"/>
-                <w:szCs w:val="20"/>
+                <w:highlight w:val="green"/>
+              </w:rPr>
+            </w:pPr>
+            <w:proofErr w:type="spellStart"/>
+            <w:r>
+              <w:rPr>
+                <w:sz w:val="20"/>
+                <w:szCs w:val="20"/>
+                <w:highlight w:val="green"/>
                 <w:lang w:val="en-CA"/>
               </w:rPr>
               <w:t>load_</w:t>
@@ -3426,6 +3597,7 @@
               <w:rPr>
                 <w:sz w:val="20"/>
                 <w:szCs w:val="20"/>
+                <w:highlight w:val="green"/>
                 <w:lang w:val="en-CA"/>
               </w:rPr>
               <w:t>station.R</w:t>
@@ -3450,13 +3622,15 @@
                 <w:rFonts w:cstheme="minorHAnsi"/>
                 <w:sz w:val="20"/>
                 <w:szCs w:val="20"/>
-              </w:rPr>
-            </w:pPr>
-            <w:r>
-              <w:rPr>
-                <w:rFonts w:cstheme="minorHAnsi"/>
-                <w:sz w:val="20"/>
-                <w:szCs w:val="20"/>
+                <w:highlight w:val="green"/>
+              </w:rPr>
+            </w:pPr>
+            <w:r>
+              <w:rPr>
+                <w:rFonts w:cstheme="minorHAnsi"/>
+                <w:sz w:val="20"/>
+                <w:szCs w:val="20"/>
+                <w:highlight w:val="green"/>
               </w:rPr>
               <w:t>Remplacer nom de colonne « duration » par « Durée »</w:t>
             </w:r>
@@ -3583,7 +3757,7 @@
                 <w:szCs w:val="20"/>
               </w:rPr>
             </w:pPr>
-            <w:commentRangeStart w:id="2"/>
+            <w:commentRangeStart w:id="1"/>
             <w:r>
               <w:rPr>
                 <w:rFonts w:cstheme="minorHAnsi"/>
@@ -3664,12 +3838,12 @@
               </w:rPr>
               <w:t xml:space="preserve"> </w:t>
             </w:r>
-            <w:commentRangeEnd w:id="2"/>
+            <w:commentRangeEnd w:id="1"/>
             <w:r>
               <w:rPr>
                 <w:rStyle w:val="Marquedecommentaire"/>
               </w:rPr>
-              <w:commentReference w:id="2"/>
+              <w:commentReference w:id="1"/>
             </w:r>
           </w:p>
           <w:p>
@@ -4186,13 +4360,15 @@
               <w:rPr>
                 <w:sz w:val="20"/>
                 <w:szCs w:val="20"/>
-              </w:rPr>
-            </w:pPr>
-            <w:proofErr w:type="spellStart"/>
-            <w:r>
-              <w:rPr>
-                <w:sz w:val="20"/>
-                <w:szCs w:val="20"/>
+                <w:highlight w:val="green"/>
+              </w:rPr>
+            </w:pPr>
+            <w:proofErr w:type="spellStart"/>
+            <w:r>
+              <w:rPr>
+                <w:sz w:val="20"/>
+                <w:szCs w:val="20"/>
+                <w:highlight w:val="green"/>
               </w:rPr>
               <w:t>Vérifier_doublons</w:t>
             </w:r>
@@ -4206,12 +4382,14 @@
               <w:rPr>
                 <w:sz w:val="20"/>
                 <w:szCs w:val="20"/>
-              </w:rPr>
-            </w:pPr>
-            <w:r>
-              <w:rPr>
-                <w:sz w:val="20"/>
-                <w:szCs w:val="20"/>
+                <w:highlight w:val="green"/>
+              </w:rPr>
+            </w:pPr>
+            <w:r>
+              <w:rPr>
+                <w:sz w:val="20"/>
+                <w:szCs w:val="20"/>
+                <w:highlight w:val="green"/>
               </w:rPr>
               <w:t>_</w:t>
             </w:r>
@@ -4220,6 +4398,7 @@
               <w:rPr>
                 <w:sz w:val="20"/>
                 <w:szCs w:val="20"/>
+                <w:highlight w:val="green"/>
               </w:rPr>
               <w:t>data_recolte</w:t>
             </w:r>
@@ -4233,12 +4412,14 @@
               <w:rPr>
                 <w:sz w:val="20"/>
                 <w:szCs w:val="20"/>
-              </w:rPr>
-            </w:pPr>
-            <w:r>
-              <w:rPr>
-                <w:sz w:val="20"/>
-                <w:szCs w:val="20"/>
+                <w:highlight w:val="green"/>
+              </w:rPr>
+            </w:pPr>
+            <w:r>
+              <w:rPr>
+                <w:sz w:val="20"/>
+                <w:szCs w:val="20"/>
+                <w:highlight w:val="green"/>
               </w:rPr>
               <w:t>_</w:t>
             </w:r>
@@ -4247,6 +4428,7 @@
               <w:rPr>
                 <w:sz w:val="20"/>
                 <w:szCs w:val="20"/>
+                <w:highlight w:val="green"/>
               </w:rPr>
               <w:t>data_station</w:t>
             </w:r>
@@ -4269,15 +4451,17 @@
                 <w:rFonts w:ascii="Segoe UI" w:hAnsi="Segoe UI" w:cs="Segoe UI"/>
                 <w:sz w:val="18"/>
                 <w:szCs w:val="18"/>
-              </w:rPr>
-            </w:pPr>
-          </w:p>
-          <w:p>
-            <w:pPr>
-              <w:rPr>
-                <w:rFonts w:cstheme="minorHAnsi"/>
-                <w:sz w:val="20"/>
-                <w:szCs w:val="20"/>
+                <w:highlight w:val="green"/>
+              </w:rPr>
+            </w:pPr>
+          </w:p>
+          <w:p>
+            <w:pPr>
+              <w:rPr>
+                <w:rFonts w:cstheme="minorHAnsi"/>
+                <w:sz w:val="20"/>
+                <w:szCs w:val="20"/>
+                <w:highlight w:val="green"/>
               </w:rPr>
             </w:pPr>
             <w:r>
@@ -4285,6 +4469,7 @@
                 <w:rFonts w:ascii="Segoe UI" w:hAnsi="Segoe UI" w:cs="Segoe UI"/>
                 <w:sz w:val="18"/>
                 <w:szCs w:val="18"/>
+                <w:highlight w:val="green"/>
               </w:rPr>
               <w:t>Enlever cette vérification, très peu de doublon et faux sentiment de sécurité</w:t>
             </w:r>
@@ -4296,6 +4481,7 @@
                 <w:rFonts w:cstheme="minorHAnsi"/>
                 <w:sz w:val="20"/>
                 <w:szCs w:val="20"/>
+                <w:highlight w:val="green"/>
               </w:rPr>
             </w:pPr>
           </w:p>
@@ -4319,13 +4505,15 @@
               <w:rPr>
                 <w:sz w:val="20"/>
                 <w:szCs w:val="20"/>
-              </w:rPr>
-            </w:pPr>
-            <w:proofErr w:type="spellStart"/>
-            <w:r>
-              <w:rPr>
-                <w:sz w:val="20"/>
-                <w:szCs w:val="20"/>
+                <w:highlight w:val="green"/>
+              </w:rPr>
+            </w:pPr>
+            <w:proofErr w:type="spellStart"/>
+            <w:r>
+              <w:rPr>
+                <w:sz w:val="20"/>
+                <w:szCs w:val="20"/>
+                <w:highlight w:val="green"/>
               </w:rPr>
               <w:t>Vérifier_dataframe_vide</w:t>
             </w:r>
@@ -4351,6 +4539,7 @@
                 <w:kern w:val="0"/>
                 <w:sz w:val="20"/>
                 <w:szCs w:val="20"/>
+                <w:highlight w:val="green"/>
                 <w:lang w:eastAsia="fr-CA"/>
                 <w14:ligatures w14:val="none"/>
               </w:rPr>
@@ -4361,6 +4550,7 @@
                 <w:kern w:val="0"/>
                 <w:sz w:val="20"/>
                 <w:szCs w:val="20"/>
+                <w:highlight w:val="green"/>
                 <w:lang w:eastAsia="fr-CA"/>
                 <w14:ligatures w14:val="none"/>
               </w:rPr>
@@ -4556,6 +4746,7 @@
                 <w:rFonts w:cstheme="minorHAnsi"/>
                 <w:sz w:val="20"/>
                 <w:szCs w:val="20"/>
+                <w:highlight w:val="green"/>
               </w:rPr>
               <w:t>Enlever le texte # aux lignes 10 et 11.</w:t>
             </w:r>
@@ -6520,12 +6711,14 @@
               <w:rPr>
                 <w:sz w:val="20"/>
                 <w:szCs w:val="20"/>
-              </w:rPr>
-            </w:pPr>
-            <w:r>
-              <w:rPr>
-                <w:sz w:val="20"/>
-                <w:szCs w:val="20"/>
+                <w:highlight w:val="green"/>
+              </w:rPr>
+            </w:pPr>
+            <w:r>
+              <w:rPr>
+                <w:sz w:val="20"/>
+                <w:szCs w:val="20"/>
+                <w:highlight w:val="green"/>
               </w:rPr>
               <w:t>Corriger les textes ci-dessous (</w:t>
             </w:r>
@@ -6533,6 +6726,7 @@
               <w:rPr>
                 <w:sz w:val="20"/>
                 <w:szCs w:val="20"/>
+                <w:highlight w:val="green"/>
               </w:rPr>
               <w:t># en vert</w:t>
             </w:r>
@@ -6540,6 +6734,7 @@
               <w:rPr>
                 <w:sz w:val="20"/>
                 <w:szCs w:val="20"/>
+                <w:highlight w:val="green"/>
               </w:rPr>
               <w:t>)</w:t>
             </w:r>
@@ -6549,12 +6744,14 @@
               <w:rPr>
                 <w:sz w:val="20"/>
                 <w:szCs w:val="20"/>
-              </w:rPr>
-            </w:pPr>
-            <w:r>
-              <w:rPr>
-                <w:sz w:val="20"/>
-                <w:szCs w:val="20"/>
+                <w:highlight w:val="green"/>
+              </w:rPr>
+            </w:pPr>
+            <w:r>
+              <w:rPr>
+                <w:sz w:val="20"/>
+                <w:szCs w:val="20"/>
+                <w:highlight w:val="green"/>
               </w:rPr>
               <w:t>L. 25 : statistiques de longueur (et non par longueur)</w:t>
             </w:r>
@@ -6564,12 +6761,14 @@
               <w:rPr>
                 <w:sz w:val="20"/>
                 <w:szCs w:val="20"/>
-              </w:rPr>
-            </w:pPr>
-            <w:r>
-              <w:rPr>
-                <w:sz w:val="20"/>
-                <w:szCs w:val="20"/>
+                <w:highlight w:val="green"/>
+              </w:rPr>
+            </w:pPr>
+            <w:r>
+              <w:rPr>
+                <w:sz w:val="20"/>
+                <w:szCs w:val="20"/>
+                <w:highlight w:val="green"/>
               </w:rPr>
               <w:t>L. 41 : statistiques de masse (et non par masse)</w:t>
             </w:r>
@@ -6585,6 +6784,7 @@
               <w:rPr>
                 <w:sz w:val="20"/>
                 <w:szCs w:val="20"/>
+                <w:highlight w:val="green"/>
               </w:rPr>
               <w:t>L. 57 : statistiques d’âge (et non par âge)</w:t>
             </w:r>
@@ -7879,8 +8079,17 @@
               <w:rPr>
                 <w:sz w:val="20"/>
                 <w:szCs w:val="20"/>
-              </w:rPr>
-              <w:t>Corriger le titre du tableau « Table de sélection du modèle de croissance » et de la figure « Longueur à l’âge des spécimens capturés et modèle de croissance »</w:t>
+                <w:highlight w:val="green"/>
+              </w:rPr>
+              <w:t xml:space="preserve">Corriger le titre du tableau « Table de sélection du modèle de </w:t>
+            </w:r>
+            <w:r>
+              <w:rPr>
+                <w:sz w:val="20"/>
+                <w:szCs w:val="20"/>
+                <w:highlight w:val="green"/>
+              </w:rPr>
+              <w:t>croissance » et de la figure « Longueur à l’âge des spécimens capturés et modèle de croissance »</w:t>
             </w:r>
           </w:p>
           <w:p>
@@ -8203,7 +8412,7 @@
             </w:pPr>
           </w:p>
           <w:p>
-            <w:bookmarkStart w:id="3" w:name="_Hlk181609112"/>
+            <w:bookmarkStart w:id="2" w:name="_Hlk181609112"/>
             <w:r>
               <w:rPr>
                 <w:rFonts w:eastAsia="Times New Roman"/>
@@ -8239,7 +8448,7 @@
               <w:t>)</w:t>
             </w:r>
           </w:p>
-          <w:bookmarkEnd w:id="3"/>
+          <w:bookmarkEnd w:id="2"/>
           <w:p>
             <w:pPr>
               <w:rPr>
@@ -8628,6 +8837,7 @@
               <w:rPr>
                 <w:sz w:val="20"/>
                 <w:szCs w:val="20"/>
+                <w:highlight w:val="green"/>
               </w:rPr>
               <w:t>On peut enlever le bouton de téléchargement de l’indice PSD et de Robson-</w:t>
             </w:r>
@@ -8636,6 +8846,7 @@
               <w:rPr>
                 <w:sz w:val="20"/>
                 <w:szCs w:val="20"/>
+                <w:highlight w:val="green"/>
               </w:rPr>
               <w:t>chapman</w:t>
             </w:r>
@@ -8741,23 +8952,7 @@
 
 <file path=word/comments.xml><?xml version="1.0" encoding="utf-8"?>
 <w:comments xmlns:wpc="http://schemas.microsoft.com/office/word/2010/wordprocessingCanvas" xmlns:cx="http://schemas.microsoft.com/office/drawing/2014/chartex" xmlns:cx1="http://schemas.microsoft.com/office/drawing/2015/9/8/chartex" xmlns:cx2="http://schemas.microsoft.com/office/drawing/2015/10/21/chartex" xmlns:cx3="http://schemas.microsoft.com/office/drawing/2016/5/9/chartex" xmlns:cx4="http://schemas.microsoft.com/office/drawing/2016/5/10/chartex" xmlns:cx5="http://schemas.microsoft.com/office/drawing/2016/5/11/chartex" xmlns:cx6="http://schemas.microsoft.com/office/drawing/2016/5/12/chartex" xmlns:cx7="http://schemas.microsoft.com/office/drawing/2016/5/13/chartex" xmlns:cx8="http://schemas.microsoft.com/office/drawing/2016/5/14/chartex" xmlns:mc="http://schemas.openxmlformats.org/markup-compatibility/2006" xmlns:aink="http://schemas.microsoft.com/office/drawing/2016/ink" xmlns:am3d="http://schemas.microsoft.com/office/drawing/2017/model3d" xmlns:o="urn:schemas-microsoft-com:office:office" xmlns:oel="http://schemas.microsoft.com/office/2019/extlst" xmlns:r="http://schemas.openxmlformats.org/officeDocument/2006/relationships" xmlns:m="http://schemas.openxmlformats.org/officeDocument/2006/math" xmlns:v="urn:schemas-microsoft-com:vml" xmlns:wp14="http://schemas.microsoft.com/office/word/2010/wordprocessingDrawing" xmlns:wp="http://schemas.openxmlformats.org/drawingml/2006/wordprocessingDrawing" xmlns:w10="urn:schemas-microsoft-com:office:word" xmlns:w="http://schemas.openxmlformats.org/wordprocessingml/2006/main" xmlns:w14="http://schemas.microsoft.com/office/word/2010/wordml" xmlns:w15="http://schemas.microsoft.com/office/word/2012/wordml" xmlns:w16cex="http://schemas.microsoft.com/office/word/2018/wordml/cex" xmlns:w16cid="http://schemas.microsoft.com/office/word/2016/wordml/cid" xmlns:w16="http://schemas.microsoft.com/office/word/2018/wordml" xmlns:w16du="http://schemas.microsoft.com/office/word/2023/wordml/word16du" xmlns:w16sdtdh="http://schemas.microsoft.com/office/word/2020/wordml/sdtdatahash" xmlns:w16sdtfl="http://schemas.microsoft.com/office/word/2024/wordml/sdtformatlock" xmlns:w16se="http://schemas.microsoft.com/office/word/2015/wordml/symex" xmlns:wpg="http://schemas.microsoft.com/office/word/2010/wordprocessingGroup" xmlns:wpi="http://schemas.microsoft.com/office/word/2010/wordprocessingInk" xmlns:wne="http://schemas.microsoft.com/office/word/2006/wordml" xmlns:wps="http://schemas.microsoft.com/office/word/2010/wordprocessingShape" mc:Ignorable="w14 w15 w16se w16cid w16 w16cex w16sdtdh w16sdtfl w16du wp14">
-  <w:comment w:id="1" w:author="Gagné, Stéphanie (DEFA)" w:date="2024-09-19T10:42:00Z" w:initials="GS(">
-    <w:p>
-      <w:pPr>
-        <w:pStyle w:val="Commentaire"/>
-      </w:pPr>
-      <w:r>
-        <w:rPr>
-          <w:rStyle w:val="Marquedecommentaire"/>
-        </w:rPr>
-        <w:annotationRef/>
-      </w:r>
-      <w:r>
-        <w:t>@ Caro : merci de compléter la phrase selon ce que ton script fait</w:t>
-      </w:r>
-    </w:p>
-  </w:comment>
-  <w:comment w:id="2" w:author="Gagné, Stéphanie (DEFA)" w:date="2025-01-06T14:00:00Z" w:initials="GS(">
+  <w:comment w:id="1" w:author="Gagné, Stéphanie (DEFA)" w:date="2025-01-06T14:00:00Z" w:initials="GS(">
     <w:p>
       <w:pPr>
         <w:pStyle w:val="Commentaire"/>
@@ -8820,21 +9015,18 @@
 
 <file path=word/commentsExtended.xml><?xml version="1.0" encoding="utf-8"?>
 <w15:commentsEx xmlns:wpc="http://schemas.microsoft.com/office/word/2010/wordprocessingCanvas" xmlns:cx="http://schemas.microsoft.com/office/drawing/2014/chartex" xmlns:cx1="http://schemas.microsoft.com/office/drawing/2015/9/8/chartex" xmlns:cx2="http://schemas.microsoft.com/office/drawing/2015/10/21/chartex" xmlns:cx3="http://schemas.microsoft.com/office/drawing/2016/5/9/chartex" xmlns:cx4="http://schemas.microsoft.com/office/drawing/2016/5/10/chartex" xmlns:cx5="http://schemas.microsoft.com/office/drawing/2016/5/11/chartex" xmlns:cx6="http://schemas.microsoft.com/office/drawing/2016/5/12/chartex" xmlns:cx7="http://schemas.microsoft.com/office/drawing/2016/5/13/chartex" xmlns:cx8="http://schemas.microsoft.com/office/drawing/2016/5/14/chartex" xmlns:mc="http://schemas.openxmlformats.org/markup-compatibility/2006" xmlns:aink="http://schemas.microsoft.com/office/drawing/2016/ink" xmlns:am3d="http://schemas.microsoft.com/office/drawing/2017/model3d" xmlns:o="urn:schemas-microsoft-com:office:office" xmlns:oel="http://schemas.microsoft.com/office/2019/extlst" xmlns:r="http://schemas.openxmlformats.org/officeDocument/2006/relationships" xmlns:m="http://schemas.openxmlformats.org/officeDocument/2006/math" xmlns:v="urn:schemas-microsoft-com:vml" xmlns:wp14="http://schemas.microsoft.com/office/word/2010/wordprocessingDrawing" xmlns:wp="http://schemas.openxmlformats.org/drawingml/2006/wordprocessingDrawing" xmlns:w10="urn:schemas-microsoft-com:office:word" xmlns:w="http://schemas.openxmlformats.org/wordprocessingml/2006/main" xmlns:w14="http://schemas.microsoft.com/office/word/2010/wordml" xmlns:w15="http://schemas.microsoft.com/office/word/2012/wordml" xmlns:w16cex="http://schemas.microsoft.com/office/word/2018/wordml/cex" xmlns:w16cid="http://schemas.microsoft.com/office/word/2016/wordml/cid" xmlns:w16="http://schemas.microsoft.com/office/word/2018/wordml" xmlns:w16du="http://schemas.microsoft.com/office/word/2023/wordml/word16du" xmlns:w16sdtdh="http://schemas.microsoft.com/office/word/2020/wordml/sdtdatahash" xmlns:w16sdtfl="http://schemas.microsoft.com/office/word/2024/wordml/sdtformatlock" xmlns:w16se="http://schemas.microsoft.com/office/word/2015/wordml/symex" xmlns:wpg="http://schemas.microsoft.com/office/word/2010/wordprocessingGroup" xmlns:wpi="http://schemas.microsoft.com/office/word/2010/wordprocessingInk" xmlns:wne="http://schemas.microsoft.com/office/word/2006/wordml" xmlns:wps="http://schemas.microsoft.com/office/word/2010/wordprocessingShape" mc:Ignorable="w14 w15 w16se w16cid w16 w16cex w16sdtdh w16sdtfl w16du wp14">
-  <w15:commentEx w15:paraId="55D82BEC" w15:done="0"/>
   <w15:commentEx w15:paraId="48B58B14" w15:done="0"/>
 </w15:commentsEx>
 </file>
 
 <file path=word/commentsExtensible.xml><?xml version="1.0" encoding="utf-8"?>
 <w16cex:commentsExtensible xmlns:wpc="http://schemas.microsoft.com/office/word/2010/wordprocessingCanvas" xmlns:cx="http://schemas.microsoft.com/office/drawing/2014/chartex" xmlns:cx1="http://schemas.microsoft.com/office/drawing/2015/9/8/chartex" xmlns:cx2="http://schemas.microsoft.com/office/drawing/2015/10/21/chartex" xmlns:cx3="http://schemas.microsoft.com/office/drawing/2016/5/9/chartex" xmlns:cx4="http://schemas.microsoft.com/office/drawing/2016/5/10/chartex" xmlns:cx5="http://schemas.microsoft.com/office/drawing/2016/5/11/chartex" xmlns:cx6="http://schemas.microsoft.com/office/drawing/2016/5/12/chartex" xmlns:cx7="http://schemas.microsoft.com/office/drawing/2016/5/13/chartex" xmlns:cx8="http://schemas.microsoft.com/office/drawing/2016/5/14/chartex" xmlns:cr="http://schemas.microsoft.com/office/comments/2020/reactions" xmlns:mc="http://schemas.openxmlformats.org/markup-compatibility/2006" xmlns:aink="http://schemas.microsoft.com/office/drawing/2016/ink" xmlns:am3d="http://schemas.microsoft.com/office/drawing/2017/model3d" xmlns:o="urn:schemas-microsoft-com:office:office" xmlns:oel="http://schemas.microsoft.com/office/2019/extlst" xmlns:r="http://schemas.openxmlformats.org/officeDocument/2006/relationships" xmlns:m="http://schemas.openxmlformats.org/officeDocument/2006/math" xmlns:v="urn:schemas-microsoft-com:vml" xmlns:wp14="http://schemas.microsoft.com/office/word/2010/wordprocessingDrawing" xmlns:wp="http://schemas.openxmlformats.org/drawingml/2006/wordprocessingDrawing" xmlns:w10="urn:schemas-microsoft-com:office:word" xmlns:w="http://schemas.openxmlformats.org/wordprocessingml/2006/main" xmlns:w14="http://schemas.microsoft.com/office/word/2010/wordml" xmlns:w15="http://schemas.microsoft.com/office/word/2012/wordml" xmlns:w16cex="http://schemas.microsoft.com/office/word/2018/wordml/cex" xmlns:w16cid="http://schemas.microsoft.com/office/word/2016/wordml/cid" xmlns:w16="http://schemas.microsoft.com/office/word/2018/wordml" xmlns:w16du="http://schemas.microsoft.com/office/word/2023/wordml/word16du" xmlns:w16sdtdh="http://schemas.microsoft.com/office/word/2020/wordml/sdtdatahash" xmlns:w16sdtfl="http://schemas.microsoft.com/office/word/2024/wordml/sdtformatlock" xmlns:w16se="http://schemas.microsoft.com/office/word/2015/wordml/symex" xmlns:wpg="http://schemas.microsoft.com/office/word/2010/wordprocessingGroup" xmlns:wpi="http://schemas.microsoft.com/office/word/2010/wordprocessingInk" xmlns:wne="http://schemas.microsoft.com/office/word/2006/wordml" xmlns:wps="http://schemas.microsoft.com/office/word/2010/wordprocessingShape" mc:Ignorable="w14 w15 w16se w16cid w16 w16cex w16sdtdh w16sdtfl cr w16du wp14">
-  <w16cex:commentExtensible w16cex:durableId="2A967E9D" w16cex:dateUtc="2024-09-19T14:42:00Z"/>
   <w16cex:commentExtensible w16cex:durableId="2B266083" w16cex:dateUtc="2025-01-06T19:00:00Z"/>
 </w16cex:commentsExtensible>
 </file>
 
 <file path=word/commentsIds.xml><?xml version="1.0" encoding="utf-8"?>
 <w16cid:commentsIds xmlns:wpc="http://schemas.microsoft.com/office/word/2010/wordprocessingCanvas" xmlns:cx="http://schemas.microsoft.com/office/drawing/2014/chartex" xmlns:cx1="http://schemas.microsoft.com/office/drawing/2015/9/8/chartex" xmlns:cx2="http://schemas.microsoft.com/office/drawing/2015/10/21/chartex" xmlns:cx3="http://schemas.microsoft.com/office/drawing/2016/5/9/chartex" xmlns:cx4="http://schemas.microsoft.com/office/drawing/2016/5/10/chartex" xmlns:cx5="http://schemas.microsoft.com/office/drawing/2016/5/11/chartex" xmlns:cx6="http://schemas.microsoft.com/office/drawing/2016/5/12/chartex" xmlns:cx7="http://schemas.microsoft.com/office/drawing/2016/5/13/chartex" xmlns:cx8="http://schemas.microsoft.com/office/drawing/2016/5/14/chartex" xmlns:mc="http://schemas.openxmlformats.org/markup-compatibility/2006" xmlns:aink="http://schemas.microsoft.com/office/drawing/2016/ink" xmlns:am3d="http://schemas.microsoft.com/office/drawing/2017/model3d" xmlns:o="urn:schemas-microsoft-com:office:office" xmlns:oel="http://schemas.microsoft.com/office/2019/extlst" xmlns:r="http://schemas.openxmlformats.org/officeDocument/2006/relationships" xmlns:m="http://schemas.openxmlformats.org/officeDocument/2006/math" xmlns:v="urn:schemas-microsoft-com:vml" xmlns:wp14="http://schemas.microsoft.com/office/word/2010/wordprocessingDrawing" xmlns:wp="http://schemas.openxmlformats.org/drawingml/2006/wordprocessingDrawing" xmlns:w10="urn:schemas-microsoft-com:office:word" xmlns:w="http://schemas.openxmlformats.org/wordprocessingml/2006/main" xmlns:w14="http://schemas.microsoft.com/office/word/2010/wordml" xmlns:w15="http://schemas.microsoft.com/office/word/2012/wordml" xmlns:w16cex="http://schemas.microsoft.com/office/word/2018/wordml/cex" xmlns:w16cid="http://schemas.microsoft.com/office/word/2016/wordml/cid" xmlns:w16="http://schemas.microsoft.com/office/word/2018/wordml" xmlns:w16du="http://schemas.microsoft.com/office/word/2023/wordml/word16du" xmlns:w16sdtdh="http://schemas.microsoft.com/office/word/2020/wordml/sdtdatahash" xmlns:w16sdtfl="http://schemas.microsoft.com/office/word/2024/wordml/sdtformatlock" xmlns:w16se="http://schemas.microsoft.com/office/word/2015/wordml/symex" xmlns:wpg="http://schemas.microsoft.com/office/word/2010/wordprocessingGroup" xmlns:wpi="http://schemas.microsoft.com/office/word/2010/wordprocessingInk" xmlns:wne="http://schemas.microsoft.com/office/word/2006/wordml" xmlns:wps="http://schemas.microsoft.com/office/word/2010/wordprocessingShape" mc:Ignorable="w14 w15 w16se w16cid w16 w16cex w16sdtdh w16sdtfl w16du wp14">
-  <w16cid:commentId w16cid:paraId="55D82BEC" w16cid:durableId="2A967E9D"/>
   <w16cid:commentId w16cid:paraId="48B58B14" w16cid:durableId="2B266083"/>
 </w16cid:commentsIds>
 </file>

</xml_diff>

<commit_message>
correction des df specimen, capture, creation de specimen_valid
</commit_message>
<xml_diff>
--- a/man/Plan de travail pour Caro_janv 2025.docx
+++ b/man/Plan de travail pour Caro_janv 2025.docx
@@ -208,14 +208,21 @@
           <w:ilvl w:val="0"/>
           <w:numId w:val="1"/>
         </w:numPr>
+        <w:rPr>
+          <w:highlight w:val="green"/>
+        </w:rPr>
       </w:pPr>
       <w:r>
+        <w:rPr>
+          <w:highlight w:val="green"/>
+        </w:rPr>
         <w:t xml:space="preserve">Actuellement, il y a </w:t>
       </w:r>
       <w:r>
         <w:rPr>
           <w:b/>
           <w:bCs/>
+          <w:highlight w:val="green"/>
         </w:rPr>
         <w:t xml:space="preserve">2 </w:t>
       </w:r>
@@ -224,6 +231,7 @@
         <w:rPr>
           <w:b/>
           <w:bCs/>
+          <w:highlight w:val="green"/>
         </w:rPr>
         <w:t>reactives</w:t>
       </w:r>
@@ -232,18 +240,28 @@
         <w:rPr>
           <w:b/>
           <w:bCs/>
+          <w:highlight w:val="green"/>
         </w:rPr>
         <w:t xml:space="preserve"> expressions</w:t>
       </w:r>
       <w:r>
+        <w:rPr>
+          <w:highlight w:val="green"/>
+        </w:rPr>
         <w:t xml:space="preserve"> sous forme de base de données (</w:t>
       </w:r>
       <w:proofErr w:type="spellStart"/>
       <w:r>
+        <w:rPr>
+          <w:highlight w:val="green"/>
+        </w:rPr>
         <w:t>dataframe</w:t>
       </w:r>
       <w:proofErr w:type="spellEnd"/>
       <w:r>
+        <w:rPr>
+          <w:highlight w:val="green"/>
+        </w:rPr>
         <w:t>) :</w:t>
       </w:r>
     </w:p>
@@ -254,20 +272,30 @@
           <w:ilvl w:val="1"/>
           <w:numId w:val="1"/>
         </w:numPr>
+        <w:rPr>
+          <w:highlight w:val="green"/>
+        </w:rPr>
       </w:pPr>
       <w:proofErr w:type="gramStart"/>
       <w:r>
         <w:rPr>
           <w:b/>
           <w:bCs/>
+          <w:highlight w:val="green"/>
         </w:rPr>
         <w:t>capture</w:t>
       </w:r>
       <w:r>
+        <w:rPr>
+          <w:highlight w:val="green"/>
+        </w:rPr>
         <w:t>(</w:t>
       </w:r>
       <w:proofErr w:type="gramEnd"/>
       <w:r>
+        <w:rPr>
+          <w:highlight w:val="green"/>
+        </w:rPr>
         <w:t xml:space="preserve">) : fusion de </w:t>
       </w:r>
       <w:proofErr w:type="spellStart"/>
@@ -275,21 +303,29 @@
         <w:rPr>
           <w:i/>
           <w:iCs/>
+          <w:highlight w:val="green"/>
         </w:rPr>
         <w:t>recolte</w:t>
       </w:r>
       <w:proofErr w:type="spellEnd"/>
       <w:r>
+        <w:rPr>
+          <w:highlight w:val="green"/>
+        </w:rPr>
         <w:t xml:space="preserve"> et </w:t>
       </w:r>
       <w:r>
         <w:rPr>
           <w:i/>
           <w:iCs/>
+          <w:highlight w:val="green"/>
         </w:rPr>
         <w:t>station</w:t>
       </w:r>
       <w:r>
+        <w:rPr>
+          <w:highlight w:val="green"/>
+        </w:rPr>
         <w:t xml:space="preserve"> </w:t>
       </w:r>
     </w:p>
@@ -300,6 +336,9 @@
           <w:ilvl w:val="1"/>
           <w:numId w:val="1"/>
         </w:numPr>
+        <w:rPr>
+          <w:highlight w:val="green"/>
+        </w:rPr>
       </w:pPr>
       <w:proofErr w:type="spellStart"/>
       <w:proofErr w:type="gramStart"/>
@@ -307,15 +346,22 @@
         <w:rPr>
           <w:b/>
           <w:bCs/>
+          <w:highlight w:val="green"/>
         </w:rPr>
         <w:t>specimen</w:t>
       </w:r>
       <w:proofErr w:type="spellEnd"/>
       <w:r>
+        <w:rPr>
+          <w:highlight w:val="green"/>
+        </w:rPr>
         <w:t>(</w:t>
       </w:r>
       <w:proofErr w:type="gramEnd"/>
       <w:r>
+        <w:rPr>
+          <w:highlight w:val="green"/>
+        </w:rPr>
         <w:t xml:space="preserve">) : fusion de </w:t>
       </w:r>
       <w:proofErr w:type="spellStart"/>
@@ -323,17 +369,22 @@
         <w:rPr>
           <w:i/>
           <w:iCs/>
+          <w:highlight w:val="green"/>
         </w:rPr>
         <w:t>specimen</w:t>
       </w:r>
       <w:proofErr w:type="spellEnd"/>
       <w:r>
+        <w:rPr>
+          <w:highlight w:val="green"/>
+        </w:rPr>
         <w:t xml:space="preserve"> et </w:t>
       </w:r>
       <w:r>
         <w:rPr>
           <w:i/>
           <w:iCs/>
+          <w:highlight w:val="green"/>
         </w:rPr>
         <w:t>station</w:t>
       </w:r>
@@ -344,9 +395,13 @@
         <w:ind w:left="720"/>
         <w:rPr>
           <w:rStyle w:val="cf01"/>
+          <w:highlight w:val="green"/>
         </w:rPr>
       </w:pPr>
       <w:r>
+        <w:rPr>
+          <w:highlight w:val="green"/>
+        </w:rPr>
         <w:t xml:space="preserve">Ces </w:t>
       </w:r>
       <w:proofErr w:type="spellStart"/>
@@ -354,6 +409,7 @@
         <w:rPr>
           <w:b/>
           <w:bCs/>
+          <w:highlight w:val="green"/>
         </w:rPr>
         <w:t>reactives</w:t>
       </w:r>
@@ -362,31 +418,32 @@
         <w:rPr>
           <w:b/>
           <w:bCs/>
+          <w:highlight w:val="green"/>
         </w:rPr>
         <w:t xml:space="preserve"> expressions</w:t>
       </w:r>
       <w:r>
-        <w:t xml:space="preserve"> sont seulement la fusion de deux BD, </w:t>
+        <w:rPr>
+          <w:highlight w:val="green"/>
+        </w:rPr>
+        <w:t xml:space="preserve"> sont seulement la fusion de deux BD, sans aucune sélection (filtre). Toutes les stations y sont (non-valides et dirigées). Nous avons clarifié les données à utiliser pour chaque indicateur, et il y aurait 3 BD requises pour faire </w:t>
       </w:r>
       <w:r>
-        <w:t xml:space="preserve">sans aucune sélection (filtre). Toutes les stations y sont (non-valides et dirigées). </w:t>
-      </w:r>
-      <w:r>
-        <w:t>Nous avons clarifié les données à utiliser pour chaque indicateur</w:t>
-      </w:r>
-      <w:r>
-        <w:t xml:space="preserve">, et il y aurait </w:t>
-      </w:r>
-      <w:r>
-        <w:t xml:space="preserve">3 BD requises pour faire </w:t>
-      </w:r>
-      <w:r>
+        <w:rPr>
+          <w:highlight w:val="green"/>
+        </w:rPr>
         <w:t xml:space="preserve">toutes les </w:t>
       </w:r>
       <w:r>
+        <w:rPr>
+          <w:highlight w:val="green"/>
+        </w:rPr>
         <w:t xml:space="preserve">analyses. Nous proposons ainsi de corriger les </w:t>
       </w:r>
       <w:r>
+        <w:rPr>
+          <w:highlight w:val="green"/>
+        </w:rPr>
         <w:t xml:space="preserve">données lors du </w:t>
       </w:r>
       <w:proofErr w:type="spellStart"/>
@@ -398,44 +455,78 @@
           <w:kern w:val="2"/>
           <w:sz w:val="20"/>
           <w:szCs w:val="20"/>
+          <w:highlight w:val="green"/>
           <w14:ligatures w14:val="standardContextual"/>
         </w:rPr>
         <w:t>load</w:t>
       </w:r>
       <w:proofErr w:type="spellEnd"/>
       <w:r>
+        <w:rPr>
+          <w:highlight w:val="green"/>
+        </w:rPr>
         <w:t>, (en amont) puis de créer 3</w:t>
       </w:r>
       <w:r>
+        <w:rPr>
+          <w:highlight w:val="green"/>
+        </w:rPr>
         <w:t xml:space="preserve"> </w:t>
       </w:r>
       <w:proofErr w:type="spellStart"/>
       <w:r>
+        <w:rPr>
+          <w:highlight w:val="green"/>
+        </w:rPr>
         <w:t>reactive</w:t>
       </w:r>
       <w:proofErr w:type="spellEnd"/>
       <w:r>
+        <w:rPr>
+          <w:highlight w:val="green"/>
+        </w:rPr>
         <w:t xml:space="preserve"> expression</w:t>
       </w:r>
       <w:r>
+        <w:rPr>
+          <w:highlight w:val="green"/>
+        </w:rPr>
         <w:t xml:space="preserve"> avec les filtres requis. Chaque analyse appellera la BD requise selon le cas</w:t>
       </w:r>
       <w:r>
+        <w:rPr>
+          <w:highlight w:val="green"/>
+        </w:rPr>
         <w:t xml:space="preserve"> plutôt que de </w:t>
       </w:r>
       <w:r>
+        <w:rPr>
+          <w:highlight w:val="green"/>
+        </w:rPr>
         <w:t>corriger et/ou d’appliquer des f</w:t>
       </w:r>
       <w:r>
+        <w:rPr>
+          <w:highlight w:val="green"/>
+        </w:rPr>
         <w:t>iltre</w:t>
       </w:r>
       <w:r>
+        <w:rPr>
+          <w:highlight w:val="green"/>
+        </w:rPr>
         <w:t>s</w:t>
       </w:r>
       <w:r>
+        <w:rPr>
+          <w:highlight w:val="green"/>
+        </w:rPr>
         <w:t xml:space="preserve"> à chaque fois. Voici donc ce qui serait requis</w:t>
       </w:r>
       <w:r>
+        <w:rPr>
+          <w:highlight w:val="green"/>
+        </w:rPr>
         <w:t> :</w:t>
       </w:r>
     </w:p>
@@ -446,61 +537,100 @@
           <w:ilvl w:val="0"/>
           <w:numId w:val="21"/>
         </w:numPr>
+        <w:rPr>
+          <w:highlight w:val="green"/>
+        </w:rPr>
       </w:pPr>
       <w:proofErr w:type="gramStart"/>
       <w:r>
         <w:rPr>
           <w:b/>
           <w:bCs/>
+          <w:highlight w:val="green"/>
         </w:rPr>
         <w:t>capture</w:t>
       </w:r>
       <w:r>
+        <w:rPr>
+          <w:highlight w:val="green"/>
+        </w:rPr>
         <w:t>(</w:t>
       </w:r>
       <w:proofErr w:type="gramEnd"/>
       <w:r>
+        <w:rPr>
+          <w:highlight w:val="green"/>
+        </w:rPr>
         <w:t xml:space="preserve">) :  fusion de </w:t>
       </w:r>
       <w:r>
         <w:rPr>
           <w:i/>
           <w:iCs/>
+          <w:highlight w:val="green"/>
         </w:rPr>
         <w:t>récolte</w:t>
       </w:r>
       <w:r>
+        <w:rPr>
+          <w:highlight w:val="green"/>
+        </w:rPr>
         <w:t xml:space="preserve"> et </w:t>
       </w:r>
       <w:r>
         <w:rPr>
           <w:i/>
           <w:iCs/>
+          <w:highlight w:val="green"/>
         </w:rPr>
         <w:t>station</w:t>
       </w:r>
       <w:r>
+        <w:rPr>
+          <w:highlight w:val="green"/>
+        </w:rPr>
         <w:t>, mais il faudrait</w:t>
       </w:r>
       <w:r>
+        <w:rPr>
+          <w:highlight w:val="green"/>
+        </w:rPr>
         <w:t xml:space="preserve"> ajouter un filtre pour n’avoir que les</w:t>
       </w:r>
       <w:r>
+        <w:rPr>
+          <w:highlight w:val="green"/>
+        </w:rPr>
         <w:t xml:space="preserve"> stations valides et au hasard seulement</w:t>
       </w:r>
       <w:r>
+        <w:rPr>
+          <w:highlight w:val="green"/>
+        </w:rPr>
         <w:t xml:space="preserve">. S’assurer d’avoir toutes les stations en ajoutant récolte = 0 </w:t>
       </w:r>
       <w:r>
+        <w:rPr>
+          <w:highlight w:val="green"/>
+        </w:rPr>
         <w:t xml:space="preserve">aux stations </w:t>
       </w:r>
       <w:r>
+        <w:rPr>
+          <w:highlight w:val="green"/>
+        </w:rPr>
         <w:t xml:space="preserve">(valide et au hasard) </w:t>
       </w:r>
       <w:r>
+        <w:rPr>
+          <w:highlight w:val="green"/>
+        </w:rPr>
         <w:t>sans récolte</w:t>
       </w:r>
       <w:r>
+        <w:rPr>
+          <w:highlight w:val="green"/>
+        </w:rPr>
         <w:t>.</w:t>
       </w:r>
     </w:p>
@@ -511,6 +641,9 @@
           <w:ilvl w:val="0"/>
           <w:numId w:val="21"/>
         </w:numPr>
+        <w:rPr>
+          <w:highlight w:val="green"/>
+        </w:rPr>
       </w:pPr>
       <w:proofErr w:type="spellStart"/>
       <w:proofErr w:type="gramStart"/>
@@ -518,15 +651,22 @@
         <w:rPr>
           <w:b/>
           <w:bCs/>
+          <w:highlight w:val="green"/>
         </w:rPr>
         <w:t>specimen</w:t>
       </w:r>
       <w:proofErr w:type="spellEnd"/>
       <w:r>
+        <w:rPr>
+          <w:highlight w:val="green"/>
+        </w:rPr>
         <w:t>(</w:t>
       </w:r>
       <w:proofErr w:type="gramEnd"/>
       <w:r>
+        <w:rPr>
+          <w:highlight w:val="green"/>
+        </w:rPr>
         <w:t xml:space="preserve">) : fusion de </w:t>
       </w:r>
       <w:proofErr w:type="spellStart"/>
@@ -534,35 +674,30 @@
         <w:rPr>
           <w:i/>
           <w:iCs/>
+          <w:highlight w:val="green"/>
         </w:rPr>
         <w:t>specimen</w:t>
       </w:r>
       <w:proofErr w:type="spellEnd"/>
       <w:r>
+        <w:rPr>
+          <w:highlight w:val="green"/>
+        </w:rPr>
         <w:t xml:space="preserve"> et </w:t>
       </w:r>
       <w:r>
         <w:rPr>
           <w:i/>
           <w:iCs/>
+          <w:highlight w:val="green"/>
         </w:rPr>
-        <w:t>statio</w:t>
+        <w:t xml:space="preserve">station, </w:t>
       </w:r>
       <w:r>
         <w:rPr>
-          <w:i/>
-          <w:iCs/>
+          <w:highlight w:val="green"/>
         </w:rPr>
-        <w:t xml:space="preserve">n, </w:t>
-      </w:r>
-      <w:r>
-        <w:t>mais il faudrait ajouter un filtre pour n’avoir que les spécimens des</w:t>
-      </w:r>
-      <w:r>
-        <w:t xml:space="preserve"> stations valides et au hasard seulement</w:t>
-      </w:r>
-      <w:r>
-        <w:t>.</w:t>
+        <w:t>mais il faudrait ajouter un filtre pour n’avoir que les spécimens des stations valides et au hasard seulement.</w:t>
       </w:r>
     </w:p>
     <w:p>
@@ -572,20 +707,38 @@
           <w:ilvl w:val="0"/>
           <w:numId w:val="21"/>
         </w:numPr>
+        <w:rPr>
+          <w:highlight w:val="green"/>
+        </w:rPr>
       </w:pPr>
       <w:r>
+        <w:rPr>
+          <w:highlight w:val="green"/>
+        </w:rPr>
         <w:t xml:space="preserve">Les spécimens des stations valides (conserver les spécimens des stations hasard + dirigées). Cette table ne semble pas présente et elle devrait </w:t>
       </w:r>
       <w:r>
+        <w:rPr>
+          <w:highlight w:val="green"/>
+        </w:rPr>
         <w:t xml:space="preserve">aussi </w:t>
       </w:r>
       <w:r>
+        <w:rPr>
+          <w:highlight w:val="green"/>
+        </w:rPr>
         <w:t xml:space="preserve">être créé comme </w:t>
       </w:r>
       <w:r>
+        <w:rPr>
+          <w:highlight w:val="green"/>
+        </w:rPr>
         <w:t>une</w:t>
       </w:r>
       <w:r>
+        <w:rPr>
+          <w:highlight w:val="green"/>
+        </w:rPr>
         <w:t xml:space="preserve"> </w:t>
       </w:r>
       <w:proofErr w:type="spellStart"/>
@@ -593,6 +746,7 @@
         <w:rPr>
           <w:i/>
           <w:iCs/>
+          <w:highlight w:val="green"/>
         </w:rPr>
         <w:t>reactive</w:t>
       </w:r>
@@ -601,10 +755,14 @@
         <w:rPr>
           <w:i/>
           <w:iCs/>
+          <w:highlight w:val="green"/>
         </w:rPr>
         <w:t xml:space="preserve"> expression</w:t>
       </w:r>
       <w:r>
+        <w:rPr>
+          <w:highlight w:val="green"/>
+        </w:rPr>
         <w:t xml:space="preserve">, car elle est utilisée pour plusieurs indicateurs. Je vais l’appeler </w:t>
       </w:r>
       <w:proofErr w:type="spellStart"/>
@@ -612,6 +770,7 @@
         <w:rPr>
           <w:b/>
           <w:bCs/>
+          <w:highlight w:val="green"/>
         </w:rPr>
         <w:t>specimen_</w:t>
       </w:r>
@@ -620,21 +779,34 @@
         <w:rPr>
           <w:b/>
           <w:bCs/>
+          <w:highlight w:val="green"/>
         </w:rPr>
         <w:t>valid</w:t>
       </w:r>
       <w:proofErr w:type="spellEnd"/>
       <w:r>
+        <w:rPr>
+          <w:highlight w:val="green"/>
+        </w:rPr>
         <w:t>(</w:t>
       </w:r>
       <w:proofErr w:type="gramEnd"/>
       <w:r>
+        <w:rPr>
+          <w:highlight w:val="green"/>
+        </w:rPr>
         <w:t xml:space="preserve">) pour </w:t>
       </w:r>
       <w:r>
+        <w:rPr>
+          <w:highlight w:val="green"/>
+        </w:rPr>
         <w:t xml:space="preserve">la suite dans le </w:t>
       </w:r>
       <w:r>
+        <w:rPr>
+          <w:highlight w:val="green"/>
+        </w:rPr>
         <w:t>présent document.</w:t>
       </w:r>
     </w:p>
@@ -741,6 +913,7 @@
               <w:rPr>
                 <w:sz w:val="20"/>
                 <w:szCs w:val="20"/>
+                <w:highlight w:val="green"/>
                 <w:lang w:val="en-CA"/>
               </w:rPr>
             </w:pPr>
@@ -749,34 +922,20 @@
               <w:rPr>
                 <w:sz w:val="20"/>
                 <w:szCs w:val="20"/>
+                <w:highlight w:val="green"/>
                 <w:lang w:val="en-CA"/>
               </w:rPr>
-              <w:t>create</w:t>
-            </w:r>
-            <w:r>
-              <w:rPr>
-                <w:sz w:val="20"/>
-                <w:szCs w:val="20"/>
+              <w:t>create_</w:t>
+            </w:r>
+            <w:proofErr w:type="gramStart"/>
+            <w:r>
+              <w:rPr>
+                <w:sz w:val="20"/>
+                <w:szCs w:val="20"/>
+                <w:highlight w:val="green"/>
                 <w:lang w:val="en-CA"/>
               </w:rPr>
-              <w:t>_</w:t>
-            </w:r>
-            <w:proofErr w:type="gramStart"/>
-            <w:r>
-              <w:rPr>
-                <w:sz w:val="20"/>
-                <w:szCs w:val="20"/>
-                <w:lang w:val="en-CA"/>
-              </w:rPr>
-              <w:t>capture</w:t>
-            </w:r>
-            <w:r>
-              <w:rPr>
-                <w:sz w:val="20"/>
-                <w:szCs w:val="20"/>
-                <w:lang w:val="en-CA"/>
-              </w:rPr>
-              <w:t>.R</w:t>
+              <w:t>capture.R</w:t>
             </w:r>
             <w:proofErr w:type="spellEnd"/>
             <w:proofErr w:type="gramEnd"/>
@@ -788,6 +947,7 @@
               <w:rPr>
                 <w:sz w:val="20"/>
                 <w:szCs w:val="20"/>
+                <w:highlight w:val="green"/>
                 <w:lang w:val="en-CA"/>
               </w:rPr>
             </w:pPr>
@@ -796,34 +956,20 @@
               <w:rPr>
                 <w:sz w:val="20"/>
                 <w:szCs w:val="20"/>
+                <w:highlight w:val="green"/>
                 <w:lang w:val="en-CA"/>
               </w:rPr>
-              <w:t>create</w:t>
-            </w:r>
-            <w:r>
-              <w:rPr>
-                <w:sz w:val="20"/>
-                <w:szCs w:val="20"/>
+              <w:t>create_</w:t>
+            </w:r>
+            <w:proofErr w:type="gramStart"/>
+            <w:r>
+              <w:rPr>
+                <w:sz w:val="20"/>
+                <w:szCs w:val="20"/>
+                <w:highlight w:val="green"/>
                 <w:lang w:val="en-CA"/>
               </w:rPr>
-              <w:t>_</w:t>
-            </w:r>
-            <w:proofErr w:type="gramStart"/>
-            <w:r>
-              <w:rPr>
-                <w:sz w:val="20"/>
-                <w:szCs w:val="20"/>
-                <w:lang w:val="en-CA"/>
-              </w:rPr>
-              <w:t>specimens</w:t>
-            </w:r>
-            <w:r>
-              <w:rPr>
-                <w:sz w:val="20"/>
-                <w:szCs w:val="20"/>
-                <w:lang w:val="en-CA"/>
-              </w:rPr>
-              <w:t>.R</w:t>
+              <w:t>specimens.R</w:t>
             </w:r>
             <w:proofErr w:type="spellEnd"/>
             <w:proofErr w:type="gramEnd"/>
@@ -844,27 +990,23 @@
               <w:rPr>
                 <w:sz w:val="20"/>
                 <w:szCs w:val="20"/>
-              </w:rPr>
-            </w:pPr>
-            <w:r>
-              <w:rPr>
-                <w:sz w:val="20"/>
-                <w:szCs w:val="20"/>
-              </w:rPr>
-              <w:t xml:space="preserve">Enlever le </w:t>
-            </w:r>
-            <w:r>
-              <w:rPr>
-                <w:sz w:val="20"/>
-                <w:szCs w:val="20"/>
-              </w:rPr>
-              <w:t>"</w:t>
-            </w:r>
-            <w:proofErr w:type="spellStart"/>
-            <w:r>
-              <w:rPr>
-                <w:sz w:val="20"/>
-                <w:szCs w:val="20"/>
+                <w:highlight w:val="green"/>
+              </w:rPr>
+            </w:pPr>
+            <w:r>
+              <w:rPr>
+                <w:sz w:val="20"/>
+                <w:szCs w:val="20"/>
+                <w:highlight w:val="green"/>
+              </w:rPr>
+              <w:t>Enlever le "</w:t>
+            </w:r>
+            <w:proofErr w:type="spellStart"/>
+            <w:r>
+              <w:rPr>
+                <w:sz w:val="20"/>
+                <w:szCs w:val="20"/>
+                <w:highlight w:val="green"/>
               </w:rPr>
               <w:t>nom_lac</w:t>
             </w:r>
@@ -873,21 +1015,16 @@
               <w:rPr>
                 <w:sz w:val="20"/>
                 <w:szCs w:val="20"/>
-              </w:rPr>
-              <w:t>" dans le « by »</w:t>
-            </w:r>
-            <w:r>
-              <w:rPr>
-                <w:sz w:val="20"/>
-                <w:szCs w:val="20"/>
-              </w:rPr>
-              <w:t xml:space="preserve">. Ça permet d’alléger, et il y a des risques d’erreur avec </w:t>
-            </w:r>
-            <w:proofErr w:type="spellStart"/>
-            <w:r>
-              <w:rPr>
-                <w:sz w:val="20"/>
-                <w:szCs w:val="20"/>
+                <w:highlight w:val="green"/>
+              </w:rPr>
+              <w:t xml:space="preserve">" dans le « by ». Ça permet d’alléger, et il y a des risques d’erreur avec </w:t>
+            </w:r>
+            <w:proofErr w:type="spellStart"/>
+            <w:r>
+              <w:rPr>
+                <w:sz w:val="20"/>
+                <w:szCs w:val="20"/>
+                <w:highlight w:val="green"/>
               </w:rPr>
               <w:t>nom_lac</w:t>
             </w:r>
@@ -896,6 +1033,7 @@
               <w:rPr>
                 <w:sz w:val="20"/>
                 <w:szCs w:val="20"/>
+                <w:highlight w:val="green"/>
               </w:rPr>
               <w:t xml:space="preserve">. C’est pourquoi on se fie davantage au </w:t>
             </w:r>
@@ -904,6 +1042,7 @@
               <w:rPr>
                 <w:sz w:val="20"/>
                 <w:szCs w:val="20"/>
+                <w:highlight w:val="green"/>
               </w:rPr>
               <w:t>nolac</w:t>
             </w:r>
@@ -912,36 +1051,33 @@
               <w:rPr>
                 <w:sz w:val="20"/>
                 <w:szCs w:val="20"/>
-              </w:rPr>
-              <w:t xml:space="preserve"> </w:t>
-            </w:r>
-            <w:r>
-              <w:rPr>
-                <w:sz w:val="20"/>
-                <w:szCs w:val="20"/>
-              </w:rPr>
-              <w:t>comme clé.</w:t>
-            </w:r>
-          </w:p>
-          <w:p>
-            <w:pPr>
-              <w:rPr>
-                <w:sz w:val="20"/>
-                <w:szCs w:val="20"/>
-              </w:rPr>
-            </w:pPr>
-          </w:p>
-          <w:p>
-            <w:pPr>
-              <w:rPr>
-                <w:sz w:val="20"/>
-                <w:szCs w:val="20"/>
-              </w:rPr>
-            </w:pPr>
-            <w:r>
-              <w:rPr>
-                <w:sz w:val="20"/>
-                <w:szCs w:val="20"/>
+                <w:highlight w:val="green"/>
+              </w:rPr>
+              <w:t xml:space="preserve"> comme clé.</w:t>
+            </w:r>
+          </w:p>
+          <w:p>
+            <w:pPr>
+              <w:rPr>
+                <w:sz w:val="20"/>
+                <w:szCs w:val="20"/>
+                <w:highlight w:val="green"/>
+              </w:rPr>
+            </w:pPr>
+          </w:p>
+          <w:p>
+            <w:pPr>
+              <w:rPr>
+                <w:sz w:val="20"/>
+                <w:szCs w:val="20"/>
+                <w:highlight w:val="green"/>
+              </w:rPr>
+            </w:pPr>
+            <w:r>
+              <w:rPr>
+                <w:sz w:val="20"/>
+                <w:szCs w:val="20"/>
+                <w:highlight w:val="green"/>
               </w:rPr>
               <w:t xml:space="preserve">Dans </w:t>
             </w:r>
@@ -953,6 +1089,7 @@
                 <w:color w:val="0070C0"/>
                 <w:sz w:val="20"/>
                 <w:szCs w:val="20"/>
+                <w:highlight w:val="green"/>
               </w:rPr>
               <w:t>create_specimen</w:t>
             </w:r>
@@ -961,6 +1098,7 @@
               <w:rPr>
                 <w:sz w:val="20"/>
                 <w:szCs w:val="20"/>
+                <w:highlight w:val="green"/>
               </w:rPr>
               <w:t xml:space="preserve">, enlever le remplacement de NA dans </w:t>
             </w:r>
@@ -969,6 +1107,7 @@
               <w:rPr>
                 <w:sz w:val="20"/>
                 <w:szCs w:val="20"/>
+                <w:highlight w:val="green"/>
               </w:rPr>
               <w:t>sex</w:t>
             </w:r>
@@ -977,6 +1116,7 @@
               <w:rPr>
                 <w:sz w:val="20"/>
                 <w:szCs w:val="20"/>
+                <w:highlight w:val="green"/>
               </w:rPr>
               <w:t xml:space="preserve"> et maturité (lignes 3 à 16). Cette correction doit être apportée dans </w:t>
             </w:r>
@@ -988,6 +1128,7 @@
                 <w:color w:val="0070C0"/>
                 <w:sz w:val="20"/>
                 <w:szCs w:val="20"/>
+                <w:highlight w:val="green"/>
               </w:rPr>
               <w:t>load_</w:t>
             </w:r>
@@ -999,6 +1140,7 @@
                 <w:color w:val="0070C0"/>
                 <w:sz w:val="20"/>
                 <w:szCs w:val="20"/>
+                <w:highlight w:val="green"/>
               </w:rPr>
               <w:t>specimen.R</w:t>
             </w:r>
@@ -1008,6 +1150,7 @@
               <w:rPr>
                 <w:sz w:val="20"/>
                 <w:szCs w:val="20"/>
+                <w:highlight w:val="green"/>
               </w:rPr>
               <w:t xml:space="preserve"> (je l’ai inscrit dans les tableaux ci-dessous).</w:t>
             </w:r>
@@ -1015,6 +1158,7 @@
               <w:rPr>
                 <w:sz w:val="20"/>
                 <w:szCs w:val="20"/>
+                <w:highlight w:val="green"/>
               </w:rPr>
               <w:t xml:space="preserve"> </w:t>
             </w:r>
@@ -3655,13 +3799,15 @@
               <w:rPr>
                 <w:sz w:val="20"/>
                 <w:szCs w:val="20"/>
-              </w:rPr>
-            </w:pPr>
-            <w:proofErr w:type="spellStart"/>
-            <w:r>
-              <w:rPr>
-                <w:sz w:val="20"/>
-                <w:szCs w:val="20"/>
+                <w:highlight w:val="green"/>
+              </w:rPr>
+            </w:pPr>
+            <w:proofErr w:type="spellStart"/>
+            <w:r>
+              <w:rPr>
+                <w:sz w:val="20"/>
+                <w:szCs w:val="20"/>
+                <w:highlight w:val="green"/>
                 <w:lang w:val="en-CA"/>
               </w:rPr>
               <w:t>load_</w:t>
@@ -3671,25 +3817,10 @@
               <w:rPr>
                 <w:sz w:val="20"/>
                 <w:szCs w:val="20"/>
+                <w:highlight w:val="green"/>
                 <w:lang w:val="en-CA"/>
               </w:rPr>
-              <w:t>s</w:t>
-            </w:r>
-            <w:r>
-              <w:rPr>
-                <w:sz w:val="20"/>
-                <w:szCs w:val="20"/>
-                <w:lang w:val="en-CA"/>
-              </w:rPr>
-              <w:t>pecimen</w:t>
-            </w:r>
-            <w:r>
-              <w:rPr>
-                <w:sz w:val="20"/>
-                <w:szCs w:val="20"/>
-                <w:lang w:val="en-CA"/>
-              </w:rPr>
-              <w:t>.R</w:t>
+              <w:t>specimen.R</w:t>
             </w:r>
             <w:proofErr w:type="spellEnd"/>
             <w:proofErr w:type="gramEnd"/>
@@ -3711,13 +3842,15 @@
                 <w:rFonts w:cstheme="minorHAnsi"/>
                 <w:sz w:val="20"/>
                 <w:szCs w:val="20"/>
-              </w:rPr>
-            </w:pPr>
-            <w:r>
-              <w:rPr>
-                <w:rFonts w:cstheme="minorHAnsi"/>
-                <w:sz w:val="20"/>
-                <w:szCs w:val="20"/>
+                <w:highlight w:val="green"/>
+              </w:rPr>
+            </w:pPr>
+            <w:r>
+              <w:rPr>
+                <w:rFonts w:cstheme="minorHAnsi"/>
+                <w:sz w:val="20"/>
+                <w:szCs w:val="20"/>
+                <w:highlight w:val="green"/>
               </w:rPr>
               <w:t xml:space="preserve">Dans la visualisation au bas de la page de téléchargement, mettre les spécimens en ordre croissant de </w:t>
             </w:r>
@@ -3727,6 +3860,7 @@
                 <w:rFonts w:cstheme="minorHAnsi"/>
                 <w:sz w:val="20"/>
                 <w:szCs w:val="20"/>
+                <w:highlight w:val="green"/>
               </w:rPr>
               <w:t>no_specimen</w:t>
             </w:r>
@@ -3736,6 +3870,7 @@
                 <w:rFonts w:cstheme="minorHAnsi"/>
                 <w:sz w:val="20"/>
                 <w:szCs w:val="20"/>
+                <w:highlight w:val="green"/>
               </w:rPr>
               <w:t>.</w:t>
             </w:r>
@@ -3746,23 +3881,25 @@
                 <w:rFonts w:cstheme="minorHAnsi"/>
                 <w:sz w:val="20"/>
                 <w:szCs w:val="20"/>
-              </w:rPr>
-            </w:pPr>
-          </w:p>
-          <w:p>
-            <w:pPr>
-              <w:rPr>
-                <w:rFonts w:cstheme="minorHAnsi"/>
-                <w:sz w:val="20"/>
-                <w:szCs w:val="20"/>
-              </w:rPr>
-            </w:pPr>
-            <w:commentRangeStart w:id="1"/>
-            <w:r>
-              <w:rPr>
-                <w:rFonts w:cstheme="minorHAnsi"/>
-                <w:sz w:val="20"/>
-                <w:szCs w:val="20"/>
+                <w:highlight w:val="green"/>
+              </w:rPr>
+            </w:pPr>
+          </w:p>
+          <w:p>
+            <w:pPr>
+              <w:rPr>
+                <w:rFonts w:cstheme="minorHAnsi"/>
+                <w:sz w:val="20"/>
+                <w:szCs w:val="20"/>
+                <w:highlight w:val="green"/>
+              </w:rPr>
+            </w:pPr>
+            <w:r>
+              <w:rPr>
+                <w:rFonts w:cstheme="minorHAnsi"/>
+                <w:sz w:val="20"/>
+                <w:szCs w:val="20"/>
+                <w:highlight w:val="green"/>
               </w:rPr>
               <w:t>Les étapes</w:t>
             </w:r>
@@ -3779,13 +3916,15 @@
                 <w:rFonts w:cstheme="minorHAnsi"/>
                 <w:sz w:val="20"/>
                 <w:szCs w:val="20"/>
-              </w:rPr>
-            </w:pPr>
-            <w:r>
-              <w:rPr>
-                <w:rFonts w:cstheme="minorHAnsi"/>
-                <w:sz w:val="20"/>
-                <w:szCs w:val="20"/>
+                <w:highlight w:val="green"/>
+              </w:rPr>
+            </w:pPr>
+            <w:r>
+              <w:rPr>
+                <w:rFonts w:cstheme="minorHAnsi"/>
+                <w:sz w:val="20"/>
+                <w:szCs w:val="20"/>
+                <w:highlight w:val="green"/>
               </w:rPr>
               <w:t xml:space="preserve">Remplacer les NA par IND dans </w:t>
             </w:r>
@@ -3795,6 +3934,7 @@
                 <w:rFonts w:cstheme="minorHAnsi"/>
                 <w:sz w:val="20"/>
                 <w:szCs w:val="20"/>
+                <w:highlight w:val="green"/>
               </w:rPr>
               <w:t>sex</w:t>
             </w:r>
@@ -3804,6 +3944,7 @@
                 <w:rFonts w:cstheme="minorHAnsi"/>
                 <w:sz w:val="20"/>
                 <w:szCs w:val="20"/>
+                <w:highlight w:val="green"/>
               </w:rPr>
               <w:t xml:space="preserve"> et maturité</w:t>
             </w:r>
@@ -3820,13 +3961,15 @@
                 <w:rFonts w:cstheme="minorHAnsi"/>
                 <w:sz w:val="20"/>
                 <w:szCs w:val="20"/>
-              </w:rPr>
-            </w:pPr>
-            <w:r>
-              <w:rPr>
-                <w:rFonts w:cstheme="minorHAnsi"/>
-                <w:sz w:val="20"/>
-                <w:szCs w:val="20"/>
+                <w:highlight w:val="green"/>
+              </w:rPr>
+            </w:pPr>
+            <w:r>
+              <w:rPr>
+                <w:rFonts w:cstheme="minorHAnsi"/>
+                <w:sz w:val="20"/>
+                <w:szCs w:val="20"/>
+                <w:highlight w:val="green"/>
               </w:rPr>
               <w:t>Convertir en facteur</w:t>
             </w:r>
@@ -3835,30 +3978,26 @@
                 <w:rFonts w:cstheme="minorHAnsi"/>
                 <w:sz w:val="20"/>
                 <w:szCs w:val="20"/>
+                <w:highlight w:val="green"/>
               </w:rPr>
               <w:t xml:space="preserve"> </w:t>
             </w:r>
-            <w:commentRangeEnd w:id="1"/>
-            <w:r>
-              <w:rPr>
-                <w:rStyle w:val="Marquedecommentaire"/>
-              </w:rPr>
-              <w:commentReference w:id="1"/>
-            </w:r>
-          </w:p>
-          <w:p>
-            <w:pPr>
-              <w:rPr>
-                <w:rFonts w:cstheme="minorHAnsi"/>
-                <w:sz w:val="20"/>
-                <w:szCs w:val="20"/>
-              </w:rPr>
-            </w:pPr>
-            <w:r>
-              <w:rPr>
-                <w:rFonts w:cstheme="minorHAnsi"/>
-                <w:sz w:val="20"/>
-                <w:szCs w:val="20"/>
+          </w:p>
+          <w:p>
+            <w:pPr>
+              <w:rPr>
+                <w:rFonts w:cstheme="minorHAnsi"/>
+                <w:sz w:val="20"/>
+                <w:szCs w:val="20"/>
+                <w:highlight w:val="green"/>
+              </w:rPr>
+            </w:pPr>
+            <w:r>
+              <w:rPr>
+                <w:rFonts w:cstheme="minorHAnsi"/>
+                <w:sz w:val="20"/>
+                <w:szCs w:val="20"/>
+                <w:highlight w:val="green"/>
               </w:rPr>
               <w:t xml:space="preserve">Devrait être faites dans </w:t>
             </w:r>
@@ -3870,6 +4009,7 @@
                 <w:color w:val="0070C0"/>
                 <w:sz w:val="20"/>
                 <w:szCs w:val="20"/>
+                <w:highlight w:val="green"/>
               </w:rPr>
               <w:t>load_</w:t>
             </w:r>
@@ -3881,6 +4021,7 @@
                 <w:color w:val="0070C0"/>
                 <w:sz w:val="20"/>
                 <w:szCs w:val="20"/>
+                <w:highlight w:val="green"/>
               </w:rPr>
               <w:t>specimen.R</w:t>
             </w:r>
@@ -3891,6 +4032,7 @@
                 <w:rFonts w:cstheme="minorHAnsi"/>
                 <w:sz w:val="20"/>
                 <w:szCs w:val="20"/>
+                <w:highlight w:val="green"/>
               </w:rPr>
               <w:t xml:space="preserve"> plutôt que dans </w:t>
             </w:r>
@@ -3902,6 +4044,7 @@
                 <w:color w:val="0070C0"/>
                 <w:sz w:val="20"/>
                 <w:szCs w:val="20"/>
+                <w:highlight w:val="green"/>
               </w:rPr>
               <w:t>create_specimen.R</w:t>
             </w:r>
@@ -3911,6 +4054,7 @@
                 <w:rFonts w:cstheme="minorHAnsi"/>
                 <w:sz w:val="20"/>
                 <w:szCs w:val="20"/>
+                <w:highlight w:val="green"/>
               </w:rPr>
               <w:t xml:space="preserve"> tel que c’est le cas actuellement (lignes 3 à 16). </w:t>
             </w:r>
@@ -3919,6 +4063,7 @@
                 <w:rFonts w:cstheme="minorHAnsi"/>
                 <w:sz w:val="20"/>
                 <w:szCs w:val="20"/>
+                <w:highlight w:val="green"/>
               </w:rPr>
               <w:t>Car il y a des situations où on utilise tous les spécimens, donc il est préférable de faire ces corrections en amont de la fusion avec stations.</w:t>
             </w:r>
@@ -3943,6 +4088,7 @@
               <w:rPr>
                 <w:sz w:val="20"/>
                 <w:szCs w:val="20"/>
+                <w:highlight w:val="green"/>
                 <w:lang w:val="en-CA"/>
               </w:rPr>
             </w:pPr>
@@ -3951,6 +4097,7 @@
               <w:rPr>
                 <w:sz w:val="20"/>
                 <w:szCs w:val="20"/>
+                <w:highlight w:val="green"/>
                 <w:lang w:val="en-CA"/>
               </w:rPr>
               <w:t>load_</w:t>
@@ -3960,6 +4107,7 @@
               <w:rPr>
                 <w:sz w:val="20"/>
                 <w:szCs w:val="20"/>
+                <w:highlight w:val="green"/>
                 <w:lang w:val="en-CA"/>
               </w:rPr>
               <w:t>station.R</w:t>
@@ -3986,13 +4134,15 @@
                 <w:rFonts w:cstheme="minorHAnsi"/>
                 <w:sz w:val="20"/>
                 <w:szCs w:val="20"/>
-              </w:rPr>
-            </w:pPr>
-            <w:r>
-              <w:rPr>
-                <w:rFonts w:cstheme="minorHAnsi"/>
-                <w:sz w:val="20"/>
-                <w:szCs w:val="20"/>
+                <w:highlight w:val="green"/>
+              </w:rPr>
+            </w:pPr>
+            <w:r>
+              <w:rPr>
+                <w:rFonts w:cstheme="minorHAnsi"/>
+                <w:sz w:val="20"/>
+                <w:szCs w:val="20"/>
+                <w:highlight w:val="green"/>
               </w:rPr>
               <w:t xml:space="preserve">Pour les corrections de </w:t>
             </w:r>
@@ -4002,6 +4152,7 @@
                 <w:rFonts w:cstheme="minorHAnsi"/>
                 <w:sz w:val="20"/>
                 <w:szCs w:val="20"/>
+                <w:highlight w:val="green"/>
               </w:rPr>
               <w:t>st_valide</w:t>
             </w:r>
@@ -4011,6 +4162,7 @@
                 <w:rFonts w:cstheme="minorHAnsi"/>
                 <w:sz w:val="20"/>
                 <w:szCs w:val="20"/>
+                <w:highlight w:val="green"/>
               </w:rPr>
               <w:t xml:space="preserve"> et </w:t>
             </w:r>
@@ -4020,6 +4172,7 @@
                 <w:rFonts w:cstheme="minorHAnsi"/>
                 <w:sz w:val="20"/>
                 <w:szCs w:val="20"/>
+                <w:highlight w:val="green"/>
               </w:rPr>
               <w:t>st_hasard</w:t>
             </w:r>
@@ -4029,6 +4182,7 @@
                 <w:rFonts w:cstheme="minorHAnsi"/>
                 <w:sz w:val="20"/>
                 <w:szCs w:val="20"/>
+                <w:highlight w:val="green"/>
               </w:rPr>
               <w:t> :</w:t>
             </w:r>
@@ -4039,13 +4193,15 @@
                 <w:rFonts w:cstheme="minorHAnsi"/>
                 <w:sz w:val="20"/>
                 <w:szCs w:val="20"/>
-              </w:rPr>
-            </w:pPr>
-            <w:r>
-              <w:rPr>
-                <w:rFonts w:cstheme="minorHAnsi"/>
-                <w:sz w:val="20"/>
-                <w:szCs w:val="20"/>
+                <w:highlight w:val="green"/>
+              </w:rPr>
+            </w:pPr>
+            <w:r>
+              <w:rPr>
+                <w:rFonts w:cstheme="minorHAnsi"/>
+                <w:sz w:val="20"/>
+                <w:szCs w:val="20"/>
+                <w:highlight w:val="green"/>
               </w:rPr>
               <w:t>En plus de</w:t>
             </w:r>
@@ -4054,6 +4210,7 @@
                 <w:rFonts w:cstheme="minorHAnsi"/>
                 <w:sz w:val="20"/>
                 <w:szCs w:val="20"/>
+                <w:highlight w:val="green"/>
               </w:rPr>
               <w:t xml:space="preserve"> remplacer les </w:t>
             </w:r>
@@ -4062,6 +4219,7 @@
                 <w:rFonts w:cstheme="minorHAnsi"/>
                 <w:sz w:val="20"/>
                 <w:szCs w:val="20"/>
+                <w:highlight w:val="green"/>
               </w:rPr>
               <w:t>NA</w:t>
             </w:r>
@@ -4070,6 +4228,7 @@
                 <w:rFonts w:cstheme="minorHAnsi"/>
                 <w:sz w:val="20"/>
                 <w:szCs w:val="20"/>
+                <w:highlight w:val="green"/>
               </w:rPr>
               <w:t xml:space="preserve"> par « O »</w:t>
             </w:r>
@@ -4078,24 +4237,9 @@
                 <w:rFonts w:cstheme="minorHAnsi"/>
                 <w:sz w:val="20"/>
                 <w:szCs w:val="20"/>
-              </w:rPr>
-              <w:t>, i</w:t>
-            </w:r>
-            <w:r>
-              <w:rPr>
-                <w:rFonts w:cstheme="minorHAnsi"/>
-                <w:sz w:val="20"/>
-                <w:szCs w:val="20"/>
-              </w:rPr>
-              <w:t>l faut aussi remplacer les “IND” et “-“ p</w:t>
-            </w:r>
-            <w:r>
-              <w:rPr>
-                <w:rFonts w:cstheme="minorHAnsi"/>
-                <w:sz w:val="20"/>
-                <w:szCs w:val="20"/>
-              </w:rPr>
-              <w:t>ar « O »</w:t>
+                <w:highlight w:val="green"/>
+              </w:rPr>
+              <w:t>, il faut aussi remplacer les “IND” et “-“ par « O »</w:t>
             </w:r>
           </w:p>
         </w:tc>
@@ -4118,6 +4262,7 @@
               <w:rPr>
                 <w:sz w:val="20"/>
                 <w:szCs w:val="20"/>
+                <w:highlight w:val="yellow"/>
                 <w:lang w:val="en-CA"/>
               </w:rPr>
             </w:pPr>
@@ -4126,6 +4271,7 @@
               <w:rPr>
                 <w:sz w:val="20"/>
                 <w:szCs w:val="20"/>
+                <w:highlight w:val="yellow"/>
                 <w:lang w:val="en-CA"/>
               </w:rPr>
               <w:t>load_</w:t>
@@ -4135,6 +4281,7 @@
               <w:rPr>
                 <w:sz w:val="20"/>
                 <w:szCs w:val="20"/>
+                <w:highlight w:val="yellow"/>
                 <w:lang w:val="en-CA"/>
               </w:rPr>
               <w:t>lac.R</w:t>
@@ -4149,6 +4296,7 @@
               <w:rPr>
                 <w:sz w:val="20"/>
                 <w:szCs w:val="20"/>
+                <w:highlight w:val="yellow"/>
                 <w:lang w:val="en-CA"/>
               </w:rPr>
             </w:pPr>
@@ -4157,6 +4305,7 @@
               <w:rPr>
                 <w:sz w:val="20"/>
                 <w:szCs w:val="20"/>
+                <w:highlight w:val="yellow"/>
                 <w:lang w:val="en-CA"/>
               </w:rPr>
               <w:t>load_</w:t>
@@ -4166,6 +4315,7 @@
               <w:rPr>
                 <w:sz w:val="20"/>
                 <w:szCs w:val="20"/>
+                <w:highlight w:val="yellow"/>
                 <w:lang w:val="en-CA"/>
               </w:rPr>
               <w:t>station.R</w:t>
@@ -4180,6 +4330,7 @@
               <w:rPr>
                 <w:sz w:val="20"/>
                 <w:szCs w:val="20"/>
+                <w:highlight w:val="yellow"/>
                 <w:lang w:val="en-CA"/>
               </w:rPr>
             </w:pPr>
@@ -4188,6 +4339,7 @@
               <w:rPr>
                 <w:sz w:val="20"/>
                 <w:szCs w:val="20"/>
+                <w:highlight w:val="yellow"/>
                 <w:lang w:val="en-CA"/>
               </w:rPr>
               <w:t>load_</w:t>
@@ -4197,6 +4349,7 @@
               <w:rPr>
                 <w:sz w:val="20"/>
                 <w:szCs w:val="20"/>
+                <w:highlight w:val="yellow"/>
                 <w:lang w:val="en-CA"/>
               </w:rPr>
               <w:t>recolte.R</w:t>
@@ -4211,6 +4364,7 @@
               <w:rPr>
                 <w:sz w:val="20"/>
                 <w:szCs w:val="20"/>
+                <w:highlight w:val="yellow"/>
                 <w:lang w:val="en-CA"/>
               </w:rPr>
             </w:pPr>
@@ -4219,6 +4373,7 @@
               <w:rPr>
                 <w:sz w:val="20"/>
                 <w:szCs w:val="20"/>
+                <w:highlight w:val="yellow"/>
                 <w:lang w:val="en-CA"/>
               </w:rPr>
               <w:t>load_</w:t>
@@ -4228,6 +4383,7 @@
               <w:rPr>
                 <w:sz w:val="20"/>
                 <w:szCs w:val="20"/>
+                <w:highlight w:val="yellow"/>
                 <w:lang w:val="en-CA"/>
               </w:rPr>
               <w:t>specimen.R</w:t>
@@ -4254,13 +4410,16 @@
                 <w:rFonts w:cstheme="minorHAnsi"/>
                 <w:sz w:val="20"/>
                 <w:szCs w:val="20"/>
-              </w:rPr>
-            </w:pPr>
-            <w:r>
-              <w:rPr>
-                <w:rFonts w:cstheme="minorHAnsi"/>
-                <w:sz w:val="20"/>
-                <w:szCs w:val="20"/>
+                <w:highlight w:val="yellow"/>
+              </w:rPr>
+            </w:pPr>
+            <w:commentRangeStart w:id="1"/>
+            <w:r>
+              <w:rPr>
+                <w:rFonts w:cstheme="minorHAnsi"/>
+                <w:sz w:val="20"/>
+                <w:szCs w:val="20"/>
+                <w:highlight w:val="yellow"/>
               </w:rPr>
               <w:t>Quand on télécharge d’IFA, l’année est donnée en date, avec le 1</w:t>
             </w:r>
@@ -4269,6 +4428,7 @@
                 <w:rFonts w:cstheme="minorHAnsi"/>
                 <w:sz w:val="20"/>
                 <w:szCs w:val="20"/>
+                <w:highlight w:val="yellow"/>
                 <w:vertAlign w:val="superscript"/>
               </w:rPr>
               <w:t>er</w:t>
@@ -4278,6 +4438,7 @@
                 <w:rFonts w:cstheme="minorHAnsi"/>
                 <w:sz w:val="20"/>
                 <w:szCs w:val="20"/>
+                <w:highlight w:val="yellow"/>
               </w:rPr>
               <w:t xml:space="preserve"> janvier comme jour par défaut (1993-01-01 au lieu de 1993). Par conséquent, dans le choix des années, le choix est 33970 au lieu de 1993. Il faudrait transformer la variable « année » [4] en date et en extraire l’année uniquement pour qu’elle soit un entier numérique (as </w:t>
             </w:r>
@@ -4287,6 +4448,7 @@
                 <w:rFonts w:cstheme="minorHAnsi"/>
                 <w:sz w:val="20"/>
                 <w:szCs w:val="20"/>
+                <w:highlight w:val="yellow"/>
               </w:rPr>
               <w:t>integer</w:t>
             </w:r>
@@ -4296,6 +4458,7 @@
                 <w:rFonts w:cstheme="minorHAnsi"/>
                 <w:sz w:val="20"/>
                 <w:szCs w:val="20"/>
+                <w:highlight w:val="yellow"/>
               </w:rPr>
               <w:t xml:space="preserve"> avant </w:t>
             </w:r>
@@ -4305,6 +4468,7 @@
                 <w:rFonts w:cstheme="minorHAnsi"/>
                 <w:sz w:val="20"/>
                 <w:szCs w:val="20"/>
+                <w:highlight w:val="yellow"/>
               </w:rPr>
               <w:t>mutate</w:t>
             </w:r>
@@ -4314,8 +4478,19 @@
                 <w:rFonts w:cstheme="minorHAnsi"/>
                 <w:sz w:val="20"/>
                 <w:szCs w:val="20"/>
+                <w:highlight w:val="yellow"/>
               </w:rPr>
               <w:t xml:space="preserve"> as factor).</w:t>
+            </w:r>
+            <w:commentRangeEnd w:id="1"/>
+            <w:r>
+              <w:rPr>
+                <w:rStyle w:val="Marquedecommentaire"/>
+                <w:kern w:val="0"/>
+                <w:highlight w:val="yellow"/>
+                <w14:ligatures w14:val="none"/>
+              </w:rPr>
+              <w:commentReference w:id="1"/>
             </w:r>
           </w:p>
           <w:p>
@@ -4326,6 +4501,7 @@
                 <w:rFonts w:cstheme="minorHAnsi"/>
                 <w:sz w:val="20"/>
                 <w:szCs w:val="20"/>
+                <w:highlight w:val="yellow"/>
               </w:rPr>
             </w:pPr>
           </w:p>
@@ -4337,6 +4513,7 @@
                 <w:rFonts w:cstheme="minorHAnsi"/>
                 <w:sz w:val="20"/>
                 <w:szCs w:val="20"/>
+                <w:highlight w:val="yellow"/>
               </w:rPr>
             </w:pPr>
           </w:p>
@@ -8952,7 +9129,7 @@
 
 <file path=word/comments.xml><?xml version="1.0" encoding="utf-8"?>
 <w:comments xmlns:wpc="http://schemas.microsoft.com/office/word/2010/wordprocessingCanvas" xmlns:cx="http://schemas.microsoft.com/office/drawing/2014/chartex" xmlns:cx1="http://schemas.microsoft.com/office/drawing/2015/9/8/chartex" xmlns:cx2="http://schemas.microsoft.com/office/drawing/2015/10/21/chartex" xmlns:cx3="http://schemas.microsoft.com/office/drawing/2016/5/9/chartex" xmlns:cx4="http://schemas.microsoft.com/office/drawing/2016/5/10/chartex" xmlns:cx5="http://schemas.microsoft.com/office/drawing/2016/5/11/chartex" xmlns:cx6="http://schemas.microsoft.com/office/drawing/2016/5/12/chartex" xmlns:cx7="http://schemas.microsoft.com/office/drawing/2016/5/13/chartex" xmlns:cx8="http://schemas.microsoft.com/office/drawing/2016/5/14/chartex" xmlns:mc="http://schemas.openxmlformats.org/markup-compatibility/2006" xmlns:aink="http://schemas.microsoft.com/office/drawing/2016/ink" xmlns:am3d="http://schemas.microsoft.com/office/drawing/2017/model3d" xmlns:o="urn:schemas-microsoft-com:office:office" xmlns:oel="http://schemas.microsoft.com/office/2019/extlst" xmlns:r="http://schemas.openxmlformats.org/officeDocument/2006/relationships" xmlns:m="http://schemas.openxmlformats.org/officeDocument/2006/math" xmlns:v="urn:schemas-microsoft-com:vml" xmlns:wp14="http://schemas.microsoft.com/office/word/2010/wordprocessingDrawing" xmlns:wp="http://schemas.openxmlformats.org/drawingml/2006/wordprocessingDrawing" xmlns:w10="urn:schemas-microsoft-com:office:word" xmlns:w="http://schemas.openxmlformats.org/wordprocessingml/2006/main" xmlns:w14="http://schemas.microsoft.com/office/word/2010/wordml" xmlns:w15="http://schemas.microsoft.com/office/word/2012/wordml" xmlns:w16cex="http://schemas.microsoft.com/office/word/2018/wordml/cex" xmlns:w16cid="http://schemas.microsoft.com/office/word/2016/wordml/cid" xmlns:w16="http://schemas.microsoft.com/office/word/2018/wordml" xmlns:w16du="http://schemas.microsoft.com/office/word/2023/wordml/word16du" xmlns:w16sdtdh="http://schemas.microsoft.com/office/word/2020/wordml/sdtdatahash" xmlns:w16sdtfl="http://schemas.microsoft.com/office/word/2024/wordml/sdtformatlock" xmlns:w16se="http://schemas.microsoft.com/office/word/2015/wordml/symex" xmlns:wpg="http://schemas.microsoft.com/office/word/2010/wordprocessingGroup" xmlns:wpi="http://schemas.microsoft.com/office/word/2010/wordprocessingInk" xmlns:wne="http://schemas.microsoft.com/office/word/2006/wordml" xmlns:wps="http://schemas.microsoft.com/office/word/2010/wordprocessingShape" mc:Ignorable="w14 w15 w16se w16cid w16 w16cex w16sdtdh w16sdtfl w16du wp14">
-  <w:comment w:id="1" w:author="Gagné, Stéphanie (DEFA)" w:date="2025-01-06T14:00:00Z" w:initials="GS(">
+  <w:comment w:id="1" w:author="Brûlé, Caroline" w:date="2025-01-31T14:50:00Z" w:initials="CB">
     <w:p>
       <w:pPr>
         <w:pStyle w:val="Commentaire"/>
@@ -8964,49 +9141,10 @@
         <w:annotationRef/>
       </w:r>
       <w:r>
-        <w:t xml:space="preserve">Je pense que ça éviterait d’avoir le  warning suivant : </w:t>
-      </w:r>
-    </w:p>
-    <w:p>
-      <w:pPr>
-        <w:pStyle w:val="Commentaire"/>
-      </w:pPr>
-      <w:r>
         <w:rPr>
-          <w:color w:val="FF0000"/>
           <w:lang w:val="en-CA"/>
         </w:rPr>
-        <w:t>NAs introduced by coercion</w:t>
-      </w:r>
-    </w:p>
-    <w:p>
-      <w:pPr>
-        <w:pStyle w:val="Commentaire"/>
-      </w:pPr>
-      <w:r>
-        <w:rPr>
-          <w:color w:val="FF0000"/>
-          <w:lang w:val="en-CA"/>
-        </w:rPr>
-        <w:t>Warning in `[&lt;-.factor`(`*tmp*`, is.na(alldata$sexe), value = "IND") :</w:t>
-      </w:r>
-    </w:p>
-    <w:p>
-      <w:pPr>
-        <w:pStyle w:val="Commentaire"/>
-      </w:pPr>
-      <w:r>
-        <w:rPr>
-          <w:color w:val="FF0000"/>
-          <w:lang w:val="en-CA"/>
-        </w:rPr>
-        <w:t xml:space="preserve">  </w:t>
-      </w:r>
-      <w:r>
-        <w:rPr>
-          <w:color w:val="FF0000"/>
-        </w:rPr>
-        <w:t>invalid factor level, NA generated</w:t>
+        <w:t>Il me faudrait un jeu de données dans lequel on rencontre ce problème, parce que ça n’arrive pas avec data/exempledata.xlsx</w:t>
       </w:r>
     </w:p>
   </w:comment>
@@ -9015,19 +9153,19 @@
 
 <file path=word/commentsExtended.xml><?xml version="1.0" encoding="utf-8"?>
 <w15:commentsEx xmlns:wpc="http://schemas.microsoft.com/office/word/2010/wordprocessingCanvas" xmlns:cx="http://schemas.microsoft.com/office/drawing/2014/chartex" xmlns:cx1="http://schemas.microsoft.com/office/drawing/2015/9/8/chartex" xmlns:cx2="http://schemas.microsoft.com/office/drawing/2015/10/21/chartex" xmlns:cx3="http://schemas.microsoft.com/office/drawing/2016/5/9/chartex" xmlns:cx4="http://schemas.microsoft.com/office/drawing/2016/5/10/chartex" xmlns:cx5="http://schemas.microsoft.com/office/drawing/2016/5/11/chartex" xmlns:cx6="http://schemas.microsoft.com/office/drawing/2016/5/12/chartex" xmlns:cx7="http://schemas.microsoft.com/office/drawing/2016/5/13/chartex" xmlns:cx8="http://schemas.microsoft.com/office/drawing/2016/5/14/chartex" xmlns:mc="http://schemas.openxmlformats.org/markup-compatibility/2006" xmlns:aink="http://schemas.microsoft.com/office/drawing/2016/ink" xmlns:am3d="http://schemas.microsoft.com/office/drawing/2017/model3d" xmlns:o="urn:schemas-microsoft-com:office:office" xmlns:oel="http://schemas.microsoft.com/office/2019/extlst" xmlns:r="http://schemas.openxmlformats.org/officeDocument/2006/relationships" xmlns:m="http://schemas.openxmlformats.org/officeDocument/2006/math" xmlns:v="urn:schemas-microsoft-com:vml" xmlns:wp14="http://schemas.microsoft.com/office/word/2010/wordprocessingDrawing" xmlns:wp="http://schemas.openxmlformats.org/drawingml/2006/wordprocessingDrawing" xmlns:w10="urn:schemas-microsoft-com:office:word" xmlns:w="http://schemas.openxmlformats.org/wordprocessingml/2006/main" xmlns:w14="http://schemas.microsoft.com/office/word/2010/wordml" xmlns:w15="http://schemas.microsoft.com/office/word/2012/wordml" xmlns:w16cex="http://schemas.microsoft.com/office/word/2018/wordml/cex" xmlns:w16cid="http://schemas.microsoft.com/office/word/2016/wordml/cid" xmlns:w16="http://schemas.microsoft.com/office/word/2018/wordml" xmlns:w16du="http://schemas.microsoft.com/office/word/2023/wordml/word16du" xmlns:w16sdtdh="http://schemas.microsoft.com/office/word/2020/wordml/sdtdatahash" xmlns:w16sdtfl="http://schemas.microsoft.com/office/word/2024/wordml/sdtformatlock" xmlns:w16se="http://schemas.microsoft.com/office/word/2015/wordml/symex" xmlns:wpg="http://schemas.microsoft.com/office/word/2010/wordprocessingGroup" xmlns:wpi="http://schemas.microsoft.com/office/word/2010/wordprocessingInk" xmlns:wne="http://schemas.microsoft.com/office/word/2006/wordml" xmlns:wps="http://schemas.microsoft.com/office/word/2010/wordprocessingShape" mc:Ignorable="w14 w15 w16se w16cid w16 w16cex w16sdtdh w16sdtfl w16du wp14">
-  <w15:commentEx w15:paraId="48B58B14" w15:done="0"/>
+  <w15:commentEx w15:paraId="66B249C4" w15:done="0"/>
 </w15:commentsEx>
 </file>
 
 <file path=word/commentsExtensible.xml><?xml version="1.0" encoding="utf-8"?>
 <w16cex:commentsExtensible xmlns:wpc="http://schemas.microsoft.com/office/word/2010/wordprocessingCanvas" xmlns:cx="http://schemas.microsoft.com/office/drawing/2014/chartex" xmlns:cx1="http://schemas.microsoft.com/office/drawing/2015/9/8/chartex" xmlns:cx2="http://schemas.microsoft.com/office/drawing/2015/10/21/chartex" xmlns:cx3="http://schemas.microsoft.com/office/drawing/2016/5/9/chartex" xmlns:cx4="http://schemas.microsoft.com/office/drawing/2016/5/10/chartex" xmlns:cx5="http://schemas.microsoft.com/office/drawing/2016/5/11/chartex" xmlns:cx6="http://schemas.microsoft.com/office/drawing/2016/5/12/chartex" xmlns:cx7="http://schemas.microsoft.com/office/drawing/2016/5/13/chartex" xmlns:cx8="http://schemas.microsoft.com/office/drawing/2016/5/14/chartex" xmlns:cr="http://schemas.microsoft.com/office/comments/2020/reactions" xmlns:mc="http://schemas.openxmlformats.org/markup-compatibility/2006" xmlns:aink="http://schemas.microsoft.com/office/drawing/2016/ink" xmlns:am3d="http://schemas.microsoft.com/office/drawing/2017/model3d" xmlns:o="urn:schemas-microsoft-com:office:office" xmlns:oel="http://schemas.microsoft.com/office/2019/extlst" xmlns:r="http://schemas.openxmlformats.org/officeDocument/2006/relationships" xmlns:m="http://schemas.openxmlformats.org/officeDocument/2006/math" xmlns:v="urn:schemas-microsoft-com:vml" xmlns:wp14="http://schemas.microsoft.com/office/word/2010/wordprocessingDrawing" xmlns:wp="http://schemas.openxmlformats.org/drawingml/2006/wordprocessingDrawing" xmlns:w10="urn:schemas-microsoft-com:office:word" xmlns:w="http://schemas.openxmlformats.org/wordprocessingml/2006/main" xmlns:w14="http://schemas.microsoft.com/office/word/2010/wordml" xmlns:w15="http://schemas.microsoft.com/office/word/2012/wordml" xmlns:w16cex="http://schemas.microsoft.com/office/word/2018/wordml/cex" xmlns:w16cid="http://schemas.microsoft.com/office/word/2016/wordml/cid" xmlns:w16="http://schemas.microsoft.com/office/word/2018/wordml" xmlns:w16du="http://schemas.microsoft.com/office/word/2023/wordml/word16du" xmlns:w16sdtdh="http://schemas.microsoft.com/office/word/2020/wordml/sdtdatahash" xmlns:w16sdtfl="http://schemas.microsoft.com/office/word/2024/wordml/sdtformatlock" xmlns:w16se="http://schemas.microsoft.com/office/word/2015/wordml/symex" xmlns:wpg="http://schemas.microsoft.com/office/word/2010/wordprocessingGroup" xmlns:wpi="http://schemas.microsoft.com/office/word/2010/wordprocessingInk" xmlns:wne="http://schemas.microsoft.com/office/word/2006/wordml" xmlns:wps="http://schemas.microsoft.com/office/word/2010/wordprocessingShape" mc:Ignorable="w14 w15 w16se w16cid w16 w16cex w16sdtdh w16sdtfl cr w16du wp14">
-  <w16cex:commentExtensible w16cex:durableId="2B266083" w16cex:dateUtc="2025-01-06T19:00:00Z"/>
+  <w16cex:commentExtensible w16cex:durableId="016CA658" w16cex:dateUtc="2025-01-31T19:50:00Z"/>
 </w16cex:commentsExtensible>
 </file>
 
 <file path=word/commentsIds.xml><?xml version="1.0" encoding="utf-8"?>
 <w16cid:commentsIds xmlns:wpc="http://schemas.microsoft.com/office/word/2010/wordprocessingCanvas" xmlns:cx="http://schemas.microsoft.com/office/drawing/2014/chartex" xmlns:cx1="http://schemas.microsoft.com/office/drawing/2015/9/8/chartex" xmlns:cx2="http://schemas.microsoft.com/office/drawing/2015/10/21/chartex" xmlns:cx3="http://schemas.microsoft.com/office/drawing/2016/5/9/chartex" xmlns:cx4="http://schemas.microsoft.com/office/drawing/2016/5/10/chartex" xmlns:cx5="http://schemas.microsoft.com/office/drawing/2016/5/11/chartex" xmlns:cx6="http://schemas.microsoft.com/office/drawing/2016/5/12/chartex" xmlns:cx7="http://schemas.microsoft.com/office/drawing/2016/5/13/chartex" xmlns:cx8="http://schemas.microsoft.com/office/drawing/2016/5/14/chartex" xmlns:mc="http://schemas.openxmlformats.org/markup-compatibility/2006" xmlns:aink="http://schemas.microsoft.com/office/drawing/2016/ink" xmlns:am3d="http://schemas.microsoft.com/office/drawing/2017/model3d" xmlns:o="urn:schemas-microsoft-com:office:office" xmlns:oel="http://schemas.microsoft.com/office/2019/extlst" xmlns:r="http://schemas.openxmlformats.org/officeDocument/2006/relationships" xmlns:m="http://schemas.openxmlformats.org/officeDocument/2006/math" xmlns:v="urn:schemas-microsoft-com:vml" xmlns:wp14="http://schemas.microsoft.com/office/word/2010/wordprocessingDrawing" xmlns:wp="http://schemas.openxmlformats.org/drawingml/2006/wordprocessingDrawing" xmlns:w10="urn:schemas-microsoft-com:office:word" xmlns:w="http://schemas.openxmlformats.org/wordprocessingml/2006/main" xmlns:w14="http://schemas.microsoft.com/office/word/2010/wordml" xmlns:w15="http://schemas.microsoft.com/office/word/2012/wordml" xmlns:w16cex="http://schemas.microsoft.com/office/word/2018/wordml/cex" xmlns:w16cid="http://schemas.microsoft.com/office/word/2016/wordml/cid" xmlns:w16="http://schemas.microsoft.com/office/word/2018/wordml" xmlns:w16du="http://schemas.microsoft.com/office/word/2023/wordml/word16du" xmlns:w16sdtdh="http://schemas.microsoft.com/office/word/2020/wordml/sdtdatahash" xmlns:w16sdtfl="http://schemas.microsoft.com/office/word/2024/wordml/sdtformatlock" xmlns:w16se="http://schemas.microsoft.com/office/word/2015/wordml/symex" xmlns:wpg="http://schemas.microsoft.com/office/word/2010/wordprocessingGroup" xmlns:wpi="http://schemas.microsoft.com/office/word/2010/wordprocessingInk" xmlns:wne="http://schemas.microsoft.com/office/word/2006/wordml" xmlns:wps="http://schemas.microsoft.com/office/word/2010/wordprocessingShape" mc:Ignorable="w14 w15 w16se w16cid w16 w16cex w16sdtdh w16sdtfl w16du wp14">
-  <w16cid:commentId w16cid:paraId="48B58B14" w16cid:durableId="2B266083"/>
+  <w16cid:commentId w16cid:paraId="66B249C4" w16cid:durableId="016CA658"/>
 </w16cid:commentsIds>
 </file>
 
@@ -11167,8 +11305,8 @@
 
 <file path=word/people.xml><?xml version="1.0" encoding="utf-8"?>
 <w15:people xmlns:wpc="http://schemas.microsoft.com/office/word/2010/wordprocessingCanvas" xmlns:cx="http://schemas.microsoft.com/office/drawing/2014/chartex" xmlns:cx1="http://schemas.microsoft.com/office/drawing/2015/9/8/chartex" xmlns:cx2="http://schemas.microsoft.com/office/drawing/2015/10/21/chartex" xmlns:cx3="http://schemas.microsoft.com/office/drawing/2016/5/9/chartex" xmlns:cx4="http://schemas.microsoft.com/office/drawing/2016/5/10/chartex" xmlns:cx5="http://schemas.microsoft.com/office/drawing/2016/5/11/chartex" xmlns:cx6="http://schemas.microsoft.com/office/drawing/2016/5/12/chartex" xmlns:cx7="http://schemas.microsoft.com/office/drawing/2016/5/13/chartex" xmlns:cx8="http://schemas.microsoft.com/office/drawing/2016/5/14/chartex" xmlns:mc="http://schemas.openxmlformats.org/markup-compatibility/2006" xmlns:aink="http://schemas.microsoft.com/office/drawing/2016/ink" xmlns:am3d="http://schemas.microsoft.com/office/drawing/2017/model3d" xmlns:o="urn:schemas-microsoft-com:office:office" xmlns:oel="http://schemas.microsoft.com/office/2019/extlst" xmlns:r="http://schemas.openxmlformats.org/officeDocument/2006/relationships" xmlns:m="http://schemas.openxmlformats.org/officeDocument/2006/math" xmlns:v="urn:schemas-microsoft-com:vml" xmlns:wp14="http://schemas.microsoft.com/office/word/2010/wordprocessingDrawing" xmlns:wp="http://schemas.openxmlformats.org/drawingml/2006/wordprocessingDrawing" xmlns:w10="urn:schemas-microsoft-com:office:word" xmlns:w="http://schemas.openxmlformats.org/wordprocessingml/2006/main" xmlns:w14="http://schemas.microsoft.com/office/word/2010/wordml" xmlns:w15="http://schemas.microsoft.com/office/word/2012/wordml" xmlns:w16cex="http://schemas.microsoft.com/office/word/2018/wordml/cex" xmlns:w16cid="http://schemas.microsoft.com/office/word/2016/wordml/cid" xmlns:w16="http://schemas.microsoft.com/office/word/2018/wordml" xmlns:w16du="http://schemas.microsoft.com/office/word/2023/wordml/word16du" xmlns:w16sdtdh="http://schemas.microsoft.com/office/word/2020/wordml/sdtdatahash" xmlns:w16sdtfl="http://schemas.microsoft.com/office/word/2024/wordml/sdtformatlock" xmlns:w16se="http://schemas.microsoft.com/office/word/2015/wordml/symex" xmlns:wpg="http://schemas.microsoft.com/office/word/2010/wordprocessingGroup" xmlns:wpi="http://schemas.microsoft.com/office/word/2010/wordprocessingInk" xmlns:wne="http://schemas.microsoft.com/office/word/2006/wordml" xmlns:wps="http://schemas.microsoft.com/office/word/2010/wordprocessingShape" mc:Ignorable="w14 w15 w16se w16cid w16 w16cex w16sdtdh w16sdtfl w16du wp14">
-  <w15:person w15:author="Gagné, Stéphanie (DEFA)">
-    <w15:presenceInfo w15:providerId="AD" w15:userId="S::GAGST2@mffp.gouv.qc.ca::e7f995fd-ee73-4e2f-a152-21f000930aa9"/>
+  <w15:person w15:author="Brûlé, Caroline">
+    <w15:presenceInfo w15:providerId="AD" w15:userId="S::Caroline.Brule@environnement.gouv.qc.ca::f1e7452b-5e17-4c7e-866d-8906919e201c"/>
   </w15:person>
 </w15:people>
 </file>

</xml_diff>

<commit_message>
new week new safe
</commit_message>
<xml_diff>
--- a/man/Plan de travail pour Caro_janv 2025.docx
+++ b/man/Plan de travail pour Caro_janv 2025.docx
@@ -1985,6 +1985,7 @@
               <w:rPr>
                 <w:sz w:val="20"/>
                 <w:szCs w:val="20"/>
+                <w:highlight w:val="green"/>
                 <w:lang w:val="en-CA"/>
               </w:rPr>
             </w:pPr>
@@ -1995,6 +1996,7 @@
                 <w:i w:val="0"/>
                 <w:sz w:val="20"/>
                 <w:szCs w:val="20"/>
+                <w:highlight w:val="green"/>
               </w:rPr>
               <w:t>app</w:t>
             </w:r>
@@ -2004,6 +2006,7 @@
                 <w:i w:val="0"/>
                 <w:sz w:val="20"/>
                 <w:szCs w:val="20"/>
+                <w:highlight w:val="green"/>
               </w:rPr>
               <w:t>_server.R</w:t>
             </w:r>
@@ -2026,19 +2029,32 @@
               <w:rPr>
                 <w:sz w:val="20"/>
                 <w:szCs w:val="20"/>
+                <w:highlight w:val="green"/>
               </w:rPr>
               <w:t xml:space="preserve">l. 24 à 32 : </w:t>
             </w:r>
             <w:r>
+              <w:rPr>
+                <w:highlight w:val="green"/>
+              </w:rPr>
               <w:t>possible de mettre les numéro</w:t>
             </w:r>
             <w:r>
+              <w:rPr>
+                <w:highlight w:val="green"/>
+              </w:rPr>
               <w:t>s</w:t>
             </w:r>
             <w:r>
+              <w:rPr>
+                <w:highlight w:val="green"/>
+              </w:rPr>
               <w:t xml:space="preserve"> de lac en ordre croissant ? </w:t>
             </w:r>
             <w:r>
+              <w:rPr>
+                <w:highlight w:val="green"/>
+              </w:rPr>
               <w:t xml:space="preserve">Nous proposons d’utiliser </w:t>
             </w:r>
             <w:proofErr w:type="spellStart"/>
@@ -2046,6 +2062,7 @@
             <w:r>
               <w:rPr>
                 <w:color w:val="2E74B5" w:themeColor="accent5" w:themeShade="BF"/>
+                <w:highlight w:val="green"/>
               </w:rPr>
               <w:t>df</w:t>
             </w:r>
@@ -2053,6 +2070,7 @@
             <w:r>
               <w:rPr>
                 <w:color w:val="2E74B5" w:themeColor="accent5" w:themeShade="BF"/>
+                <w:highlight w:val="green"/>
               </w:rPr>
               <w:t>[</w:t>
             </w:r>
@@ -2061,6 +2079,7 @@
             <w:r>
               <w:rPr>
                 <w:color w:val="2E74B5" w:themeColor="accent5" w:themeShade="BF"/>
+                <w:highlight w:val="green"/>
               </w:rPr>
               <w:t>order</w:t>
             </w:r>
@@ -2068,6 +2087,7 @@
             <w:r>
               <w:rPr>
                 <w:color w:val="2E74B5" w:themeColor="accent5" w:themeShade="BF"/>
+                <w:highlight w:val="green"/>
               </w:rPr>
               <w:t>(</w:t>
             </w:r>
@@ -2075,6 +2095,7 @@
             <w:r>
               <w:rPr>
                 <w:color w:val="2E74B5" w:themeColor="accent5" w:themeShade="BF"/>
+                <w:highlight w:val="green"/>
               </w:rPr>
               <w:t>df$nolac,decreasing</w:t>
             </w:r>
@@ -2082,40 +2103,47 @@
             <w:r>
               <w:rPr>
                 <w:color w:val="2E74B5" w:themeColor="accent5" w:themeShade="BF"/>
+                <w:highlight w:val="green"/>
               </w:rPr>
               <w:t xml:space="preserve"> = FALSE),]</w:t>
             </w:r>
             <w:r>
-              <w:t xml:space="preserve"> </w:t>
-            </w:r>
-            <w:r>
-              <w:t>#fonctionne sur facteur alphanumérique</w:t>
-            </w:r>
-            <w:r>
-              <w:t xml:space="preserve"> (</w:t>
-            </w:r>
-            <w:r>
-              <w:t>fonction applicable sur des facteurs alphanumériques</w:t>
-            </w:r>
-            <w:r>
-              <w:t>).</w:t>
+              <w:rPr>
+                <w:highlight w:val="green"/>
+              </w:rPr>
+              <w:t xml:space="preserve"> #fonctionne sur facteur alphanumérique (fonction applicable sur des facteurs alphanumériques).</w:t>
             </w:r>
           </w:p>
           <w:p/>
           <w:p>
             <w:r>
+              <w:rPr>
+                <w:highlight w:val="green"/>
+              </w:rPr>
               <w:t xml:space="preserve">l. </w:t>
             </w:r>
             <w:r>
+              <w:rPr>
+                <w:highlight w:val="green"/>
+              </w:rPr>
               <w:t>42</w:t>
             </w:r>
             <w:r>
+              <w:rPr>
+                <w:highlight w:val="green"/>
+              </w:rPr>
               <w:t xml:space="preserve"> : </w:t>
             </w:r>
             <w:r>
+              <w:rPr>
+                <w:highlight w:val="green"/>
+              </w:rPr>
               <w:t xml:space="preserve">Ajouter une précision entre parenthèse (et non gras) : « Si </w:t>
             </w:r>
             <w:r>
+              <w:rPr>
+                <w:highlight w:val="green"/>
+              </w:rPr>
               <w:t>plus d’une année d’inventaire est sélectionnée, les données seront combinées comme si elles ne constituaient qu’un seul inventaire. »</w:t>
             </w:r>
           </w:p>
@@ -4262,7 +4290,6 @@
               <w:rPr>
                 <w:sz w:val="20"/>
                 <w:szCs w:val="20"/>
-                <w:highlight w:val="yellow"/>
                 <w:lang w:val="en-CA"/>
               </w:rPr>
             </w:pPr>
@@ -4271,7 +4298,6 @@
               <w:rPr>
                 <w:sz w:val="20"/>
                 <w:szCs w:val="20"/>
-                <w:highlight w:val="yellow"/>
                 <w:lang w:val="en-CA"/>
               </w:rPr>
               <w:t>load_</w:t>
@@ -4281,7 +4307,6 @@
               <w:rPr>
                 <w:sz w:val="20"/>
                 <w:szCs w:val="20"/>
-                <w:highlight w:val="yellow"/>
                 <w:lang w:val="en-CA"/>
               </w:rPr>
               <w:t>lac.R</w:t>
@@ -4296,7 +4321,6 @@
               <w:rPr>
                 <w:sz w:val="20"/>
                 <w:szCs w:val="20"/>
-                <w:highlight w:val="yellow"/>
                 <w:lang w:val="en-CA"/>
               </w:rPr>
             </w:pPr>
@@ -4305,7 +4329,6 @@
               <w:rPr>
                 <w:sz w:val="20"/>
                 <w:szCs w:val="20"/>
-                <w:highlight w:val="yellow"/>
                 <w:lang w:val="en-CA"/>
               </w:rPr>
               <w:t>load_</w:t>
@@ -4315,7 +4338,6 @@
               <w:rPr>
                 <w:sz w:val="20"/>
                 <w:szCs w:val="20"/>
-                <w:highlight w:val="yellow"/>
                 <w:lang w:val="en-CA"/>
               </w:rPr>
               <w:t>station.R</w:t>
@@ -4330,7 +4352,6 @@
               <w:rPr>
                 <w:sz w:val="20"/>
                 <w:szCs w:val="20"/>
-                <w:highlight w:val="yellow"/>
                 <w:lang w:val="en-CA"/>
               </w:rPr>
             </w:pPr>
@@ -4339,7 +4360,6 @@
               <w:rPr>
                 <w:sz w:val="20"/>
                 <w:szCs w:val="20"/>
-                <w:highlight w:val="yellow"/>
                 <w:lang w:val="en-CA"/>
               </w:rPr>
               <w:t>load_</w:t>
@@ -4349,7 +4369,6 @@
               <w:rPr>
                 <w:sz w:val="20"/>
                 <w:szCs w:val="20"/>
-                <w:highlight w:val="yellow"/>
                 <w:lang w:val="en-CA"/>
               </w:rPr>
               <w:t>recolte.R</w:t>
@@ -4364,7 +4383,6 @@
               <w:rPr>
                 <w:sz w:val="20"/>
                 <w:szCs w:val="20"/>
-                <w:highlight w:val="yellow"/>
                 <w:lang w:val="en-CA"/>
               </w:rPr>
             </w:pPr>
@@ -4373,7 +4391,6 @@
               <w:rPr>
                 <w:sz w:val="20"/>
                 <w:szCs w:val="20"/>
-                <w:highlight w:val="yellow"/>
                 <w:lang w:val="en-CA"/>
               </w:rPr>
               <w:t>load_</w:t>
@@ -4383,7 +4400,6 @@
               <w:rPr>
                 <w:sz w:val="20"/>
                 <w:szCs w:val="20"/>
-                <w:highlight w:val="yellow"/>
                 <w:lang w:val="en-CA"/>
               </w:rPr>
               <w:t>specimen.R</w:t>
@@ -4410,16 +4426,13 @@
                 <w:rFonts w:cstheme="minorHAnsi"/>
                 <w:sz w:val="20"/>
                 <w:szCs w:val="20"/>
-                <w:highlight w:val="yellow"/>
-              </w:rPr>
-            </w:pPr>
-            <w:commentRangeStart w:id="1"/>
-            <w:r>
-              <w:rPr>
-                <w:rFonts w:cstheme="minorHAnsi"/>
-                <w:sz w:val="20"/>
-                <w:szCs w:val="20"/>
-                <w:highlight w:val="yellow"/>
+              </w:rPr>
+            </w:pPr>
+            <w:r>
+              <w:rPr>
+                <w:rFonts w:cstheme="minorHAnsi"/>
+                <w:sz w:val="20"/>
+                <w:szCs w:val="20"/>
               </w:rPr>
               <w:t>Quand on télécharge d’IFA, l’année est donnée en date, avec le 1</w:t>
             </w:r>
@@ -4428,7 +4441,6 @@
                 <w:rFonts w:cstheme="minorHAnsi"/>
                 <w:sz w:val="20"/>
                 <w:szCs w:val="20"/>
-                <w:highlight w:val="yellow"/>
                 <w:vertAlign w:val="superscript"/>
               </w:rPr>
               <w:t>er</w:t>
@@ -4438,7 +4450,6 @@
                 <w:rFonts w:cstheme="minorHAnsi"/>
                 <w:sz w:val="20"/>
                 <w:szCs w:val="20"/>
-                <w:highlight w:val="yellow"/>
               </w:rPr>
               <w:t xml:space="preserve"> janvier comme jour par défaut (1993-01-01 au lieu de 1993). Par conséquent, dans le choix des années, le choix est 33970 au lieu de 1993. Il faudrait transformer la variable « année » [4] en date et en extraire l’année uniquement pour qu’elle soit un entier numérique (as </w:t>
             </w:r>
@@ -4448,7 +4459,6 @@
                 <w:rFonts w:cstheme="minorHAnsi"/>
                 <w:sz w:val="20"/>
                 <w:szCs w:val="20"/>
-                <w:highlight w:val="yellow"/>
               </w:rPr>
               <w:t>integer</w:t>
             </w:r>
@@ -4458,7 +4468,6 @@
                 <w:rFonts w:cstheme="minorHAnsi"/>
                 <w:sz w:val="20"/>
                 <w:szCs w:val="20"/>
-                <w:highlight w:val="yellow"/>
               </w:rPr>
               <w:t xml:space="preserve"> avant </w:t>
             </w:r>
@@ -4468,7 +4477,6 @@
                 <w:rFonts w:cstheme="minorHAnsi"/>
                 <w:sz w:val="20"/>
                 <w:szCs w:val="20"/>
-                <w:highlight w:val="yellow"/>
               </w:rPr>
               <w:t>mutate</w:t>
             </w:r>
@@ -4478,19 +4486,8 @@
                 <w:rFonts w:cstheme="minorHAnsi"/>
                 <w:sz w:val="20"/>
                 <w:szCs w:val="20"/>
-                <w:highlight w:val="yellow"/>
               </w:rPr>
               <w:t xml:space="preserve"> as factor).</w:t>
-            </w:r>
-            <w:commentRangeEnd w:id="1"/>
-            <w:r>
-              <w:rPr>
-                <w:rStyle w:val="Marquedecommentaire"/>
-                <w:kern w:val="0"/>
-                <w:highlight w:val="yellow"/>
-                <w14:ligatures w14:val="none"/>
-              </w:rPr>
-              <w:commentReference w:id="1"/>
             </w:r>
           </w:p>
           <w:p>
@@ -4501,7 +4498,6 @@
                 <w:rFonts w:cstheme="minorHAnsi"/>
                 <w:sz w:val="20"/>
                 <w:szCs w:val="20"/>
-                <w:highlight w:val="yellow"/>
               </w:rPr>
             </w:pPr>
           </w:p>
@@ -4513,7 +4509,6 @@
                 <w:rFonts w:cstheme="minorHAnsi"/>
                 <w:sz w:val="20"/>
                 <w:szCs w:val="20"/>
-                <w:highlight w:val="yellow"/>
               </w:rPr>
             </w:pPr>
           </w:p>
@@ -4754,6 +4749,7 @@
               <w:rPr>
                 <w:sz w:val="20"/>
                 <w:szCs w:val="20"/>
+                <w:highlight w:val="green"/>
                 <w:lang w:val="en-CA"/>
               </w:rPr>
             </w:pPr>
@@ -4762,6 +4758,7 @@
               <w:rPr>
                 <w:sz w:val="20"/>
                 <w:szCs w:val="20"/>
+                <w:highlight w:val="green"/>
                 <w:lang w:val="en-CA"/>
               </w:rPr>
               <w:t>abondance_</w:t>
@@ -4771,6 +4768,7 @@
               <w:rPr>
                 <w:sz w:val="20"/>
                 <w:szCs w:val="20"/>
+                <w:highlight w:val="green"/>
                 <w:lang w:val="en-CA"/>
               </w:rPr>
               <w:t>tab</w:t>
@@ -4779,6 +4777,7 @@
               <w:rPr>
                 <w:sz w:val="20"/>
                 <w:szCs w:val="20"/>
+                <w:highlight w:val="green"/>
                 <w:lang w:val="en-CA"/>
               </w:rPr>
               <w:t>le</w:t>
@@ -4787,6 +4786,7 @@
               <w:rPr>
                 <w:sz w:val="20"/>
                 <w:szCs w:val="20"/>
+                <w:highlight w:val="green"/>
                 <w:lang w:val="en-CA"/>
               </w:rPr>
               <w:t>.R</w:t>
@@ -4814,6 +4814,7 @@
                 <w:color w:val="70AD47" w:themeColor="accent6"/>
                 <w:sz w:val="20"/>
                 <w:szCs w:val="20"/>
+                <w:highlight w:val="green"/>
               </w:rPr>
             </w:pPr>
             <w:r>
@@ -4822,6 +4823,7 @@
                 <w:color w:val="70AD47" w:themeColor="accent6"/>
                 <w:sz w:val="20"/>
                 <w:szCs w:val="20"/>
+                <w:highlight w:val="green"/>
               </w:rPr>
               <w:t xml:space="preserve">Il faut utiliser les données de </w:t>
             </w:r>
@@ -4833,6 +4835,7 @@
                 <w:color w:val="70AD47" w:themeColor="accent6"/>
                 <w:sz w:val="20"/>
                 <w:szCs w:val="20"/>
+                <w:highlight w:val="green"/>
               </w:rPr>
               <w:t>specimen</w:t>
             </w:r>
@@ -4843,6 +4846,7 @@
                 <w:color w:val="70AD47" w:themeColor="accent6"/>
                 <w:sz w:val="20"/>
                 <w:szCs w:val="20"/>
+                <w:highlight w:val="green"/>
               </w:rPr>
               <w:t>(</w:t>
             </w:r>
@@ -4853,6 +4857,7 @@
                 <w:color w:val="70AD47" w:themeColor="accent6"/>
                 <w:sz w:val="20"/>
                 <w:szCs w:val="20"/>
+                <w:highlight w:val="green"/>
               </w:rPr>
               <w:t>)</w:t>
             </w:r>
@@ -4862,6 +4867,7 @@
                 <w:color w:val="70AD47" w:themeColor="accent6"/>
                 <w:sz w:val="20"/>
                 <w:szCs w:val="20"/>
+                <w:highlight w:val="green"/>
               </w:rPr>
               <w:t xml:space="preserve"> - </w:t>
             </w:r>
@@ -4875,6 +4881,7 @@
                 <w:color w:val="70AD47" w:themeColor="accent6"/>
                 <w:sz w:val="20"/>
                 <w:szCs w:val="20"/>
+                <w:highlight w:val="green"/>
               </w:rPr>
             </w:pPr>
             <w:r>
@@ -4883,6 +4890,7 @@
                 <w:color w:val="70AD47" w:themeColor="accent6"/>
                 <w:sz w:val="20"/>
                 <w:szCs w:val="20"/>
+                <w:highlight w:val="green"/>
               </w:rPr>
               <w:t>[spécimens des stations valides et au hasard</w:t>
             </w:r>
@@ -4892,6 +4900,7 @@
                 <w:color w:val="70AD47" w:themeColor="accent6"/>
                 <w:sz w:val="20"/>
                 <w:szCs w:val="20"/>
+                <w:highlight w:val="green"/>
               </w:rPr>
               <w:t>]</w:t>
             </w:r>
@@ -4905,6 +4914,7 @@
                 <w:color w:val="70AD47" w:themeColor="accent6"/>
                 <w:sz w:val="20"/>
                 <w:szCs w:val="20"/>
+                <w:highlight w:val="green"/>
               </w:rPr>
             </w:pPr>
           </w:p>
@@ -4916,6 +4926,7 @@
                 <w:rFonts w:cstheme="minorHAnsi"/>
                 <w:sz w:val="20"/>
                 <w:szCs w:val="20"/>
+                <w:highlight w:val="green"/>
               </w:rPr>
             </w:pPr>
             <w:r>
@@ -4936,6 +4947,7 @@
                 <w:rFonts w:cstheme="minorHAnsi"/>
                 <w:sz w:val="20"/>
                 <w:szCs w:val="20"/>
+                <w:highlight w:val="green"/>
               </w:rPr>
             </w:pPr>
           </w:p>
@@ -4947,13 +4959,15 @@
                 <w:rFonts w:cstheme="minorHAnsi"/>
                 <w:sz w:val="20"/>
                 <w:szCs w:val="20"/>
-              </w:rPr>
-            </w:pPr>
-            <w:r>
-              <w:rPr>
-                <w:rFonts w:cstheme="minorHAnsi"/>
-                <w:sz w:val="20"/>
-                <w:szCs w:val="20"/>
+                <w:highlight w:val="green"/>
+              </w:rPr>
+            </w:pPr>
+            <w:r>
+              <w:rPr>
+                <w:rFonts w:cstheme="minorHAnsi"/>
+                <w:sz w:val="20"/>
+                <w:szCs w:val="20"/>
+                <w:highlight w:val="green"/>
               </w:rPr>
               <w:t xml:space="preserve">l. 1 à 9 : </w:t>
             </w:r>
@@ -4962,6 +4976,7 @@
                 <w:rFonts w:cstheme="minorHAnsi"/>
                 <w:sz w:val="20"/>
                 <w:szCs w:val="20"/>
+                <w:highlight w:val="green"/>
               </w:rPr>
               <w:t xml:space="preserve">Pourquoi on ajoute une colonne n total à </w:t>
             </w:r>
@@ -4971,6 +4986,7 @@
                 <w:rFonts w:cstheme="minorHAnsi"/>
                 <w:sz w:val="20"/>
                 <w:szCs w:val="20"/>
+                <w:highlight w:val="green"/>
               </w:rPr>
               <w:t>dataspec</w:t>
             </w:r>
@@ -4980,6 +4996,7 @@
                 <w:rFonts w:cstheme="minorHAnsi"/>
                 <w:sz w:val="20"/>
                 <w:szCs w:val="20"/>
+                <w:highlight w:val="green"/>
               </w:rPr>
               <w:t xml:space="preserve"> ? Cette valeur ne semble pas être réutilis</w:t>
             </w:r>
@@ -4988,6 +5005,7 @@
                 <w:rFonts w:cstheme="minorHAnsi"/>
                 <w:sz w:val="20"/>
                 <w:szCs w:val="20"/>
+                <w:highlight w:val="green"/>
               </w:rPr>
               <w:t>ée</w:t>
             </w:r>
@@ -4996,6 +5014,7 @@
                 <w:rFonts w:cstheme="minorHAnsi"/>
                 <w:sz w:val="20"/>
                 <w:szCs w:val="20"/>
+                <w:highlight w:val="green"/>
               </w:rPr>
               <w:t xml:space="preserve"> par la suite.</w:t>
             </w:r>
@@ -5004,6 +5023,7 @@
                 <w:rFonts w:cstheme="minorHAnsi"/>
                 <w:sz w:val="20"/>
                 <w:szCs w:val="20"/>
+                <w:highlight w:val="green"/>
               </w:rPr>
               <w:t xml:space="preserve"> On pourrait utiliser que </w:t>
             </w:r>
@@ -5012,6 +5032,7 @@
                 <w:rFonts w:cstheme="minorHAnsi"/>
                 <w:sz w:val="20"/>
                 <w:szCs w:val="20"/>
+                <w:highlight w:val="green"/>
               </w:rPr>
               <w:t xml:space="preserve">la </w:t>
             </w:r>
@@ -5021,6 +5042,7 @@
                 <w:rFonts w:cstheme="minorHAnsi"/>
                 <w:sz w:val="20"/>
                 <w:szCs w:val="20"/>
+                <w:highlight w:val="green"/>
               </w:rPr>
               <w:t>reactive</w:t>
             </w:r>
@@ -5030,6 +5052,7 @@
                 <w:rFonts w:cstheme="minorHAnsi"/>
                 <w:sz w:val="20"/>
                 <w:szCs w:val="20"/>
+                <w:highlight w:val="green"/>
               </w:rPr>
               <w:t xml:space="preserve"> expression </w:t>
             </w:r>
@@ -5040,6 +5063,7 @@
                 <w:rFonts w:cstheme="minorHAnsi"/>
                 <w:sz w:val="20"/>
                 <w:szCs w:val="20"/>
+                <w:highlight w:val="green"/>
               </w:rPr>
               <w:t>specimen</w:t>
             </w:r>
@@ -5049,6 +5073,7 @@
                 <w:rFonts w:cstheme="minorHAnsi"/>
                 <w:sz w:val="20"/>
                 <w:szCs w:val="20"/>
+                <w:highlight w:val="green"/>
               </w:rPr>
               <w:t>(</w:t>
             </w:r>
@@ -5058,6 +5083,7 @@
                 <w:rFonts w:cstheme="minorHAnsi"/>
                 <w:sz w:val="20"/>
                 <w:szCs w:val="20"/>
+                <w:highlight w:val="green"/>
               </w:rPr>
               <w:t>).</w:t>
             </w:r>
@@ -5068,22 +5094,25 @@
                 <w:rFonts w:cstheme="minorHAnsi"/>
                 <w:sz w:val="20"/>
                 <w:szCs w:val="20"/>
-              </w:rPr>
-            </w:pPr>
-          </w:p>
-          <w:p>
-            <w:pPr>
-              <w:rPr>
-                <w:rFonts w:cstheme="minorHAnsi"/>
-                <w:sz w:val="20"/>
-                <w:szCs w:val="20"/>
-              </w:rPr>
-            </w:pPr>
-            <w:r>
-              <w:rPr>
-                <w:rFonts w:cstheme="minorHAnsi"/>
-                <w:sz w:val="20"/>
-                <w:szCs w:val="20"/>
+                <w:highlight w:val="green"/>
+              </w:rPr>
+            </w:pPr>
+          </w:p>
+          <w:p>
+            <w:pPr>
+              <w:rPr>
+                <w:rFonts w:cstheme="minorHAnsi"/>
+                <w:sz w:val="20"/>
+                <w:szCs w:val="20"/>
+                <w:highlight w:val="green"/>
+              </w:rPr>
+            </w:pPr>
+            <w:r>
+              <w:rPr>
+                <w:rFonts w:cstheme="minorHAnsi"/>
+                <w:sz w:val="20"/>
+                <w:szCs w:val="20"/>
+                <w:highlight w:val="green"/>
               </w:rPr>
               <w:t xml:space="preserve">MP : l. 90 à 98. Les </w:t>
             </w:r>
@@ -5093,6 +5122,7 @@
                 <w:rFonts w:cstheme="minorHAnsi"/>
                 <w:sz w:val="20"/>
                 <w:szCs w:val="20"/>
+                <w:highlight w:val="green"/>
               </w:rPr>
               <w:t>reprod</w:t>
             </w:r>
@@ -5102,6 +5132,7 @@
                 <w:rFonts w:cstheme="minorHAnsi"/>
                 <w:sz w:val="20"/>
                 <w:szCs w:val="20"/>
+                <w:highlight w:val="green"/>
               </w:rPr>
               <w:t xml:space="preserve">. actifs </w:t>
             </w:r>
@@ -5110,6 +5141,7 @@
                 <w:rFonts w:cstheme="minorHAnsi"/>
                 <w:sz w:val="20"/>
                 <w:szCs w:val="20"/>
+                <w:highlight w:val="green"/>
               </w:rPr>
               <w:t>mâles</w:t>
             </w:r>
@@ -5118,6 +5150,7 @@
                 <w:rFonts w:cstheme="minorHAnsi"/>
                 <w:sz w:val="20"/>
                 <w:szCs w:val="20"/>
+                <w:highlight w:val="green"/>
               </w:rPr>
               <w:t xml:space="preserve"> ne sortent pas dans le tableau de données. </w:t>
             </w:r>
@@ -5126,6 +5159,7 @@
                 <w:rFonts w:cstheme="minorHAnsi"/>
                 <w:sz w:val="20"/>
                 <w:szCs w:val="20"/>
+                <w:highlight w:val="green"/>
               </w:rPr>
               <w:t>I</w:t>
             </w:r>
@@ -5134,6 +5168,7 @@
                 <w:rFonts w:cstheme="minorHAnsi"/>
                 <w:sz w:val="20"/>
                 <w:szCs w:val="20"/>
+                <w:highlight w:val="green"/>
               </w:rPr>
               <w:t>l faudrait que la ligne soit présente dans le tableau même si la valeur d’abondance est à 0.</w:t>
             </w:r>
@@ -5145,6 +5180,7 @@
                 <w:rFonts w:asciiTheme="minorHAnsi" w:hAnsiTheme="minorHAnsi" w:cstheme="minorHAnsi"/>
                 <w:sz w:val="20"/>
                 <w:szCs w:val="20"/>
+                <w:highlight w:val="green"/>
               </w:rPr>
             </w:pPr>
             <w:r>
@@ -5152,6 +5188,7 @@
                 <w:rFonts w:asciiTheme="minorHAnsi" w:hAnsiTheme="minorHAnsi" w:cstheme="minorHAnsi"/>
                 <w:sz w:val="20"/>
                 <w:szCs w:val="20"/>
+                <w:highlight w:val="green"/>
               </w:rPr>
               <w:t>l. 117 à 122. Il serait préférable de se fier sur le nombre de ligne que sur le numéro unique des spécimens pour déterminer le nombre de mâles ou de femelles</w:t>
             </w:r>
@@ -5160,6 +5197,7 @@
                 <w:rFonts w:asciiTheme="minorHAnsi" w:hAnsiTheme="minorHAnsi" w:cstheme="minorHAnsi"/>
                 <w:sz w:val="20"/>
                 <w:szCs w:val="20"/>
+                <w:highlight w:val="green"/>
               </w:rPr>
               <w:t xml:space="preserve">, car il pourrait y avoir une erreur de saisie avec 2 spécimens ayant le même numéro. Pourquoi ne pas utiliser </w:t>
             </w:r>
@@ -5169,6 +5207,7 @@
                 <w:rFonts w:asciiTheme="minorHAnsi" w:hAnsiTheme="minorHAnsi" w:cstheme="minorHAnsi"/>
                 <w:sz w:val="20"/>
                 <w:szCs w:val="20"/>
+                <w:highlight w:val="green"/>
               </w:rPr>
               <w:t>summarise</w:t>
             </w:r>
@@ -5178,6 +5217,7 @@
                 <w:rFonts w:asciiTheme="minorHAnsi" w:hAnsiTheme="minorHAnsi" w:cstheme="minorHAnsi"/>
                 <w:sz w:val="20"/>
                 <w:szCs w:val="20"/>
+                <w:highlight w:val="green"/>
               </w:rPr>
               <w:t xml:space="preserve"> comme précédemment ?</w:t>
             </w:r>
@@ -5188,6 +5228,7 @@
                 <w:rFonts w:cstheme="minorHAnsi"/>
                 <w:sz w:val="20"/>
                 <w:szCs w:val="20"/>
+                <w:highlight w:val="green"/>
               </w:rPr>
             </w:pPr>
           </w:p>
@@ -6325,6 +6366,7 @@
                 <w:color w:val="70AD47" w:themeColor="accent6"/>
                 <w:sz w:val="20"/>
                 <w:szCs w:val="20"/>
+                <w:highlight w:val="green"/>
               </w:rPr>
             </w:pPr>
             <w:r>
@@ -6333,6 +6375,7 @@
                 <w:color w:val="70AD47" w:themeColor="accent6"/>
                 <w:sz w:val="20"/>
                 <w:szCs w:val="20"/>
+                <w:highlight w:val="green"/>
               </w:rPr>
               <w:t xml:space="preserve">Il faut utiliser les données de </w:t>
             </w:r>
@@ -6344,8 +6387,9 @@
                 <w:color w:val="70AD47" w:themeColor="accent6"/>
                 <w:sz w:val="20"/>
                 <w:szCs w:val="20"/>
-              </w:rPr>
-              <w:t>specimens</w:t>
+                <w:highlight w:val="green"/>
+              </w:rPr>
+              <w:t>specimen</w:t>
             </w:r>
             <w:proofErr w:type="spellEnd"/>
             <w:r>
@@ -6354,6 +6398,7 @@
                 <w:color w:val="70AD47" w:themeColor="accent6"/>
                 <w:sz w:val="20"/>
                 <w:szCs w:val="20"/>
+                <w:highlight w:val="green"/>
               </w:rPr>
               <w:t>(</w:t>
             </w:r>
@@ -6364,6 +6409,7 @@
                 <w:color w:val="70AD47" w:themeColor="accent6"/>
                 <w:sz w:val="20"/>
                 <w:szCs w:val="20"/>
+                <w:highlight w:val="green"/>
               </w:rPr>
               <w:t>)</w:t>
             </w:r>
@@ -6385,6 +6431,7 @@
                 <w:color w:val="70AD47" w:themeColor="accent6"/>
                 <w:sz w:val="20"/>
                 <w:szCs w:val="20"/>
+                <w:highlight w:val="green"/>
               </w:rPr>
               <w:t>[</w:t>
             </w:r>
@@ -6394,6 +6441,7 @@
                 <w:color w:val="70AD47" w:themeColor="accent6"/>
                 <w:sz w:val="20"/>
                 <w:szCs w:val="20"/>
+                <w:highlight w:val="green"/>
               </w:rPr>
               <w:t>biomasse</w:t>
             </w:r>
@@ -6403,6 +6451,7 @@
                 <w:color w:val="70AD47" w:themeColor="accent6"/>
                 <w:sz w:val="20"/>
                 <w:szCs w:val="20"/>
+                <w:highlight w:val="green"/>
               </w:rPr>
               <w:t xml:space="preserve"> des stations valides et au hasard, incluant les stations avec 0 captures]</w:t>
             </w:r>
@@ -6724,23 +6773,17 @@
               <w:rPr>
                 <w:sz w:val="20"/>
                 <w:szCs w:val="20"/>
+                <w:highlight w:val="green"/>
                 <w:lang w:val="en-CA"/>
               </w:rPr>
-              <w:t>taille_</w:t>
-            </w:r>
-            <w:r>
-              <w:rPr>
-                <w:sz w:val="20"/>
-                <w:szCs w:val="20"/>
-                <w:lang w:val="en-CA"/>
-              </w:rPr>
-              <w:t>masse_</w:t>
+              <w:t>taille_masse_</w:t>
             </w:r>
             <w:proofErr w:type="gramStart"/>
             <w:r>
               <w:rPr>
                 <w:sz w:val="20"/>
                 <w:szCs w:val="20"/>
+                <w:highlight w:val="green"/>
                 <w:lang w:val="en-CA"/>
               </w:rPr>
               <w:t>age.R</w:t>
@@ -6778,6 +6821,7 @@
                 <w:color w:val="70AD47" w:themeColor="accent6"/>
                 <w:sz w:val="20"/>
                 <w:szCs w:val="20"/>
+                <w:highlight w:val="green"/>
               </w:rPr>
             </w:pPr>
             <w:r>
@@ -6786,6 +6830,7 @@
                 <w:color w:val="70AD47" w:themeColor="accent6"/>
                 <w:sz w:val="20"/>
                 <w:szCs w:val="20"/>
+                <w:highlight w:val="green"/>
               </w:rPr>
               <w:t xml:space="preserve">Il faut utiliser les données de </w:t>
             </w:r>
@@ -6796,6 +6841,7 @@
                 <w:color w:val="70AD47" w:themeColor="accent6"/>
                 <w:sz w:val="20"/>
                 <w:szCs w:val="20"/>
+                <w:highlight w:val="green"/>
               </w:rPr>
               <w:t>specimen_</w:t>
             </w:r>
@@ -6806,6 +6852,7 @@
                 <w:color w:val="70AD47" w:themeColor="accent6"/>
                 <w:sz w:val="20"/>
                 <w:szCs w:val="20"/>
+                <w:highlight w:val="green"/>
               </w:rPr>
               <w:t>valid</w:t>
             </w:r>
@@ -6816,6 +6863,7 @@
                 <w:color w:val="70AD47" w:themeColor="accent6"/>
                 <w:sz w:val="20"/>
                 <w:szCs w:val="20"/>
+                <w:highlight w:val="green"/>
               </w:rPr>
               <w:t>(</w:t>
             </w:r>
@@ -6826,6 +6874,7 @@
                 <w:color w:val="70AD47" w:themeColor="accent6"/>
                 <w:sz w:val="20"/>
                 <w:szCs w:val="20"/>
+                <w:highlight w:val="green"/>
               </w:rPr>
               <w:t>)</w:t>
             </w:r>
@@ -6847,6 +6896,7 @@
                 <w:color w:val="70AD47" w:themeColor="accent6"/>
                 <w:sz w:val="20"/>
                 <w:szCs w:val="20"/>
+                <w:highlight w:val="green"/>
               </w:rPr>
               <w:t xml:space="preserve">[spécimens des stations valides, </w:t>
             </w:r>
@@ -6857,6 +6907,7 @@
                 <w:color w:val="70AD47" w:themeColor="accent6"/>
                 <w:sz w:val="20"/>
                 <w:szCs w:val="20"/>
+                <w:highlight w:val="green"/>
               </w:rPr>
               <w:t>hasard+dirigés</w:t>
             </w:r>
@@ -6867,6 +6918,7 @@
                 <w:color w:val="70AD47" w:themeColor="accent6"/>
                 <w:sz w:val="20"/>
                 <w:szCs w:val="20"/>
+                <w:highlight w:val="green"/>
               </w:rPr>
               <w:t>)</w:t>
             </w:r>
@@ -7241,12 +7293,14 @@
               <w:rPr>
                 <w:sz w:val="20"/>
                 <w:szCs w:val="20"/>
-              </w:rPr>
-            </w:pPr>
-            <w:r>
-              <w:rPr>
-                <w:sz w:val="20"/>
-                <w:szCs w:val="20"/>
+                <w:highlight w:val="green"/>
+              </w:rPr>
+            </w:pPr>
+            <w:r>
+              <w:rPr>
+                <w:sz w:val="20"/>
+                <w:szCs w:val="20"/>
+                <w:highlight w:val="green"/>
               </w:rPr>
               <w:t xml:space="preserve">Dans les filtres, remplacer « Origine » par « Origine (marqué ou non-marqué) ». </w:t>
             </w:r>
@@ -7256,6 +7310,7 @@
               <w:rPr>
                 <w:sz w:val="20"/>
                 <w:szCs w:val="20"/>
+                <w:highlight w:val="green"/>
               </w:rPr>
             </w:pPr>
           </w:p>
@@ -7272,8 +7327,17 @@
                 <w:rFonts w:eastAsia="Times New Roman"/>
                 <w:sz w:val="20"/>
                 <w:szCs w:val="20"/>
-              </w:rPr>
-              <w:t>Modifier le titre de l’axe des y : « Nb. dorés jaunes échantillonnés » </w:t>
+                <w:highlight w:val="green"/>
+              </w:rPr>
+              <w:t>Modifier le titre de l’axe des y : « Nb. dorés jaunes échantillonnés »</w:t>
+            </w:r>
+            <w:r>
+              <w:rPr>
+                <w:rFonts w:eastAsia="Times New Roman"/>
+                <w:sz w:val="20"/>
+                <w:szCs w:val="20"/>
+              </w:rPr>
+              <w:t> </w:t>
             </w:r>
           </w:p>
           <w:p>
@@ -7860,6 +7924,7 @@
                 <w:szCs w:val="20"/>
               </w:rPr>
             </w:pPr>
+            <w:commentRangeStart w:id="1"/>
             <w:r>
               <w:rPr>
                 <w:rFonts w:cstheme="minorHAnsi"/>
@@ -7908,6 +7973,15 @@
                 <w:szCs w:val="20"/>
               </w:rPr>
               <w:t>)</w:t>
+            </w:r>
+            <w:commentRangeEnd w:id="1"/>
+            <w:r>
+              <w:rPr>
+                <w:rStyle w:val="Marquedecommentaire"/>
+                <w:kern w:val="0"/>
+                <w14:ligatures w14:val="none"/>
+              </w:rPr>
+              <w:commentReference w:id="1"/>
             </w:r>
           </w:p>
           <w:p>
@@ -9129,7 +9203,7 @@
 
 <file path=word/comments.xml><?xml version="1.0" encoding="utf-8"?>
 <w:comments xmlns:wpc="http://schemas.microsoft.com/office/word/2010/wordprocessingCanvas" xmlns:cx="http://schemas.microsoft.com/office/drawing/2014/chartex" xmlns:cx1="http://schemas.microsoft.com/office/drawing/2015/9/8/chartex" xmlns:cx2="http://schemas.microsoft.com/office/drawing/2015/10/21/chartex" xmlns:cx3="http://schemas.microsoft.com/office/drawing/2016/5/9/chartex" xmlns:cx4="http://schemas.microsoft.com/office/drawing/2016/5/10/chartex" xmlns:cx5="http://schemas.microsoft.com/office/drawing/2016/5/11/chartex" xmlns:cx6="http://schemas.microsoft.com/office/drawing/2016/5/12/chartex" xmlns:cx7="http://schemas.microsoft.com/office/drawing/2016/5/13/chartex" xmlns:cx8="http://schemas.microsoft.com/office/drawing/2016/5/14/chartex" xmlns:mc="http://schemas.openxmlformats.org/markup-compatibility/2006" xmlns:aink="http://schemas.microsoft.com/office/drawing/2016/ink" xmlns:am3d="http://schemas.microsoft.com/office/drawing/2017/model3d" xmlns:o="urn:schemas-microsoft-com:office:office" xmlns:oel="http://schemas.microsoft.com/office/2019/extlst" xmlns:r="http://schemas.openxmlformats.org/officeDocument/2006/relationships" xmlns:m="http://schemas.openxmlformats.org/officeDocument/2006/math" xmlns:v="urn:schemas-microsoft-com:vml" xmlns:wp14="http://schemas.microsoft.com/office/word/2010/wordprocessingDrawing" xmlns:wp="http://schemas.openxmlformats.org/drawingml/2006/wordprocessingDrawing" xmlns:w10="urn:schemas-microsoft-com:office:word" xmlns:w="http://schemas.openxmlformats.org/wordprocessingml/2006/main" xmlns:w14="http://schemas.microsoft.com/office/word/2010/wordml" xmlns:w15="http://schemas.microsoft.com/office/word/2012/wordml" xmlns:w16cex="http://schemas.microsoft.com/office/word/2018/wordml/cex" xmlns:w16cid="http://schemas.microsoft.com/office/word/2016/wordml/cid" xmlns:w16="http://schemas.microsoft.com/office/word/2018/wordml" xmlns:w16du="http://schemas.microsoft.com/office/word/2023/wordml/word16du" xmlns:w16sdtdh="http://schemas.microsoft.com/office/word/2020/wordml/sdtdatahash" xmlns:w16sdtfl="http://schemas.microsoft.com/office/word/2024/wordml/sdtformatlock" xmlns:w16se="http://schemas.microsoft.com/office/word/2015/wordml/symex" xmlns:wpg="http://schemas.microsoft.com/office/word/2010/wordprocessingGroup" xmlns:wpi="http://schemas.microsoft.com/office/word/2010/wordprocessingInk" xmlns:wne="http://schemas.microsoft.com/office/word/2006/wordml" xmlns:wps="http://schemas.microsoft.com/office/word/2010/wordprocessingShape" mc:Ignorable="w14 w15 w16se w16cid w16 w16cex w16sdtdh w16sdtfl w16du wp14">
-  <w:comment w:id="1" w:author="Brûlé, Caroline" w:date="2025-01-31T14:50:00Z" w:initials="CB">
+  <w:comment w:id="1" w:author="Brûlé, Caroline" w:date="2025-01-31T16:10:00Z" w:initials="CB">
     <w:p>
       <w:pPr>
         <w:pStyle w:val="Commentaire"/>
@@ -9141,10 +9215,7 @@
         <w:annotationRef/>
       </w:r>
       <w:r>
-        <w:rPr>
-          <w:lang w:val="en-CA"/>
-        </w:rPr>
-        <w:t>Il me faudrait un jeu de données dans lequel on rencontre ce problème, parce que ça n’arrive pas avec data/exempledata.xlsx</w:t>
+        <w:t xml:space="preserve">Non, ce n,est pas la même chose. Tous les spécimens de toute les stations, c'est vraiment tout, peu importe ce qui est inscrit dans les champs valide et Hasard. Mais [spécimens des stations valides et au hasard] veut dire qu'il faut filtrer les spécimens avec hasard = O ET valide =O </w:t>
       </w:r>
     </w:p>
   </w:comment>
@@ -9153,20 +9224,70 @@
 
 <file path=word/commentsExtended.xml><?xml version="1.0" encoding="utf-8"?>
 <w15:commentsEx xmlns:wpc="http://schemas.microsoft.com/office/word/2010/wordprocessingCanvas" xmlns:cx="http://schemas.microsoft.com/office/drawing/2014/chartex" xmlns:cx1="http://schemas.microsoft.com/office/drawing/2015/9/8/chartex" xmlns:cx2="http://schemas.microsoft.com/office/drawing/2015/10/21/chartex" xmlns:cx3="http://schemas.microsoft.com/office/drawing/2016/5/9/chartex" xmlns:cx4="http://schemas.microsoft.com/office/drawing/2016/5/10/chartex" xmlns:cx5="http://schemas.microsoft.com/office/drawing/2016/5/11/chartex" xmlns:cx6="http://schemas.microsoft.com/office/drawing/2016/5/12/chartex" xmlns:cx7="http://schemas.microsoft.com/office/drawing/2016/5/13/chartex" xmlns:cx8="http://schemas.microsoft.com/office/drawing/2016/5/14/chartex" xmlns:mc="http://schemas.openxmlformats.org/markup-compatibility/2006" xmlns:aink="http://schemas.microsoft.com/office/drawing/2016/ink" xmlns:am3d="http://schemas.microsoft.com/office/drawing/2017/model3d" xmlns:o="urn:schemas-microsoft-com:office:office" xmlns:oel="http://schemas.microsoft.com/office/2019/extlst" xmlns:r="http://schemas.openxmlformats.org/officeDocument/2006/relationships" xmlns:m="http://schemas.openxmlformats.org/officeDocument/2006/math" xmlns:v="urn:schemas-microsoft-com:vml" xmlns:wp14="http://schemas.microsoft.com/office/word/2010/wordprocessingDrawing" xmlns:wp="http://schemas.openxmlformats.org/drawingml/2006/wordprocessingDrawing" xmlns:w10="urn:schemas-microsoft-com:office:word" xmlns:w="http://schemas.openxmlformats.org/wordprocessingml/2006/main" xmlns:w14="http://schemas.microsoft.com/office/word/2010/wordml" xmlns:w15="http://schemas.microsoft.com/office/word/2012/wordml" xmlns:w16cex="http://schemas.microsoft.com/office/word/2018/wordml/cex" xmlns:w16cid="http://schemas.microsoft.com/office/word/2016/wordml/cid" xmlns:w16="http://schemas.microsoft.com/office/word/2018/wordml" xmlns:w16du="http://schemas.microsoft.com/office/word/2023/wordml/word16du" xmlns:w16sdtdh="http://schemas.microsoft.com/office/word/2020/wordml/sdtdatahash" xmlns:w16sdtfl="http://schemas.microsoft.com/office/word/2024/wordml/sdtformatlock" xmlns:w16se="http://schemas.microsoft.com/office/word/2015/wordml/symex" xmlns:wpg="http://schemas.microsoft.com/office/word/2010/wordprocessingGroup" xmlns:wpi="http://schemas.microsoft.com/office/word/2010/wordprocessingInk" xmlns:wne="http://schemas.microsoft.com/office/word/2006/wordml" xmlns:wps="http://schemas.microsoft.com/office/word/2010/wordprocessingShape" mc:Ignorable="w14 w15 w16se w16cid w16 w16cex w16sdtdh w16sdtfl w16du wp14">
-  <w15:commentEx w15:paraId="66B249C4" w15:done="0"/>
+  <w15:commentEx w15:paraId="33848BC5" w15:done="0"/>
 </w15:commentsEx>
 </file>
 
 <file path=word/commentsExtensible.xml><?xml version="1.0" encoding="utf-8"?>
 <w16cex:commentsExtensible xmlns:wpc="http://schemas.microsoft.com/office/word/2010/wordprocessingCanvas" xmlns:cx="http://schemas.microsoft.com/office/drawing/2014/chartex" xmlns:cx1="http://schemas.microsoft.com/office/drawing/2015/9/8/chartex" xmlns:cx2="http://schemas.microsoft.com/office/drawing/2015/10/21/chartex" xmlns:cx3="http://schemas.microsoft.com/office/drawing/2016/5/9/chartex" xmlns:cx4="http://schemas.microsoft.com/office/drawing/2016/5/10/chartex" xmlns:cx5="http://schemas.microsoft.com/office/drawing/2016/5/11/chartex" xmlns:cx6="http://schemas.microsoft.com/office/drawing/2016/5/12/chartex" xmlns:cx7="http://schemas.microsoft.com/office/drawing/2016/5/13/chartex" xmlns:cx8="http://schemas.microsoft.com/office/drawing/2016/5/14/chartex" xmlns:cr="http://schemas.microsoft.com/office/comments/2020/reactions" xmlns:mc="http://schemas.openxmlformats.org/markup-compatibility/2006" xmlns:aink="http://schemas.microsoft.com/office/drawing/2016/ink" xmlns:am3d="http://schemas.microsoft.com/office/drawing/2017/model3d" xmlns:o="urn:schemas-microsoft-com:office:office" xmlns:oel="http://schemas.microsoft.com/office/2019/extlst" xmlns:r="http://schemas.openxmlformats.org/officeDocument/2006/relationships" xmlns:m="http://schemas.openxmlformats.org/officeDocument/2006/math" xmlns:v="urn:schemas-microsoft-com:vml" xmlns:wp14="http://schemas.microsoft.com/office/word/2010/wordprocessingDrawing" xmlns:wp="http://schemas.openxmlformats.org/drawingml/2006/wordprocessingDrawing" xmlns:w10="urn:schemas-microsoft-com:office:word" xmlns:w="http://schemas.openxmlformats.org/wordprocessingml/2006/main" xmlns:w14="http://schemas.microsoft.com/office/word/2010/wordml" xmlns:w15="http://schemas.microsoft.com/office/word/2012/wordml" xmlns:w16cex="http://schemas.microsoft.com/office/word/2018/wordml/cex" xmlns:w16cid="http://schemas.microsoft.com/office/word/2016/wordml/cid" xmlns:w16="http://schemas.microsoft.com/office/word/2018/wordml" xmlns:w16du="http://schemas.microsoft.com/office/word/2023/wordml/word16du" xmlns:w16sdtdh="http://schemas.microsoft.com/office/word/2020/wordml/sdtdatahash" xmlns:w16sdtfl="http://schemas.microsoft.com/office/word/2024/wordml/sdtformatlock" xmlns:w16se="http://schemas.microsoft.com/office/word/2015/wordml/symex" xmlns:wpg="http://schemas.microsoft.com/office/word/2010/wordprocessingGroup" xmlns:wpi="http://schemas.microsoft.com/office/word/2010/wordprocessingInk" xmlns:wne="http://schemas.microsoft.com/office/word/2006/wordml" xmlns:wps="http://schemas.microsoft.com/office/word/2010/wordprocessingShape" mc:Ignorable="w14 w15 w16se w16cid w16 w16cex w16sdtdh w16sdtfl cr w16du wp14">
-  <w16cex:commentExtensible w16cex:durableId="016CA658" w16cex:dateUtc="2025-01-31T19:50:00Z"/>
+  <w16cex:commentExtensible w16cex:durableId="60AE9307" w16cex:dateUtc="2025-01-31T21:10:00Z"/>
 </w16cex:commentsExtensible>
 </file>
 
 <file path=word/commentsIds.xml><?xml version="1.0" encoding="utf-8"?>
 <w16cid:commentsIds xmlns:wpc="http://schemas.microsoft.com/office/word/2010/wordprocessingCanvas" xmlns:cx="http://schemas.microsoft.com/office/drawing/2014/chartex" xmlns:cx1="http://schemas.microsoft.com/office/drawing/2015/9/8/chartex" xmlns:cx2="http://schemas.microsoft.com/office/drawing/2015/10/21/chartex" xmlns:cx3="http://schemas.microsoft.com/office/drawing/2016/5/9/chartex" xmlns:cx4="http://schemas.microsoft.com/office/drawing/2016/5/10/chartex" xmlns:cx5="http://schemas.microsoft.com/office/drawing/2016/5/11/chartex" xmlns:cx6="http://schemas.microsoft.com/office/drawing/2016/5/12/chartex" xmlns:cx7="http://schemas.microsoft.com/office/drawing/2016/5/13/chartex" xmlns:cx8="http://schemas.microsoft.com/office/drawing/2016/5/14/chartex" xmlns:mc="http://schemas.openxmlformats.org/markup-compatibility/2006" xmlns:aink="http://schemas.microsoft.com/office/drawing/2016/ink" xmlns:am3d="http://schemas.microsoft.com/office/drawing/2017/model3d" xmlns:o="urn:schemas-microsoft-com:office:office" xmlns:oel="http://schemas.microsoft.com/office/2019/extlst" xmlns:r="http://schemas.openxmlformats.org/officeDocument/2006/relationships" xmlns:m="http://schemas.openxmlformats.org/officeDocument/2006/math" xmlns:v="urn:schemas-microsoft-com:vml" xmlns:wp14="http://schemas.microsoft.com/office/word/2010/wordprocessingDrawing" xmlns:wp="http://schemas.openxmlformats.org/drawingml/2006/wordprocessingDrawing" xmlns:w10="urn:schemas-microsoft-com:office:word" xmlns:w="http://schemas.openxmlformats.org/wordprocessingml/2006/main" xmlns:w14="http://schemas.microsoft.com/office/word/2010/wordml" xmlns:w15="http://schemas.microsoft.com/office/word/2012/wordml" xmlns:w16cex="http://schemas.microsoft.com/office/word/2018/wordml/cex" xmlns:w16cid="http://schemas.microsoft.com/office/word/2016/wordml/cid" xmlns:w16="http://schemas.microsoft.com/office/word/2018/wordml" xmlns:w16du="http://schemas.microsoft.com/office/word/2023/wordml/word16du" xmlns:w16sdtdh="http://schemas.microsoft.com/office/word/2020/wordml/sdtdatahash" xmlns:w16sdtfl="http://schemas.microsoft.com/office/word/2024/wordml/sdtformatlock" xmlns:w16se="http://schemas.microsoft.com/office/word/2015/wordml/symex" xmlns:wpg="http://schemas.microsoft.com/office/word/2010/wordprocessingGroup" xmlns:wpi="http://schemas.microsoft.com/office/word/2010/wordprocessingInk" xmlns:wne="http://schemas.microsoft.com/office/word/2006/wordml" xmlns:wps="http://schemas.microsoft.com/office/word/2010/wordprocessingShape" mc:Ignorable="w14 w15 w16se w16cid w16 w16cex w16sdtdh w16sdtfl w16du wp14">
-  <w16cid:commentId w16cid:paraId="66B249C4" w16cid:durableId="016CA658"/>
+  <w16cid:commentId w16cid:paraId="33848BC5" w16cid:durableId="60AE9307"/>
 </w16cid:commentsIds>
+</file>
+
+<file path=word/endnotes.xml><?xml version="1.0" encoding="utf-8"?>
+<w:endnotes xmlns:wpc="http://schemas.microsoft.com/office/word/2010/wordprocessingCanvas" xmlns:cx="http://schemas.microsoft.com/office/drawing/2014/chartex" xmlns:cx1="http://schemas.microsoft.com/office/drawing/2015/9/8/chartex" xmlns:cx2="http://schemas.microsoft.com/office/drawing/2015/10/21/chartex" xmlns:cx3="http://schemas.microsoft.com/office/drawing/2016/5/9/chartex" xmlns:cx4="http://schemas.microsoft.com/office/drawing/2016/5/10/chartex" xmlns:cx5="http://schemas.microsoft.com/office/drawing/2016/5/11/chartex" xmlns:cx6="http://schemas.microsoft.com/office/drawing/2016/5/12/chartex" xmlns:cx7="http://schemas.microsoft.com/office/drawing/2016/5/13/chartex" xmlns:cx8="http://schemas.microsoft.com/office/drawing/2016/5/14/chartex" xmlns:mc="http://schemas.openxmlformats.org/markup-compatibility/2006" xmlns:aink="http://schemas.microsoft.com/office/drawing/2016/ink" xmlns:am3d="http://schemas.microsoft.com/office/drawing/2017/model3d" xmlns:o="urn:schemas-microsoft-com:office:office" xmlns:oel="http://schemas.microsoft.com/office/2019/extlst" xmlns:r="http://schemas.openxmlformats.org/officeDocument/2006/relationships" xmlns:m="http://schemas.openxmlformats.org/officeDocument/2006/math" xmlns:v="urn:schemas-microsoft-com:vml" xmlns:wp14="http://schemas.microsoft.com/office/word/2010/wordprocessingDrawing" xmlns:wp="http://schemas.openxmlformats.org/drawingml/2006/wordprocessingDrawing" xmlns:w10="urn:schemas-microsoft-com:office:word" xmlns:w="http://schemas.openxmlformats.org/wordprocessingml/2006/main" xmlns:w14="http://schemas.microsoft.com/office/word/2010/wordml" xmlns:w15="http://schemas.microsoft.com/office/word/2012/wordml" xmlns:w16cex="http://schemas.microsoft.com/office/word/2018/wordml/cex" xmlns:w16cid="http://schemas.microsoft.com/office/word/2016/wordml/cid" xmlns:w16="http://schemas.microsoft.com/office/word/2018/wordml" xmlns:w16du="http://schemas.microsoft.com/office/word/2023/wordml/word16du" xmlns:w16sdtdh="http://schemas.microsoft.com/office/word/2020/wordml/sdtdatahash" xmlns:w16sdtfl="http://schemas.microsoft.com/office/word/2024/wordml/sdtformatlock" xmlns:w16se="http://schemas.microsoft.com/office/word/2015/wordml/symex" xmlns:wpg="http://schemas.microsoft.com/office/word/2010/wordprocessingGroup" xmlns:wpi="http://schemas.microsoft.com/office/word/2010/wordprocessingInk" xmlns:wne="http://schemas.microsoft.com/office/word/2006/wordml" xmlns:wps="http://schemas.microsoft.com/office/word/2010/wordprocessingShape" mc:Ignorable="w14 w15 w16se w16cid w16 w16cex w16sdtdh w16sdtfl w16du wp14">
+  <w:endnote w:type="separator" w:id="-1">
+    <w:p>
+      <w:pPr>
+        <w:spacing w:after="0" w:line="240" w:lineRule="auto"/>
+      </w:pPr>
+      <w:r>
+        <w:separator/>
+      </w:r>
+    </w:p>
+  </w:endnote>
+  <w:endnote w:type="continuationSeparator" w:id="0">
+    <w:p>
+      <w:pPr>
+        <w:spacing w:after="0" w:line="240" w:lineRule="auto"/>
+      </w:pPr>
+      <w:r>
+        <w:continuationSeparator/>
+      </w:r>
+    </w:p>
+  </w:endnote>
+</w:endnotes>
+</file>
+
+<file path=word/footnotes.xml><?xml version="1.0" encoding="utf-8"?>
+<w:footnotes xmlns:wpc="http://schemas.microsoft.com/office/word/2010/wordprocessingCanvas" xmlns:cx="http://schemas.microsoft.com/office/drawing/2014/chartex" xmlns:cx1="http://schemas.microsoft.com/office/drawing/2015/9/8/chartex" xmlns:cx2="http://schemas.microsoft.com/office/drawing/2015/10/21/chartex" xmlns:cx3="http://schemas.microsoft.com/office/drawing/2016/5/9/chartex" xmlns:cx4="http://schemas.microsoft.com/office/drawing/2016/5/10/chartex" xmlns:cx5="http://schemas.microsoft.com/office/drawing/2016/5/11/chartex" xmlns:cx6="http://schemas.microsoft.com/office/drawing/2016/5/12/chartex" xmlns:cx7="http://schemas.microsoft.com/office/drawing/2016/5/13/chartex" xmlns:cx8="http://schemas.microsoft.com/office/drawing/2016/5/14/chartex" xmlns:mc="http://schemas.openxmlformats.org/markup-compatibility/2006" xmlns:aink="http://schemas.microsoft.com/office/drawing/2016/ink" xmlns:am3d="http://schemas.microsoft.com/office/drawing/2017/model3d" xmlns:o="urn:schemas-microsoft-com:office:office" xmlns:oel="http://schemas.microsoft.com/office/2019/extlst" xmlns:r="http://schemas.openxmlformats.org/officeDocument/2006/relationships" xmlns:m="http://schemas.openxmlformats.org/officeDocument/2006/math" xmlns:v="urn:schemas-microsoft-com:vml" xmlns:wp14="http://schemas.microsoft.com/office/word/2010/wordprocessingDrawing" xmlns:wp="http://schemas.openxmlformats.org/drawingml/2006/wordprocessingDrawing" xmlns:w10="urn:schemas-microsoft-com:office:word" xmlns:w="http://schemas.openxmlformats.org/wordprocessingml/2006/main" xmlns:w14="http://schemas.microsoft.com/office/word/2010/wordml" xmlns:w15="http://schemas.microsoft.com/office/word/2012/wordml" xmlns:w16cex="http://schemas.microsoft.com/office/word/2018/wordml/cex" xmlns:w16cid="http://schemas.microsoft.com/office/word/2016/wordml/cid" xmlns:w16="http://schemas.microsoft.com/office/word/2018/wordml" xmlns:w16du="http://schemas.microsoft.com/office/word/2023/wordml/word16du" xmlns:w16sdtdh="http://schemas.microsoft.com/office/word/2020/wordml/sdtdatahash" xmlns:w16sdtfl="http://schemas.microsoft.com/office/word/2024/wordml/sdtformatlock" xmlns:w16se="http://schemas.microsoft.com/office/word/2015/wordml/symex" xmlns:wpg="http://schemas.microsoft.com/office/word/2010/wordprocessingGroup" xmlns:wpi="http://schemas.microsoft.com/office/word/2010/wordprocessingInk" xmlns:wne="http://schemas.microsoft.com/office/word/2006/wordml" xmlns:wps="http://schemas.microsoft.com/office/word/2010/wordprocessingShape" mc:Ignorable="w14 w15 w16se w16cid w16 w16cex w16sdtdh w16sdtfl w16du wp14">
+  <w:footnote w:type="separator" w:id="-1">
+    <w:p>
+      <w:pPr>
+        <w:spacing w:after="0" w:line="240" w:lineRule="auto"/>
+      </w:pPr>
+      <w:r>
+        <w:separator/>
+      </w:r>
+    </w:p>
+  </w:footnote>
+  <w:footnote w:type="continuationSeparator" w:id="0">
+    <w:p>
+      <w:pPr>
+        <w:spacing w:after="0" w:line="240" w:lineRule="auto"/>
+      </w:pPr>
+      <w:r>
+        <w:continuationSeparator/>
+      </w:r>
+    </w:p>
+  </w:footnote>
+</w:footnotes>
 </file>
 
 <file path=word/numbering.xml><?xml version="1.0" encoding="utf-8"?>
@@ -12031,6 +12152,50 @@
       <w14:ligatures w14:val="none"/>
     </w:rPr>
   </w:style>
+  <w:style w:type="paragraph" w:styleId="En-tte">
+    <w:name w:val="header"/>
+    <w:basedOn w:val="Normal"/>
+    <w:link w:val="En-tteCar"/>
+    <w:uiPriority w:val="99"/>
+    <w:unhideWhenUsed/>
+    <w:rsid w:val="00097D80"/>
+    <w:pPr>
+      <w:tabs>
+        <w:tab w:val="center" w:pos="4320"/>
+        <w:tab w:val="right" w:pos="8640"/>
+      </w:tabs>
+      <w:spacing w:after="0" w:line="240" w:lineRule="auto"/>
+    </w:pPr>
+  </w:style>
+  <w:style w:type="character" w:customStyle="1" w:styleId="En-tteCar">
+    <w:name w:val="En-tête Car"/>
+    <w:basedOn w:val="Policepardfaut"/>
+    <w:link w:val="En-tte"/>
+    <w:uiPriority w:val="99"/>
+    <w:rsid w:val="00097D80"/>
+  </w:style>
+  <w:style w:type="paragraph" w:styleId="Pieddepage">
+    <w:name w:val="footer"/>
+    <w:basedOn w:val="Normal"/>
+    <w:link w:val="PieddepageCar"/>
+    <w:uiPriority w:val="99"/>
+    <w:unhideWhenUsed/>
+    <w:rsid w:val="00097D80"/>
+    <w:pPr>
+      <w:tabs>
+        <w:tab w:val="center" w:pos="4320"/>
+        <w:tab w:val="right" w:pos="8640"/>
+      </w:tabs>
+      <w:spacing w:after="0" w:line="240" w:lineRule="auto"/>
+    </w:pPr>
+  </w:style>
+  <w:style w:type="character" w:customStyle="1" w:styleId="PieddepageCar">
+    <w:name w:val="Pied de page Car"/>
+    <w:basedOn w:val="Policepardfaut"/>
+    <w:link w:val="Pieddepage"/>
+    <w:uiPriority w:val="99"/>
+    <w:rsid w:val="00097D80"/>
+  </w:style>
 </w:styles>
 </file>
 

</xml_diff>

<commit_message>
correction de l'année dans les load
</commit_message>
<xml_diff>
--- a/man/Plan de travail pour Caro_janv 2025.docx
+++ b/man/Plan de travail pour Caro_janv 2025.docx
@@ -4290,6 +4290,7 @@
               <w:rPr>
                 <w:sz w:val="20"/>
                 <w:szCs w:val="20"/>
+                <w:highlight w:val="green"/>
                 <w:lang w:val="en-CA"/>
               </w:rPr>
             </w:pPr>
@@ -4298,6 +4299,7 @@
               <w:rPr>
                 <w:sz w:val="20"/>
                 <w:szCs w:val="20"/>
+                <w:highlight w:val="green"/>
                 <w:lang w:val="en-CA"/>
               </w:rPr>
               <w:t>load_</w:t>
@@ -4307,6 +4309,7 @@
               <w:rPr>
                 <w:sz w:val="20"/>
                 <w:szCs w:val="20"/>
+                <w:highlight w:val="green"/>
                 <w:lang w:val="en-CA"/>
               </w:rPr>
               <w:t>lac.R</w:t>
@@ -4321,6 +4324,7 @@
               <w:rPr>
                 <w:sz w:val="20"/>
                 <w:szCs w:val="20"/>
+                <w:highlight w:val="green"/>
                 <w:lang w:val="en-CA"/>
               </w:rPr>
             </w:pPr>
@@ -4329,6 +4333,7 @@
               <w:rPr>
                 <w:sz w:val="20"/>
                 <w:szCs w:val="20"/>
+                <w:highlight w:val="green"/>
                 <w:lang w:val="en-CA"/>
               </w:rPr>
               <w:t>load_</w:t>
@@ -4338,6 +4343,7 @@
               <w:rPr>
                 <w:sz w:val="20"/>
                 <w:szCs w:val="20"/>
+                <w:highlight w:val="green"/>
                 <w:lang w:val="en-CA"/>
               </w:rPr>
               <w:t>station.R</w:t>
@@ -4352,6 +4358,7 @@
               <w:rPr>
                 <w:sz w:val="20"/>
                 <w:szCs w:val="20"/>
+                <w:highlight w:val="green"/>
                 <w:lang w:val="en-CA"/>
               </w:rPr>
             </w:pPr>
@@ -4360,6 +4367,7 @@
               <w:rPr>
                 <w:sz w:val="20"/>
                 <w:szCs w:val="20"/>
+                <w:highlight w:val="green"/>
                 <w:lang w:val="en-CA"/>
               </w:rPr>
               <w:t>load_</w:t>
@@ -4369,6 +4377,7 @@
               <w:rPr>
                 <w:sz w:val="20"/>
                 <w:szCs w:val="20"/>
+                <w:highlight w:val="green"/>
                 <w:lang w:val="en-CA"/>
               </w:rPr>
               <w:t>recolte.R</w:t>
@@ -4383,6 +4392,7 @@
               <w:rPr>
                 <w:sz w:val="20"/>
                 <w:szCs w:val="20"/>
+                <w:highlight w:val="green"/>
                 <w:lang w:val="en-CA"/>
               </w:rPr>
             </w:pPr>
@@ -4391,6 +4401,7 @@
               <w:rPr>
                 <w:sz w:val="20"/>
                 <w:szCs w:val="20"/>
+                <w:highlight w:val="green"/>
                 <w:lang w:val="en-CA"/>
               </w:rPr>
               <w:t>load_</w:t>
@@ -4400,6 +4411,7 @@
               <w:rPr>
                 <w:sz w:val="20"/>
                 <w:szCs w:val="20"/>
+                <w:highlight w:val="green"/>
                 <w:lang w:val="en-CA"/>
               </w:rPr>
               <w:t>specimen.R</w:t>
@@ -4426,13 +4438,15 @@
                 <w:rFonts w:cstheme="minorHAnsi"/>
                 <w:sz w:val="20"/>
                 <w:szCs w:val="20"/>
-              </w:rPr>
-            </w:pPr>
-            <w:r>
-              <w:rPr>
-                <w:rFonts w:cstheme="minorHAnsi"/>
-                <w:sz w:val="20"/>
-                <w:szCs w:val="20"/>
+                <w:highlight w:val="green"/>
+              </w:rPr>
+            </w:pPr>
+            <w:r>
+              <w:rPr>
+                <w:rFonts w:cstheme="minorHAnsi"/>
+                <w:sz w:val="20"/>
+                <w:szCs w:val="20"/>
+                <w:highlight w:val="green"/>
               </w:rPr>
               <w:t>Quand on télécharge d’IFA, l’année est donnée en date, avec le 1</w:t>
             </w:r>
@@ -4441,6 +4455,7 @@
                 <w:rFonts w:cstheme="minorHAnsi"/>
                 <w:sz w:val="20"/>
                 <w:szCs w:val="20"/>
+                <w:highlight w:val="green"/>
                 <w:vertAlign w:val="superscript"/>
               </w:rPr>
               <w:t>er</w:t>
@@ -4450,6 +4465,7 @@
                 <w:rFonts w:cstheme="minorHAnsi"/>
                 <w:sz w:val="20"/>
                 <w:szCs w:val="20"/>
+                <w:highlight w:val="green"/>
               </w:rPr>
               <w:t xml:space="preserve"> janvier comme jour par défaut (1993-01-01 au lieu de 1993). Par conséquent, dans le choix des années, le choix est 33970 au lieu de 1993. Il faudrait transformer la variable « année » [4] en date et en extraire l’année uniquement pour qu’elle soit un entier numérique (as </w:t>
             </w:r>
@@ -4459,6 +4475,7 @@
                 <w:rFonts w:cstheme="minorHAnsi"/>
                 <w:sz w:val="20"/>
                 <w:szCs w:val="20"/>
+                <w:highlight w:val="green"/>
               </w:rPr>
               <w:t>integer</w:t>
             </w:r>
@@ -4468,6 +4485,7 @@
                 <w:rFonts w:cstheme="minorHAnsi"/>
                 <w:sz w:val="20"/>
                 <w:szCs w:val="20"/>
+                <w:highlight w:val="green"/>
               </w:rPr>
               <w:t xml:space="preserve"> avant </w:t>
             </w:r>
@@ -4477,6 +4495,7 @@
                 <w:rFonts w:cstheme="minorHAnsi"/>
                 <w:sz w:val="20"/>
                 <w:szCs w:val="20"/>
+                <w:highlight w:val="green"/>
               </w:rPr>
               <w:t>mutate</w:t>
             </w:r>
@@ -4486,6 +4505,7 @@
                 <w:rFonts w:cstheme="minorHAnsi"/>
                 <w:sz w:val="20"/>
                 <w:szCs w:val="20"/>
+                <w:highlight w:val="green"/>
               </w:rPr>
               <w:t xml:space="preserve"> as factor).</w:t>
             </w:r>
@@ -4498,6 +4518,7 @@
                 <w:rFonts w:cstheme="minorHAnsi"/>
                 <w:sz w:val="20"/>
                 <w:szCs w:val="20"/>
+                <w:highlight w:val="green"/>
               </w:rPr>
             </w:pPr>
           </w:p>
@@ -4509,6 +4530,7 @@
                 <w:rFonts w:cstheme="minorHAnsi"/>
                 <w:sz w:val="20"/>
                 <w:szCs w:val="20"/>
+                <w:highlight w:val="green"/>
               </w:rPr>
             </w:pPr>
           </w:p>

</xml_diff>

<commit_message>
enfin affichage des categories vides dans ggplot (misere)
</commit_message>
<xml_diff>
--- a/man/Plan de travail pour Caro_janv 2025.docx
+++ b/man/Plan de travail pour Caro_janv 2025.docx
@@ -7072,6 +7072,7 @@
               <w:rPr>
                 <w:sz w:val="20"/>
                 <w:szCs w:val="20"/>
+                <w:highlight w:val="green"/>
               </w:rPr>
             </w:pPr>
             <w:proofErr w:type="spellStart"/>
@@ -7080,6 +7081,7 @@
               <w:rPr>
                 <w:sz w:val="20"/>
                 <w:szCs w:val="20"/>
+                <w:highlight w:val="green"/>
               </w:rPr>
               <w:t>structure</w:t>
             </w:r>
@@ -7088,6 +7090,7 @@
               <w:rPr>
                 <w:sz w:val="20"/>
                 <w:szCs w:val="20"/>
+                <w:highlight w:val="green"/>
               </w:rPr>
               <w:t>_taille.R</w:t>
             </w:r>
@@ -7109,6 +7112,7 @@
               <w:rPr>
                 <w:sz w:val="20"/>
                 <w:szCs w:val="20"/>
+                <w:highlight w:val="green"/>
               </w:rPr>
             </w:pPr>
             <w:r>
@@ -7116,6 +7120,7 @@
                 <w:rFonts w:eastAsia="Times New Roman"/>
                 <w:sz w:val="20"/>
                 <w:szCs w:val="20"/>
+                <w:highlight w:val="green"/>
               </w:rPr>
               <w:t>Vérifier l’étiquette des abscisses. Il est recommandé de ne pas mettre les valeurs centrales mais plutôt les bornes supérieures et inférieures des intervalles.</w:t>
             </w:r>
@@ -7140,6 +7145,7 @@
               <w:rPr>
                 <w:sz w:val="20"/>
                 <w:szCs w:val="20"/>
+                <w:highlight w:val="green"/>
               </w:rPr>
             </w:pPr>
             <w:proofErr w:type="spellStart"/>
@@ -7148,6 +7154,7 @@
               <w:rPr>
                 <w:sz w:val="20"/>
                 <w:szCs w:val="20"/>
+                <w:highlight w:val="green"/>
               </w:rPr>
               <w:t>structure</w:t>
             </w:r>
@@ -7156,6 +7163,7 @@
               <w:rPr>
                 <w:sz w:val="20"/>
                 <w:szCs w:val="20"/>
+                <w:highlight w:val="green"/>
               </w:rPr>
               <w:t>_taille.R</w:t>
             </w:r>
@@ -7168,13 +7176,15 @@
               <w:rPr>
                 <w:sz w:val="20"/>
                 <w:szCs w:val="20"/>
-              </w:rPr>
-            </w:pPr>
-            <w:proofErr w:type="spellStart"/>
-            <w:r>
-              <w:rPr>
-                <w:sz w:val="20"/>
-                <w:szCs w:val="20"/>
+                <w:highlight w:val="green"/>
+              </w:rPr>
+            </w:pPr>
+            <w:proofErr w:type="spellStart"/>
+            <w:r>
+              <w:rPr>
+                <w:sz w:val="20"/>
+                <w:szCs w:val="20"/>
+                <w:highlight w:val="green"/>
               </w:rPr>
               <w:t>Structure_</w:t>
             </w:r>
@@ -7183,6 +7193,7 @@
               <w:rPr>
                 <w:sz w:val="20"/>
                 <w:szCs w:val="20"/>
+                <w:highlight w:val="green"/>
               </w:rPr>
               <w:t>age.R</w:t>
             </w:r>
@@ -7209,6 +7220,7 @@
                 <w:color w:val="70AD47" w:themeColor="accent6"/>
                 <w:sz w:val="20"/>
                 <w:szCs w:val="20"/>
+                <w:highlight w:val="green"/>
               </w:rPr>
             </w:pPr>
             <w:r>
@@ -7217,6 +7229,7 @@
                 <w:color w:val="70AD47" w:themeColor="accent6"/>
                 <w:sz w:val="20"/>
                 <w:szCs w:val="20"/>
+                <w:highlight w:val="green"/>
               </w:rPr>
               <w:t xml:space="preserve">Il faut utiliser les données de </w:t>
             </w:r>
@@ -7227,6 +7240,7 @@
                 <w:color w:val="70AD47" w:themeColor="accent6"/>
                 <w:sz w:val="20"/>
                 <w:szCs w:val="20"/>
+                <w:highlight w:val="green"/>
               </w:rPr>
               <w:t>specimen_</w:t>
             </w:r>
@@ -7237,6 +7251,7 @@
                 <w:color w:val="70AD47" w:themeColor="accent6"/>
                 <w:sz w:val="20"/>
                 <w:szCs w:val="20"/>
+                <w:highlight w:val="green"/>
               </w:rPr>
               <w:t>valid</w:t>
             </w:r>
@@ -7247,6 +7262,7 @@
                 <w:color w:val="70AD47" w:themeColor="accent6"/>
                 <w:sz w:val="20"/>
                 <w:szCs w:val="20"/>
+                <w:highlight w:val="green"/>
               </w:rPr>
               <w:t>(</w:t>
             </w:r>
@@ -7257,6 +7273,7 @@
                 <w:color w:val="70AD47" w:themeColor="accent6"/>
                 <w:sz w:val="20"/>
                 <w:szCs w:val="20"/>
+                <w:highlight w:val="green"/>
               </w:rPr>
               <w:t>)</w:t>
             </w:r>
@@ -7278,6 +7295,7 @@
                 <w:color w:val="70AD47" w:themeColor="accent6"/>
                 <w:sz w:val="20"/>
                 <w:szCs w:val="20"/>
+                <w:highlight w:val="green"/>
               </w:rPr>
               <w:t xml:space="preserve">[spécimens des stations valides, </w:t>
             </w:r>
@@ -7288,6 +7306,7 @@
                 <w:color w:val="70AD47" w:themeColor="accent6"/>
                 <w:sz w:val="20"/>
                 <w:szCs w:val="20"/>
+                <w:highlight w:val="green"/>
               </w:rPr>
               <w:t>hasard+dirigés</w:t>
             </w:r>
@@ -7298,6 +7317,7 @@
                 <w:color w:val="70AD47" w:themeColor="accent6"/>
                 <w:sz w:val="20"/>
                 <w:szCs w:val="20"/>
+                <w:highlight w:val="green"/>
               </w:rPr>
               <w:t>)</w:t>
             </w:r>
@@ -7351,13 +7371,33 @@
                 <w:szCs w:val="20"/>
                 <w:highlight w:val="green"/>
               </w:rPr>
-              <w:t>Modifier le titre de l’axe des y : « Nb. dorés jaunes échantillonnés »</w:t>
-            </w:r>
+              <w:t xml:space="preserve">Modifier le titre de l’axe des y : « Nb. </w:t>
+            </w:r>
+            <w:proofErr w:type="gramStart"/>
             <w:r>
               <w:rPr>
                 <w:rFonts w:eastAsia="Times New Roman"/>
                 <w:sz w:val="20"/>
                 <w:szCs w:val="20"/>
+                <w:highlight w:val="green"/>
+              </w:rPr>
+              <w:t>dorés</w:t>
+            </w:r>
+            <w:proofErr w:type="gramEnd"/>
+            <w:r>
+              <w:rPr>
+                <w:rFonts w:eastAsia="Times New Roman"/>
+                <w:sz w:val="20"/>
+                <w:szCs w:val="20"/>
+                <w:highlight w:val="green"/>
+              </w:rPr>
+              <w:t xml:space="preserve"> jaunes échantillonnés »</w:t>
+            </w:r>
+            <w:r>
+              <w:rPr>
+                <w:rFonts w:eastAsia="Times New Roman"/>
+                <w:sz w:val="20"/>
+                <w:szCs w:val="20"/>
               </w:rPr>
               <w:t> </w:t>
             </w:r>
@@ -7368,6 +7408,7 @@
                 <w:rFonts w:eastAsia="Times New Roman"/>
                 <w:sz w:val="20"/>
                 <w:szCs w:val="20"/>
+                <w:lang w:val="en-CA"/>
               </w:rPr>
             </w:pPr>
           </w:p>

</xml_diff>

<commit_message>
debut maj. de calcul CPUE
</commit_message>
<xml_diff>
--- a/man/Plan de travail pour Caro_janv 2025.docx
+++ b/man/Plan de travail pour Caro_janv 2025.docx
@@ -5339,6 +5339,7 @@
                 <w:color w:val="70AD47" w:themeColor="accent6"/>
                 <w:sz w:val="20"/>
                 <w:szCs w:val="20"/>
+                <w:highlight w:val="green"/>
               </w:rPr>
             </w:pPr>
             <w:r>
@@ -5347,6 +5348,7 @@
                 <w:color w:val="70AD47" w:themeColor="accent6"/>
                 <w:sz w:val="20"/>
                 <w:szCs w:val="20"/>
+                <w:highlight w:val="green"/>
               </w:rPr>
               <w:t xml:space="preserve">Il faut utiliser les données de </w:t>
             </w:r>
@@ -5357,6 +5359,7 @@
                 <w:color w:val="70AD47" w:themeColor="accent6"/>
                 <w:sz w:val="20"/>
                 <w:szCs w:val="20"/>
+                <w:highlight w:val="green"/>
               </w:rPr>
               <w:t>capture(</w:t>
             </w:r>
@@ -5367,6 +5370,7 @@
                 <w:color w:val="70AD47" w:themeColor="accent6"/>
                 <w:sz w:val="20"/>
                 <w:szCs w:val="20"/>
+                <w:highlight w:val="green"/>
               </w:rPr>
               <w:t>)</w:t>
             </w:r>
@@ -5388,6 +5392,7 @@
                 <w:color w:val="70AD47" w:themeColor="accent6"/>
                 <w:sz w:val="20"/>
                 <w:szCs w:val="20"/>
+                <w:highlight w:val="green"/>
               </w:rPr>
               <w:t>[récolte des stations valides et au hasard, incluant les stations avec 0 captures]</w:t>
             </w:r>
@@ -5404,20 +5409,30 @@
           <w:p>
             <w:pPr>
               <w:contextualSpacing/>
-            </w:pPr>
-            <w:r>
-              <w:rPr>
-                <w:sz w:val="20"/>
-                <w:szCs w:val="20"/>
+              <w:rPr>
+                <w:highlight w:val="green"/>
+              </w:rPr>
+            </w:pPr>
+            <w:r>
+              <w:rPr>
+                <w:sz w:val="20"/>
+                <w:szCs w:val="20"/>
+                <w:highlight w:val="green"/>
               </w:rPr>
               <w:t xml:space="preserve">Il faudrait vérifier si les modèles ont convergé avec </w:t>
             </w:r>
             <w:proofErr w:type="spellStart"/>
             <w:r>
+              <w:rPr>
+                <w:highlight w:val="green"/>
+              </w:rPr>
               <w:t>my_model_name$converged</w:t>
             </w:r>
             <w:proofErr w:type="spellEnd"/>
             <w:r>
+              <w:rPr>
+                <w:highlight w:val="green"/>
+              </w:rPr>
               <w:t xml:space="preserve"> (TRUE or FALSE)</w:t>
             </w:r>
           </w:p>
@@ -5433,6 +5448,7 @@
               <w:rPr>
                 <w:sz w:val="20"/>
                 <w:szCs w:val="20"/>
+                <w:highlight w:val="green"/>
               </w:rPr>
               <w:t>Et si c’est FALSE, l’indiquer dans les commentaires</w:t>
             </w:r>
@@ -5458,6 +5474,7 @@
               <w:rPr>
                 <w:sz w:val="20"/>
                 <w:szCs w:val="20"/>
+                <w:highlight w:val="green"/>
               </w:rPr>
               <w:t xml:space="preserve">Enlever le model </w:t>
             </w:r>
@@ -5466,6 +5483,7 @@
               <w:rPr>
                 <w:sz w:val="20"/>
                 <w:szCs w:val="20"/>
+                <w:highlight w:val="green"/>
               </w:rPr>
               <w:t>averaging</w:t>
             </w:r>
@@ -5474,6 +5492,7 @@
               <w:rPr>
                 <w:sz w:val="20"/>
                 <w:szCs w:val="20"/>
+                <w:highlight w:val="green"/>
               </w:rPr>
               <w:t xml:space="preserve"> (modèle « compromis »).</w:t>
             </w:r>
@@ -5552,12 +5571,14 @@
               <w:rPr>
                 <w:sz w:val="20"/>
                 <w:szCs w:val="20"/>
-              </w:rPr>
-            </w:pPr>
-            <w:r>
-              <w:rPr>
-                <w:sz w:val="20"/>
-                <w:szCs w:val="20"/>
+                <w:highlight w:val="green"/>
+              </w:rPr>
+            </w:pPr>
+            <w:r>
+              <w:rPr>
+                <w:sz w:val="20"/>
+                <w:szCs w:val="20"/>
+                <w:highlight w:val="green"/>
               </w:rPr>
               <w:t xml:space="preserve">l. 471 à 473 : La sélection des modèles de CPUE est basée sur le test </w:t>
             </w:r>
@@ -5566,6 +5587,7 @@
               <w:rPr>
                 <w:sz w:val="20"/>
                 <w:szCs w:val="20"/>
+                <w:highlight w:val="green"/>
               </w:rPr>
               <w:t>hnp</w:t>
             </w:r>
@@ -5574,6 +5596,7 @@
               <w:rPr>
                 <w:sz w:val="20"/>
                 <w:szCs w:val="20"/>
+                <w:highlight w:val="green"/>
               </w:rPr>
               <w:t xml:space="preserve"> seulement. Ajouter le </w:t>
             </w:r>
@@ -5582,6 +5605,7 @@
               <w:rPr>
                 <w:sz w:val="20"/>
                 <w:szCs w:val="20"/>
+                <w:highlight w:val="green"/>
               </w:rPr>
               <w:t>AICc</w:t>
             </w:r>
@@ -5590,6 +5614,7 @@
               <w:rPr>
                 <w:sz w:val="20"/>
                 <w:szCs w:val="20"/>
+                <w:highlight w:val="green"/>
               </w:rPr>
               <w:t xml:space="preserve"> et </w:t>
             </w:r>
@@ -5601,6 +5626,7 @@
                 <w:color w:val="333333"/>
                 <w:sz w:val="21"/>
                 <w:szCs w:val="21"/>
+                <w:highlight w:val="green"/>
                 <w:shd w:val="clear" w:color="auto" w:fill="FFFFFF"/>
               </w:rPr>
               <w:t xml:space="preserve">Δ </w:t>
@@ -5614,6 +5640,7 @@
                 <w:color w:val="333333"/>
                 <w:sz w:val="21"/>
                 <w:szCs w:val="21"/>
+                <w:highlight w:val="green"/>
                 <w:shd w:val="clear" w:color="auto" w:fill="FFFFFF"/>
               </w:rPr>
               <w:t>AICc</w:t>
@@ -5627,6 +5654,7 @@
                 <w:color w:val="333333"/>
                 <w:sz w:val="21"/>
                 <w:szCs w:val="21"/>
+                <w:highlight w:val="green"/>
                 <w:shd w:val="clear" w:color="auto" w:fill="FFFFFF"/>
               </w:rPr>
               <w:t xml:space="preserve"> </w:t>
@@ -5635,6 +5663,7 @@
               <w:rPr>
                 <w:sz w:val="20"/>
                 <w:szCs w:val="20"/>
+                <w:highlight w:val="green"/>
               </w:rPr>
               <w:t>dans le tableau des résultats</w:t>
             </w:r>
@@ -5642,6 +5671,7 @@
               <w:rPr>
                 <w:sz w:val="20"/>
                 <w:szCs w:val="20"/>
+                <w:highlight w:val="green"/>
               </w:rPr>
               <w:t xml:space="preserve"> et baser la sélection du meilleur modèle à partir de l’</w:t>
             </w:r>
@@ -5650,6 +5680,7 @@
               <w:rPr>
                 <w:sz w:val="20"/>
                 <w:szCs w:val="20"/>
+                <w:highlight w:val="green"/>
               </w:rPr>
               <w:t>AIC</w:t>
             </w:r>
@@ -5657,6 +5688,7 @@
               <w:rPr>
                 <w:sz w:val="20"/>
                 <w:szCs w:val="20"/>
+                <w:highlight w:val="green"/>
               </w:rPr>
               <w:t>c</w:t>
             </w:r>
@@ -5665,6 +5697,7 @@
               <w:rPr>
                 <w:sz w:val="20"/>
                 <w:szCs w:val="20"/>
+                <w:highlight w:val="green"/>
               </w:rPr>
               <w:t xml:space="preserve"> (attention, ce filtre doit être fait parmi les modèles qui s’ajustent bien uniquement)</w:t>
             </w:r>
@@ -5675,6 +5708,7 @@
               <w:rPr>
                 <w:sz w:val="20"/>
                 <w:szCs w:val="20"/>
+                <w:highlight w:val="green"/>
               </w:rPr>
             </w:pPr>
           </w:p>
@@ -5684,12 +5718,14 @@
               <w:rPr>
                 <w:sz w:val="20"/>
                 <w:szCs w:val="20"/>
-              </w:rPr>
-            </w:pPr>
-            <w:r>
-              <w:rPr>
-                <w:sz w:val="20"/>
-                <w:szCs w:val="20"/>
+                <w:highlight w:val="green"/>
+              </w:rPr>
+            </w:pPr>
+            <w:r>
+              <w:rPr>
+                <w:sz w:val="20"/>
+                <w:szCs w:val="20"/>
+                <w:highlight w:val="green"/>
               </w:rPr>
               <w:t>Ajouter du texte pour orienter l’utilisateur sur le choix du modèle.</w:t>
             </w:r>
@@ -5700,6 +5736,7 @@
               <w:rPr>
                 <w:sz w:val="20"/>
                 <w:szCs w:val="20"/>
+                <w:highlight w:val="green"/>
               </w:rPr>
             </w:pPr>
           </w:p>
@@ -5715,12 +5752,14 @@
               <w:rPr>
                 <w:sz w:val="20"/>
                 <w:szCs w:val="20"/>
-              </w:rPr>
-            </w:pPr>
-            <w:r>
-              <w:rPr>
-                <w:sz w:val="20"/>
-                <w:szCs w:val="20"/>
+                <w:highlight w:val="green"/>
+              </w:rPr>
+            </w:pPr>
+            <w:r>
+              <w:rPr>
+                <w:sz w:val="20"/>
+                <w:szCs w:val="20"/>
+                <w:highlight w:val="green"/>
               </w:rPr>
               <w:t>Pour les modèles qui s’aju</w:t>
             </w:r>
@@ -5728,6 +5767,7 @@
               <w:rPr>
                 <w:sz w:val="20"/>
                 <w:szCs w:val="20"/>
+                <w:highlight w:val="green"/>
               </w:rPr>
               <w:t>s</w:t>
             </w:r>
@@ -5735,6 +5775,7 @@
               <w:rPr>
                 <w:sz w:val="20"/>
                 <w:szCs w:val="20"/>
+                <w:highlight w:val="green"/>
               </w:rPr>
               <w:t xml:space="preserve">tent bien aux données, le modèle ayant le plus bas </w:t>
             </w:r>
@@ -5743,6 +5784,7 @@
               <w:rPr>
                 <w:sz w:val="20"/>
                 <w:szCs w:val="20"/>
+                <w:highlight w:val="green"/>
               </w:rPr>
               <w:t>AICc</w:t>
             </w:r>
@@ -5751,6 +5793,7 @@
               <w:rPr>
                 <w:sz w:val="20"/>
                 <w:szCs w:val="20"/>
+                <w:highlight w:val="green"/>
               </w:rPr>
               <w:t xml:space="preserve"> doit avoir le commentaire suivant : « </w:t>
             </w:r>
@@ -5758,6 +5801,7 @@
               <w:rPr>
                 <w:sz w:val="20"/>
                 <w:szCs w:val="20"/>
+                <w:highlight w:val="green"/>
               </w:rPr>
               <w:t xml:space="preserve">Le modèle XX s’ajuste bien à vos données. </w:t>
             </w:r>
@@ -5765,6 +5809,7 @@
               <w:rPr>
                 <w:sz w:val="20"/>
                 <w:szCs w:val="20"/>
+                <w:highlight w:val="green"/>
               </w:rPr>
               <w:t xml:space="preserve">Ce modèle est recommandé car son </w:t>
             </w:r>
@@ -5773,6 +5818,7 @@
               <w:rPr>
                 <w:sz w:val="20"/>
                 <w:szCs w:val="20"/>
+                <w:highlight w:val="green"/>
               </w:rPr>
               <w:t>AICc</w:t>
             </w:r>
@@ -5781,6 +5827,7 @@
               <w:rPr>
                 <w:sz w:val="20"/>
                 <w:szCs w:val="20"/>
+                <w:highlight w:val="green"/>
               </w:rPr>
               <w:t xml:space="preserve"> est le plus faible »</w:t>
             </w:r>
@@ -5788,6 +5835,7 @@
               <w:rPr>
                 <w:sz w:val="20"/>
                 <w:szCs w:val="20"/>
+                <w:highlight w:val="green"/>
               </w:rPr>
               <w:t>;</w:t>
             </w:r>
@@ -5804,12 +5852,14 @@
               <w:rPr>
                 <w:sz w:val="20"/>
                 <w:szCs w:val="20"/>
-              </w:rPr>
-            </w:pPr>
-            <w:r>
-              <w:rPr>
-                <w:sz w:val="20"/>
-                <w:szCs w:val="20"/>
+                <w:highlight w:val="green"/>
+              </w:rPr>
+            </w:pPr>
+            <w:r>
+              <w:rPr>
+                <w:sz w:val="20"/>
+                <w:szCs w:val="20"/>
+                <w:highlight w:val="green"/>
               </w:rPr>
               <w:t xml:space="preserve">Si aucun modèle ne s’ajuste bien aux données, choisir le modèle ayant le plus bas </w:t>
             </w:r>
@@ -5818,6 +5868,7 @@
               <w:rPr>
                 <w:sz w:val="20"/>
                 <w:szCs w:val="20"/>
+                <w:highlight w:val="green"/>
               </w:rPr>
               <w:t>AICc</w:t>
             </w:r>
@@ -5826,6 +5877,7 @@
               <w:rPr>
                 <w:sz w:val="20"/>
                 <w:szCs w:val="20"/>
+                <w:highlight w:val="green"/>
               </w:rPr>
               <w:t>.</w:t>
             </w:r>
@@ -5833,6 +5885,7 @@
               <w:rPr>
                 <w:sz w:val="20"/>
                 <w:szCs w:val="20"/>
+                <w:highlight w:val="green"/>
               </w:rPr>
               <w:t xml:space="preserve"> Le commentaire à ajouter serait donc : « Le modèle XX ne s’ajuste pas bien à vos données. Il s’agit toutefois du meilleur modèle parmi les options disponibles. » </w:t>
             </w:r>
@@ -5852,12 +5905,14 @@
               <w:rPr>
                 <w:sz w:val="20"/>
                 <w:szCs w:val="20"/>
-              </w:rPr>
-            </w:pPr>
-            <w:r>
-              <w:rPr>
-                <w:sz w:val="20"/>
-                <w:szCs w:val="20"/>
+                <w:highlight w:val="green"/>
+              </w:rPr>
+            </w:pPr>
+            <w:r>
+              <w:rPr>
+                <w:sz w:val="20"/>
+                <w:szCs w:val="20"/>
+                <w:highlight w:val="green"/>
               </w:rPr>
               <w:t xml:space="preserve">Intervalle de confiance (l.80 à 103) : </w:t>
             </w:r>
@@ -5865,6 +5920,7 @@
               <w:rPr>
                 <w:sz w:val="20"/>
                 <w:szCs w:val="20"/>
+                <w:highlight w:val="green"/>
               </w:rPr>
               <w:t>Utiliser l’option décrite ci-dessous qui est aussi celle utilisée aux l. 498 à 507. S’assurer que cette méthode de calcul des IC est utilisé</w:t>
             </w:r>
@@ -5872,6 +5928,7 @@
               <w:rPr>
                 <w:sz w:val="20"/>
                 <w:szCs w:val="20"/>
+                <w:highlight w:val="green"/>
               </w:rPr>
               <w:t>e</w:t>
             </w:r>
@@ -5879,6 +5936,7 @@
               <w:rPr>
                 <w:sz w:val="20"/>
                 <w:szCs w:val="20"/>
+                <w:highlight w:val="green"/>
               </w:rPr>
               <w:t xml:space="preserve"> pour tous les modèles</w:t>
             </w:r>
@@ -5889,14 +5947,16 @@
               <w:rPr>
                 <w:sz w:val="20"/>
                 <w:szCs w:val="20"/>
-              </w:rPr>
-            </w:pPr>
-          </w:p>
-          <w:p>
-            <w:pPr>
-              <w:rPr>
-                <w:sz w:val="20"/>
-                <w:szCs w:val="20"/>
+                <w:highlight w:val="green"/>
+              </w:rPr>
+            </w:pPr>
+          </w:p>
+          <w:p>
+            <w:pPr>
+              <w:rPr>
+                <w:sz w:val="20"/>
+                <w:szCs w:val="20"/>
+                <w:highlight w:val="green"/>
                 <w:lang w:val="en-CA"/>
               </w:rPr>
             </w:pPr>
@@ -5905,6 +5965,7 @@
               <w:rPr>
                 <w:sz w:val="20"/>
                 <w:szCs w:val="20"/>
+                <w:highlight w:val="green"/>
                 <w:lang w:val="en-CA"/>
               </w:rPr>
               <w:t>CPUEfinal.p</w:t>
@@ -5914,6 +5975,7 @@
               <w:rPr>
                 <w:sz w:val="20"/>
                 <w:szCs w:val="20"/>
+                <w:highlight w:val="green"/>
                 <w:lang w:val="en-CA"/>
               </w:rPr>
               <w:t xml:space="preserve"> = </w:t>
@@ -5923,6 +5985,7 @@
               <w:rPr>
                 <w:sz w:val="20"/>
                 <w:szCs w:val="20"/>
+                <w:highlight w:val="green"/>
                 <w:lang w:val="en-CA"/>
               </w:rPr>
               <w:t>exp(</w:t>
@@ -5933,6 +5996,7 @@
               <w:rPr>
                 <w:sz w:val="20"/>
                 <w:szCs w:val="20"/>
+                <w:highlight w:val="green"/>
                 <w:lang w:val="en-CA"/>
               </w:rPr>
               <w:t>predM.p$fit</w:t>
@@ -5942,6 +6006,7 @@
               <w:rPr>
                 <w:sz w:val="20"/>
                 <w:szCs w:val="20"/>
+                <w:highlight w:val="green"/>
                 <w:lang w:val="en-CA"/>
               </w:rPr>
               <w:t>)</w:t>
@@ -5952,6 +6017,7 @@
               <w:rPr>
                 <w:sz w:val="20"/>
                 <w:szCs w:val="20"/>
+                <w:highlight w:val="green"/>
                 <w:lang w:val="en-CA"/>
               </w:rPr>
             </w:pPr>
@@ -5960,6 +6026,7 @@
               <w:rPr>
                 <w:sz w:val="20"/>
                 <w:szCs w:val="20"/>
+                <w:highlight w:val="green"/>
                 <w:lang w:val="en-CA"/>
               </w:rPr>
               <w:t>linf</w:t>
@@ -5969,6 +6036,7 @@
               <w:rPr>
                 <w:sz w:val="20"/>
                 <w:szCs w:val="20"/>
+                <w:highlight w:val="green"/>
                 <w:lang w:val="en-CA"/>
               </w:rPr>
               <w:t xml:space="preserve"> = </w:t>
@@ -5978,6 +6046,7 @@
               <w:rPr>
                 <w:sz w:val="20"/>
                 <w:szCs w:val="20"/>
+                <w:highlight w:val="green"/>
                 <w:lang w:val="en-CA"/>
               </w:rPr>
               <w:t>exp(</w:t>
@@ -5988,6 +6057,7 @@
               <w:rPr>
                 <w:sz w:val="20"/>
                 <w:szCs w:val="20"/>
+                <w:highlight w:val="green"/>
                 <w:lang w:val="en-CA"/>
               </w:rPr>
               <w:t>predM.p$fit</w:t>
@@ -5997,6 +6067,7 @@
               <w:rPr>
                 <w:sz w:val="20"/>
                 <w:szCs w:val="20"/>
+                <w:highlight w:val="green"/>
                 <w:lang w:val="en-CA"/>
               </w:rPr>
               <w:t xml:space="preserve"> – 1.96*</w:t>
@@ -6006,6 +6077,7 @@
               <w:rPr>
                 <w:sz w:val="20"/>
                 <w:szCs w:val="20"/>
+                <w:highlight w:val="green"/>
                 <w:lang w:val="en-CA"/>
               </w:rPr>
               <w:t>predM.p$se.fit</w:t>
@@ -6015,6 +6087,7 @@
               <w:rPr>
                 <w:sz w:val="20"/>
                 <w:szCs w:val="20"/>
+                <w:highlight w:val="green"/>
                 <w:lang w:val="en-CA"/>
               </w:rPr>
               <w:t>)</w:t>
@@ -6033,6 +6106,7 @@
               <w:rPr>
                 <w:sz w:val="20"/>
                 <w:szCs w:val="20"/>
+                <w:highlight w:val="green"/>
                 <w:lang w:val="en-CA"/>
               </w:rPr>
               <w:t>lsup</w:t>
@@ -6042,6 +6116,7 @@
               <w:rPr>
                 <w:sz w:val="20"/>
                 <w:szCs w:val="20"/>
+                <w:highlight w:val="green"/>
                 <w:lang w:val="en-CA"/>
               </w:rPr>
               <w:t xml:space="preserve"> = </w:t>
@@ -6051,6 +6126,7 @@
               <w:rPr>
                 <w:sz w:val="20"/>
                 <w:szCs w:val="20"/>
+                <w:highlight w:val="green"/>
                 <w:lang w:val="en-CA"/>
               </w:rPr>
               <w:t>exp(</w:t>
@@ -6061,6 +6137,7 @@
               <w:rPr>
                 <w:sz w:val="20"/>
                 <w:szCs w:val="20"/>
+                <w:highlight w:val="green"/>
                 <w:lang w:val="en-CA"/>
               </w:rPr>
               <w:t>predM.p$fit</w:t>
@@ -6070,6 +6147,7 @@
               <w:rPr>
                 <w:sz w:val="20"/>
                 <w:szCs w:val="20"/>
+                <w:highlight w:val="green"/>
                 <w:lang w:val="en-CA"/>
               </w:rPr>
               <w:t xml:space="preserve"> + 1.96*</w:t>
@@ -6079,6 +6157,7 @@
               <w:rPr>
                 <w:sz w:val="20"/>
                 <w:szCs w:val="20"/>
+                <w:highlight w:val="green"/>
                 <w:lang w:val="en-CA"/>
               </w:rPr>
               <w:t>predM.p$se.fit</w:t>
@@ -6088,6 +6167,7 @@
               <w:rPr>
                 <w:sz w:val="20"/>
                 <w:szCs w:val="20"/>
+                <w:highlight w:val="green"/>
                 <w:lang w:val="en-CA"/>
               </w:rPr>
               <w:t>)</w:t>

</xml_diff>

<commit_message>
update relation masse-longueur et ses coefficients
</commit_message>
<xml_diff>
--- a/man/Plan de travail pour Caro_janv 2025.docx
+++ b/man/Plan de travail pour Caro_janv 2025.docx
@@ -6357,7 +6357,6 @@
                 <w:sz w:val="20"/>
                 <w:szCs w:val="20"/>
                 <w:highlight w:val="green"/>
-                <w:lang w:val="en-CA"/>
               </w:rPr>
             </w:pPr>
             <w:r>
@@ -7789,6 +7788,7 @@
               <w:rPr>
                 <w:sz w:val="20"/>
                 <w:szCs w:val="20"/>
+                <w:highlight w:val="green"/>
                 <w:lang w:val="en-CA"/>
               </w:rPr>
             </w:pPr>
@@ -7797,25 +7797,10 @@
               <w:rPr>
                 <w:sz w:val="20"/>
                 <w:szCs w:val="20"/>
+                <w:highlight w:val="green"/>
                 <w:lang w:val="en-CA"/>
               </w:rPr>
-              <w:t>relation</w:t>
-            </w:r>
-            <w:r>
-              <w:rPr>
-                <w:sz w:val="20"/>
-                <w:szCs w:val="20"/>
-                <w:lang w:val="en-CA"/>
-              </w:rPr>
-              <w:t>_</w:t>
-            </w:r>
-            <w:r>
-              <w:rPr>
-                <w:sz w:val="20"/>
-                <w:szCs w:val="20"/>
-                <w:lang w:val="en-CA"/>
-              </w:rPr>
-              <w:t>masse</w:t>
+              <w:t>relation_masse</w:t>
             </w:r>
             <w:proofErr w:type="spellEnd"/>
           </w:p>
@@ -7833,6 +7818,7 @@
               <w:rPr>
                 <w:sz w:val="20"/>
                 <w:szCs w:val="20"/>
+                <w:highlight w:val="green"/>
                 <w:lang w:val="en-CA"/>
               </w:rPr>
               <w:t>_</w:t>
@@ -7843,17 +7829,10 @@
               <w:rPr>
                 <w:sz w:val="20"/>
                 <w:szCs w:val="20"/>
+                <w:highlight w:val="green"/>
                 <w:lang w:val="en-CA"/>
               </w:rPr>
-              <w:t>longueur</w:t>
-            </w:r>
-            <w:r>
-              <w:rPr>
-                <w:sz w:val="20"/>
-                <w:szCs w:val="20"/>
-                <w:lang w:val="en-CA"/>
-              </w:rPr>
-              <w:t>.R</w:t>
+              <w:t>longueur.R</w:t>
             </w:r>
             <w:proofErr w:type="spellEnd"/>
             <w:proofErr w:type="gramEnd"/>
@@ -7948,12 +7927,14 @@
           <w:p>
             <w:pPr>
               <w:rPr>
-                <w:sz w:val="20"/>
-                <w:szCs w:val="20"/>
-              </w:rPr>
-            </w:pPr>
-            <w:r>
-              <w:rPr>
+                <w:strike/>
+                <w:sz w:val="20"/>
+                <w:szCs w:val="20"/>
+              </w:rPr>
+            </w:pPr>
+            <w:r>
+              <w:rPr>
+                <w:strike/>
                 <w:sz w:val="20"/>
                 <w:szCs w:val="20"/>
                 <w:highlight w:val="green"/>
@@ -7976,6 +7957,7 @@
                 <w:rFonts w:eastAsia="Times New Roman"/>
                 <w:sz w:val="20"/>
                 <w:szCs w:val="20"/>
+                <w:highlight w:val="green"/>
               </w:rPr>
             </w:pPr>
             <w:r>
@@ -7983,6 +7965,7 @@
                 <w:rFonts w:eastAsia="Times New Roman"/>
                 <w:sz w:val="20"/>
                 <w:szCs w:val="20"/>
+                <w:highlight w:val="green"/>
               </w:rPr>
               <w:t>Ajouter l’erreur associé aux coefficients (SE ou IC95%)</w:t>
             </w:r>
@@ -7993,29 +7976,24 @@
                 <w:rFonts w:eastAsia="Times New Roman"/>
                 <w:sz w:val="20"/>
                 <w:szCs w:val="20"/>
-              </w:rPr>
-            </w:pPr>
-          </w:p>
-          <w:p>
-            <w:pPr>
-              <w:rPr>
-                <w:sz w:val="20"/>
-                <w:szCs w:val="20"/>
-              </w:rPr>
-            </w:pPr>
-            <w:r>
-              <w:rPr>
-                <w:sz w:val="20"/>
-                <w:szCs w:val="20"/>
-              </w:rPr>
-              <w:t>l. 66. + 200 : Il y a parfois des problèmes d’affichage des coefficients dépendant de l’étendue des valeurs de LTM. Nous proposons de sortir les valeurs dans un tableau avec estimé et SE</w:t>
-            </w:r>
-            <w:r>
-              <w:rPr>
-                <w:sz w:val="20"/>
-                <w:szCs w:val="20"/>
-              </w:rPr>
-              <w:t>.</w:t>
+                <w:highlight w:val="green"/>
+              </w:rPr>
+            </w:pPr>
+          </w:p>
+          <w:p>
+            <w:pPr>
+              <w:rPr>
+                <w:sz w:val="20"/>
+                <w:szCs w:val="20"/>
+              </w:rPr>
+            </w:pPr>
+            <w:r>
+              <w:rPr>
+                <w:sz w:val="20"/>
+                <w:szCs w:val="20"/>
+                <w:highlight w:val="green"/>
+              </w:rPr>
+              <w:t>l. 66. + 200 : Il y a parfois des problèmes d’affichage des coefficients dépendant de l’étendue des valeurs de LTM. Nous proposons de sortir les valeurs dans un tableau avec estimé et SE.</w:t>
             </w:r>
           </w:p>
           <w:p>

</xml_diff>

<commit_message>
modele de croissance fxne maintenant
</commit_message>
<xml_diff>
--- a/man/Plan de travail pour Caro_janv 2025.docx
+++ b/man/Plan de travail pour Caro_janv 2025.docx
@@ -341,7 +341,6 @@
         </w:rPr>
       </w:pPr>
       <w:proofErr w:type="spellStart"/>
-      <w:proofErr w:type="gramStart"/>
       <w:r>
         <w:rPr>
           <w:b/>
@@ -355,14 +354,7 @@
         <w:rPr>
           <w:highlight w:val="green"/>
         </w:rPr>
-        <w:t>(</w:t>
-      </w:r>
-      <w:proofErr w:type="gramEnd"/>
-      <w:r>
-        <w:rPr>
-          <w:highlight w:val="green"/>
-        </w:rPr>
-        <w:t xml:space="preserve">) : fusion de </w:t>
+        <w:t xml:space="preserve">() : fusion de </w:t>
       </w:r>
       <w:proofErr w:type="spellStart"/>
       <w:r>
@@ -541,7 +533,6 @@
           <w:highlight w:val="green"/>
         </w:rPr>
       </w:pPr>
-      <w:proofErr w:type="gramStart"/>
       <w:r>
         <w:rPr>
           <w:b/>
@@ -554,14 +545,7 @@
         <w:rPr>
           <w:highlight w:val="green"/>
         </w:rPr>
-        <w:t>(</w:t>
-      </w:r>
-      <w:proofErr w:type="gramEnd"/>
-      <w:r>
-        <w:rPr>
-          <w:highlight w:val="green"/>
-        </w:rPr>
-        <w:t xml:space="preserve">) :  fusion de </w:t>
+        <w:t xml:space="preserve">() :  fusion de </w:t>
       </w:r>
       <w:r>
         <w:rPr>
@@ -646,7 +630,6 @@
         </w:rPr>
       </w:pPr>
       <w:proofErr w:type="spellStart"/>
-      <w:proofErr w:type="gramStart"/>
       <w:r>
         <w:rPr>
           <w:b/>
@@ -660,14 +643,7 @@
         <w:rPr>
           <w:highlight w:val="green"/>
         </w:rPr>
-        <w:t>(</w:t>
-      </w:r>
-      <w:proofErr w:type="gramEnd"/>
-      <w:r>
-        <w:rPr>
-          <w:highlight w:val="green"/>
-        </w:rPr>
-        <w:t xml:space="preserve">) : fusion de </w:t>
+        <w:t xml:space="preserve">() : fusion de </w:t>
       </w:r>
       <w:proofErr w:type="spellStart"/>
       <w:r>
@@ -772,30 +748,14 @@
           <w:bCs/>
           <w:highlight w:val="green"/>
         </w:rPr>
-        <w:t>specimen_</w:t>
-      </w:r>
-      <w:proofErr w:type="gramStart"/>
-      <w:r>
-        <w:rPr>
-          <w:b/>
-          <w:bCs/>
-          <w:highlight w:val="green"/>
-        </w:rPr>
-        <w:t>valid</w:t>
+        <w:t>specimen_valid</w:t>
       </w:r>
       <w:proofErr w:type="spellEnd"/>
       <w:r>
         <w:rPr>
           <w:highlight w:val="green"/>
         </w:rPr>
-        <w:t>(</w:t>
-      </w:r>
-      <w:proofErr w:type="gramEnd"/>
-      <w:r>
-        <w:rPr>
-          <w:highlight w:val="green"/>
-        </w:rPr>
-        <w:t xml:space="preserve">) pour </w:t>
+        <w:t xml:space="preserve">() pour </w:t>
       </w:r>
       <w:r>
         <w:rPr>
@@ -816,59 +776,103 @@
         <w:ind w:left="720"/>
       </w:pPr>
       <w:r>
+        <w:rPr>
+          <w:highlight w:val="yellow"/>
+        </w:rPr>
         <w:t xml:space="preserve">Il m’est cependant </w:t>
       </w:r>
       <w:r>
+        <w:rPr>
+          <w:highlight w:val="yellow"/>
+        </w:rPr>
         <w:t>parfois</w:t>
       </w:r>
       <w:r>
+        <w:rPr>
+          <w:highlight w:val="yellow"/>
+        </w:rPr>
         <w:t xml:space="preserve"> difficile de vérifier quelle base de données est utilisé</w:t>
       </w:r>
       <w:r>
+        <w:rPr>
+          <w:highlight w:val="yellow"/>
+        </w:rPr>
         <w:t>e</w:t>
       </w:r>
       <w:r>
+        <w:rPr>
+          <w:highlight w:val="yellow"/>
+        </w:rPr>
         <w:t xml:space="preserve"> dans chaque analyse. J’ai donc opté pour inscrire la base de donnée</w:t>
       </w:r>
       <w:r>
+        <w:rPr>
+          <w:highlight w:val="yellow"/>
+        </w:rPr>
         <w:t xml:space="preserve">s (ou la </w:t>
       </w:r>
       <w:proofErr w:type="spellStart"/>
       <w:r>
+        <w:rPr>
+          <w:highlight w:val="yellow"/>
+        </w:rPr>
         <w:t>reactive</w:t>
       </w:r>
       <w:proofErr w:type="spellEnd"/>
       <w:r>
+        <w:rPr>
+          <w:highlight w:val="yellow"/>
+        </w:rPr>
         <w:t xml:space="preserve"> expression)</w:t>
       </w:r>
       <w:r>
+        <w:rPr>
+          <w:highlight w:val="yellow"/>
+        </w:rPr>
         <w:t xml:space="preserve"> à utiliser</w:t>
       </w:r>
       <w:r>
+        <w:rPr>
+          <w:highlight w:val="yellow"/>
+        </w:rPr>
         <w:t xml:space="preserve"> </w:t>
       </w:r>
       <w:r>
         <w:rPr>
           <w:color w:val="70AD47" w:themeColor="accent6"/>
+          <w:highlight w:val="yellow"/>
         </w:rPr>
         <w:t>en vert</w:t>
       </w:r>
       <w:r>
         <w:rPr>
           <w:color w:val="70AD47" w:themeColor="accent6"/>
+          <w:highlight w:val="yellow"/>
         </w:rPr>
         <w:t>.</w:t>
       </w:r>
       <w:r>
+        <w:rPr>
+          <w:highlight w:val="yellow"/>
+        </w:rPr>
         <w:t xml:space="preserve"> </w:t>
       </w:r>
       <w:r>
+        <w:rPr>
+          <w:highlight w:val="yellow"/>
+        </w:rPr>
         <w:t>J</w:t>
       </w:r>
       <w:r>
+        <w:rPr>
+          <w:highlight w:val="yellow"/>
+        </w:rPr>
         <w:t xml:space="preserve">e te </w:t>
       </w:r>
       <w:r>
+        <w:rPr>
+          <w:highlight w:val="yellow"/>
+        </w:rPr>
         <w:t>demanderais donc de vérifier si c’est ok ou s’il y a des correctifs à apporter à ce niveau.</w:t>
       </w:r>
     </w:p>
@@ -8448,15 +8452,27 @@
               <w:rPr>
                 <w:sz w:val="20"/>
                 <w:szCs w:val="20"/>
-              </w:rPr>
-            </w:pPr>
-            <w:proofErr w:type="spellStart"/>
-            <w:r>
-              <w:rPr>
-                <w:sz w:val="20"/>
-                <w:szCs w:val="20"/>
-              </w:rPr>
-              <w:t>courbe_croissance</w:t>
+                <w:highlight w:val="green"/>
+              </w:rPr>
+            </w:pPr>
+            <w:proofErr w:type="spellStart"/>
+            <w:proofErr w:type="gramStart"/>
+            <w:r>
+              <w:rPr>
+                <w:sz w:val="20"/>
+                <w:szCs w:val="20"/>
+                <w:highlight w:val="green"/>
+              </w:rPr>
+              <w:t>courbe</w:t>
+            </w:r>
+            <w:proofErr w:type="gramEnd"/>
+            <w:r>
+              <w:rPr>
+                <w:sz w:val="20"/>
+                <w:szCs w:val="20"/>
+                <w:highlight w:val="green"/>
+              </w:rPr>
+              <w:t>_croissance</w:t>
             </w:r>
             <w:proofErr w:type="spellEnd"/>
           </w:p>
@@ -8468,12 +8484,14 @@
               <w:rPr>
                 <w:sz w:val="20"/>
                 <w:szCs w:val="20"/>
-              </w:rPr>
-            </w:pPr>
-            <w:r>
-              <w:rPr>
-                <w:sz w:val="20"/>
-                <w:szCs w:val="20"/>
+                <w:highlight w:val="green"/>
+              </w:rPr>
+            </w:pPr>
+            <w:r>
+              <w:rPr>
+                <w:sz w:val="20"/>
+                <w:szCs w:val="20"/>
+                <w:highlight w:val="green"/>
               </w:rPr>
               <w:t>_</w:t>
             </w:r>
@@ -8483,6 +8501,7 @@
               <w:rPr>
                 <w:sz w:val="20"/>
                 <w:szCs w:val="20"/>
+                <w:highlight w:val="green"/>
               </w:rPr>
               <w:t>comparaison.R</w:t>
             </w:r>
@@ -8497,12 +8516,14 @@
               <w:rPr>
                 <w:sz w:val="20"/>
                 <w:szCs w:val="20"/>
-              </w:rPr>
-            </w:pPr>
-            <w:r>
-              <w:rPr>
-                <w:sz w:val="20"/>
-                <w:szCs w:val="20"/>
+                <w:highlight w:val="green"/>
+              </w:rPr>
+            </w:pPr>
+            <w:r>
+              <w:rPr>
+                <w:sz w:val="20"/>
+                <w:szCs w:val="20"/>
+                <w:highlight w:val="green"/>
               </w:rPr>
               <w:t>_</w:t>
             </w:r>
@@ -8511,6 +8532,7 @@
               <w:rPr>
                 <w:sz w:val="20"/>
                 <w:szCs w:val="20"/>
+                <w:highlight w:val="green"/>
               </w:rPr>
               <w:t>ggVONBERT.R</w:t>
             </w:r>
@@ -8524,12 +8546,14 @@
               <w:rPr>
                 <w:sz w:val="20"/>
                 <w:szCs w:val="20"/>
-              </w:rPr>
-            </w:pPr>
-            <w:r>
-              <w:rPr>
-                <w:sz w:val="20"/>
-                <w:szCs w:val="20"/>
+                <w:highlight w:val="green"/>
+              </w:rPr>
+            </w:pPr>
+            <w:r>
+              <w:rPr>
+                <w:sz w:val="20"/>
+                <w:szCs w:val="20"/>
+                <w:highlight w:val="green"/>
               </w:rPr>
               <w:t>_</w:t>
             </w:r>
@@ -8538,6 +8562,7 @@
               <w:rPr>
                 <w:sz w:val="20"/>
                 <w:szCs w:val="20"/>
+                <w:highlight w:val="green"/>
               </w:rPr>
               <w:t>ggGOMP.R</w:t>
             </w:r>
@@ -8551,12 +8576,14 @@
               <w:rPr>
                 <w:sz w:val="20"/>
                 <w:szCs w:val="20"/>
-              </w:rPr>
-            </w:pPr>
-            <w:r>
-              <w:rPr>
-                <w:sz w:val="20"/>
-                <w:szCs w:val="20"/>
+                <w:highlight w:val="green"/>
+              </w:rPr>
+            </w:pPr>
+            <w:r>
+              <w:rPr>
+                <w:sz w:val="20"/>
+                <w:szCs w:val="20"/>
+                <w:highlight w:val="green"/>
               </w:rPr>
               <w:t>_</w:t>
             </w:r>
@@ -8565,6 +8592,7 @@
               <w:rPr>
                 <w:sz w:val="20"/>
                 <w:szCs w:val="20"/>
+                <w:highlight w:val="green"/>
               </w:rPr>
               <w:t>ggLOGIST.R</w:t>
             </w:r>
@@ -8586,44 +8614,40 @@
               <w:rPr>
                 <w:sz w:val="20"/>
                 <w:szCs w:val="20"/>
-              </w:rPr>
-            </w:pPr>
-            <w:r>
-              <w:rPr>
-                <w:sz w:val="20"/>
-                <w:szCs w:val="20"/>
-                <w:highlight w:val="green"/>
-              </w:rPr>
-              <w:t xml:space="preserve">Corriger le titre du tableau « Table de sélection du modèle de </w:t>
-            </w:r>
-            <w:r>
-              <w:rPr>
-                <w:sz w:val="20"/>
-                <w:szCs w:val="20"/>
-                <w:highlight w:val="green"/>
-              </w:rPr>
-              <w:t>croissance » et de la figure « Longueur à l’âge des spécimens capturés et modèle de croissance »</w:t>
-            </w:r>
-          </w:p>
-          <w:p>
-            <w:pPr>
-              <w:rPr>
-                <w:sz w:val="20"/>
-                <w:szCs w:val="20"/>
-              </w:rPr>
-            </w:pPr>
-          </w:p>
-          <w:p>
-            <w:pPr>
-              <w:rPr>
-                <w:sz w:val="20"/>
-                <w:szCs w:val="20"/>
-              </w:rPr>
-            </w:pPr>
-            <w:r>
-              <w:rPr>
-                <w:sz w:val="20"/>
-                <w:szCs w:val="20"/>
+                <w:highlight w:val="green"/>
+              </w:rPr>
+            </w:pPr>
+            <w:r>
+              <w:rPr>
+                <w:sz w:val="20"/>
+                <w:szCs w:val="20"/>
+                <w:highlight w:val="green"/>
+              </w:rPr>
+              <w:t>Corriger le titre du tableau « Table de sélection du modèle de croissance » et de la figure « Longueur à l’âge des spécimens capturés et modèle de croissance »</w:t>
+            </w:r>
+          </w:p>
+          <w:p>
+            <w:pPr>
+              <w:rPr>
+                <w:sz w:val="20"/>
+                <w:szCs w:val="20"/>
+                <w:highlight w:val="green"/>
+              </w:rPr>
+            </w:pPr>
+          </w:p>
+          <w:p>
+            <w:pPr>
+              <w:rPr>
+                <w:sz w:val="20"/>
+                <w:szCs w:val="20"/>
+                <w:highlight w:val="green"/>
+              </w:rPr>
+            </w:pPr>
+            <w:r>
+              <w:rPr>
+                <w:sz w:val="20"/>
+                <w:szCs w:val="20"/>
+                <w:highlight w:val="green"/>
               </w:rPr>
               <w:t>Aucun modèle de croissance ne fonctionne (</w:t>
             </w:r>
@@ -8632,6 +8656,7 @@
               <w:rPr>
                 <w:sz w:val="20"/>
                 <w:szCs w:val="20"/>
+                <w:highlight w:val="green"/>
               </w:rPr>
               <w:t>Error</w:t>
             </w:r>
@@ -8640,6 +8665,7 @@
               <w:rPr>
                 <w:sz w:val="20"/>
                 <w:szCs w:val="20"/>
+                <w:highlight w:val="green"/>
               </w:rPr>
               <w:t> : objet ‘sv0’ introuvable. Éventuellement à vérifier :</w:t>
             </w:r>
@@ -8655,12 +8681,14 @@
               <w:rPr>
                 <w:sz w:val="20"/>
                 <w:szCs w:val="20"/>
-              </w:rPr>
-            </w:pPr>
-            <w:r>
-              <w:rPr>
-                <w:sz w:val="20"/>
-                <w:szCs w:val="20"/>
+                <w:highlight w:val="green"/>
+              </w:rPr>
+            </w:pPr>
+            <w:r>
+              <w:rPr>
+                <w:sz w:val="20"/>
+                <w:szCs w:val="20"/>
+                <w:highlight w:val="green"/>
               </w:rPr>
               <w:t>les équations des modèles sont en référence sous le graphique.</w:t>
             </w:r>
@@ -8676,12 +8704,14 @@
               <w:rPr>
                 <w:sz w:val="20"/>
                 <w:szCs w:val="20"/>
-              </w:rPr>
-            </w:pPr>
-            <w:r>
-              <w:rPr>
-                <w:sz w:val="20"/>
-                <w:szCs w:val="20"/>
+                <w:highlight w:val="green"/>
+              </w:rPr>
+            </w:pPr>
+            <w:r>
+              <w:rPr>
+                <w:sz w:val="20"/>
+                <w:szCs w:val="20"/>
+                <w:highlight w:val="green"/>
               </w:rPr>
               <w:t>la ligne est noire, pas rouge, et qu’il est indiqué à quoi elle correspond</w:t>
             </w:r>
@@ -8691,12 +8721,14 @@
               <w:rPr>
                 <w:sz w:val="20"/>
                 <w:szCs w:val="20"/>
-              </w:rPr>
-            </w:pPr>
-            <w:r>
-              <w:rPr>
-                <w:sz w:val="20"/>
-                <w:szCs w:val="20"/>
+                <w:highlight w:val="green"/>
+              </w:rPr>
+            </w:pPr>
+            <w:r>
+              <w:rPr>
+                <w:sz w:val="20"/>
+                <w:szCs w:val="20"/>
+                <w:highlight w:val="green"/>
               </w:rPr>
               <w:t>Quand on change de modèle, la ligne rouge se déplace, mais pas la ligne noire.</w:t>
             </w:r>

</xml_diff>

<commit_message>
biomasse table et cie, tout fonctionne
</commit_message>
<xml_diff>
--- a/man/Plan de travail pour Caro_janv 2025.docx
+++ b/man/Plan de travail pour Caro_janv 2025.docx
@@ -6654,6 +6654,7 @@
               <w:rPr>
                 <w:sz w:val="20"/>
                 <w:szCs w:val="20"/>
+                <w:highlight w:val="green"/>
               </w:rPr>
               <w:t xml:space="preserve">Si on utilise la </w:t>
             </w:r>
@@ -6662,6 +6663,7 @@
               <w:rPr>
                 <w:sz w:val="20"/>
                 <w:szCs w:val="20"/>
+                <w:highlight w:val="green"/>
               </w:rPr>
               <w:t>reactive</w:t>
             </w:r>
@@ -6670,6 +6672,7 @@
               <w:rPr>
                 <w:sz w:val="20"/>
                 <w:szCs w:val="20"/>
+                <w:highlight w:val="green"/>
               </w:rPr>
               <w:t xml:space="preserve"> expression </w:t>
             </w:r>
@@ -6681,6 +6684,7 @@
                 <w:color w:val="70AD47" w:themeColor="accent6"/>
                 <w:sz w:val="20"/>
                 <w:szCs w:val="20"/>
+                <w:highlight w:val="green"/>
               </w:rPr>
               <w:t>specimens</w:t>
             </w:r>
@@ -6691,6 +6695,7 @@
                 <w:color w:val="70AD47" w:themeColor="accent6"/>
                 <w:sz w:val="20"/>
                 <w:szCs w:val="20"/>
+                <w:highlight w:val="green"/>
               </w:rPr>
               <w:t>(</w:t>
             </w:r>
@@ -6701,6 +6706,7 @@
                 <w:color w:val="70AD47" w:themeColor="accent6"/>
                 <w:sz w:val="20"/>
                 <w:szCs w:val="20"/>
+                <w:highlight w:val="green"/>
               </w:rPr>
               <w:t xml:space="preserve">), </w:t>
             </w:r>
@@ -6708,15 +6714,9 @@
               <w:rPr>
                 <w:sz w:val="20"/>
                 <w:szCs w:val="20"/>
-              </w:rPr>
-              <w:t xml:space="preserve">je crois qu’on pourrait retirer les lignes </w:t>
-            </w:r>
-            <w:r>
-              <w:rPr>
-                <w:sz w:val="20"/>
-                <w:szCs w:val="20"/>
-              </w:rPr>
-              <w:t>1 à 18.</w:t>
+                <w:highlight w:val="green"/>
+              </w:rPr>
+              <w:t>je crois qu’on pourrait retirer les lignes 1 à 18.</w:t>
             </w:r>
           </w:p>
           <w:p>
@@ -6817,12 +6817,14 @@
               <w:rPr>
                 <w:sz w:val="20"/>
                 <w:szCs w:val="20"/>
-              </w:rPr>
-            </w:pPr>
-            <w:r>
-              <w:rPr>
-                <w:sz w:val="20"/>
-                <w:szCs w:val="20"/>
+                <w:highlight w:val="green"/>
+              </w:rPr>
+            </w:pPr>
+            <w:r>
+              <w:rPr>
+                <w:sz w:val="20"/>
+                <w:szCs w:val="20"/>
+                <w:highlight w:val="green"/>
               </w:rPr>
               <w:t xml:space="preserve">Remplacer les symboles mâle et femelle par du texte. </w:t>
             </w:r>
@@ -6832,20 +6834,22 @@
               <w:rPr>
                 <w:sz w:val="20"/>
                 <w:szCs w:val="20"/>
-              </w:rPr>
-            </w:pPr>
-          </w:p>
-          <w:p>
-            <w:pPr>
-              <w:rPr>
-                <w:sz w:val="20"/>
-                <w:szCs w:val="20"/>
-              </w:rPr>
-            </w:pPr>
-            <w:r>
-              <w:rPr>
-                <w:sz w:val="20"/>
-                <w:szCs w:val="20"/>
+                <w:highlight w:val="green"/>
+              </w:rPr>
+            </w:pPr>
+          </w:p>
+          <w:p>
+            <w:pPr>
+              <w:rPr>
+                <w:sz w:val="20"/>
+                <w:szCs w:val="20"/>
+              </w:rPr>
+            </w:pPr>
+            <w:r>
+              <w:rPr>
+                <w:sz w:val="20"/>
+                <w:szCs w:val="20"/>
+                <w:highlight w:val="green"/>
               </w:rPr>
               <w:t xml:space="preserve">Ajouter les intervalles de confiance pour la BPUE </w:t>
             </w:r>
@@ -6854,6 +6858,7 @@
               <w:rPr>
                 <w:sz w:val="20"/>
                 <w:szCs w:val="20"/>
+                <w:highlight w:val="green"/>
               </w:rPr>
               <w:t>Fmat</w:t>
             </w:r>
@@ -6862,6 +6867,7 @@
               <w:rPr>
                 <w:sz w:val="20"/>
                 <w:szCs w:val="20"/>
+                <w:highlight w:val="green"/>
               </w:rPr>
               <w:t xml:space="preserve"> (repro. Actifs)</w:t>
             </w:r>
@@ -6882,10 +6888,12 @@
                 <w:szCs w:val="20"/>
               </w:rPr>
             </w:pPr>
-            <w:r>
-              <w:rPr>
-                <w:sz w:val="20"/>
-                <w:szCs w:val="20"/>
+            <w:commentRangeStart w:id="2"/>
+            <w:r>
+              <w:rPr>
+                <w:sz w:val="20"/>
+                <w:szCs w:val="20"/>
+                <w:highlight w:val="yellow"/>
               </w:rPr>
               <w:t xml:space="preserve">l. 28 à 37. </w:t>
             </w:r>
@@ -6893,9 +6901,19 @@
               <w:rPr>
                 <w:sz w:val="20"/>
                 <w:szCs w:val="20"/>
+                <w:highlight w:val="yellow"/>
               </w:rPr>
               <w:t>Enlever les deux modèles puisqu’ils ne sont pas utilisés</w:t>
             </w:r>
+            <w:commentRangeEnd w:id="2"/>
+            <w:r>
+              <w:rPr>
+                <w:rStyle w:val="Marquedecommentaire"/>
+                <w:kern w:val="0"/>
+                <w14:ligatures w14:val="none"/>
+              </w:rPr>
+              <w:commentReference w:id="2"/>
+            </w:r>
           </w:p>
           <w:p>
             <w:pPr>
@@ -6919,7 +6937,15 @@
                 <w:sz w:val="20"/>
                 <w:szCs w:val="20"/>
               </w:rPr>
-              <w:t>l. 209. Catégorie « Tous ». Il serait préférable de faire le calcul de pourcentage comme pour les autres catégories plutôt que de supposer que le pourcentage fait 100.</w:t>
+              <w:t>l</w:t>
+            </w:r>
+            <w:r>
+              <w:rPr>
+                <w:sz w:val="20"/>
+                <w:szCs w:val="20"/>
+                <w:highlight w:val="green"/>
+              </w:rPr>
+              <w:t>. 209. Catégorie « Tous ». Il serait préférable de faire le calcul de pourcentage comme pour les autres catégories plutôt que de supposer que le pourcentage fait 100.</w:t>
             </w:r>
           </w:p>
         </w:tc>
@@ -7077,7 +7103,29 @@
                 <w:szCs w:val="20"/>
                 <w:highlight w:val="green"/>
               </w:rPr>
-              <w:t xml:space="preserve">[spécimens des stations valides, </w:t>
+              <w:t>[</w:t>
+            </w:r>
+            <w:proofErr w:type="gramStart"/>
+            <w:r>
+              <w:rPr>
+                <w:rFonts w:cstheme="minorHAnsi"/>
+                <w:color w:val="70AD47" w:themeColor="accent6"/>
+                <w:sz w:val="20"/>
+                <w:szCs w:val="20"/>
+                <w:highlight w:val="green"/>
+              </w:rPr>
+              <w:t>spécimens</w:t>
+            </w:r>
+            <w:proofErr w:type="gramEnd"/>
+            <w:r>
+              <w:rPr>
+                <w:rFonts w:cstheme="minorHAnsi"/>
+                <w:color w:val="70AD47" w:themeColor="accent6"/>
+                <w:sz w:val="20"/>
+                <w:szCs w:val="20"/>
+                <w:highlight w:val="green"/>
+              </w:rPr>
+              <w:t xml:space="preserve"> des stations valides, </w:t>
             </w:r>
             <w:proofErr w:type="spellStart"/>
             <w:r>
@@ -8256,7 +8304,7 @@
               </w:rPr>
               <w:t>_</w:t>
             </w:r>
-            <w:commentRangeStart w:id="2"/>
+            <w:commentRangeStart w:id="3"/>
             <w:r>
               <w:rPr>
                 <w:sz w:val="20"/>
@@ -8265,7 +8313,7 @@
               </w:rPr>
               <w:t>croissance</w:t>
             </w:r>
-            <w:commentRangeEnd w:id="2"/>
+            <w:commentRangeEnd w:id="3"/>
             <w:proofErr w:type="spellEnd"/>
             <w:r>
               <w:rPr>
@@ -8277,7 +8325,7 @@
                 <w:highlight w:val="green"/>
                 <w14:ligatures w14:val="none"/>
               </w:rPr>
-              <w:commentReference w:id="2"/>
+              <w:commentReference w:id="3"/>
             </w:r>
           </w:p>
           <w:p>
@@ -8957,7 +9005,7 @@
             </w:pPr>
           </w:p>
           <w:p>
-            <w:bookmarkStart w:id="3" w:name="_Hlk181609112"/>
+            <w:bookmarkStart w:id="4" w:name="_Hlk181609112"/>
             <w:r>
               <w:rPr>
                 <w:rFonts w:eastAsia="Times New Roman"/>
@@ -8993,7 +9041,7 @@
               <w:t>)</w:t>
             </w:r>
           </w:p>
-          <w:bookmarkEnd w:id="3"/>
+          <w:bookmarkEnd w:id="4"/>
           <w:p>
             <w:pPr>
               <w:rPr>
@@ -9139,15 +9187,36 @@
                 <w:lang w:val="en-CA"/>
               </w:rPr>
               <w:lastRenderedPageBreak/>
-              <w:t>ggmodel_L_L50</w:t>
-            </w:r>
+              <w:t>ggmodel_</w:t>
+            </w:r>
+            <w:commentRangeStart w:id="5"/>
             <w:r>
               <w:rPr>
                 <w:sz w:val="20"/>
                 <w:szCs w:val="20"/>
                 <w:lang w:val="en-CA"/>
               </w:rPr>
+              <w:t>L_L50</w:t>
+            </w:r>
+            <w:r>
+              <w:rPr>
+                <w:sz w:val="20"/>
+                <w:szCs w:val="20"/>
+                <w:lang w:val="en-CA"/>
+              </w:rPr>
               <w:t>.R</w:t>
+            </w:r>
+            <w:commentRangeEnd w:id="5"/>
+            <w:r>
+              <w:rPr>
+                <w:rStyle w:val="Marquedecommentaire"/>
+                <w:rFonts w:asciiTheme="minorHAnsi" w:hAnsiTheme="minorHAnsi" w:cstheme="minorBidi"/>
+                <w:i w:val="0"/>
+                <w:color w:val="auto"/>
+                <w:kern w:val="0"/>
+                <w14:ligatures w14:val="none"/>
+              </w:rPr>
+              <w:commentReference w:id="5"/>
             </w:r>
           </w:p>
           <w:p>
@@ -9186,13 +9255,34 @@
                 <w:szCs w:val="20"/>
               </w:rPr>
             </w:pPr>
+            <w:commentRangeStart w:id="6"/>
             <w:r>
               <w:rPr>
                 <w:sz w:val="20"/>
                 <w:szCs w:val="20"/>
                 <w:lang w:val="en-CA"/>
               </w:rPr>
-              <w:t>ggmodel_INT_L50</w:t>
+              <w:t>ggmodel</w:t>
+            </w:r>
+            <w:commentRangeEnd w:id="6"/>
+            <w:r>
+              <w:rPr>
+                <w:rStyle w:val="Marquedecommentaire"/>
+                <w:rFonts w:asciiTheme="minorHAnsi" w:hAnsiTheme="minorHAnsi" w:cstheme="minorBidi"/>
+                <w:i w:val="0"/>
+                <w:color w:val="auto"/>
+                <w:kern w:val="0"/>
+                <w14:ligatures w14:val="none"/>
+              </w:rPr>
+              <w:commentReference w:id="6"/>
+            </w:r>
+            <w:r>
+              <w:rPr>
+                <w:sz w:val="20"/>
+                <w:szCs w:val="20"/>
+                <w:lang w:val="en-CA"/>
+              </w:rPr>
+              <w:t>_INT_L50</w:t>
             </w:r>
             <w:r>
               <w:rPr>
@@ -9519,7 +9609,23 @@
       </w:r>
     </w:p>
   </w:comment>
-  <w:comment w:id="2" w:author="Brûlé, Caroline" w:date="2025-02-03T15:31:00Z" w:initials="CB">
+  <w:comment w:id="2" w:author="Brûlé, Caroline" w:date="2025-02-05T08:42:00Z" w:initials="CB">
+    <w:p>
+      <w:pPr>
+        <w:pStyle w:val="Commentaire"/>
+      </w:pPr>
+      <w:r>
+        <w:rPr>
+          <w:rStyle w:val="Marquedecommentaire"/>
+        </w:rPr>
+        <w:annotationRef/>
+      </w:r>
+      <w:r>
+        <w:t>Avant de changer le contenu, j’attend des nouvelles sur les modeles à présenter ? Parce que actuellement, on fait un model averaging de deux modele qui ne sont pas optimale pour des données continues… SG me revient là dessus</w:t>
+      </w:r>
+    </w:p>
+  </w:comment>
+  <w:comment w:id="3" w:author="Brûlé, Caroline" w:date="2025-02-03T15:31:00Z" w:initials="CB">
     <w:p>
       <w:pPr>
         <w:pStyle w:val="Commentaire"/>
@@ -9535,27 +9641,68 @@
       </w:r>
     </w:p>
   </w:comment>
+  <w:comment w:id="5" w:author="Brûlé, Caroline" w:date="2025-02-04T14:15:00Z" w:initials="CB">
+    <w:p>
+      <w:pPr>
+        <w:pStyle w:val="Commentaire"/>
+      </w:pPr>
+      <w:r>
+        <w:rPr>
+          <w:rStyle w:val="Marquedecommentaire"/>
+        </w:rPr>
+        <w:annotationRef/>
+      </w:r>
+      <w:r>
+        <w:t>Pourquoi pas pour age aussi ??</w:t>
+      </w:r>
+    </w:p>
+  </w:comment>
+  <w:comment w:id="6" w:author="Brûlé, Caroline" w:date="2025-02-04T14:17:00Z" w:initials="CB">
+    <w:p>
+      <w:pPr>
+        <w:pStyle w:val="Commentaire"/>
+      </w:pPr>
+      <w:r>
+        <w:rPr>
+          <w:rStyle w:val="Marquedecommentaire"/>
+        </w:rPr>
+        <w:annotationRef/>
+      </w:r>
+      <w:r>
+        <w:t>Il me semble quon mavait dit que ma methode ne serait pas celle utilisée. Jattend un reprex pour changer ce module</w:t>
+      </w:r>
+    </w:p>
+  </w:comment>
 </w:comments>
 </file>
 
 <file path=word/commentsExtended.xml><?xml version="1.0" encoding="utf-8"?>
 <w15:commentsEx xmlns:wpc="http://schemas.microsoft.com/office/word/2010/wordprocessingCanvas" xmlns:cx="http://schemas.microsoft.com/office/drawing/2014/chartex" xmlns:cx1="http://schemas.microsoft.com/office/drawing/2015/9/8/chartex" xmlns:cx2="http://schemas.microsoft.com/office/drawing/2015/10/21/chartex" xmlns:cx3="http://schemas.microsoft.com/office/drawing/2016/5/9/chartex" xmlns:cx4="http://schemas.microsoft.com/office/drawing/2016/5/10/chartex" xmlns:cx5="http://schemas.microsoft.com/office/drawing/2016/5/11/chartex" xmlns:cx6="http://schemas.microsoft.com/office/drawing/2016/5/12/chartex" xmlns:cx7="http://schemas.microsoft.com/office/drawing/2016/5/13/chartex" xmlns:cx8="http://schemas.microsoft.com/office/drawing/2016/5/14/chartex" xmlns:mc="http://schemas.openxmlformats.org/markup-compatibility/2006" xmlns:aink="http://schemas.microsoft.com/office/drawing/2016/ink" xmlns:am3d="http://schemas.microsoft.com/office/drawing/2017/model3d" xmlns:o="urn:schemas-microsoft-com:office:office" xmlns:oel="http://schemas.microsoft.com/office/2019/extlst" xmlns:r="http://schemas.openxmlformats.org/officeDocument/2006/relationships" xmlns:m="http://schemas.openxmlformats.org/officeDocument/2006/math" xmlns:v="urn:schemas-microsoft-com:vml" xmlns:wp14="http://schemas.microsoft.com/office/word/2010/wordprocessingDrawing" xmlns:wp="http://schemas.openxmlformats.org/drawingml/2006/wordprocessingDrawing" xmlns:w10="urn:schemas-microsoft-com:office:word" xmlns:w="http://schemas.openxmlformats.org/wordprocessingml/2006/main" xmlns:w14="http://schemas.microsoft.com/office/word/2010/wordml" xmlns:w15="http://schemas.microsoft.com/office/word/2012/wordml" xmlns:w16cex="http://schemas.microsoft.com/office/word/2018/wordml/cex" xmlns:w16cid="http://schemas.microsoft.com/office/word/2016/wordml/cid" xmlns:w16="http://schemas.microsoft.com/office/word/2018/wordml" xmlns:w16du="http://schemas.microsoft.com/office/word/2023/wordml/word16du" xmlns:w16sdtdh="http://schemas.microsoft.com/office/word/2020/wordml/sdtdatahash" xmlns:w16sdtfl="http://schemas.microsoft.com/office/word/2024/wordml/sdtformatlock" xmlns:w16se="http://schemas.microsoft.com/office/word/2015/wordml/symex" xmlns:wpg="http://schemas.microsoft.com/office/word/2010/wordprocessingGroup" xmlns:wpi="http://schemas.microsoft.com/office/word/2010/wordprocessingInk" xmlns:wne="http://schemas.microsoft.com/office/word/2006/wordml" xmlns:wps="http://schemas.microsoft.com/office/word/2010/wordprocessingShape" mc:Ignorable="w14 w15 w16se w16cid w16 w16cex w16sdtdh w16sdtfl w16du wp14">
   <w15:commentEx w15:paraId="5DECB99D" w15:done="0"/>
+  <w15:commentEx w15:paraId="19987A62" w15:done="0"/>
   <w15:commentEx w15:paraId="2D107027" w15:done="0"/>
+  <w15:commentEx w15:paraId="39B3DBCC" w15:done="0"/>
+  <w15:commentEx w15:paraId="42E0EDD9" w15:done="0"/>
 </w15:commentsEx>
 </file>
 
 <file path=word/commentsExtensible.xml><?xml version="1.0" encoding="utf-8"?>
 <w16cex:commentsExtensible xmlns:wpc="http://schemas.microsoft.com/office/word/2010/wordprocessingCanvas" xmlns:cx="http://schemas.microsoft.com/office/drawing/2014/chartex" xmlns:cx1="http://schemas.microsoft.com/office/drawing/2015/9/8/chartex" xmlns:cx2="http://schemas.microsoft.com/office/drawing/2015/10/21/chartex" xmlns:cx3="http://schemas.microsoft.com/office/drawing/2016/5/9/chartex" xmlns:cx4="http://schemas.microsoft.com/office/drawing/2016/5/10/chartex" xmlns:cx5="http://schemas.microsoft.com/office/drawing/2016/5/11/chartex" xmlns:cx6="http://schemas.microsoft.com/office/drawing/2016/5/12/chartex" xmlns:cx7="http://schemas.microsoft.com/office/drawing/2016/5/13/chartex" xmlns:cx8="http://schemas.microsoft.com/office/drawing/2016/5/14/chartex" xmlns:cr="http://schemas.microsoft.com/office/comments/2020/reactions" xmlns:mc="http://schemas.openxmlformats.org/markup-compatibility/2006" xmlns:aink="http://schemas.microsoft.com/office/drawing/2016/ink" xmlns:am3d="http://schemas.microsoft.com/office/drawing/2017/model3d" xmlns:o="urn:schemas-microsoft-com:office:office" xmlns:oel="http://schemas.microsoft.com/office/2019/extlst" xmlns:r="http://schemas.openxmlformats.org/officeDocument/2006/relationships" xmlns:m="http://schemas.openxmlformats.org/officeDocument/2006/math" xmlns:v="urn:schemas-microsoft-com:vml" xmlns:wp14="http://schemas.microsoft.com/office/word/2010/wordprocessingDrawing" xmlns:wp="http://schemas.openxmlformats.org/drawingml/2006/wordprocessingDrawing" xmlns:w10="urn:schemas-microsoft-com:office:word" xmlns:w="http://schemas.openxmlformats.org/wordprocessingml/2006/main" xmlns:w14="http://schemas.microsoft.com/office/word/2010/wordml" xmlns:w15="http://schemas.microsoft.com/office/word/2012/wordml" xmlns:w16cex="http://schemas.microsoft.com/office/word/2018/wordml/cex" xmlns:w16cid="http://schemas.microsoft.com/office/word/2016/wordml/cid" xmlns:w16="http://schemas.microsoft.com/office/word/2018/wordml" xmlns:w16du="http://schemas.microsoft.com/office/word/2023/wordml/word16du" xmlns:w16sdtdh="http://schemas.microsoft.com/office/word/2020/wordml/sdtdatahash" xmlns:w16sdtfl="http://schemas.microsoft.com/office/word/2024/wordml/sdtformatlock" xmlns:w16se="http://schemas.microsoft.com/office/word/2015/wordml/symex" xmlns:wpg="http://schemas.microsoft.com/office/word/2010/wordprocessingGroup" xmlns:wpi="http://schemas.microsoft.com/office/word/2010/wordprocessingInk" xmlns:wne="http://schemas.microsoft.com/office/word/2006/wordml" xmlns:wps="http://schemas.microsoft.com/office/word/2010/wordprocessingShape" mc:Ignorable="w14 w15 w16se w16cid w16 w16cex w16sdtdh w16sdtfl cr w16du wp14">
   <w16cex:commentExtensible w16cex:durableId="1B567433" w16cex:dateUtc="2025-02-04T16:14:00Z"/>
+  <w16cex:commentExtensible w16cex:durableId="4D47D05E" w16cex:dateUtc="2025-02-05T13:42:00Z"/>
   <w16cex:commentExtensible w16cex:durableId="3A31C2BC" w16cex:dateUtc="2025-02-03T20:31:00Z"/>
+  <w16cex:commentExtensible w16cex:durableId="0173FC8E" w16cex:dateUtc="2025-02-04T19:15:00Z"/>
+  <w16cex:commentExtensible w16cex:durableId="34A2474B" w16cex:dateUtc="2025-02-04T19:17:00Z"/>
 </w16cex:commentsExtensible>
 </file>
 
 <file path=word/commentsIds.xml><?xml version="1.0" encoding="utf-8"?>
 <w16cid:commentsIds xmlns:wpc="http://schemas.microsoft.com/office/word/2010/wordprocessingCanvas" xmlns:cx="http://schemas.microsoft.com/office/drawing/2014/chartex" xmlns:cx1="http://schemas.microsoft.com/office/drawing/2015/9/8/chartex" xmlns:cx2="http://schemas.microsoft.com/office/drawing/2015/10/21/chartex" xmlns:cx3="http://schemas.microsoft.com/office/drawing/2016/5/9/chartex" xmlns:cx4="http://schemas.microsoft.com/office/drawing/2016/5/10/chartex" xmlns:cx5="http://schemas.microsoft.com/office/drawing/2016/5/11/chartex" xmlns:cx6="http://schemas.microsoft.com/office/drawing/2016/5/12/chartex" xmlns:cx7="http://schemas.microsoft.com/office/drawing/2016/5/13/chartex" xmlns:cx8="http://schemas.microsoft.com/office/drawing/2016/5/14/chartex" xmlns:mc="http://schemas.openxmlformats.org/markup-compatibility/2006" xmlns:aink="http://schemas.microsoft.com/office/drawing/2016/ink" xmlns:am3d="http://schemas.microsoft.com/office/drawing/2017/model3d" xmlns:o="urn:schemas-microsoft-com:office:office" xmlns:oel="http://schemas.microsoft.com/office/2019/extlst" xmlns:r="http://schemas.openxmlformats.org/officeDocument/2006/relationships" xmlns:m="http://schemas.openxmlformats.org/officeDocument/2006/math" xmlns:v="urn:schemas-microsoft-com:vml" xmlns:wp14="http://schemas.microsoft.com/office/word/2010/wordprocessingDrawing" xmlns:wp="http://schemas.openxmlformats.org/drawingml/2006/wordprocessingDrawing" xmlns:w10="urn:schemas-microsoft-com:office:word" xmlns:w="http://schemas.openxmlformats.org/wordprocessingml/2006/main" xmlns:w14="http://schemas.microsoft.com/office/word/2010/wordml" xmlns:w15="http://schemas.microsoft.com/office/word/2012/wordml" xmlns:w16cex="http://schemas.microsoft.com/office/word/2018/wordml/cex" xmlns:w16cid="http://schemas.microsoft.com/office/word/2016/wordml/cid" xmlns:w16="http://schemas.microsoft.com/office/word/2018/wordml" xmlns:w16du="http://schemas.microsoft.com/office/word/2023/wordml/word16du" xmlns:w16sdtdh="http://schemas.microsoft.com/office/word/2020/wordml/sdtdatahash" xmlns:w16sdtfl="http://schemas.microsoft.com/office/word/2024/wordml/sdtformatlock" xmlns:w16se="http://schemas.microsoft.com/office/word/2015/wordml/symex" xmlns:wpg="http://schemas.microsoft.com/office/word/2010/wordprocessingGroup" xmlns:wpi="http://schemas.microsoft.com/office/word/2010/wordprocessingInk" xmlns:wne="http://schemas.microsoft.com/office/word/2006/wordml" xmlns:wps="http://schemas.microsoft.com/office/word/2010/wordprocessingShape" mc:Ignorable="w14 w15 w16se w16cid w16 w16cex w16sdtdh w16sdtfl w16du wp14">
   <w16cid:commentId w16cid:paraId="5DECB99D" w16cid:durableId="1B567433"/>
+  <w16cid:commentId w16cid:paraId="19987A62" w16cid:durableId="4D47D05E"/>
   <w16cid:commentId w16cid:paraId="2D107027" w16cid:durableId="3A31C2BC"/>
+  <w16cid:commentId w16cid:paraId="39B3DBCC" w16cid:durableId="0173FC8E"/>
+  <w16cid:commentId w16cid:paraId="42E0EDD9" w16cid:durableId="34A2474B"/>
 </w16cid:commentsIds>
 </file>
 

</xml_diff>

<commit_message>
first commit pour module L50
</commit_message>
<xml_diff>
--- a/man/Plan de travail pour Caro_janv 2025.docx
+++ b/man/Plan de travail pour Caro_janv 2025.docx
@@ -9571,6 +9571,103 @@
         </w:tc>
       </w:tr>
     </w:tbl>
+    <w:p>
+      <w:pPr>
+        <w:rPr>
+          <w:b/>
+          <w:bCs/>
+          <w:sz w:val="24"/>
+          <w:szCs w:val="24"/>
+        </w:rPr>
+      </w:pPr>
+    </w:p>
+    <w:p>
+      <w:pPr>
+        <w:rPr>
+          <w:b/>
+          <w:bCs/>
+          <w:sz w:val="24"/>
+          <w:szCs w:val="24"/>
+        </w:rPr>
+      </w:pPr>
+    </w:p>
+    <w:p>
+      <w:pPr>
+        <w:rPr>
+          <w:b/>
+          <w:bCs/>
+          <w:sz w:val="24"/>
+          <w:szCs w:val="24"/>
+        </w:rPr>
+      </w:pPr>
+      <w:r>
+        <w:rPr>
+          <w:b/>
+          <w:bCs/>
+          <w:sz w:val="24"/>
+          <w:szCs w:val="24"/>
+        </w:rPr>
+        <w:t xml:space="preserve">Il faudra vérifier si </w:t>
+      </w:r>
+      <w:r>
+        <w:rPr>
+          <w:b/>
+          <w:bCs/>
+          <w:sz w:val="24"/>
+          <w:szCs w:val="24"/>
+        </w:rPr>
+        <w:t xml:space="preserve">l’appli fonctionne même si pas de Femelle, même si pas de male, même si pas de IND, etc. </w:t>
+      </w:r>
+      <w:r>
+        <w:rPr>
+          <w:b/>
+          <w:bCs/>
+          <w:sz w:val="24"/>
+          <w:szCs w:val="24"/>
+        </w:rPr>
+        <w:t xml:space="preserve">bref, est-ce que </w:t>
+      </w:r>
+      <w:proofErr w:type="gramStart"/>
+      <w:r>
+        <w:rPr>
+          <w:b/>
+          <w:bCs/>
+          <w:sz w:val="24"/>
+          <w:szCs w:val="24"/>
+        </w:rPr>
+        <w:t>ca</w:t>
+      </w:r>
+      <w:proofErr w:type="gramEnd"/>
+      <w:r>
+        <w:rPr>
+          <w:b/>
+          <w:bCs/>
+          <w:sz w:val="24"/>
+          <w:szCs w:val="24"/>
+        </w:rPr>
+        <w:t xml:space="preserve"> bogue s’il manque une </w:t>
+      </w:r>
+      <w:proofErr w:type="spellStart"/>
+      <w:r>
+        <w:rPr>
+          <w:b/>
+          <w:bCs/>
+          <w:sz w:val="24"/>
+          <w:szCs w:val="24"/>
+        </w:rPr>
+        <w:t>categorie</w:t>
+      </w:r>
+      <w:proofErr w:type="spellEnd"/>
+      <w:r>
+        <w:rPr>
+          <w:b/>
+          <w:bCs/>
+          <w:sz w:val="24"/>
+          <w:szCs w:val="24"/>
+        </w:rPr>
+        <w:t xml:space="preserve"> ?</w:t>
+      </w:r>
+    </w:p>
     <w:p>
       <w:pPr>
         <w:rPr>

</xml_diff>

<commit_message>
simplification panel relation masse-longueur
</commit_message>
<xml_diff>
--- a/man/Plan de travail pour Caro_janv 2025.docx
+++ b/man/Plan de travail pour Caro_janv 2025.docx
@@ -1215,6 +1215,7 @@
               <w:rPr>
                 <w:sz w:val="20"/>
                 <w:szCs w:val="20"/>
+                <w:highlight w:val="green"/>
                 <w:lang w:val="en-CA"/>
               </w:rPr>
             </w:pPr>
@@ -1224,6 +1225,7 @@
               <w:rPr>
                 <w:sz w:val="20"/>
                 <w:szCs w:val="20"/>
+                <w:highlight w:val="green"/>
               </w:rPr>
               <w:lastRenderedPageBreak/>
               <w:t>app.R</w:t>
@@ -1248,12 +1250,14 @@
               <w:rPr>
                 <w:sz w:val="20"/>
                 <w:szCs w:val="20"/>
-              </w:rPr>
-            </w:pPr>
-            <w:r>
-              <w:rPr>
-                <w:sz w:val="20"/>
-                <w:szCs w:val="20"/>
+                <w:highlight w:val="green"/>
+              </w:rPr>
+            </w:pPr>
+            <w:r>
+              <w:rPr>
+                <w:sz w:val="20"/>
+                <w:szCs w:val="20"/>
+                <w:highlight w:val="green"/>
               </w:rPr>
               <w:t xml:space="preserve">Dans la liste des packages, il manque l’installation de </w:t>
             </w:r>
@@ -1262,6 +1266,7 @@
               <w:rPr>
                 <w:sz w:val="20"/>
                 <w:szCs w:val="20"/>
+                <w:highlight w:val="green"/>
               </w:rPr>
               <w:t>investr</w:t>
             </w:r>
@@ -1270,6 +1275,7 @@
               <w:rPr>
                 <w:sz w:val="20"/>
                 <w:szCs w:val="20"/>
+                <w:highlight w:val="green"/>
               </w:rPr>
               <w:t xml:space="preserve">, </w:t>
             </w:r>
@@ -1278,6 +1284,7 @@
               <w:rPr>
                 <w:sz w:val="20"/>
                 <w:szCs w:val="20"/>
+                <w:highlight w:val="green"/>
               </w:rPr>
               <w:t>pROC</w:t>
             </w:r>
@@ -1286,6 +1293,7 @@
               <w:rPr>
                 <w:sz w:val="20"/>
                 <w:szCs w:val="20"/>
+                <w:highlight w:val="green"/>
               </w:rPr>
               <w:t xml:space="preserve">, </w:t>
             </w:r>
@@ -1294,6 +1302,7 @@
               <w:rPr>
                 <w:sz w:val="20"/>
                 <w:szCs w:val="20"/>
+                <w:highlight w:val="green"/>
               </w:rPr>
               <w:t>DescTools</w:t>
             </w:r>
@@ -1302,6 +1311,7 @@
               <w:rPr>
                 <w:sz w:val="20"/>
                 <w:szCs w:val="20"/>
+                <w:highlight w:val="green"/>
               </w:rPr>
               <w:t xml:space="preserve"> et </w:t>
             </w:r>
@@ -1310,6 +1320,7 @@
               <w:rPr>
                 <w:sz w:val="20"/>
                 <w:szCs w:val="20"/>
+                <w:highlight w:val="green"/>
               </w:rPr>
               <w:t>Emdbook</w:t>
             </w:r>
@@ -1318,6 +1329,7 @@
               <w:rPr>
                 <w:sz w:val="20"/>
                 <w:szCs w:val="20"/>
+                <w:highlight w:val="green"/>
               </w:rPr>
               <w:t>.</w:t>
             </w:r>
@@ -1325,6 +1337,7 @@
               <w:rPr>
                 <w:sz w:val="20"/>
                 <w:szCs w:val="20"/>
+                <w:highlight w:val="green"/>
               </w:rPr>
               <w:t xml:space="preserve"> Vérifier aussi package AER (</w:t>
             </w:r>
@@ -1334,6 +1347,7 @@
               <w:rPr>
                 <w:sz w:val="20"/>
                 <w:szCs w:val="20"/>
+                <w:highlight w:val="green"/>
               </w:rPr>
               <w:t>dispersiontest.R</w:t>
             </w:r>
@@ -1343,6 +1357,7 @@
               <w:rPr>
                 <w:sz w:val="20"/>
                 <w:szCs w:val="20"/>
+                <w:highlight w:val="green"/>
               </w:rPr>
               <w:t>)</w:t>
             </w:r>
@@ -1389,9 +1404,18 @@
                 <w:sz w:val="20"/>
                 <w:szCs w:val="20"/>
               </w:rPr>
-              <w:t>_ui.R</w:t>
-            </w:r>
-            <w:proofErr w:type="spellEnd"/>
+              <w:t>_</w:t>
+            </w:r>
+            <w:proofErr w:type="gramStart"/>
+            <w:r>
+              <w:rPr>
+                <w:sz w:val="20"/>
+                <w:szCs w:val="20"/>
+              </w:rPr>
+              <w:t>ui.R</w:t>
+            </w:r>
+            <w:proofErr w:type="spellEnd"/>
+            <w:proofErr w:type="gramEnd"/>
           </w:p>
         </w:tc>
         <w:tc>
@@ -2012,9 +2036,20 @@
                 <w:szCs w:val="20"/>
                 <w:highlight w:val="green"/>
               </w:rPr>
-              <w:t>_server.R</w:t>
-            </w:r>
-            <w:proofErr w:type="spellEnd"/>
+              <w:t>_</w:t>
+            </w:r>
+            <w:proofErr w:type="gramStart"/>
+            <w:r>
+              <w:rPr>
+                <w:i w:val="0"/>
+                <w:sz w:val="20"/>
+                <w:szCs w:val="20"/>
+                <w:highlight w:val="green"/>
+              </w:rPr>
+              <w:t>server.R</w:t>
+            </w:r>
+            <w:proofErr w:type="spellEnd"/>
+            <w:proofErr w:type="gramEnd"/>
           </w:p>
         </w:tc>
         <w:tc>
@@ -2079,31 +2114,40 @@
               <w:t>[</w:t>
             </w:r>
             <w:proofErr w:type="spellStart"/>
+            <w:r>
+              <w:rPr>
+                <w:color w:val="2E74B5" w:themeColor="accent5" w:themeShade="BF"/>
+                <w:highlight w:val="green"/>
+              </w:rPr>
+              <w:t>order</w:t>
+            </w:r>
+            <w:proofErr w:type="spellEnd"/>
+            <w:r>
+              <w:rPr>
+                <w:color w:val="2E74B5" w:themeColor="accent5" w:themeShade="BF"/>
+                <w:highlight w:val="green"/>
+              </w:rPr>
+              <w:t>(</w:t>
+            </w:r>
+            <w:proofErr w:type="spellStart"/>
             <w:proofErr w:type="gramEnd"/>
             <w:r>
               <w:rPr>
                 <w:color w:val="2E74B5" w:themeColor="accent5" w:themeShade="BF"/>
                 <w:highlight w:val="green"/>
               </w:rPr>
-              <w:t>order</w:t>
-            </w:r>
-            <w:proofErr w:type="spellEnd"/>
+              <w:t>df$</w:t>
+            </w:r>
+            <w:proofErr w:type="gramStart"/>
             <w:r>
               <w:rPr>
                 <w:color w:val="2E74B5" w:themeColor="accent5" w:themeShade="BF"/>
                 <w:highlight w:val="green"/>
               </w:rPr>
-              <w:t>(</w:t>
-            </w:r>
-            <w:proofErr w:type="spellStart"/>
-            <w:r>
-              <w:rPr>
-                <w:color w:val="2E74B5" w:themeColor="accent5" w:themeShade="BF"/>
-                <w:highlight w:val="green"/>
-              </w:rPr>
-              <w:t>df$nolac,decreasing</w:t>
-            </w:r>
-            <w:proofErr w:type="spellEnd"/>
+              <w:t>nolac,decreasing</w:t>
+            </w:r>
+            <w:proofErr w:type="spellEnd"/>
+            <w:proofErr w:type="gramEnd"/>
             <w:r>
               <w:rPr>
                 <w:color w:val="2E74B5" w:themeColor="accent5" w:themeShade="BF"/>
@@ -4078,9 +4122,22 @@
                 <w:szCs w:val="20"/>
                 <w:highlight w:val="green"/>
               </w:rPr>
-              <w:t>create_specimen.R</w:t>
-            </w:r>
-            <w:proofErr w:type="spellEnd"/>
+              <w:t>create_</w:t>
+            </w:r>
+            <w:proofErr w:type="gramStart"/>
+            <w:r>
+              <w:rPr>
+                <w:rFonts w:ascii="Arial" w:hAnsi="Arial" w:cs="Arial"/>
+                <w:i/>
+                <w:color w:val="0070C0"/>
+                <w:sz w:val="20"/>
+                <w:szCs w:val="20"/>
+                <w:highlight w:val="green"/>
+              </w:rPr>
+              <w:t>specimen.R</w:t>
+            </w:r>
+            <w:proofErr w:type="spellEnd"/>
+            <w:proofErr w:type="gramEnd"/>
             <w:r>
               <w:rPr>
                 <w:rFonts w:cstheme="minorHAnsi"/>
@@ -7297,9 +7354,19 @@
                 <w:szCs w:val="20"/>
                 <w:highlight w:val="green"/>
               </w:rPr>
-              <w:t>_taille.R</w:t>
-            </w:r>
-            <w:proofErr w:type="spellEnd"/>
+              <w:t>_</w:t>
+            </w:r>
+            <w:proofErr w:type="gramStart"/>
+            <w:r>
+              <w:rPr>
+                <w:sz w:val="20"/>
+                <w:szCs w:val="20"/>
+                <w:highlight w:val="green"/>
+              </w:rPr>
+              <w:t>taille.R</w:t>
+            </w:r>
+            <w:proofErr w:type="spellEnd"/>
+            <w:proofErr w:type="gramEnd"/>
           </w:p>
         </w:tc>
         <w:tc>
@@ -7370,9 +7437,19 @@
                 <w:szCs w:val="20"/>
                 <w:highlight w:val="green"/>
               </w:rPr>
-              <w:t>_taille.R</w:t>
-            </w:r>
-            <w:proofErr w:type="spellEnd"/>
+              <w:t>_</w:t>
+            </w:r>
+            <w:proofErr w:type="gramStart"/>
+            <w:r>
+              <w:rPr>
+                <w:sz w:val="20"/>
+                <w:szCs w:val="20"/>
+                <w:highlight w:val="green"/>
+              </w:rPr>
+              <w:t>taille.R</w:t>
+            </w:r>
+            <w:proofErr w:type="spellEnd"/>
+            <w:proofErr w:type="gramEnd"/>
           </w:p>
           <w:p>
             <w:pPr>

</xml_diff>

<commit_message>
simplification indice de condition
</commit_message>
<xml_diff>
--- a/man/Plan de travail pour Caro_janv 2025.docx
+++ b/man/Plan de travail pour Caro_janv 2025.docx
@@ -19,7 +19,6 @@
           <w:szCs w:val="24"/>
         </w:rPr>
       </w:pPr>
-      <w:proofErr w:type="spellStart"/>
       <w:r>
         <w:rPr>
           <w:b/>
@@ -27,17 +26,7 @@
           <w:sz w:val="24"/>
           <w:szCs w:val="24"/>
         </w:rPr>
-        <w:t>AquaPop</w:t>
-      </w:r>
-      <w:proofErr w:type="spellEnd"/>
-      <w:r>
-        <w:rPr>
-          <w:b/>
-          <w:bCs/>
-          <w:sz w:val="24"/>
-          <w:szCs w:val="24"/>
-        </w:rPr>
-        <w:t xml:space="preserve"> 1.0 - Corrections </w:t>
+        <w:t xml:space="preserve">AquaPop 1.0 - Corrections </w:t>
       </w:r>
       <w:r>
         <w:rPr>
@@ -106,7 +95,6 @@
         </w:rPr>
         <w:t xml:space="preserve"> Toutefois, j’ai vérifié avec </w:t>
       </w:r>
-      <w:proofErr w:type="spellStart"/>
       <w:r>
         <w:rPr>
           <w:i/>
@@ -115,7 +103,6 @@
         </w:rPr>
         <w:t>TemporairyUntilGood</w:t>
       </w:r>
-      <w:proofErr w:type="spellEnd"/>
       <w:r>
         <w:rPr>
           <w:highlight w:val="green"/>
@@ -224,45 +211,13 @@
           <w:bCs/>
           <w:highlight w:val="green"/>
         </w:rPr>
-        <w:t xml:space="preserve">2 </w:t>
-      </w:r>
-      <w:proofErr w:type="spellStart"/>
-      <w:r>
-        <w:rPr>
-          <w:b/>
-          <w:bCs/>
+        <w:t>2 reactives expressions</w:t>
+      </w:r>
+      <w:r>
+        <w:rPr>
           <w:highlight w:val="green"/>
         </w:rPr>
-        <w:t>reactives</w:t>
-      </w:r>
-      <w:proofErr w:type="spellEnd"/>
-      <w:r>
-        <w:rPr>
-          <w:b/>
-          <w:bCs/>
-          <w:highlight w:val="green"/>
-        </w:rPr>
-        <w:t xml:space="preserve"> expressions</w:t>
-      </w:r>
-      <w:r>
-        <w:rPr>
-          <w:highlight w:val="green"/>
-        </w:rPr>
-        <w:t xml:space="preserve"> sous forme de base de données (</w:t>
-      </w:r>
-      <w:proofErr w:type="spellStart"/>
-      <w:r>
-        <w:rPr>
-          <w:highlight w:val="green"/>
-        </w:rPr>
-        <w:t>dataframe</w:t>
-      </w:r>
-      <w:proofErr w:type="spellEnd"/>
-      <w:r>
-        <w:rPr>
-          <w:highlight w:val="green"/>
-        </w:rPr>
-        <w:t>) :</w:t>
+        <w:t xml:space="preserve"> sous forme de base de données (dataframe) :</w:t>
       </w:r>
     </w:p>
     <w:p>
@@ -276,7 +231,6 @@
           <w:highlight w:val="green"/>
         </w:rPr>
       </w:pPr>
-      <w:proofErr w:type="gramStart"/>
       <w:r>
         <w:rPr>
           <w:b/>
@@ -289,16 +243,8 @@
         <w:rPr>
           <w:highlight w:val="green"/>
         </w:rPr>
-        <w:t>(</w:t>
-      </w:r>
-      <w:proofErr w:type="gramEnd"/>
-      <w:r>
-        <w:rPr>
-          <w:highlight w:val="green"/>
-        </w:rPr>
-        <w:t xml:space="preserve">) : fusion de </w:t>
-      </w:r>
-      <w:proofErr w:type="spellStart"/>
+        <w:t xml:space="preserve">() : fusion de </w:t>
+      </w:r>
       <w:r>
         <w:rPr>
           <w:i/>
@@ -307,7 +253,6 @@
         </w:rPr>
         <w:t>recolte</w:t>
       </w:r>
-      <w:proofErr w:type="spellEnd"/>
       <w:r>
         <w:rPr>
           <w:highlight w:val="green"/>
@@ -340,7 +285,6 @@
           <w:highlight w:val="green"/>
         </w:rPr>
       </w:pPr>
-      <w:proofErr w:type="spellStart"/>
       <w:r>
         <w:rPr>
           <w:b/>
@@ -349,14 +293,12 @@
         </w:rPr>
         <w:t>specimen</w:t>
       </w:r>
-      <w:proofErr w:type="spellEnd"/>
       <w:r>
         <w:rPr>
           <w:highlight w:val="green"/>
         </w:rPr>
         <w:t xml:space="preserve">() : fusion de </w:t>
       </w:r>
-      <w:proofErr w:type="spellStart"/>
       <w:r>
         <w:rPr>
           <w:i/>
@@ -365,7 +307,6 @@
         </w:rPr>
         <w:t>specimen</w:t>
       </w:r>
-      <w:proofErr w:type="spellEnd"/>
       <w:r>
         <w:rPr>
           <w:highlight w:val="green"/>
@@ -396,49 +337,38 @@
         </w:rPr>
         <w:t xml:space="preserve">Ces </w:t>
       </w:r>
-      <w:proofErr w:type="spellStart"/>
       <w:r>
         <w:rPr>
           <w:b/>
           <w:bCs/>
           <w:highlight w:val="green"/>
         </w:rPr>
-        <w:t>reactives</w:t>
-      </w:r>
-      <w:proofErr w:type="spellEnd"/>
-      <w:r>
-        <w:rPr>
-          <w:b/>
-          <w:bCs/>
+        <w:t>reactives expressions</w:t>
+      </w:r>
+      <w:r>
+        <w:rPr>
           <w:highlight w:val="green"/>
         </w:rPr>
-        <w:t xml:space="preserve"> expressions</w:t>
+        <w:t xml:space="preserve"> sont seulement la fusion de deux BD, sans aucune sélection (filtre). Toutes les stations y sont (non-valides et dirigées). Nous avons clarifié les données à utiliser pour chaque indicateur, et il y aurait 3 BD requises pour faire </w:t>
       </w:r>
       <w:r>
         <w:rPr>
           <w:highlight w:val="green"/>
         </w:rPr>
-        <w:t xml:space="preserve"> sont seulement la fusion de deux BD, sans aucune sélection (filtre). Toutes les stations y sont (non-valides et dirigées). Nous avons clarifié les données à utiliser pour chaque indicateur, et il y aurait 3 BD requises pour faire </w:t>
+        <w:t xml:space="preserve">toutes les </w:t>
       </w:r>
       <w:r>
         <w:rPr>
           <w:highlight w:val="green"/>
         </w:rPr>
-        <w:t xml:space="preserve">toutes les </w:t>
+        <w:t xml:space="preserve">analyses. Nous proposons ainsi de corriger les </w:t>
       </w:r>
       <w:r>
         <w:rPr>
           <w:highlight w:val="green"/>
         </w:rPr>
-        <w:t xml:space="preserve">analyses. Nous proposons ainsi de corriger les </w:t>
-      </w:r>
-      <w:r>
-        <w:rPr>
-          <w:highlight w:val="green"/>
-        </w:rPr>
         <w:t xml:space="preserve">données lors du </w:t>
       </w:r>
-      <w:proofErr w:type="spellStart"/>
       <w:r>
         <w:rPr>
           <w:rFonts w:ascii="Arial" w:hAnsi="Arial" w:cs="Arial"/>
@@ -452,7 +382,6 @@
         </w:rPr>
         <w:t>load</w:t>
       </w:r>
-      <w:proofErr w:type="spellEnd"/>
       <w:r>
         <w:rPr>
           <w:highlight w:val="green"/>
@@ -463,21 +392,7 @@
         <w:rPr>
           <w:highlight w:val="green"/>
         </w:rPr>
-        <w:t xml:space="preserve"> </w:t>
-      </w:r>
-      <w:proofErr w:type="spellStart"/>
-      <w:r>
-        <w:rPr>
-          <w:highlight w:val="green"/>
-        </w:rPr>
-        <w:t>reactive</w:t>
-      </w:r>
-      <w:proofErr w:type="spellEnd"/>
-      <w:r>
-        <w:rPr>
-          <w:highlight w:val="green"/>
-        </w:rPr>
-        <w:t xml:space="preserve"> expression</w:t>
+        <w:t xml:space="preserve"> reactive expression</w:t>
       </w:r>
       <w:r>
         <w:rPr>
@@ -629,7 +544,6 @@
           <w:highlight w:val="green"/>
         </w:rPr>
       </w:pPr>
-      <w:proofErr w:type="spellStart"/>
       <w:r>
         <w:rPr>
           <w:b/>
@@ -638,14 +552,12 @@
         </w:rPr>
         <w:t>specimen</w:t>
       </w:r>
-      <w:proofErr w:type="spellEnd"/>
       <w:r>
         <w:rPr>
           <w:highlight w:val="green"/>
         </w:rPr>
         <w:t xml:space="preserve">() : fusion de </w:t>
       </w:r>
-      <w:proofErr w:type="spellStart"/>
       <w:r>
         <w:rPr>
           <w:i/>
@@ -654,7 +566,6 @@
         </w:rPr>
         <w:t>specimen</w:t>
       </w:r>
-      <w:proofErr w:type="spellEnd"/>
       <w:r>
         <w:rPr>
           <w:highlight w:val="green"/>
@@ -717,31 +628,20 @@
         </w:rPr>
         <w:t xml:space="preserve"> </w:t>
       </w:r>
-      <w:proofErr w:type="spellStart"/>
       <w:r>
         <w:rPr>
           <w:i/>
           <w:iCs/>
           <w:highlight w:val="green"/>
         </w:rPr>
-        <w:t>reactive</w:t>
-      </w:r>
-      <w:proofErr w:type="spellEnd"/>
-      <w:r>
-        <w:rPr>
-          <w:i/>
-          <w:iCs/>
+        <w:t>reactive expression</w:t>
+      </w:r>
+      <w:r>
+        <w:rPr>
           <w:highlight w:val="green"/>
         </w:rPr>
-        <w:t xml:space="preserve"> expression</w:t>
-      </w:r>
-      <w:r>
-        <w:rPr>
-          <w:highlight w:val="green"/>
-        </w:rPr>
         <w:t xml:space="preserve">, car elle est utilisée pour plusieurs indicateurs. Je vais l’appeler </w:t>
       </w:r>
-      <w:proofErr w:type="spellStart"/>
       <w:r>
         <w:rPr>
           <w:b/>
@@ -750,7 +650,6 @@
         </w:rPr>
         <w:t>specimen_valid</w:t>
       </w:r>
-      <w:proofErr w:type="spellEnd"/>
       <w:r>
         <w:rPr>
           <w:highlight w:val="green"/>
@@ -809,21 +708,7 @@
         <w:rPr>
           <w:highlight w:val="yellow"/>
         </w:rPr>
-        <w:t xml:space="preserve">s (ou la </w:t>
-      </w:r>
-      <w:proofErr w:type="spellStart"/>
-      <w:r>
-        <w:rPr>
-          <w:highlight w:val="yellow"/>
-        </w:rPr>
-        <w:t>reactive</w:t>
-      </w:r>
-      <w:proofErr w:type="spellEnd"/>
-      <w:r>
-        <w:rPr>
-          <w:highlight w:val="yellow"/>
-        </w:rPr>
-        <w:t xml:space="preserve"> expression)</w:t>
+        <w:t>s (ou la reactive expression)</w:t>
       </w:r>
       <w:r>
         <w:rPr>
@@ -921,7 +806,6 @@
                 <w:lang w:val="en-CA"/>
               </w:rPr>
             </w:pPr>
-            <w:proofErr w:type="spellStart"/>
             <w:r>
               <w:rPr>
                 <w:sz w:val="20"/>
@@ -929,20 +813,8 @@
                 <w:highlight w:val="green"/>
                 <w:lang w:val="en-CA"/>
               </w:rPr>
-              <w:t>create_</w:t>
-            </w:r>
-            <w:proofErr w:type="gramStart"/>
-            <w:r>
-              <w:rPr>
-                <w:sz w:val="20"/>
-                <w:szCs w:val="20"/>
-                <w:highlight w:val="green"/>
-                <w:lang w:val="en-CA"/>
-              </w:rPr>
-              <w:t>capture.R</w:t>
-            </w:r>
-            <w:proofErr w:type="spellEnd"/>
-            <w:proofErr w:type="gramEnd"/>
+              <w:t>create_capture.R</w:t>
+            </w:r>
           </w:p>
           <w:p>
             <w:pPr>
@@ -955,7 +827,6 @@
                 <w:lang w:val="en-CA"/>
               </w:rPr>
             </w:pPr>
-            <w:proofErr w:type="spellStart"/>
             <w:r>
               <w:rPr>
                 <w:sz w:val="20"/>
@@ -963,20 +834,8 @@
                 <w:highlight w:val="green"/>
                 <w:lang w:val="en-CA"/>
               </w:rPr>
-              <w:t>create_</w:t>
-            </w:r>
-            <w:proofErr w:type="gramStart"/>
-            <w:r>
-              <w:rPr>
-                <w:sz w:val="20"/>
-                <w:szCs w:val="20"/>
-                <w:highlight w:val="green"/>
-                <w:lang w:val="en-CA"/>
-              </w:rPr>
-              <w:t>specimens.R</w:t>
-            </w:r>
-            <w:proofErr w:type="spellEnd"/>
-            <w:proofErr w:type="gramEnd"/>
+              <w:t>create_specimens.R</w:t>
+            </w:r>
           </w:p>
         </w:tc>
         <w:tc>
@@ -1003,61 +862,7 @@
                 <w:szCs w:val="20"/>
                 <w:highlight w:val="green"/>
               </w:rPr>
-              <w:t>Enlever le "</w:t>
-            </w:r>
-            <w:proofErr w:type="spellStart"/>
-            <w:r>
-              <w:rPr>
-                <w:sz w:val="20"/>
-                <w:szCs w:val="20"/>
-                <w:highlight w:val="green"/>
-              </w:rPr>
-              <w:t>nom_lac</w:t>
-            </w:r>
-            <w:proofErr w:type="spellEnd"/>
-            <w:r>
-              <w:rPr>
-                <w:sz w:val="20"/>
-                <w:szCs w:val="20"/>
-                <w:highlight w:val="green"/>
-              </w:rPr>
-              <w:t xml:space="preserve">" dans le « by ». Ça permet d’alléger, et il y a des risques d’erreur avec </w:t>
-            </w:r>
-            <w:proofErr w:type="spellStart"/>
-            <w:r>
-              <w:rPr>
-                <w:sz w:val="20"/>
-                <w:szCs w:val="20"/>
-                <w:highlight w:val="green"/>
-              </w:rPr>
-              <w:t>nom_lac</w:t>
-            </w:r>
-            <w:proofErr w:type="spellEnd"/>
-            <w:r>
-              <w:rPr>
-                <w:sz w:val="20"/>
-                <w:szCs w:val="20"/>
-                <w:highlight w:val="green"/>
-              </w:rPr>
-              <w:t xml:space="preserve">. C’est pourquoi on se fie davantage au </w:t>
-            </w:r>
-            <w:proofErr w:type="spellStart"/>
-            <w:r>
-              <w:rPr>
-                <w:sz w:val="20"/>
-                <w:szCs w:val="20"/>
-                <w:highlight w:val="green"/>
-              </w:rPr>
-              <w:t>nolac</w:t>
-            </w:r>
-            <w:proofErr w:type="spellEnd"/>
-            <w:r>
-              <w:rPr>
-                <w:sz w:val="20"/>
-                <w:szCs w:val="20"/>
-                <w:highlight w:val="green"/>
-              </w:rPr>
-              <w:t xml:space="preserve"> comme clé.</w:t>
+              <w:t>Enlever le "nom_lac" dans le « by ». Ça permet d’alléger, et il y a des risques d’erreur avec nom_lac. C’est pourquoi on se fie davantage au nolac comme clé.</w:t>
             </w:r>
           </w:p>
           <w:p>
@@ -1085,7 +890,6 @@
               </w:rPr>
               <w:t xml:space="preserve">Dans </w:t>
             </w:r>
-            <w:proofErr w:type="spellStart"/>
             <w:r>
               <w:rPr>
                 <w:rFonts w:ascii="Arial" w:hAnsi="Arial" w:cs="Arial"/>
@@ -1097,34 +901,14 @@
               </w:rPr>
               <w:t>create_specimen</w:t>
             </w:r>
-            <w:proofErr w:type="spellEnd"/>
-            <w:r>
-              <w:rPr>
-                <w:sz w:val="20"/>
-                <w:szCs w:val="20"/>
-                <w:highlight w:val="green"/>
-              </w:rPr>
-              <w:t xml:space="preserve">, enlever le remplacement de NA dans </w:t>
-            </w:r>
-            <w:proofErr w:type="spellStart"/>
-            <w:r>
-              <w:rPr>
-                <w:sz w:val="20"/>
-                <w:szCs w:val="20"/>
-                <w:highlight w:val="green"/>
-              </w:rPr>
-              <w:t>sex</w:t>
-            </w:r>
-            <w:proofErr w:type="spellEnd"/>
-            <w:r>
-              <w:rPr>
-                <w:sz w:val="20"/>
-                <w:szCs w:val="20"/>
-                <w:highlight w:val="green"/>
-              </w:rPr>
-              <w:t xml:space="preserve"> et maturité (lignes 3 à 16). Cette correction doit être apportée dans </w:t>
-            </w:r>
-            <w:proofErr w:type="spellStart"/>
+            <w:r>
+              <w:rPr>
+                <w:sz w:val="20"/>
+                <w:szCs w:val="20"/>
+                <w:highlight w:val="green"/>
+              </w:rPr>
+              <w:t xml:space="preserve">, enlever le remplacement de NA dans sex et maturité (lignes 3 à 16). Cette correction doit être apportée dans </w:t>
+            </w:r>
             <w:r>
               <w:rPr>
                 <w:rFonts w:ascii="Arial" w:hAnsi="Arial" w:cs="Arial"/>
@@ -1134,22 +918,8 @@
                 <w:szCs w:val="20"/>
                 <w:highlight w:val="green"/>
               </w:rPr>
-              <w:t>load_</w:t>
-            </w:r>
-            <w:proofErr w:type="gramStart"/>
-            <w:r>
-              <w:rPr>
-                <w:rFonts w:ascii="Arial" w:hAnsi="Arial" w:cs="Arial"/>
-                <w:i/>
-                <w:color w:val="0070C0"/>
-                <w:sz w:val="20"/>
-                <w:szCs w:val="20"/>
-                <w:highlight w:val="green"/>
-              </w:rPr>
-              <w:t>specimen.R</w:t>
-            </w:r>
-            <w:proofErr w:type="spellEnd"/>
-            <w:proofErr w:type="gramEnd"/>
+              <w:t>load_specimen.R</w:t>
+            </w:r>
             <w:r>
               <w:rPr>
                 <w:sz w:val="20"/>
@@ -1219,8 +989,6 @@
                 <w:lang w:val="en-CA"/>
               </w:rPr>
             </w:pPr>
-            <w:proofErr w:type="spellStart"/>
-            <w:proofErr w:type="gramStart"/>
             <w:r>
               <w:rPr>
                 <w:sz w:val="20"/>
@@ -1230,8 +998,6 @@
               <w:lastRenderedPageBreak/>
               <w:t>app.R</w:t>
             </w:r>
-            <w:proofErr w:type="spellEnd"/>
-            <w:proofErr w:type="gramEnd"/>
           </w:p>
         </w:tc>
         <w:tc>
@@ -1259,107 +1025,15 @@
                 <w:szCs w:val="20"/>
                 <w:highlight w:val="green"/>
               </w:rPr>
-              <w:t xml:space="preserve">Dans la liste des packages, il manque l’installation de </w:t>
-            </w:r>
-            <w:proofErr w:type="spellStart"/>
-            <w:r>
-              <w:rPr>
-                <w:sz w:val="20"/>
-                <w:szCs w:val="20"/>
-                <w:highlight w:val="green"/>
-              </w:rPr>
-              <w:t>investr</w:t>
-            </w:r>
-            <w:proofErr w:type="spellEnd"/>
-            <w:r>
-              <w:rPr>
-                <w:sz w:val="20"/>
-                <w:szCs w:val="20"/>
-                <w:highlight w:val="green"/>
-              </w:rPr>
-              <w:t xml:space="preserve">, </w:t>
-            </w:r>
-            <w:proofErr w:type="spellStart"/>
-            <w:r>
-              <w:rPr>
-                <w:sz w:val="20"/>
-                <w:szCs w:val="20"/>
-                <w:highlight w:val="green"/>
-              </w:rPr>
-              <w:t>pROC</w:t>
-            </w:r>
-            <w:proofErr w:type="spellEnd"/>
-            <w:r>
-              <w:rPr>
-                <w:sz w:val="20"/>
-                <w:szCs w:val="20"/>
-                <w:highlight w:val="green"/>
-              </w:rPr>
-              <w:t xml:space="preserve">, </w:t>
-            </w:r>
-            <w:proofErr w:type="spellStart"/>
-            <w:r>
-              <w:rPr>
-                <w:sz w:val="20"/>
-                <w:szCs w:val="20"/>
-                <w:highlight w:val="green"/>
-              </w:rPr>
-              <w:t>DescTools</w:t>
-            </w:r>
-            <w:proofErr w:type="spellEnd"/>
-            <w:r>
-              <w:rPr>
-                <w:sz w:val="20"/>
-                <w:szCs w:val="20"/>
-                <w:highlight w:val="green"/>
-              </w:rPr>
-              <w:t xml:space="preserve"> et </w:t>
-            </w:r>
-            <w:proofErr w:type="spellStart"/>
-            <w:r>
-              <w:rPr>
-                <w:sz w:val="20"/>
-                <w:szCs w:val="20"/>
-                <w:highlight w:val="green"/>
-              </w:rPr>
-              <w:t>Emdbook</w:t>
-            </w:r>
-            <w:proofErr w:type="spellEnd"/>
-            <w:r>
-              <w:rPr>
-                <w:sz w:val="20"/>
-                <w:szCs w:val="20"/>
-                <w:highlight w:val="green"/>
-              </w:rPr>
-              <w:t>.</w:t>
-            </w:r>
-            <w:r>
-              <w:rPr>
-                <w:sz w:val="20"/>
-                <w:szCs w:val="20"/>
-                <w:highlight w:val="green"/>
-              </w:rPr>
-              <w:t xml:space="preserve"> Vérifier aussi package AER (</w:t>
-            </w:r>
-            <w:proofErr w:type="spellStart"/>
-            <w:proofErr w:type="gramStart"/>
-            <w:r>
-              <w:rPr>
-                <w:sz w:val="20"/>
-                <w:szCs w:val="20"/>
-                <w:highlight w:val="green"/>
-              </w:rPr>
-              <w:t>dispersiontest.R</w:t>
-            </w:r>
-            <w:proofErr w:type="spellEnd"/>
-            <w:proofErr w:type="gramEnd"/>
-            <w:r>
-              <w:rPr>
-                <w:sz w:val="20"/>
-                <w:szCs w:val="20"/>
-                <w:highlight w:val="green"/>
-              </w:rPr>
-              <w:t>)</w:t>
+              <w:t>Dans la liste des packages, il manque l’installation de investr, pROC, DescTools et Emdbook.</w:t>
+            </w:r>
+            <w:r>
+              <w:rPr>
+                <w:sz w:val="20"/>
+                <w:szCs w:val="20"/>
+                <w:highlight w:val="green"/>
+              </w:rPr>
+              <w:t xml:space="preserve"> Vérifier aussi package AER (dispersiontest.R)</w:t>
             </w:r>
           </w:p>
         </w:tc>
@@ -1389,33 +1063,13 @@
               </w:rPr>
             </w:pPr>
             <w:bookmarkStart w:id="0" w:name="_Hlk150930610"/>
-            <w:proofErr w:type="spellStart"/>
-            <w:proofErr w:type="gramStart"/>
-            <w:r>
-              <w:rPr>
-                <w:sz w:val="20"/>
-                <w:szCs w:val="20"/>
-              </w:rPr>
-              <w:t>app</w:t>
-            </w:r>
-            <w:proofErr w:type="gramEnd"/>
-            <w:r>
-              <w:rPr>
-                <w:sz w:val="20"/>
-                <w:szCs w:val="20"/>
-              </w:rPr>
-              <w:t>_</w:t>
-            </w:r>
-            <w:proofErr w:type="gramStart"/>
-            <w:r>
-              <w:rPr>
-                <w:sz w:val="20"/>
-                <w:szCs w:val="20"/>
-              </w:rPr>
-              <w:t>ui.R</w:t>
-            </w:r>
-            <w:proofErr w:type="spellEnd"/>
-            <w:proofErr w:type="gramEnd"/>
+            <w:r>
+              <w:rPr>
+                <w:sz w:val="20"/>
+                <w:szCs w:val="20"/>
+              </w:rPr>
+              <w:t>app_ui.R</w:t>
+            </w:r>
           </w:p>
         </w:tc>
         <w:tc>
@@ -1758,8 +1412,6 @@
                 <w:lang w:val="en-CA"/>
               </w:rPr>
             </w:pPr>
-            <w:proofErr w:type="spellStart"/>
-            <w:proofErr w:type="gramStart"/>
             <w:r>
               <w:rPr>
                 <w:sz w:val="20"/>
@@ -1768,8 +1420,6 @@
               </w:rPr>
               <w:t>utils.R</w:t>
             </w:r>
-            <w:proofErr w:type="spellEnd"/>
-            <w:proofErr w:type="gramEnd"/>
           </w:p>
         </w:tc>
         <w:tc>
@@ -1923,7 +1573,6 @@
                 <w:highlight w:val="green"/>
               </w:rPr>
             </w:pPr>
-            <w:proofErr w:type="spellStart"/>
             <w:r>
               <w:rPr>
                 <w:sz w:val="20"/>
@@ -1932,7 +1581,6 @@
               </w:rPr>
               <w:t>kable_CPUEtous</w:t>
             </w:r>
-            <w:proofErr w:type="spellEnd"/>
           </w:p>
           <w:p>
             <w:pPr>
@@ -1957,7 +1605,6 @@
                 <w:highlight w:val="green"/>
               </w:rPr>
             </w:pPr>
-            <w:proofErr w:type="spellStart"/>
             <w:r>
               <w:rPr>
                 <w:sz w:val="20"/>
@@ -1966,7 +1613,6 @@
               </w:rPr>
               <w:t>kable_CPUEFmature</w:t>
             </w:r>
-            <w:proofErr w:type="spellEnd"/>
           </w:p>
           <w:p>
             <w:pPr>
@@ -2017,8 +1663,6 @@
                 <w:lang w:val="en-CA"/>
               </w:rPr>
             </w:pPr>
-            <w:proofErr w:type="spellStart"/>
-            <w:proofErr w:type="gramStart"/>
             <w:r>
               <w:rPr>
                 <w:i w:val="0"/>
@@ -2026,30 +1670,8 @@
                 <w:szCs w:val="20"/>
                 <w:highlight w:val="green"/>
               </w:rPr>
-              <w:t>app</w:t>
-            </w:r>
-            <w:proofErr w:type="gramEnd"/>
-            <w:r>
-              <w:rPr>
-                <w:i w:val="0"/>
-                <w:sz w:val="20"/>
-                <w:szCs w:val="20"/>
-                <w:highlight w:val="green"/>
-              </w:rPr>
-              <w:t>_</w:t>
-            </w:r>
-            <w:proofErr w:type="gramStart"/>
-            <w:r>
-              <w:rPr>
-                <w:i w:val="0"/>
-                <w:sz w:val="20"/>
-                <w:szCs w:val="20"/>
-                <w:highlight w:val="green"/>
-              </w:rPr>
-              <w:t>server.R</w:t>
-            </w:r>
-            <w:proofErr w:type="spellEnd"/>
-            <w:proofErr w:type="gramEnd"/>
+              <w:t>app_server.R</w:t>
+            </w:r>
           </w:p>
         </w:tc>
         <w:tc>
@@ -2096,64 +1718,12 @@
               </w:rPr>
               <w:t xml:space="preserve">Nous proposons d’utiliser </w:t>
             </w:r>
-            <w:proofErr w:type="spellStart"/>
-            <w:proofErr w:type="gramStart"/>
             <w:r>
               <w:rPr>
                 <w:color w:val="2E74B5" w:themeColor="accent5" w:themeShade="BF"/>
                 <w:highlight w:val="green"/>
               </w:rPr>
-              <w:t>df</w:t>
-            </w:r>
-            <w:proofErr w:type="spellEnd"/>
-            <w:r>
-              <w:rPr>
-                <w:color w:val="2E74B5" w:themeColor="accent5" w:themeShade="BF"/>
-                <w:highlight w:val="green"/>
-              </w:rPr>
-              <w:t>[</w:t>
-            </w:r>
-            <w:proofErr w:type="spellStart"/>
-            <w:r>
-              <w:rPr>
-                <w:color w:val="2E74B5" w:themeColor="accent5" w:themeShade="BF"/>
-                <w:highlight w:val="green"/>
-              </w:rPr>
-              <w:t>order</w:t>
-            </w:r>
-            <w:proofErr w:type="spellEnd"/>
-            <w:r>
-              <w:rPr>
-                <w:color w:val="2E74B5" w:themeColor="accent5" w:themeShade="BF"/>
-                <w:highlight w:val="green"/>
-              </w:rPr>
-              <w:t>(</w:t>
-            </w:r>
-            <w:proofErr w:type="spellStart"/>
-            <w:proofErr w:type="gramEnd"/>
-            <w:r>
-              <w:rPr>
-                <w:color w:val="2E74B5" w:themeColor="accent5" w:themeShade="BF"/>
-                <w:highlight w:val="green"/>
-              </w:rPr>
-              <w:t>df$</w:t>
-            </w:r>
-            <w:proofErr w:type="gramStart"/>
-            <w:r>
-              <w:rPr>
-                <w:color w:val="2E74B5" w:themeColor="accent5" w:themeShade="BF"/>
-                <w:highlight w:val="green"/>
-              </w:rPr>
-              <w:t>nolac,decreasing</w:t>
-            </w:r>
-            <w:proofErr w:type="spellEnd"/>
-            <w:proofErr w:type="gramEnd"/>
-            <w:r>
-              <w:rPr>
-                <w:color w:val="2E74B5" w:themeColor="accent5" w:themeShade="BF"/>
-                <w:highlight w:val="green"/>
-              </w:rPr>
-              <w:t xml:space="preserve"> = FALSE),]</w:t>
+              <w:t>df[order(df$nolac,decreasing = FALSE),]</w:t>
             </w:r>
             <w:r>
               <w:rPr>
@@ -2293,7 +1863,6 @@
                 <w:highlight w:val="green"/>
               </w:rPr>
             </w:pPr>
-            <w:proofErr w:type="spellStart"/>
             <w:r>
               <w:rPr>
                 <w:sz w:val="20"/>
@@ -2303,7 +1872,6 @@
               </w:rPr>
               <w:t>User_guide.rmd</w:t>
             </w:r>
-            <w:proofErr w:type="spellEnd"/>
           </w:p>
         </w:tc>
         <w:tc>
@@ -2360,33 +1928,11 @@
               </w:rPr>
               <w:t xml:space="preserve">Monitoring reproduction in fish: assessing the adequacy of ogives and the predicted uncertainty of their L50 estimates for more reliable biological inferences. </w:t>
             </w:r>
-            <w:proofErr w:type="spellStart"/>
-            <w:r>
-              <w:rPr>
-                <w:highlight w:val="green"/>
-              </w:rPr>
-              <w:t>Fisheries</w:t>
-            </w:r>
-            <w:proofErr w:type="spellEnd"/>
-            <w:r>
-              <w:rPr>
-                <w:highlight w:val="green"/>
-              </w:rPr>
-              <w:t xml:space="preserve"> </w:t>
-            </w:r>
-            <w:proofErr w:type="spellStart"/>
-            <w:r>
-              <w:rPr>
-                <w:highlight w:val="green"/>
-              </w:rPr>
-              <w:t>Research</w:t>
-            </w:r>
-            <w:proofErr w:type="spellEnd"/>
-            <w:r>
-              <w:rPr>
-                <w:highlight w:val="green"/>
-              </w:rPr>
-              <w:t>. 269. 106863. 10.1016/j.fishres.2023.106863.</w:t>
+            <w:r>
+              <w:rPr>
+                <w:highlight w:val="green"/>
+              </w:rPr>
+              <w:t>Fisheries Research. 269. 106863. 10.1016/j.fishres.2023.106863.</w:t>
             </w:r>
           </w:p>
         </w:tc>
@@ -2416,7 +1962,6 @@
                 <w:lang w:val="en-CA"/>
               </w:rPr>
             </w:pPr>
-            <w:proofErr w:type="spellStart"/>
             <w:r>
               <w:rPr>
                 <w:sz w:val="20"/>
@@ -2444,7 +1989,6 @@
               </w:rPr>
               <w:t>n_texte.rmd</w:t>
             </w:r>
-            <w:proofErr w:type="spellEnd"/>
           </w:p>
         </w:tc>
         <w:tc>
@@ -2497,7 +2041,6 @@
                 <w:highlight w:val="green"/>
               </w:rPr>
             </w:pPr>
-            <w:proofErr w:type="spellStart"/>
             <w:r>
               <w:rPr>
                 <w:sz w:val="20"/>
@@ -2516,7 +2059,6 @@
               </w:rPr>
               <w:t>.rmd</w:t>
             </w:r>
-            <w:proofErr w:type="spellEnd"/>
           </w:p>
         </w:tc>
         <w:tc>
@@ -2615,7 +2157,6 @@
                 <w:shd w:val="clear" w:color="auto" w:fill="FFFFFF"/>
               </w:rPr>
             </w:pPr>
-            <w:proofErr w:type="spellStart"/>
             <w:r>
               <w:rPr>
                 <w:sz w:val="20"/>
@@ -2624,7 +2165,6 @@
               </w:rPr>
               <w:t>taillemasseage_texte.rmd</w:t>
             </w:r>
-            <w:proofErr w:type="spellEnd"/>
           </w:p>
         </w:tc>
         <w:tc>
@@ -2647,35 +2187,7 @@
               <w:rPr>
                 <w:highlight w:val="green"/>
               </w:rPr>
-              <w:t>« Le tableau suivant reprend les statistiques descriptives, soit le nombre de spécimens mesurés/pesés/âgés (N) ainsi que la moyenne (</w:t>
-            </w:r>
-            <w:proofErr w:type="spellStart"/>
-            <w:r>
-              <w:rPr>
-                <w:highlight w:val="green"/>
-              </w:rPr>
-              <w:t>Moy</w:t>
-            </w:r>
-            <w:proofErr w:type="spellEnd"/>
-            <w:r>
-              <w:rPr>
-                <w:highlight w:val="green"/>
-              </w:rPr>
-              <w:t>.), l’écart-type (ET), les valeurs minimale (Min) et maximale (Max) de la longueur totale maximale (</w:t>
-            </w:r>
-            <w:proofErr w:type="spellStart"/>
-            <w:r>
-              <w:rPr>
-                <w:highlight w:val="green"/>
-              </w:rPr>
-              <w:t>LTMax</w:t>
-            </w:r>
-            <w:proofErr w:type="spellEnd"/>
-            <w:r>
-              <w:rPr>
-                <w:highlight w:val="green"/>
-              </w:rPr>
-              <w:t>), de la masse et de l’âge des poissons pour différents groupes. »</w:t>
+              <w:t>« Le tableau suivant reprend les statistiques descriptives, soit le nombre de spécimens mesurés/pesés/âgés (N) ainsi que la moyenne (Moy.), l’écart-type (ET), les valeurs minimale (Min) et maximale (Max) de la longueur totale maximale (LTMax), de la masse et de l’âge des poissons pour différents groupes. »</w:t>
             </w:r>
           </w:p>
         </w:tc>
@@ -2705,7 +2217,6 @@
                 <w:shd w:val="clear" w:color="auto" w:fill="FFFFFF"/>
               </w:rPr>
             </w:pPr>
-            <w:proofErr w:type="spellStart"/>
             <w:r>
               <w:rPr>
                 <w:sz w:val="20"/>
@@ -2715,7 +2226,6 @@
               </w:rPr>
               <w:t>structuretaille_texte.rmd</w:t>
             </w:r>
-            <w:proofErr w:type="spellEnd"/>
           </w:p>
         </w:tc>
         <w:tc>
@@ -2738,21 +2248,7 @@
               <w:rPr>
                 <w:highlight w:val="green"/>
               </w:rPr>
-              <w:t xml:space="preserve">« L’histogramme de fréquence des longueurs permettant de caractériser la structure de taille de la population est réalisée avec la fonction </w:t>
-            </w:r>
-            <w:proofErr w:type="spellStart"/>
-            <w:r>
-              <w:rPr>
-                <w:highlight w:val="green"/>
-              </w:rPr>
-              <w:t>geom_histogram</w:t>
-            </w:r>
-            <w:proofErr w:type="spellEnd"/>
-            <w:r>
-              <w:rPr>
-                <w:highlight w:val="green"/>
-              </w:rPr>
-              <w:t xml:space="preserve"> de la librairie ggplot2 (Chang et al. 2021). La sélection des intervalles pour les classes de taille est basée sur les recommandations de Anderson et Neumann (1996) et Neumann et al. (2012). Ainsi, des intervalles de 20 mm sont utilisés pour l’omble de fontaine, alors qu’ils sont de 50 mm pour le doré jaune </w:t>
+              <w:t xml:space="preserve">« L’histogramme de fréquence des longueurs permettant de caractériser la structure de taille de la population est réalisée avec la fonction geom_histogram de la librairie ggplot2 (Chang et al. 2021). La sélection des intervalles pour les classes de taille est basée sur les recommandations de Anderson et Neumann (1996) et Neumann et al. (2012). Ainsi, des intervalles de 20 mm sont utilisés pour l’omble de fontaine, alors qu’ils sont de 50 mm pour le doré jaune </w:t>
             </w:r>
             <w:r>
               <w:rPr>
@@ -2875,35 +2371,7 @@
               <w:rPr>
                 <w:highlight w:val="green"/>
               </w:rPr>
-              <w:t>« Le tableau ci-dessous présente l’indice de masse relative (</w:t>
-            </w:r>
-            <w:proofErr w:type="spellStart"/>
-            <w:r>
-              <w:rPr>
-                <w:highlight w:val="green"/>
-              </w:rPr>
-              <w:t>Wr</w:t>
-            </w:r>
-            <w:proofErr w:type="spellEnd"/>
-            <w:r>
-              <w:rPr>
-                <w:highlight w:val="green"/>
-              </w:rPr>
-              <w:t xml:space="preserve">) et son intervalle de confiance à 95 % pour l’ensemble de la population, par sexe et par classe de PSD (classe selon </w:t>
-            </w:r>
-            <w:proofErr w:type="spellStart"/>
-            <w:r>
-              <w:rPr>
-                <w:highlight w:val="green"/>
-              </w:rPr>
-              <w:t>Gabelhouse</w:t>
-            </w:r>
-            <w:proofErr w:type="spellEnd"/>
-            <w:r>
-              <w:rPr>
-                <w:highlight w:val="green"/>
-              </w:rPr>
-              <w:t xml:space="preserve"> 1984). »</w:t>
+              <w:t>« Le tableau ci-dessous présente l’indice de masse relative (Wr) et son intervalle de confiance à 95 % pour l’ensemble de la population, par sexe et par classe de PSD (classe selon Gabelhouse 1984). »</w:t>
             </w:r>
           </w:p>
         </w:tc>
@@ -3079,7 +2547,6 @@
                 <w:highlight w:val="green"/>
               </w:rPr>
             </w:pPr>
-            <w:proofErr w:type="spellStart"/>
             <w:r>
               <w:rPr>
                 <w:sz w:val="20"/>
@@ -3088,7 +2555,6 @@
               </w:rPr>
               <w:t>CPUE_texte</w:t>
             </w:r>
-            <w:proofErr w:type="spellEnd"/>
           </w:p>
           <w:p>
             <w:pPr>
@@ -3222,23 +2688,7 @@
                 <w:strike/>
                 <w:highlight w:val="green"/>
               </w:rPr>
-              <w:t xml:space="preserve">Le nombre d’individus peut parfois </w:t>
-            </w:r>
-            <w:proofErr w:type="gramStart"/>
-            <w:r>
-              <w:rPr>
-                <w:strike/>
-                <w:highlight w:val="green"/>
-              </w:rPr>
-              <w:t>différé</w:t>
-            </w:r>
-            <w:proofErr w:type="gramEnd"/>
-            <w:r>
-              <w:rPr>
-                <w:strike/>
-                <w:highlight w:val="green"/>
-              </w:rPr>
-              <w:t xml:space="preserve"> entre les tables </w:t>
+              <w:t xml:space="preserve">Le nombre d’individus peut parfois différé entre les tables </w:t>
             </w:r>
             <w:r>
               <w:rPr>
@@ -3350,31 +2800,7 @@
                 <w:highlight w:val="green"/>
                 <w:shd w:val="clear" w:color="auto" w:fill="FFFFFF"/>
               </w:rPr>
-              <w:t>d’abondance globale (</w:t>
-            </w:r>
-            <w:proofErr w:type="spellStart"/>
-            <w:r>
-              <w:rPr>
-                <w:rFonts w:ascii="Helvetica" w:hAnsi="Helvetica" w:cs="Helvetica"/>
-                <w:color w:val="FF0000"/>
-                <w:sz w:val="21"/>
-                <w:szCs w:val="21"/>
-                <w:highlight w:val="green"/>
-                <w:shd w:val="clear" w:color="auto" w:fill="FFFFFF"/>
-              </w:rPr>
-              <w:t>CPUE_tous</w:t>
-            </w:r>
-            <w:proofErr w:type="spellEnd"/>
-            <w:r>
-              <w:rPr>
-                <w:rFonts w:ascii="Helvetica" w:hAnsi="Helvetica" w:cs="Helvetica"/>
-                <w:color w:val="FF0000"/>
-                <w:sz w:val="21"/>
-                <w:szCs w:val="21"/>
-                <w:highlight w:val="green"/>
-                <w:shd w:val="clear" w:color="auto" w:fill="FFFFFF"/>
-              </w:rPr>
-              <w:t xml:space="preserve">) sont calculés à partir du nombre de captures indiqués dans la </w:t>
+              <w:t xml:space="preserve">d’abondance globale (CPUE_tous) sont calculés à partir du nombre de captures indiqués dans la </w:t>
             </w:r>
             <w:r>
               <w:rPr>
@@ -3452,7 +2878,6 @@
                 <w:shd w:val="clear" w:color="auto" w:fill="FFFFFF"/>
               </w:rPr>
             </w:pPr>
-            <w:proofErr w:type="spellStart"/>
             <w:r>
               <w:rPr>
                 <w:sz w:val="20"/>
@@ -3460,20 +2885,8 @@
                 <w:highlight w:val="green"/>
                 <w:lang w:val="en-CA"/>
               </w:rPr>
-              <w:t>biomasse_</w:t>
-            </w:r>
-            <w:proofErr w:type="gramStart"/>
-            <w:r>
-              <w:rPr>
-                <w:sz w:val="20"/>
-                <w:szCs w:val="20"/>
-                <w:highlight w:val="green"/>
-                <w:lang w:val="en-CA"/>
-              </w:rPr>
-              <w:t>table.R</w:t>
-            </w:r>
-            <w:proofErr w:type="spellEnd"/>
-            <w:proofErr w:type="gramEnd"/>
+              <w:t>biomasse_table.R</w:t>
+            </w:r>
           </w:p>
         </w:tc>
         <w:tc>
@@ -3539,7 +2952,6 @@
                 <w:shd w:val="clear" w:color="auto" w:fill="FFFFFF"/>
               </w:rPr>
             </w:pPr>
-            <w:proofErr w:type="spellStart"/>
             <w:r>
               <w:rPr>
                 <w:sz w:val="20"/>
@@ -3550,7 +2962,6 @@
               <w:lastRenderedPageBreak/>
               <w:t>Mortalité_texte.rmd</w:t>
             </w:r>
-            <w:proofErr w:type="spellEnd"/>
           </w:p>
         </w:tc>
         <w:tc>
@@ -3583,25 +2994,7 @@
                 <w:szCs w:val="20"/>
                 <w:highlight w:val="green"/>
               </w:rPr>
-              <w:t xml:space="preserve">« Le premier tableau présente les résultats pour l’ensemble des modèles testés. Le modèle le mieux adapté aux données est celui avec le plus faible </w:t>
-            </w:r>
-            <w:proofErr w:type="spellStart"/>
-            <w:r>
-              <w:rPr>
-                <w:sz w:val="20"/>
-                <w:szCs w:val="20"/>
-                <w:highlight w:val="green"/>
-              </w:rPr>
-              <w:t>AICc</w:t>
-            </w:r>
-            <w:proofErr w:type="spellEnd"/>
-            <w:r>
-              <w:rPr>
-                <w:sz w:val="20"/>
-                <w:szCs w:val="20"/>
-                <w:highlight w:val="green"/>
-              </w:rPr>
-              <w:t>.</w:t>
+              <w:t>« Le premier tableau présente les résultats pour l’ensemble des modèles testés. Le modèle le mieux adapté aux données est celui avec le plus faible AICc.</w:t>
             </w:r>
           </w:p>
           <w:p>
@@ -3705,7 +3098,6 @@
                 <w:highlight w:val="green"/>
               </w:rPr>
             </w:pPr>
-            <w:proofErr w:type="spellStart"/>
             <w:r>
               <w:rPr>
                 <w:sz w:val="20"/>
@@ -3713,20 +3105,8 @@
                 <w:highlight w:val="green"/>
                 <w:lang w:val="en-CA"/>
               </w:rPr>
-              <w:t>load_</w:t>
-            </w:r>
-            <w:proofErr w:type="gramStart"/>
-            <w:r>
-              <w:rPr>
-                <w:sz w:val="20"/>
-                <w:szCs w:val="20"/>
-                <w:highlight w:val="green"/>
-                <w:lang w:val="en-CA"/>
-              </w:rPr>
-              <w:t>lac.R</w:t>
-            </w:r>
-            <w:proofErr w:type="spellEnd"/>
-            <w:proofErr w:type="gramEnd"/>
+              <w:t>load_lac.R</w:t>
+            </w:r>
           </w:p>
         </w:tc>
         <w:tc>
@@ -3756,27 +3136,7 @@
                 <w:szCs w:val="20"/>
                 <w:highlight w:val="green"/>
               </w:rPr>
-              <w:t xml:space="preserve">Petite erreur à la ligne 66, devrait être « #transformer en </w:t>
-            </w:r>
-            <w:proofErr w:type="spellStart"/>
-            <w:r>
-              <w:rPr>
-                <w:rFonts w:cstheme="minorHAnsi"/>
-                <w:sz w:val="20"/>
-                <w:szCs w:val="20"/>
-                <w:highlight w:val="green"/>
-              </w:rPr>
-              <w:t>character</w:t>
-            </w:r>
-            <w:proofErr w:type="spellEnd"/>
-            <w:r>
-              <w:rPr>
-                <w:rFonts w:cstheme="minorHAnsi"/>
-                <w:sz w:val="20"/>
-                <w:szCs w:val="20"/>
-                <w:highlight w:val="green"/>
-              </w:rPr>
-              <w:t> »</w:t>
+              <w:t>Petite erreur à la ligne 66, devrait être « #transformer en character »</w:t>
             </w:r>
           </w:p>
         </w:tc>
@@ -3802,7 +3162,6 @@
                 <w:highlight w:val="green"/>
               </w:rPr>
             </w:pPr>
-            <w:proofErr w:type="spellStart"/>
             <w:r>
               <w:rPr>
                 <w:sz w:val="20"/>
@@ -3810,20 +3169,8 @@
                 <w:highlight w:val="green"/>
                 <w:lang w:val="en-CA"/>
               </w:rPr>
-              <w:t>load_</w:t>
-            </w:r>
-            <w:proofErr w:type="gramStart"/>
-            <w:r>
-              <w:rPr>
-                <w:sz w:val="20"/>
-                <w:szCs w:val="20"/>
-                <w:highlight w:val="green"/>
-                <w:lang w:val="en-CA"/>
-              </w:rPr>
-              <w:t>station.R</w:t>
-            </w:r>
-            <w:proofErr w:type="spellEnd"/>
-            <w:proofErr w:type="gramEnd"/>
+              <w:t>load_station.R</w:t>
+            </w:r>
           </w:p>
         </w:tc>
         <w:tc>
@@ -3878,7 +3225,6 @@
                 <w:highlight w:val="green"/>
               </w:rPr>
             </w:pPr>
-            <w:proofErr w:type="spellStart"/>
             <w:r>
               <w:rPr>
                 <w:sz w:val="20"/>
@@ -3886,20 +3232,8 @@
                 <w:highlight w:val="green"/>
                 <w:lang w:val="en-CA"/>
               </w:rPr>
-              <w:t>load_</w:t>
-            </w:r>
-            <w:proofErr w:type="gramStart"/>
-            <w:r>
-              <w:rPr>
-                <w:sz w:val="20"/>
-                <w:szCs w:val="20"/>
-                <w:highlight w:val="green"/>
-                <w:lang w:val="en-CA"/>
-              </w:rPr>
-              <w:t>specimen.R</w:t>
-            </w:r>
-            <w:proofErr w:type="spellEnd"/>
-            <w:proofErr w:type="gramEnd"/>
+              <w:t>load_specimen.R</w:t>
+            </w:r>
           </w:p>
         </w:tc>
         <w:tc>
@@ -3928,27 +3262,7 @@
                 <w:szCs w:val="20"/>
                 <w:highlight w:val="green"/>
               </w:rPr>
-              <w:t xml:space="preserve">Dans la visualisation au bas de la page de téléchargement, mettre les spécimens en ordre croissant de </w:t>
-            </w:r>
-            <w:proofErr w:type="spellStart"/>
-            <w:r>
-              <w:rPr>
-                <w:rFonts w:cstheme="minorHAnsi"/>
-                <w:sz w:val="20"/>
-                <w:szCs w:val="20"/>
-                <w:highlight w:val="green"/>
-              </w:rPr>
-              <w:t>no_specimen</w:t>
-            </w:r>
-            <w:proofErr w:type="spellEnd"/>
-            <w:r>
-              <w:rPr>
-                <w:rFonts w:cstheme="minorHAnsi"/>
-                <w:sz w:val="20"/>
-                <w:szCs w:val="20"/>
-                <w:highlight w:val="green"/>
-              </w:rPr>
-              <w:t>.</w:t>
+              <w:t>Dans la visualisation au bas de la page de téléchargement, mettre les spécimens en ordre croissant de no_specimen.</w:t>
             </w:r>
           </w:p>
           <w:p>
@@ -4002,27 +3316,7 @@
                 <w:szCs w:val="20"/>
                 <w:highlight w:val="green"/>
               </w:rPr>
-              <w:t xml:space="preserve">Remplacer les NA par IND dans </w:t>
-            </w:r>
-            <w:proofErr w:type="spellStart"/>
-            <w:r>
-              <w:rPr>
-                <w:rFonts w:cstheme="minorHAnsi"/>
-                <w:sz w:val="20"/>
-                <w:szCs w:val="20"/>
-                <w:highlight w:val="green"/>
-              </w:rPr>
-              <w:t>sex</w:t>
-            </w:r>
-            <w:proofErr w:type="spellEnd"/>
-            <w:r>
-              <w:rPr>
-                <w:rFonts w:cstheme="minorHAnsi"/>
-                <w:sz w:val="20"/>
-                <w:szCs w:val="20"/>
-                <w:highlight w:val="green"/>
-              </w:rPr>
-              <w:t xml:space="preserve"> et maturité</w:t>
+              <w:t>Remplacer les NA par IND dans sex et maturité</w:t>
             </w:r>
           </w:p>
           <w:p>
@@ -4077,7 +3371,6 @@
               </w:rPr>
               <w:t xml:space="preserve">Devrait être faites dans </w:t>
             </w:r>
-            <w:proofErr w:type="spellStart"/>
             <w:r>
               <w:rPr>
                 <w:rFonts w:ascii="Arial" w:hAnsi="Arial" w:cs="Arial"/>
@@ -4087,9 +3380,17 @@
                 <w:szCs w:val="20"/>
                 <w:highlight w:val="green"/>
               </w:rPr>
-              <w:t>load_</w:t>
-            </w:r>
-            <w:proofErr w:type="gramStart"/>
+              <w:t>load_specimen.R</w:t>
+            </w:r>
+            <w:r>
+              <w:rPr>
+                <w:rFonts w:cstheme="minorHAnsi"/>
+                <w:sz w:val="20"/>
+                <w:szCs w:val="20"/>
+                <w:highlight w:val="green"/>
+              </w:rPr>
+              <w:t xml:space="preserve"> plutôt que dans </w:t>
+            </w:r>
             <w:r>
               <w:rPr>
                 <w:rFonts w:ascii="Arial" w:hAnsi="Arial" w:cs="Arial"/>
@@ -4099,45 +3400,8 @@
                 <w:szCs w:val="20"/>
                 <w:highlight w:val="green"/>
               </w:rPr>
-              <w:t>specimen.R</w:t>
-            </w:r>
-            <w:proofErr w:type="spellEnd"/>
-            <w:proofErr w:type="gramEnd"/>
-            <w:r>
-              <w:rPr>
-                <w:rFonts w:cstheme="minorHAnsi"/>
-                <w:sz w:val="20"/>
-                <w:szCs w:val="20"/>
-                <w:highlight w:val="green"/>
-              </w:rPr>
-              <w:t xml:space="preserve"> plutôt que dans </w:t>
-            </w:r>
-            <w:proofErr w:type="spellStart"/>
-            <w:r>
-              <w:rPr>
-                <w:rFonts w:ascii="Arial" w:hAnsi="Arial" w:cs="Arial"/>
-                <w:i/>
-                <w:color w:val="0070C0"/>
-                <w:sz w:val="20"/>
-                <w:szCs w:val="20"/>
-                <w:highlight w:val="green"/>
-              </w:rPr>
-              <w:t>create_</w:t>
-            </w:r>
-            <w:proofErr w:type="gramStart"/>
-            <w:r>
-              <w:rPr>
-                <w:rFonts w:ascii="Arial" w:hAnsi="Arial" w:cs="Arial"/>
-                <w:i/>
-                <w:color w:val="0070C0"/>
-                <w:sz w:val="20"/>
-                <w:szCs w:val="20"/>
-                <w:highlight w:val="green"/>
-              </w:rPr>
-              <w:t>specimen.R</w:t>
-            </w:r>
-            <w:proofErr w:type="spellEnd"/>
-            <w:proofErr w:type="gramEnd"/>
+              <w:t>create_specimen.R</w:t>
+            </w:r>
             <w:r>
               <w:rPr>
                 <w:rFonts w:cstheme="minorHAnsi"/>
@@ -4181,7 +3445,6 @@
                 <w:lang w:val="en-CA"/>
               </w:rPr>
             </w:pPr>
-            <w:proofErr w:type="spellStart"/>
             <w:r>
               <w:rPr>
                 <w:sz w:val="20"/>
@@ -4189,20 +3452,8 @@
                 <w:highlight w:val="green"/>
                 <w:lang w:val="en-CA"/>
               </w:rPr>
-              <w:t>load_</w:t>
-            </w:r>
-            <w:proofErr w:type="gramStart"/>
-            <w:r>
-              <w:rPr>
-                <w:sz w:val="20"/>
-                <w:szCs w:val="20"/>
-                <w:highlight w:val="green"/>
-                <w:lang w:val="en-CA"/>
-              </w:rPr>
-              <w:t>station.R</w:t>
-            </w:r>
-            <w:proofErr w:type="spellEnd"/>
-            <w:proofErr w:type="gramEnd"/>
+              <w:t>load_station.R</w:t>
+            </w:r>
           </w:p>
         </w:tc>
         <w:tc>
@@ -4233,47 +3484,7 @@
                 <w:szCs w:val="20"/>
                 <w:highlight w:val="green"/>
               </w:rPr>
-              <w:t xml:space="preserve">Pour les corrections de </w:t>
-            </w:r>
-            <w:proofErr w:type="spellStart"/>
-            <w:r>
-              <w:rPr>
-                <w:rFonts w:cstheme="minorHAnsi"/>
-                <w:sz w:val="20"/>
-                <w:szCs w:val="20"/>
-                <w:highlight w:val="green"/>
-              </w:rPr>
-              <w:t>st_valide</w:t>
-            </w:r>
-            <w:proofErr w:type="spellEnd"/>
-            <w:r>
-              <w:rPr>
-                <w:rFonts w:cstheme="minorHAnsi"/>
-                <w:sz w:val="20"/>
-                <w:szCs w:val="20"/>
-                <w:highlight w:val="green"/>
-              </w:rPr>
-              <w:t xml:space="preserve"> et </w:t>
-            </w:r>
-            <w:proofErr w:type="spellStart"/>
-            <w:r>
-              <w:rPr>
-                <w:rFonts w:cstheme="minorHAnsi"/>
-                <w:sz w:val="20"/>
-                <w:szCs w:val="20"/>
-                <w:highlight w:val="green"/>
-              </w:rPr>
-              <w:t>st_hasard</w:t>
-            </w:r>
-            <w:proofErr w:type="spellEnd"/>
-            <w:r>
-              <w:rPr>
-                <w:rFonts w:cstheme="minorHAnsi"/>
-                <w:sz w:val="20"/>
-                <w:szCs w:val="20"/>
-                <w:highlight w:val="green"/>
-              </w:rPr>
-              <w:t> :</w:t>
+              <w:t>Pour les corrections de st_valide et st_hasard :</w:t>
             </w:r>
           </w:p>
           <w:p>
@@ -4355,7 +3566,6 @@
                 <w:lang w:val="en-CA"/>
               </w:rPr>
             </w:pPr>
-            <w:proofErr w:type="spellStart"/>
             <w:r>
               <w:rPr>
                 <w:sz w:val="20"/>
@@ -4363,20 +3573,8 @@
                 <w:highlight w:val="green"/>
                 <w:lang w:val="en-CA"/>
               </w:rPr>
-              <w:t>load_</w:t>
-            </w:r>
-            <w:proofErr w:type="gramStart"/>
-            <w:r>
-              <w:rPr>
-                <w:sz w:val="20"/>
-                <w:szCs w:val="20"/>
-                <w:highlight w:val="green"/>
-                <w:lang w:val="en-CA"/>
-              </w:rPr>
-              <w:t>lac.R</w:t>
-            </w:r>
-            <w:proofErr w:type="spellEnd"/>
-            <w:proofErr w:type="gramEnd"/>
+              <w:t>load_lac.R</w:t>
+            </w:r>
           </w:p>
           <w:p>
             <w:pPr>
@@ -4389,7 +3587,6 @@
                 <w:lang w:val="en-CA"/>
               </w:rPr>
             </w:pPr>
-            <w:proofErr w:type="spellStart"/>
             <w:r>
               <w:rPr>
                 <w:sz w:val="20"/>
@@ -4397,20 +3594,8 @@
                 <w:highlight w:val="green"/>
                 <w:lang w:val="en-CA"/>
               </w:rPr>
-              <w:t>load_</w:t>
-            </w:r>
-            <w:proofErr w:type="gramStart"/>
-            <w:r>
-              <w:rPr>
-                <w:sz w:val="20"/>
-                <w:szCs w:val="20"/>
-                <w:highlight w:val="green"/>
-                <w:lang w:val="en-CA"/>
-              </w:rPr>
-              <w:t>station.R</w:t>
-            </w:r>
-            <w:proofErr w:type="spellEnd"/>
-            <w:proofErr w:type="gramEnd"/>
+              <w:t>load_station.R</w:t>
+            </w:r>
           </w:p>
           <w:p>
             <w:pPr>
@@ -4423,7 +3608,6 @@
                 <w:lang w:val="en-CA"/>
               </w:rPr>
             </w:pPr>
-            <w:proofErr w:type="spellStart"/>
             <w:r>
               <w:rPr>
                 <w:sz w:val="20"/>
@@ -4431,20 +3615,8 @@
                 <w:highlight w:val="green"/>
                 <w:lang w:val="en-CA"/>
               </w:rPr>
-              <w:t>load_</w:t>
-            </w:r>
-            <w:proofErr w:type="gramStart"/>
-            <w:r>
-              <w:rPr>
-                <w:sz w:val="20"/>
-                <w:szCs w:val="20"/>
-                <w:highlight w:val="green"/>
-                <w:lang w:val="en-CA"/>
-              </w:rPr>
-              <w:t>recolte.R</w:t>
-            </w:r>
-            <w:proofErr w:type="spellEnd"/>
-            <w:proofErr w:type="gramEnd"/>
+              <w:t>load_recolte.R</w:t>
+            </w:r>
           </w:p>
           <w:p>
             <w:pPr>
@@ -4457,7 +3629,6 @@
                 <w:lang w:val="en-CA"/>
               </w:rPr>
             </w:pPr>
-            <w:proofErr w:type="spellStart"/>
             <w:r>
               <w:rPr>
                 <w:sz w:val="20"/>
@@ -4465,20 +3636,8 @@
                 <w:highlight w:val="green"/>
                 <w:lang w:val="en-CA"/>
               </w:rPr>
-              <w:t>load_</w:t>
-            </w:r>
-            <w:proofErr w:type="gramStart"/>
-            <w:r>
-              <w:rPr>
-                <w:sz w:val="20"/>
-                <w:szCs w:val="20"/>
-                <w:highlight w:val="green"/>
-                <w:lang w:val="en-CA"/>
-              </w:rPr>
-              <w:t>specimen.R</w:t>
-            </w:r>
-            <w:proofErr w:type="spellEnd"/>
-            <w:proofErr w:type="gramEnd"/>
+              <w:t>load_specimen.R</w:t>
+            </w:r>
           </w:p>
         </w:tc>
         <w:tc>
@@ -4528,47 +3687,7 @@
                 <w:szCs w:val="20"/>
                 <w:highlight w:val="green"/>
               </w:rPr>
-              <w:t xml:space="preserve"> janvier comme jour par défaut (1993-01-01 au lieu de 1993). Par conséquent, dans le choix des années, le choix est 33970 au lieu de 1993. Il faudrait transformer la variable « année » [4] en date et en extraire l’année uniquement pour qu’elle soit un entier numérique (as </w:t>
-            </w:r>
-            <w:proofErr w:type="spellStart"/>
-            <w:r>
-              <w:rPr>
-                <w:rFonts w:cstheme="minorHAnsi"/>
-                <w:sz w:val="20"/>
-                <w:szCs w:val="20"/>
-                <w:highlight w:val="green"/>
-              </w:rPr>
-              <w:t>integer</w:t>
-            </w:r>
-            <w:proofErr w:type="spellEnd"/>
-            <w:r>
-              <w:rPr>
-                <w:rFonts w:cstheme="minorHAnsi"/>
-                <w:sz w:val="20"/>
-                <w:szCs w:val="20"/>
-                <w:highlight w:val="green"/>
-              </w:rPr>
-              <w:t xml:space="preserve"> avant </w:t>
-            </w:r>
-            <w:proofErr w:type="spellStart"/>
-            <w:r>
-              <w:rPr>
-                <w:rFonts w:cstheme="minorHAnsi"/>
-                <w:sz w:val="20"/>
-                <w:szCs w:val="20"/>
-                <w:highlight w:val="green"/>
-              </w:rPr>
-              <w:t>mutate</w:t>
-            </w:r>
-            <w:proofErr w:type="spellEnd"/>
-            <w:r>
-              <w:rPr>
-                <w:rFonts w:cstheme="minorHAnsi"/>
-                <w:sz w:val="20"/>
-                <w:szCs w:val="20"/>
-                <w:highlight w:val="green"/>
-              </w:rPr>
-              <w:t xml:space="preserve"> as factor).</w:t>
+              <w:t xml:space="preserve"> janvier comme jour par défaut (1993-01-01 au lieu de 1993). Par conséquent, dans le choix des années, le choix est 33970 au lieu de 1993. Il faudrait transformer la variable « année » [4] en date et en extraire l’année uniquement pour qu’elle soit un entier numérique (as integer avant mutate as factor).</w:t>
             </w:r>
           </w:p>
           <w:p>
@@ -4618,7 +3737,6 @@
                 <w:highlight w:val="green"/>
               </w:rPr>
             </w:pPr>
-            <w:proofErr w:type="spellStart"/>
             <w:r>
               <w:rPr>
                 <w:sz w:val="20"/>
@@ -4627,7 +3745,6 @@
               </w:rPr>
               <w:t>Vérifier_doublons</w:t>
             </w:r>
-            <w:proofErr w:type="spellEnd"/>
           </w:p>
           <w:p>
             <w:pPr>
@@ -4646,18 +3763,8 @@
                 <w:szCs w:val="20"/>
                 <w:highlight w:val="green"/>
               </w:rPr>
-              <w:t>_</w:t>
-            </w:r>
-            <w:proofErr w:type="spellStart"/>
-            <w:r>
-              <w:rPr>
-                <w:sz w:val="20"/>
-                <w:szCs w:val="20"/>
-                <w:highlight w:val="green"/>
-              </w:rPr>
-              <w:t>data_recolte</w:t>
-            </w:r>
-            <w:proofErr w:type="spellEnd"/>
+              <w:t>_data_recolte</w:t>
+            </w:r>
           </w:p>
           <w:p>
             <w:pPr>
@@ -4676,18 +3783,8 @@
                 <w:szCs w:val="20"/>
                 <w:highlight w:val="green"/>
               </w:rPr>
-              <w:t>_</w:t>
-            </w:r>
-            <w:proofErr w:type="spellStart"/>
-            <w:r>
-              <w:rPr>
-                <w:sz w:val="20"/>
-                <w:szCs w:val="20"/>
-                <w:highlight w:val="green"/>
-              </w:rPr>
-              <w:t>data_station</w:t>
-            </w:r>
-            <w:proofErr w:type="spellEnd"/>
+              <w:t>_data_station</w:t>
+            </w:r>
           </w:p>
         </w:tc>
         <w:tc>
@@ -4763,7 +3860,6 @@
                 <w:highlight w:val="green"/>
               </w:rPr>
             </w:pPr>
-            <w:proofErr w:type="spellStart"/>
             <w:r>
               <w:rPr>
                 <w:sz w:val="20"/>
@@ -4772,7 +3868,6 @@
               </w:rPr>
               <w:t>Vérifier_dataframe_vide</w:t>
             </w:r>
-            <w:proofErr w:type="spellEnd"/>
           </w:p>
         </w:tc>
         <w:tc>
@@ -4836,7 +3931,6 @@
                 <w:lang w:val="en-CA"/>
               </w:rPr>
             </w:pPr>
-            <w:proofErr w:type="spellStart"/>
             <w:r>
               <w:rPr>
                 <w:sz w:val="20"/>
@@ -4844,9 +3938,8 @@
                 <w:highlight w:val="green"/>
                 <w:lang w:val="en-CA"/>
               </w:rPr>
-              <w:t>abondance_</w:t>
-            </w:r>
-            <w:proofErr w:type="gramStart"/>
+              <w:t>abondance_tab</w:t>
+            </w:r>
             <w:r>
               <w:rPr>
                 <w:sz w:val="20"/>
@@ -4854,7 +3947,7 @@
                 <w:highlight w:val="green"/>
                 <w:lang w:val="en-CA"/>
               </w:rPr>
-              <w:t>tab</w:t>
+              <w:t>le</w:t>
             </w:r>
             <w:r>
               <w:rPr>
@@ -4863,19 +3956,8 @@
                 <w:highlight w:val="green"/>
                 <w:lang w:val="en-CA"/>
               </w:rPr>
-              <w:t>le</w:t>
-            </w:r>
-            <w:r>
-              <w:rPr>
-                <w:sz w:val="20"/>
-                <w:szCs w:val="20"/>
-                <w:highlight w:val="green"/>
-                <w:lang w:val="en-CA"/>
-              </w:rPr>
               <w:t>.R</w:t>
             </w:r>
-            <w:proofErr w:type="spellEnd"/>
-            <w:proofErr w:type="gramEnd"/>
           </w:p>
         </w:tc>
         <w:tc>
@@ -4908,41 +3990,7 @@
                 <w:szCs w:val="20"/>
                 <w:highlight w:val="green"/>
               </w:rPr>
-              <w:t xml:space="preserve">Il faut utiliser les données de </w:t>
-            </w:r>
-            <w:proofErr w:type="spellStart"/>
-            <w:proofErr w:type="gramStart"/>
-            <w:r>
-              <w:rPr>
-                <w:rFonts w:cstheme="minorHAnsi"/>
-                <w:color w:val="70AD47" w:themeColor="accent6"/>
-                <w:sz w:val="20"/>
-                <w:szCs w:val="20"/>
-                <w:highlight w:val="green"/>
-              </w:rPr>
-              <w:t>specimen</w:t>
-            </w:r>
-            <w:proofErr w:type="spellEnd"/>
-            <w:r>
-              <w:rPr>
-                <w:rFonts w:cstheme="minorHAnsi"/>
-                <w:color w:val="70AD47" w:themeColor="accent6"/>
-                <w:sz w:val="20"/>
-                <w:szCs w:val="20"/>
-                <w:highlight w:val="green"/>
-              </w:rPr>
-              <w:t>(</w:t>
-            </w:r>
-            <w:proofErr w:type="gramEnd"/>
-            <w:r>
-              <w:rPr>
-                <w:rFonts w:cstheme="minorHAnsi"/>
-                <w:color w:val="70AD47" w:themeColor="accent6"/>
-                <w:sz w:val="20"/>
-                <w:szCs w:val="20"/>
-                <w:highlight w:val="green"/>
-              </w:rPr>
-              <w:t>)</w:t>
+              <w:t>Il faut utiliser les données de specimen()</w:t>
             </w:r>
             <w:r>
               <w:rPr>
@@ -5061,27 +4109,7 @@
                 <w:szCs w:val="20"/>
                 <w:highlight w:val="green"/>
               </w:rPr>
-              <w:t xml:space="preserve">Pourquoi on ajoute une colonne n total à </w:t>
-            </w:r>
-            <w:proofErr w:type="spellStart"/>
-            <w:r>
-              <w:rPr>
-                <w:rFonts w:cstheme="minorHAnsi"/>
-                <w:sz w:val="20"/>
-                <w:szCs w:val="20"/>
-                <w:highlight w:val="green"/>
-              </w:rPr>
-              <w:t>dataspec</w:t>
-            </w:r>
-            <w:proofErr w:type="spellEnd"/>
-            <w:r>
-              <w:rPr>
-                <w:rFonts w:cstheme="minorHAnsi"/>
-                <w:sz w:val="20"/>
-                <w:szCs w:val="20"/>
-                <w:highlight w:val="green"/>
-              </w:rPr>
-              <w:t xml:space="preserve"> ? Cette valeur ne semble pas être réutilis</w:t>
+              <w:t>Pourquoi on ajoute une colonne n total à dataspec ? Cette valeur ne semble pas être réutilis</w:t>
             </w:r>
             <w:r>
               <w:rPr>
@@ -5117,107 +4145,45 @@
                 <w:szCs w:val="20"/>
                 <w:highlight w:val="green"/>
               </w:rPr>
-              <w:t xml:space="preserve">la </w:t>
-            </w:r>
-            <w:proofErr w:type="spellStart"/>
-            <w:r>
-              <w:rPr>
-                <w:rFonts w:cstheme="minorHAnsi"/>
-                <w:sz w:val="20"/>
-                <w:szCs w:val="20"/>
-                <w:highlight w:val="green"/>
-              </w:rPr>
-              <w:t>reactive</w:t>
-            </w:r>
-            <w:proofErr w:type="spellEnd"/>
-            <w:r>
-              <w:rPr>
-                <w:rFonts w:cstheme="minorHAnsi"/>
-                <w:sz w:val="20"/>
-                <w:szCs w:val="20"/>
-                <w:highlight w:val="green"/>
-              </w:rPr>
-              <w:t xml:space="preserve"> expression </w:t>
-            </w:r>
-            <w:proofErr w:type="spellStart"/>
-            <w:proofErr w:type="gramStart"/>
-            <w:r>
-              <w:rPr>
-                <w:rFonts w:cstheme="minorHAnsi"/>
-                <w:sz w:val="20"/>
-                <w:szCs w:val="20"/>
-                <w:highlight w:val="green"/>
-              </w:rPr>
-              <w:t>specimen</w:t>
-            </w:r>
-            <w:proofErr w:type="spellEnd"/>
-            <w:r>
-              <w:rPr>
-                <w:rFonts w:cstheme="minorHAnsi"/>
-                <w:sz w:val="20"/>
-                <w:szCs w:val="20"/>
-                <w:highlight w:val="green"/>
-              </w:rPr>
-              <w:t>(</w:t>
-            </w:r>
-            <w:proofErr w:type="gramEnd"/>
-            <w:r>
-              <w:rPr>
-                <w:rFonts w:cstheme="minorHAnsi"/>
-                <w:sz w:val="20"/>
-                <w:szCs w:val="20"/>
-                <w:highlight w:val="green"/>
-              </w:rPr>
-              <w:t>).</w:t>
-            </w:r>
-          </w:p>
-          <w:p>
-            <w:pPr>
-              <w:rPr>
-                <w:rFonts w:cstheme="minorHAnsi"/>
-                <w:sz w:val="20"/>
-                <w:szCs w:val="20"/>
-                <w:highlight w:val="green"/>
-              </w:rPr>
-            </w:pPr>
-          </w:p>
-          <w:p>
-            <w:pPr>
-              <w:rPr>
-                <w:rFonts w:cstheme="minorHAnsi"/>
-                <w:sz w:val="20"/>
-                <w:szCs w:val="20"/>
-                <w:highlight w:val="green"/>
-              </w:rPr>
-            </w:pPr>
-            <w:r>
-              <w:rPr>
-                <w:rFonts w:cstheme="minorHAnsi"/>
-                <w:sz w:val="20"/>
-                <w:szCs w:val="20"/>
-                <w:highlight w:val="green"/>
-              </w:rPr>
-              <w:t xml:space="preserve">MP : l. 90 à 98. Les </w:t>
-            </w:r>
-            <w:proofErr w:type="spellStart"/>
-            <w:r>
-              <w:rPr>
-                <w:rFonts w:cstheme="minorHAnsi"/>
-                <w:sz w:val="20"/>
-                <w:szCs w:val="20"/>
-                <w:highlight w:val="green"/>
-              </w:rPr>
-              <w:t>reprod</w:t>
-            </w:r>
-            <w:proofErr w:type="spellEnd"/>
-            <w:r>
-              <w:rPr>
-                <w:rFonts w:cstheme="minorHAnsi"/>
-                <w:sz w:val="20"/>
-                <w:szCs w:val="20"/>
-                <w:highlight w:val="green"/>
-              </w:rPr>
-              <w:t xml:space="preserve">. actifs </w:t>
+              <w:t xml:space="preserve">la reactive expression </w:t>
+            </w:r>
+            <w:r>
+              <w:rPr>
+                <w:rFonts w:cstheme="minorHAnsi"/>
+                <w:sz w:val="20"/>
+                <w:szCs w:val="20"/>
+                <w:highlight w:val="green"/>
+              </w:rPr>
+              <w:t>specimen().</w:t>
+            </w:r>
+          </w:p>
+          <w:p>
+            <w:pPr>
+              <w:rPr>
+                <w:rFonts w:cstheme="minorHAnsi"/>
+                <w:sz w:val="20"/>
+                <w:szCs w:val="20"/>
+                <w:highlight w:val="green"/>
+              </w:rPr>
+            </w:pPr>
+          </w:p>
+          <w:p>
+            <w:pPr>
+              <w:rPr>
+                <w:rFonts w:cstheme="minorHAnsi"/>
+                <w:sz w:val="20"/>
+                <w:szCs w:val="20"/>
+                <w:highlight w:val="green"/>
+              </w:rPr>
+            </w:pPr>
+            <w:r>
+              <w:rPr>
+                <w:rFonts w:cstheme="minorHAnsi"/>
+                <w:sz w:val="20"/>
+                <w:szCs w:val="20"/>
+                <w:highlight w:val="green"/>
+              </w:rPr>
+              <w:t xml:space="preserve">MP : l. 90 à 98. Les reprod. actifs </w:t>
             </w:r>
             <w:r>
               <w:rPr>
@@ -5282,27 +4248,7 @@
                 <w:szCs w:val="20"/>
                 <w:highlight w:val="green"/>
               </w:rPr>
-              <w:t xml:space="preserve">, car il pourrait y avoir une erreur de saisie avec 2 spécimens ayant le même numéro. Pourquoi ne pas utiliser </w:t>
-            </w:r>
-            <w:proofErr w:type="spellStart"/>
-            <w:r>
-              <w:rPr>
-                <w:rFonts w:asciiTheme="minorHAnsi" w:hAnsiTheme="minorHAnsi" w:cstheme="minorHAnsi"/>
-                <w:sz w:val="20"/>
-                <w:szCs w:val="20"/>
-                <w:highlight w:val="green"/>
-              </w:rPr>
-              <w:t>summarise</w:t>
-            </w:r>
-            <w:proofErr w:type="spellEnd"/>
-            <w:r>
-              <w:rPr>
-                <w:rFonts w:asciiTheme="minorHAnsi" w:hAnsiTheme="minorHAnsi" w:cstheme="minorHAnsi"/>
-                <w:sz w:val="20"/>
-                <w:szCs w:val="20"/>
-                <w:highlight w:val="green"/>
-              </w:rPr>
-              <w:t xml:space="preserve"> comme précédemment ?</w:t>
+              <w:t>, car il pourrait y avoir une erreur de saisie avec 2 spécimens ayant le même numéro. Pourquoi ne pas utiliser summarise comme précédemment ?</w:t>
             </w:r>
           </w:p>
           <w:p>
@@ -5339,7 +4285,6 @@
                 <w:lang w:val="en-CA"/>
               </w:rPr>
             </w:pPr>
-            <w:proofErr w:type="spellStart"/>
             <w:r>
               <w:rPr>
                 <w:sz w:val="20"/>
@@ -5350,7 +4295,6 @@
               <w:lastRenderedPageBreak/>
               <w:t>selection_modele</w:t>
             </w:r>
-            <w:proofErr w:type="spellEnd"/>
           </w:p>
           <w:p>
             <w:pPr>
@@ -5371,19 +4315,8 @@
                 <w:highlight w:val="green"/>
                 <w:lang w:val="en-CA"/>
               </w:rPr>
-              <w:t>_</w:t>
-            </w:r>
-            <w:proofErr w:type="spellStart"/>
-            <w:r>
-              <w:rPr>
-                <w:sz w:val="20"/>
-                <w:szCs w:val="20"/>
-                <w:highlight w:val="green"/>
-                <w:lang w:val="en-CA"/>
-              </w:rPr>
-              <w:t>CPUE_tous</w:t>
-            </w:r>
-            <w:proofErr w:type="spellEnd"/>
+              <w:t>_CPUE_tous</w:t>
+            </w:r>
           </w:p>
         </w:tc>
         <w:tc>
@@ -5416,29 +4349,7 @@
                 <w:szCs w:val="20"/>
                 <w:highlight w:val="green"/>
               </w:rPr>
-              <w:t xml:space="preserve">Il faut utiliser les données de </w:t>
-            </w:r>
-            <w:proofErr w:type="gramStart"/>
-            <w:r>
-              <w:rPr>
-                <w:rFonts w:cstheme="minorHAnsi"/>
-                <w:color w:val="70AD47" w:themeColor="accent6"/>
-                <w:sz w:val="20"/>
-                <w:szCs w:val="20"/>
-                <w:highlight w:val="green"/>
-              </w:rPr>
-              <w:t>capture(</w:t>
-            </w:r>
-            <w:proofErr w:type="gramEnd"/>
-            <w:r>
-              <w:rPr>
-                <w:rFonts w:cstheme="minorHAnsi"/>
-                <w:color w:val="70AD47" w:themeColor="accent6"/>
-                <w:sz w:val="20"/>
-                <w:szCs w:val="20"/>
-                <w:highlight w:val="green"/>
-              </w:rPr>
-              <w:t>)</w:t>
+              <w:t>Il faut utiliser les données de capture()</w:t>
             </w:r>
           </w:p>
           <w:p>
@@ -5489,19 +4400,11 @@
               </w:rPr>
               <w:t xml:space="preserve">Il faudrait vérifier si les modèles ont convergé avec </w:t>
             </w:r>
-            <w:proofErr w:type="spellStart"/>
-            <w:r>
-              <w:rPr>
-                <w:highlight w:val="green"/>
-              </w:rPr>
-              <w:t>my_model_name$converged</w:t>
-            </w:r>
-            <w:proofErr w:type="spellEnd"/>
-            <w:r>
-              <w:rPr>
-                <w:highlight w:val="green"/>
-              </w:rPr>
-              <w:t xml:space="preserve"> (TRUE or FALSE)</w:t>
+            <w:r>
+              <w:rPr>
+                <w:highlight w:val="green"/>
+              </w:rPr>
+              <w:t>my_model_name$converged (TRUE or FALSE)</w:t>
             </w:r>
           </w:p>
           <w:p>
@@ -5547,25 +4450,7 @@
                 <w:szCs w:val="20"/>
                 <w:highlight w:val="green"/>
               </w:rPr>
-              <w:t xml:space="preserve">Enlever le model </w:t>
-            </w:r>
-            <w:proofErr w:type="spellStart"/>
-            <w:r>
-              <w:rPr>
-                <w:sz w:val="20"/>
-                <w:szCs w:val="20"/>
-                <w:highlight w:val="green"/>
-              </w:rPr>
-              <w:t>averaging</w:t>
-            </w:r>
-            <w:proofErr w:type="spellEnd"/>
-            <w:r>
-              <w:rPr>
-                <w:sz w:val="20"/>
-                <w:szCs w:val="20"/>
-                <w:highlight w:val="green"/>
-              </w:rPr>
-              <w:t xml:space="preserve"> (modèle « compromis »).</w:t>
+              <w:t>Enlever le model averaging (modèle « compromis »).</w:t>
             </w:r>
           </w:p>
           <w:p>
@@ -5592,111 +4477,41 @@
                 <w:szCs w:val="20"/>
                 <w:highlight w:val="green"/>
               </w:rPr>
-              <w:t xml:space="preserve">Pour le test </w:t>
-            </w:r>
-            <w:proofErr w:type="spellStart"/>
-            <w:r>
-              <w:rPr>
-                <w:sz w:val="20"/>
-                <w:szCs w:val="20"/>
-                <w:highlight w:val="green"/>
-              </w:rPr>
-              <w:t>hnp</w:t>
-            </w:r>
-            <w:proofErr w:type="spellEnd"/>
-            <w:r>
-              <w:rPr>
-                <w:sz w:val="20"/>
-                <w:szCs w:val="20"/>
-                <w:highlight w:val="green"/>
-              </w:rPr>
-              <w:t>, faire 2 simulations. Ensuite</w:t>
+              <w:t>Pour le test hnp, faire 2 simulations. Ensuite</w:t>
             </w:r>
             <w:r>
               <w:rPr>
                 <w:rFonts w:eastAsia="Times New Roman"/>
                 <w:highlight w:val="green"/>
               </w:rPr>
-              <w:t xml:space="preserve">, si le résultat est entre 10 et 15%, on fait 3 autres simulations et on calcule la moyenne des 5 simulations. Ensuite on ne conserve que si &lt; 15%, et on sélectionne selon l’AIC (ou </w:t>
-            </w:r>
-            <w:proofErr w:type="spellStart"/>
-            <w:r>
+              <w:t>, si le résultat est entre 10 et 15%, on fait 3 autres simulations et on calcule la moyenne des 5 simulations. Ensuite on ne conserve que si &lt; 15%, et on sélectionne selon l’AIC (ou AICc)</w:t>
+            </w:r>
+          </w:p>
+          <w:p>
+            <w:pPr>
+              <w:contextualSpacing/>
               <w:rPr>
                 <w:rFonts w:eastAsia="Times New Roman"/>
                 <w:highlight w:val="green"/>
               </w:rPr>
-              <w:t>AICc</w:t>
-            </w:r>
-            <w:proofErr w:type="spellEnd"/>
-            <w:r>
-              <w:rPr>
-                <w:rFonts w:eastAsia="Times New Roman"/>
-                <w:highlight w:val="green"/>
-              </w:rPr>
-              <w:t>)</w:t>
-            </w:r>
+            </w:pPr>
           </w:p>
           <w:p>
             <w:pPr>
               <w:contextualSpacing/>
               <w:rPr>
-                <w:rFonts w:eastAsia="Times New Roman"/>
-                <w:highlight w:val="green"/>
-              </w:rPr>
-            </w:pPr>
-          </w:p>
-          <w:p>
-            <w:pPr>
-              <w:contextualSpacing/>
-              <w:rPr>
-                <w:sz w:val="20"/>
-                <w:szCs w:val="20"/>
-                <w:highlight w:val="green"/>
-              </w:rPr>
-            </w:pPr>
-            <w:r>
-              <w:rPr>
-                <w:sz w:val="20"/>
-                <w:szCs w:val="20"/>
-                <w:highlight w:val="green"/>
-              </w:rPr>
-              <w:t xml:space="preserve">l. 471 à 473 : La sélection des modèles de CPUE est basée sur le test </w:t>
-            </w:r>
-            <w:proofErr w:type="spellStart"/>
-            <w:r>
-              <w:rPr>
-                <w:sz w:val="20"/>
-                <w:szCs w:val="20"/>
-                <w:highlight w:val="green"/>
-              </w:rPr>
-              <w:t>hnp</w:t>
-            </w:r>
-            <w:proofErr w:type="spellEnd"/>
-            <w:r>
-              <w:rPr>
-                <w:sz w:val="20"/>
-                <w:szCs w:val="20"/>
-                <w:highlight w:val="green"/>
-              </w:rPr>
-              <w:t xml:space="preserve"> seulement. Ajouter le </w:t>
-            </w:r>
-            <w:proofErr w:type="spellStart"/>
-            <w:r>
-              <w:rPr>
-                <w:sz w:val="20"/>
-                <w:szCs w:val="20"/>
-                <w:highlight w:val="green"/>
-              </w:rPr>
-              <w:t>AICc</w:t>
-            </w:r>
-            <w:proofErr w:type="spellEnd"/>
-            <w:r>
-              <w:rPr>
-                <w:sz w:val="20"/>
-                <w:szCs w:val="20"/>
-                <w:highlight w:val="green"/>
-              </w:rPr>
-              <w:t xml:space="preserve"> et </w:t>
+                <w:sz w:val="20"/>
+                <w:szCs w:val="20"/>
+                <w:highlight w:val="green"/>
+              </w:rPr>
+            </w:pPr>
+            <w:r>
+              <w:rPr>
+                <w:sz w:val="20"/>
+                <w:szCs w:val="20"/>
+                <w:highlight w:val="green"/>
+              </w:rPr>
+              <w:t xml:space="preserve">l. 471 à 473 : La sélection des modèles de CPUE est basée sur le test hnp seulement. Ajouter le AICc et </w:t>
             </w:r>
             <w:r>
               <w:rPr>
@@ -5709,9 +4524,8 @@
                 <w:highlight w:val="green"/>
                 <w:shd w:val="clear" w:color="auto" w:fill="FFFFFF"/>
               </w:rPr>
-              <w:t xml:space="preserve">Δ </w:t>
-            </w:r>
-            <w:proofErr w:type="spellStart"/>
+              <w:t>Δ AICc</w:t>
+            </w:r>
             <w:r>
               <w:rPr>
                 <w:rFonts w:ascii="Helvetica Neue" w:hAnsi="Helvetica Neue"/>
@@ -5723,20 +4537,6 @@
                 <w:highlight w:val="green"/>
                 <w:shd w:val="clear" w:color="auto" w:fill="FFFFFF"/>
               </w:rPr>
-              <w:t>AICc</w:t>
-            </w:r>
-            <w:proofErr w:type="spellEnd"/>
-            <w:r>
-              <w:rPr>
-                <w:rFonts w:ascii="Helvetica Neue" w:hAnsi="Helvetica Neue"/>
-                <w:b/>
-                <w:bCs/>
-                <w:color w:val="333333"/>
-                <w:sz w:val="21"/>
-                <w:szCs w:val="21"/>
-                <w:highlight w:val="green"/>
-                <w:shd w:val="clear" w:color="auto" w:fill="FFFFFF"/>
-              </w:rPr>
               <w:t xml:space="preserve"> </w:t>
             </w:r>
             <w:r>
@@ -5753,16 +4553,7 @@
                 <w:szCs w:val="20"/>
                 <w:highlight w:val="green"/>
               </w:rPr>
-              <w:t xml:space="preserve"> et baser la sélection du meilleur modèle à partir de l’</w:t>
-            </w:r>
-            <w:proofErr w:type="spellStart"/>
-            <w:r>
-              <w:rPr>
-                <w:sz w:val="20"/>
-                <w:szCs w:val="20"/>
-                <w:highlight w:val="green"/>
-              </w:rPr>
-              <w:t>AIC</w:t>
+              <w:t xml:space="preserve"> et baser la sélection du meilleur modèle à partir de l’AIC</w:t>
             </w:r>
             <w:r>
               <w:rPr>
@@ -5772,7 +4563,6 @@
               </w:rPr>
               <w:t>c</w:t>
             </w:r>
-            <w:proofErr w:type="spellEnd"/>
             <w:r>
               <w:rPr>
                 <w:sz w:val="20"/>
@@ -5857,25 +4647,7 @@
                 <w:szCs w:val="20"/>
                 <w:highlight w:val="green"/>
               </w:rPr>
-              <w:t xml:space="preserve">tent bien aux données, le modèle ayant le plus bas </w:t>
-            </w:r>
-            <w:proofErr w:type="spellStart"/>
-            <w:r>
-              <w:rPr>
-                <w:sz w:val="20"/>
-                <w:szCs w:val="20"/>
-                <w:highlight w:val="green"/>
-              </w:rPr>
-              <w:t>AICc</w:t>
-            </w:r>
-            <w:proofErr w:type="spellEnd"/>
-            <w:r>
-              <w:rPr>
-                <w:sz w:val="20"/>
-                <w:szCs w:val="20"/>
-                <w:highlight w:val="green"/>
-              </w:rPr>
-              <w:t xml:space="preserve"> doit avoir le commentaire suivant : « </w:t>
+              <w:t>tent bien aux données, le modèle ayant le plus bas AICc doit avoir le commentaire suivant : « </w:t>
             </w:r>
             <w:r>
               <w:rPr>
@@ -5891,25 +4663,7 @@
                 <w:szCs w:val="20"/>
                 <w:highlight w:val="green"/>
               </w:rPr>
-              <w:t xml:space="preserve">Ce modèle est recommandé car son </w:t>
-            </w:r>
-            <w:proofErr w:type="spellStart"/>
-            <w:r>
-              <w:rPr>
-                <w:sz w:val="20"/>
-                <w:szCs w:val="20"/>
-                <w:highlight w:val="green"/>
-              </w:rPr>
-              <w:t>AICc</w:t>
-            </w:r>
-            <w:proofErr w:type="spellEnd"/>
-            <w:r>
-              <w:rPr>
-                <w:sz w:val="20"/>
-                <w:szCs w:val="20"/>
-                <w:highlight w:val="green"/>
-              </w:rPr>
-              <w:t xml:space="preserve"> est le plus faible »</w:t>
+              <w:t>Ce modèle est recommandé car son AICc est le plus faible »</w:t>
             </w:r>
             <w:r>
               <w:rPr>
@@ -5941,25 +4695,7 @@
                 <w:szCs w:val="20"/>
                 <w:highlight w:val="green"/>
               </w:rPr>
-              <w:t xml:space="preserve">Si aucun modèle ne s’ajuste bien aux données, choisir le modèle ayant le plus bas </w:t>
-            </w:r>
-            <w:proofErr w:type="spellStart"/>
-            <w:r>
-              <w:rPr>
-                <w:sz w:val="20"/>
-                <w:szCs w:val="20"/>
-                <w:highlight w:val="green"/>
-              </w:rPr>
-              <w:t>AICc</w:t>
-            </w:r>
-            <w:proofErr w:type="spellEnd"/>
-            <w:r>
-              <w:rPr>
-                <w:sz w:val="20"/>
-                <w:szCs w:val="20"/>
-                <w:highlight w:val="green"/>
-              </w:rPr>
-              <w:t>.</w:t>
+              <w:t>Si aucun modèle ne s’ajuste bien aux données, choisir le modèle ayant le plus bas AICc.</w:t>
             </w:r>
             <w:r>
               <w:rPr>
@@ -6041,7 +4777,6 @@
                 <w:lang w:val="en-CA"/>
               </w:rPr>
             </w:pPr>
-            <w:proofErr w:type="spellStart"/>
             <w:r>
               <w:rPr>
                 <w:sz w:val="20"/>
@@ -6049,19 +4784,18 @@
                 <w:highlight w:val="green"/>
                 <w:lang w:val="en-CA"/>
               </w:rPr>
-              <w:t>CPUEfinal.p</w:t>
-            </w:r>
-            <w:proofErr w:type="spellEnd"/>
-            <w:r>
+              <w:t>CPUEfinal.p = exp(predM.p$fit)</w:t>
+            </w:r>
+          </w:p>
+          <w:p>
+            <w:pPr>
               <w:rPr>
                 <w:sz w:val="20"/>
                 <w:szCs w:val="20"/>
                 <w:highlight w:val="green"/>
                 <w:lang w:val="en-CA"/>
               </w:rPr>
-              <w:t xml:space="preserve"> = </w:t>
-            </w:r>
-            <w:proofErr w:type="gramStart"/>
+            </w:pPr>
             <w:r>
               <w:rPr>
                 <w:sz w:val="20"/>
@@ -6069,20 +4803,18 @@
                 <w:highlight w:val="green"/>
                 <w:lang w:val="en-CA"/>
               </w:rPr>
-              <w:t>exp(</w:t>
-            </w:r>
-            <w:proofErr w:type="spellStart"/>
-            <w:proofErr w:type="gramEnd"/>
-            <w:r>
+              <w:t>linf = exp(predM.p$fit – 1.96*predM.p$se.fit)</w:t>
+            </w:r>
+          </w:p>
+          <w:p>
+            <w:pPr>
               <w:rPr>
                 <w:sz w:val="20"/>
                 <w:szCs w:val="20"/>
                 <w:highlight w:val="green"/>
                 <w:lang w:val="en-CA"/>
               </w:rPr>
-              <w:t>predM.p$fit</w:t>
-            </w:r>
-            <w:proofErr w:type="spellEnd"/>
+            </w:pPr>
             <w:r>
               <w:rPr>
                 <w:sz w:val="20"/>
@@ -6090,169 +4822,7 @@
                 <w:highlight w:val="green"/>
                 <w:lang w:val="en-CA"/>
               </w:rPr>
-              <w:t>)</w:t>
-            </w:r>
-          </w:p>
-          <w:p>
-            <w:pPr>
-              <w:rPr>
-                <w:sz w:val="20"/>
-                <w:szCs w:val="20"/>
-                <w:highlight w:val="green"/>
-                <w:lang w:val="en-CA"/>
-              </w:rPr>
-            </w:pPr>
-            <w:proofErr w:type="spellStart"/>
-            <w:r>
-              <w:rPr>
-                <w:sz w:val="20"/>
-                <w:szCs w:val="20"/>
-                <w:highlight w:val="green"/>
-                <w:lang w:val="en-CA"/>
-              </w:rPr>
-              <w:t>linf</w:t>
-            </w:r>
-            <w:proofErr w:type="spellEnd"/>
-            <w:r>
-              <w:rPr>
-                <w:sz w:val="20"/>
-                <w:szCs w:val="20"/>
-                <w:highlight w:val="green"/>
-                <w:lang w:val="en-CA"/>
-              </w:rPr>
-              <w:t xml:space="preserve"> = </w:t>
-            </w:r>
-            <w:proofErr w:type="gramStart"/>
-            <w:r>
-              <w:rPr>
-                <w:sz w:val="20"/>
-                <w:szCs w:val="20"/>
-                <w:highlight w:val="green"/>
-                <w:lang w:val="en-CA"/>
-              </w:rPr>
-              <w:t>exp(</w:t>
-            </w:r>
-            <w:proofErr w:type="spellStart"/>
-            <w:proofErr w:type="gramEnd"/>
-            <w:r>
-              <w:rPr>
-                <w:sz w:val="20"/>
-                <w:szCs w:val="20"/>
-                <w:highlight w:val="green"/>
-                <w:lang w:val="en-CA"/>
-              </w:rPr>
-              <w:t>predM.p$fit</w:t>
-            </w:r>
-            <w:proofErr w:type="spellEnd"/>
-            <w:r>
-              <w:rPr>
-                <w:sz w:val="20"/>
-                <w:szCs w:val="20"/>
-                <w:highlight w:val="green"/>
-                <w:lang w:val="en-CA"/>
-              </w:rPr>
-              <w:t xml:space="preserve"> – 1.96*</w:t>
-            </w:r>
-            <w:proofErr w:type="spellStart"/>
-            <w:r>
-              <w:rPr>
-                <w:sz w:val="20"/>
-                <w:szCs w:val="20"/>
-                <w:highlight w:val="green"/>
-                <w:lang w:val="en-CA"/>
-              </w:rPr>
-              <w:t>predM.p$se.fit</w:t>
-            </w:r>
-            <w:proofErr w:type="spellEnd"/>
-            <w:r>
-              <w:rPr>
-                <w:sz w:val="20"/>
-                <w:szCs w:val="20"/>
-                <w:highlight w:val="green"/>
-                <w:lang w:val="en-CA"/>
-              </w:rPr>
-              <w:t>)</w:t>
-            </w:r>
-          </w:p>
-          <w:p>
-            <w:pPr>
-              <w:rPr>
-                <w:sz w:val="20"/>
-                <w:szCs w:val="20"/>
-                <w:highlight w:val="green"/>
-                <w:lang w:val="en-CA"/>
-              </w:rPr>
-            </w:pPr>
-            <w:proofErr w:type="spellStart"/>
-            <w:r>
-              <w:rPr>
-                <w:sz w:val="20"/>
-                <w:szCs w:val="20"/>
-                <w:highlight w:val="green"/>
-                <w:lang w:val="en-CA"/>
-              </w:rPr>
-              <w:t>lsup</w:t>
-            </w:r>
-            <w:proofErr w:type="spellEnd"/>
-            <w:r>
-              <w:rPr>
-                <w:sz w:val="20"/>
-                <w:szCs w:val="20"/>
-                <w:highlight w:val="green"/>
-                <w:lang w:val="en-CA"/>
-              </w:rPr>
-              <w:t xml:space="preserve"> = </w:t>
-            </w:r>
-            <w:proofErr w:type="gramStart"/>
-            <w:r>
-              <w:rPr>
-                <w:sz w:val="20"/>
-                <w:szCs w:val="20"/>
-                <w:highlight w:val="green"/>
-                <w:lang w:val="en-CA"/>
-              </w:rPr>
-              <w:t>exp(</w:t>
-            </w:r>
-            <w:proofErr w:type="spellStart"/>
-            <w:proofErr w:type="gramEnd"/>
-            <w:r>
-              <w:rPr>
-                <w:sz w:val="20"/>
-                <w:szCs w:val="20"/>
-                <w:highlight w:val="green"/>
-                <w:lang w:val="en-CA"/>
-              </w:rPr>
-              <w:t>predM.p$fit</w:t>
-            </w:r>
-            <w:proofErr w:type="spellEnd"/>
-            <w:r>
-              <w:rPr>
-                <w:sz w:val="20"/>
-                <w:szCs w:val="20"/>
-                <w:highlight w:val="green"/>
-                <w:lang w:val="en-CA"/>
-              </w:rPr>
-              <w:t xml:space="preserve"> + 1.96*</w:t>
-            </w:r>
-            <w:proofErr w:type="spellStart"/>
-            <w:r>
-              <w:rPr>
-                <w:sz w:val="20"/>
-                <w:szCs w:val="20"/>
-                <w:highlight w:val="green"/>
-                <w:lang w:val="en-CA"/>
-              </w:rPr>
-              <w:t>predM.p$se.fit</w:t>
-            </w:r>
-            <w:proofErr w:type="spellEnd"/>
-            <w:r>
-              <w:rPr>
-                <w:sz w:val="20"/>
-                <w:szCs w:val="20"/>
-                <w:highlight w:val="green"/>
-                <w:lang w:val="en-CA"/>
-              </w:rPr>
-              <w:t>)</w:t>
+              <w:t>lsup = exp(predM.p$fit + 1.96*predM.p$se.fit)</w:t>
             </w:r>
           </w:p>
           <w:p>
@@ -6291,7 +4861,6 @@
               </w:rPr>
             </w:pPr>
             <w:commentRangeStart w:id="1"/>
-            <w:proofErr w:type="spellStart"/>
             <w:r>
               <w:rPr>
                 <w:sz w:val="20"/>
@@ -6301,7 +4870,6 @@
               </w:rPr>
               <w:t>selection_modele</w:t>
             </w:r>
-            <w:proofErr w:type="spellEnd"/>
           </w:p>
           <w:p>
             <w:pPr>
@@ -6371,41 +4939,7 @@
                 <w:highlight w:val="green"/>
               </w:rPr>
               <w:lastRenderedPageBreak/>
-              <w:t xml:space="preserve">Il faut utiliser les données de </w:t>
-            </w:r>
-            <w:proofErr w:type="spellStart"/>
-            <w:proofErr w:type="gramStart"/>
-            <w:r>
-              <w:rPr>
-                <w:rFonts w:cstheme="minorHAnsi"/>
-                <w:color w:val="70AD47" w:themeColor="accent6"/>
-                <w:sz w:val="20"/>
-                <w:szCs w:val="20"/>
-                <w:highlight w:val="green"/>
-              </w:rPr>
-              <w:t>specimen</w:t>
-            </w:r>
-            <w:proofErr w:type="spellEnd"/>
-            <w:r>
-              <w:rPr>
-                <w:rFonts w:cstheme="minorHAnsi"/>
-                <w:color w:val="70AD47" w:themeColor="accent6"/>
-                <w:sz w:val="20"/>
-                <w:szCs w:val="20"/>
-                <w:highlight w:val="green"/>
-              </w:rPr>
-              <w:t>(</w:t>
-            </w:r>
-            <w:proofErr w:type="gramEnd"/>
-            <w:r>
-              <w:rPr>
-                <w:rFonts w:cstheme="minorHAnsi"/>
-                <w:color w:val="70AD47" w:themeColor="accent6"/>
-                <w:sz w:val="20"/>
-                <w:szCs w:val="20"/>
-                <w:highlight w:val="green"/>
-              </w:rPr>
-              <w:t>)</w:t>
+              <w:t>Il faut utiliser les données de specimen()</w:t>
             </w:r>
           </w:p>
           <w:p>
@@ -6428,29 +4962,7 @@
                 <w:szCs w:val="20"/>
                 <w:highlight w:val="green"/>
               </w:rPr>
-              <w:t>[</w:t>
-            </w:r>
-            <w:proofErr w:type="gramStart"/>
-            <w:r>
-              <w:rPr>
-                <w:rFonts w:cstheme="minorHAnsi"/>
-                <w:color w:val="70AD47" w:themeColor="accent6"/>
-                <w:sz w:val="20"/>
-                <w:szCs w:val="20"/>
-                <w:highlight w:val="green"/>
-              </w:rPr>
-              <w:t>spécimens</w:t>
-            </w:r>
-            <w:proofErr w:type="gramEnd"/>
-            <w:r>
-              <w:rPr>
-                <w:rFonts w:cstheme="minorHAnsi"/>
-                <w:color w:val="70AD47" w:themeColor="accent6"/>
-                <w:sz w:val="20"/>
-                <w:szCs w:val="20"/>
-                <w:highlight w:val="green"/>
-              </w:rPr>
-              <w:t xml:space="preserve"> des stations valides et au hasard]</w:t>
+              <w:t>[spécimens des stations valides et au hasard]</w:t>
             </w:r>
           </w:p>
           <w:p>
@@ -6483,19 +4995,11 @@
               </w:rPr>
               <w:t xml:space="preserve">Il faudrait vérifier si les modèles ont convergé avec </w:t>
             </w:r>
-            <w:proofErr w:type="spellStart"/>
-            <w:r>
-              <w:rPr>
-                <w:highlight w:val="green"/>
-              </w:rPr>
-              <w:t>my_model_name$converged</w:t>
-            </w:r>
-            <w:proofErr w:type="spellEnd"/>
-            <w:r>
-              <w:rPr>
-                <w:highlight w:val="green"/>
-              </w:rPr>
-              <w:t xml:space="preserve"> (TRUE or FALSE)</w:t>
+            <w:r>
+              <w:rPr>
+                <w:highlight w:val="green"/>
+              </w:rPr>
+              <w:t>my_model_name$converged (TRUE or FALSE)</w:t>
             </w:r>
           </w:p>
           <w:p>
@@ -6553,7 +5057,6 @@
                 <w:szCs w:val="20"/>
               </w:rPr>
             </w:pPr>
-            <w:proofErr w:type="spellStart"/>
             <w:r>
               <w:rPr>
                 <w:sz w:val="20"/>
@@ -6561,27 +5064,16 @@
                 <w:lang w:val="en-CA"/>
               </w:rPr>
               <w:lastRenderedPageBreak/>
-              <w:t>biomasse_</w:t>
-            </w:r>
-            <w:proofErr w:type="gramStart"/>
+              <w:t>biomasse_table</w:t>
+            </w:r>
             <w:r>
               <w:rPr>
                 <w:sz w:val="20"/>
                 <w:szCs w:val="20"/>
                 <w:lang w:val="en-CA"/>
               </w:rPr>
-              <w:t>table</w:t>
-            </w:r>
-            <w:r>
-              <w:rPr>
-                <w:sz w:val="20"/>
-                <w:szCs w:val="20"/>
-                <w:lang w:val="en-CA"/>
-              </w:rPr>
               <w:t>.R</w:t>
             </w:r>
-            <w:proofErr w:type="spellEnd"/>
-            <w:proofErr w:type="gramEnd"/>
           </w:p>
         </w:tc>
         <w:tc>
@@ -6615,8 +5107,6 @@
               </w:rPr>
               <w:t xml:space="preserve">Il faut utiliser les données de </w:t>
             </w:r>
-            <w:proofErr w:type="spellStart"/>
-            <w:proofErr w:type="gramStart"/>
             <w:r>
               <w:rPr>
                 <w:rFonts w:cstheme="minorHAnsi"/>
@@ -6627,7 +5117,6 @@
               </w:rPr>
               <w:t>specimen</w:t>
             </w:r>
-            <w:proofErr w:type="spellEnd"/>
             <w:r>
               <w:rPr>
                 <w:rFonts w:cstheme="minorHAnsi"/>
@@ -6636,18 +5125,7 @@
                 <w:szCs w:val="20"/>
                 <w:highlight w:val="green"/>
               </w:rPr>
-              <w:t>(</w:t>
-            </w:r>
-            <w:proofErr w:type="gramEnd"/>
-            <w:r>
-              <w:rPr>
-                <w:rFonts w:cstheme="minorHAnsi"/>
-                <w:color w:val="70AD47" w:themeColor="accent6"/>
-                <w:sz w:val="20"/>
-                <w:szCs w:val="20"/>
-                <w:highlight w:val="green"/>
-              </w:rPr>
-              <w:t>)</w:t>
+              <w:t>()</w:t>
             </w:r>
           </w:p>
           <w:p>
@@ -6713,28 +5191,8 @@
                 <w:szCs w:val="20"/>
                 <w:highlight w:val="green"/>
               </w:rPr>
-              <w:t xml:space="preserve">Si on utilise la </w:t>
-            </w:r>
-            <w:proofErr w:type="spellStart"/>
-            <w:r>
-              <w:rPr>
-                <w:sz w:val="20"/>
-                <w:szCs w:val="20"/>
-                <w:highlight w:val="green"/>
-              </w:rPr>
-              <w:t>reactive</w:t>
-            </w:r>
-            <w:proofErr w:type="spellEnd"/>
-            <w:r>
-              <w:rPr>
-                <w:sz w:val="20"/>
-                <w:szCs w:val="20"/>
-                <w:highlight w:val="green"/>
-              </w:rPr>
-              <w:t xml:space="preserve"> expression </w:t>
-            </w:r>
-            <w:proofErr w:type="spellStart"/>
-            <w:proofErr w:type="gramStart"/>
+              <w:t xml:space="preserve">Si on utilise la reactive expression </w:t>
+            </w:r>
             <w:r>
               <w:rPr>
                 <w:rFonts w:cstheme="minorHAnsi"/>
@@ -6743,29 +5201,7 @@
                 <w:szCs w:val="20"/>
                 <w:highlight w:val="green"/>
               </w:rPr>
-              <w:t>specimens</w:t>
-            </w:r>
-            <w:proofErr w:type="spellEnd"/>
-            <w:r>
-              <w:rPr>
-                <w:rFonts w:cstheme="minorHAnsi"/>
-                <w:color w:val="70AD47" w:themeColor="accent6"/>
-                <w:sz w:val="20"/>
-                <w:szCs w:val="20"/>
-                <w:highlight w:val="green"/>
-              </w:rPr>
-              <w:t>(</w:t>
-            </w:r>
-            <w:proofErr w:type="gramEnd"/>
-            <w:r>
-              <w:rPr>
-                <w:rFonts w:cstheme="minorHAnsi"/>
-                <w:color w:val="70AD47" w:themeColor="accent6"/>
-                <w:sz w:val="20"/>
-                <w:szCs w:val="20"/>
-                <w:highlight w:val="green"/>
-              </w:rPr>
-              <w:t xml:space="preserve">), </w:t>
+              <w:t xml:space="preserve">specimens(), </w:t>
             </w:r>
             <w:r>
               <w:rPr>
@@ -6796,15 +5232,7 @@
                 <w:sz w:val="20"/>
                 <w:szCs w:val="20"/>
               </w:rPr>
-              <w:t xml:space="preserve">Ensuite pour chaque catégorie (tous, par sexe et par statut reproducteur), calculer les biomasses par station à partir de </w:t>
-            </w:r>
-            <w:proofErr w:type="spellStart"/>
-            <w:r>
-              <w:rPr>
-                <w:sz w:val="20"/>
-                <w:szCs w:val="20"/>
-              </w:rPr>
-              <w:t>specimen</w:t>
+              <w:t>Ensuite pour chaque catégorie (tous, par sexe et par statut reproducteur), calculer les biomasses par station à partir de specimen</w:t>
             </w:r>
             <w:r>
               <w:rPr>
@@ -6813,45 +5241,12 @@
               </w:rPr>
               <w:t>s_valid</w:t>
             </w:r>
-            <w:proofErr w:type="spellEnd"/>
-            <w:r>
-              <w:rPr>
-                <w:sz w:val="20"/>
-                <w:szCs w:val="20"/>
-              </w:rPr>
-              <w:t xml:space="preserve"> pour chaque facteur et faire un </w:t>
-            </w:r>
-            <w:proofErr w:type="spellStart"/>
-            <w:r>
-              <w:rPr>
-                <w:sz w:val="20"/>
-                <w:szCs w:val="20"/>
-              </w:rPr>
-              <w:t>left_join</w:t>
-            </w:r>
-            <w:proofErr w:type="spellEnd"/>
-            <w:r>
-              <w:rPr>
-                <w:sz w:val="20"/>
-                <w:szCs w:val="20"/>
-              </w:rPr>
-              <w:t xml:space="preserve"> (one-to-</w:t>
-            </w:r>
-            <w:proofErr w:type="spellStart"/>
-            <w:r>
-              <w:rPr>
-                <w:sz w:val="20"/>
-                <w:szCs w:val="20"/>
-              </w:rPr>
-              <w:t>many</w:t>
-            </w:r>
-            <w:proofErr w:type="spellEnd"/>
-            <w:r>
-              <w:rPr>
-                <w:sz w:val="20"/>
-                <w:szCs w:val="20"/>
-              </w:rPr>
-              <w:t xml:space="preserve"> ?)</w:t>
+            <w:r>
+              <w:rPr>
+                <w:sz w:val="20"/>
+                <w:szCs w:val="20"/>
+              </w:rPr>
+              <w:t xml:space="preserve"> pour chaque facteur et faire un left_join (one-to-many ?)</w:t>
             </w:r>
             <w:r>
               <w:rPr>
@@ -6908,25 +5303,7 @@
                 <w:szCs w:val="20"/>
                 <w:highlight w:val="green"/>
               </w:rPr>
-              <w:t xml:space="preserve">Ajouter les intervalles de confiance pour la BPUE </w:t>
-            </w:r>
-            <w:proofErr w:type="spellStart"/>
-            <w:r>
-              <w:rPr>
-                <w:sz w:val="20"/>
-                <w:szCs w:val="20"/>
-                <w:highlight w:val="green"/>
-              </w:rPr>
-              <w:t>Fmat</w:t>
-            </w:r>
-            <w:proofErr w:type="spellEnd"/>
-            <w:r>
-              <w:rPr>
-                <w:sz w:val="20"/>
-                <w:szCs w:val="20"/>
-                <w:highlight w:val="green"/>
-              </w:rPr>
-              <w:t xml:space="preserve"> (repro. Actifs)</w:t>
+              <w:t>Ajouter les intervalles de confiance pour la BPUE Fmat (repro. Actifs)</w:t>
             </w:r>
           </w:p>
           <w:p>
@@ -7030,7 +5407,6 @@
                 <w:lang w:val="en-CA"/>
               </w:rPr>
             </w:pPr>
-            <w:proofErr w:type="spellStart"/>
             <w:r>
               <w:rPr>
                 <w:sz w:val="20"/>
@@ -7038,20 +5414,8 @@
                 <w:highlight w:val="green"/>
                 <w:lang w:val="en-CA"/>
               </w:rPr>
-              <w:t>taille_masse_</w:t>
-            </w:r>
-            <w:proofErr w:type="gramStart"/>
-            <w:r>
-              <w:rPr>
-                <w:sz w:val="20"/>
-                <w:szCs w:val="20"/>
-                <w:highlight w:val="green"/>
-                <w:lang w:val="en-CA"/>
-              </w:rPr>
-              <w:t>age.R</w:t>
-            </w:r>
-            <w:proofErr w:type="spellEnd"/>
-            <w:proofErr w:type="gramEnd"/>
+              <w:t>taille_masse_age.R</w:t>
+            </w:r>
           </w:p>
           <w:p>
             <w:pPr>
@@ -7094,51 +5458,7 @@
                 <w:szCs w:val="20"/>
                 <w:highlight w:val="green"/>
               </w:rPr>
-              <w:t xml:space="preserve">Il faut utiliser les données de </w:t>
-            </w:r>
-            <w:proofErr w:type="spellStart"/>
-            <w:r>
-              <w:rPr>
-                <w:rFonts w:cstheme="minorHAnsi"/>
-                <w:color w:val="70AD47" w:themeColor="accent6"/>
-                <w:sz w:val="20"/>
-                <w:szCs w:val="20"/>
-                <w:highlight w:val="green"/>
-              </w:rPr>
-              <w:t>specimen_</w:t>
-            </w:r>
-            <w:proofErr w:type="gramStart"/>
-            <w:r>
-              <w:rPr>
-                <w:rFonts w:cstheme="minorHAnsi"/>
-                <w:color w:val="70AD47" w:themeColor="accent6"/>
-                <w:sz w:val="20"/>
-                <w:szCs w:val="20"/>
-                <w:highlight w:val="green"/>
-              </w:rPr>
-              <w:t>valid</w:t>
-            </w:r>
-            <w:proofErr w:type="spellEnd"/>
-            <w:r>
-              <w:rPr>
-                <w:rFonts w:cstheme="minorHAnsi"/>
-                <w:color w:val="70AD47" w:themeColor="accent6"/>
-                <w:sz w:val="20"/>
-                <w:szCs w:val="20"/>
-                <w:highlight w:val="green"/>
-              </w:rPr>
-              <w:t>(</w:t>
-            </w:r>
-            <w:proofErr w:type="gramEnd"/>
-            <w:r>
-              <w:rPr>
-                <w:rFonts w:cstheme="minorHAnsi"/>
-                <w:color w:val="70AD47" w:themeColor="accent6"/>
-                <w:sz w:val="20"/>
-                <w:szCs w:val="20"/>
-                <w:highlight w:val="green"/>
-              </w:rPr>
-              <w:t>)</w:t>
+              <w:t>Il faut utiliser les données de specimen_valid()</w:t>
             </w:r>
           </w:p>
           <w:p>
@@ -7160,51 +5480,7 @@
                 <w:szCs w:val="20"/>
                 <w:highlight w:val="green"/>
               </w:rPr>
-              <w:t>[</w:t>
-            </w:r>
-            <w:proofErr w:type="gramStart"/>
-            <w:r>
-              <w:rPr>
-                <w:rFonts w:cstheme="minorHAnsi"/>
-                <w:color w:val="70AD47" w:themeColor="accent6"/>
-                <w:sz w:val="20"/>
-                <w:szCs w:val="20"/>
-                <w:highlight w:val="green"/>
-              </w:rPr>
-              <w:t>spécimens</w:t>
-            </w:r>
-            <w:proofErr w:type="gramEnd"/>
-            <w:r>
-              <w:rPr>
-                <w:rFonts w:cstheme="minorHAnsi"/>
-                <w:color w:val="70AD47" w:themeColor="accent6"/>
-                <w:sz w:val="20"/>
-                <w:szCs w:val="20"/>
-                <w:highlight w:val="green"/>
-              </w:rPr>
-              <w:t xml:space="preserve"> des stations valides, </w:t>
-            </w:r>
-            <w:proofErr w:type="spellStart"/>
-            <w:r>
-              <w:rPr>
-                <w:rFonts w:cstheme="minorHAnsi"/>
-                <w:color w:val="70AD47" w:themeColor="accent6"/>
-                <w:sz w:val="20"/>
-                <w:szCs w:val="20"/>
-                <w:highlight w:val="green"/>
-              </w:rPr>
-              <w:t>hasard+dirigés</w:t>
-            </w:r>
-            <w:proofErr w:type="spellEnd"/>
-            <w:r>
-              <w:rPr>
-                <w:rFonts w:cstheme="minorHAnsi"/>
-                <w:color w:val="70AD47" w:themeColor="accent6"/>
-                <w:sz w:val="20"/>
-                <w:szCs w:val="20"/>
-                <w:highlight w:val="green"/>
-              </w:rPr>
-              <w:t>)</w:t>
+              <w:t>[spécimens des stations valides, hasard+dirigés)</w:t>
             </w:r>
           </w:p>
           <w:p>
@@ -7337,36 +5613,14 @@
                 <w:highlight w:val="green"/>
               </w:rPr>
             </w:pPr>
-            <w:proofErr w:type="spellStart"/>
-            <w:proofErr w:type="gramStart"/>
-            <w:r>
-              <w:rPr>
-                <w:sz w:val="20"/>
-                <w:szCs w:val="20"/>
-                <w:highlight w:val="green"/>
-              </w:rPr>
-              <w:t>structure</w:t>
-            </w:r>
-            <w:proofErr w:type="gramEnd"/>
-            <w:r>
-              <w:rPr>
-                <w:sz w:val="20"/>
-                <w:szCs w:val="20"/>
-                <w:highlight w:val="green"/>
-              </w:rPr>
-              <w:t>_</w:t>
-            </w:r>
-            <w:proofErr w:type="gramStart"/>
-            <w:r>
-              <w:rPr>
-                <w:sz w:val="20"/>
-                <w:szCs w:val="20"/>
-                <w:highlight w:val="green"/>
-              </w:rPr>
-              <w:t>taille.R</w:t>
-            </w:r>
-            <w:proofErr w:type="spellEnd"/>
-            <w:proofErr w:type="gramEnd"/>
+            <w:r>
+              <w:rPr>
+                <w:sz w:val="20"/>
+                <w:szCs w:val="20"/>
+                <w:highlight w:val="green"/>
+              </w:rPr>
+              <w:t>structure_taille.R</w:t>
+            </w:r>
           </w:p>
         </w:tc>
         <w:tc>
@@ -7420,36 +5674,14 @@
                 <w:highlight w:val="green"/>
               </w:rPr>
             </w:pPr>
-            <w:proofErr w:type="spellStart"/>
-            <w:proofErr w:type="gramStart"/>
-            <w:r>
-              <w:rPr>
-                <w:sz w:val="20"/>
-                <w:szCs w:val="20"/>
-                <w:highlight w:val="green"/>
-              </w:rPr>
-              <w:t>structure</w:t>
-            </w:r>
-            <w:proofErr w:type="gramEnd"/>
-            <w:r>
-              <w:rPr>
-                <w:sz w:val="20"/>
-                <w:szCs w:val="20"/>
-                <w:highlight w:val="green"/>
-              </w:rPr>
-              <w:t>_</w:t>
-            </w:r>
-            <w:proofErr w:type="gramStart"/>
-            <w:r>
-              <w:rPr>
-                <w:sz w:val="20"/>
-                <w:szCs w:val="20"/>
-                <w:highlight w:val="green"/>
-              </w:rPr>
-              <w:t>taille.R</w:t>
-            </w:r>
-            <w:proofErr w:type="spellEnd"/>
-            <w:proofErr w:type="gramEnd"/>
+            <w:r>
+              <w:rPr>
+                <w:sz w:val="20"/>
+                <w:szCs w:val="20"/>
+                <w:highlight w:val="green"/>
+              </w:rPr>
+              <w:t>structure_taille.R</w:t>
+            </w:r>
           </w:p>
           <w:p>
             <w:pPr>
@@ -7461,26 +5693,14 @@
                 <w:highlight w:val="green"/>
               </w:rPr>
             </w:pPr>
-            <w:proofErr w:type="spellStart"/>
-            <w:r>
-              <w:rPr>
-                <w:sz w:val="20"/>
-                <w:szCs w:val="20"/>
-                <w:highlight w:val="green"/>
-              </w:rPr>
-              <w:t>Structure_</w:t>
-            </w:r>
-            <w:proofErr w:type="gramStart"/>
-            <w:r>
-              <w:rPr>
-                <w:sz w:val="20"/>
-                <w:szCs w:val="20"/>
-                <w:highlight w:val="green"/>
-              </w:rPr>
-              <w:t>age.R</w:t>
-            </w:r>
-            <w:proofErr w:type="spellEnd"/>
-            <w:proofErr w:type="gramEnd"/>
+            <w:r>
+              <w:rPr>
+                <w:sz w:val="20"/>
+                <w:szCs w:val="20"/>
+                <w:highlight w:val="green"/>
+              </w:rPr>
+              <w:t>Structure_age.R</w:t>
+            </w:r>
           </w:p>
         </w:tc>
         <w:tc>
@@ -7513,51 +5733,7 @@
                 <w:szCs w:val="20"/>
                 <w:highlight w:val="green"/>
               </w:rPr>
-              <w:t xml:space="preserve">Il faut utiliser les données de </w:t>
-            </w:r>
-            <w:proofErr w:type="spellStart"/>
-            <w:r>
-              <w:rPr>
-                <w:rFonts w:cstheme="minorHAnsi"/>
-                <w:color w:val="70AD47" w:themeColor="accent6"/>
-                <w:sz w:val="20"/>
-                <w:szCs w:val="20"/>
-                <w:highlight w:val="green"/>
-              </w:rPr>
-              <w:t>specimen_</w:t>
-            </w:r>
-            <w:proofErr w:type="gramStart"/>
-            <w:r>
-              <w:rPr>
-                <w:rFonts w:cstheme="minorHAnsi"/>
-                <w:color w:val="70AD47" w:themeColor="accent6"/>
-                <w:sz w:val="20"/>
-                <w:szCs w:val="20"/>
-                <w:highlight w:val="green"/>
-              </w:rPr>
-              <w:t>valid</w:t>
-            </w:r>
-            <w:proofErr w:type="spellEnd"/>
-            <w:r>
-              <w:rPr>
-                <w:rFonts w:cstheme="minorHAnsi"/>
-                <w:color w:val="70AD47" w:themeColor="accent6"/>
-                <w:sz w:val="20"/>
-                <w:szCs w:val="20"/>
-                <w:highlight w:val="green"/>
-              </w:rPr>
-              <w:t>(</w:t>
-            </w:r>
-            <w:proofErr w:type="gramEnd"/>
-            <w:r>
-              <w:rPr>
-                <w:rFonts w:cstheme="minorHAnsi"/>
-                <w:color w:val="70AD47" w:themeColor="accent6"/>
-                <w:sz w:val="20"/>
-                <w:szCs w:val="20"/>
-                <w:highlight w:val="green"/>
-              </w:rPr>
-              <w:t>)</w:t>
+              <w:t>Il faut utiliser les données de specimen_valid()</w:t>
             </w:r>
           </w:p>
           <w:p>
@@ -7579,29 +5755,7 @@
                 <w:szCs w:val="20"/>
                 <w:highlight w:val="green"/>
               </w:rPr>
-              <w:t xml:space="preserve">[spécimens des stations valides, </w:t>
-            </w:r>
-            <w:proofErr w:type="spellStart"/>
-            <w:r>
-              <w:rPr>
-                <w:rFonts w:cstheme="minorHAnsi"/>
-                <w:color w:val="70AD47" w:themeColor="accent6"/>
-                <w:sz w:val="20"/>
-                <w:szCs w:val="20"/>
-                <w:highlight w:val="green"/>
-              </w:rPr>
-              <w:t>hasard+dirigés</w:t>
-            </w:r>
-            <w:proofErr w:type="spellEnd"/>
-            <w:r>
-              <w:rPr>
-                <w:rFonts w:cstheme="minorHAnsi"/>
-                <w:color w:val="70AD47" w:themeColor="accent6"/>
-                <w:sz w:val="20"/>
-                <w:szCs w:val="20"/>
-                <w:highlight w:val="green"/>
-              </w:rPr>
-              <w:t>)</w:t>
+              <w:t>[spécimens des stations valides, hasard+dirigés)</w:t>
             </w:r>
           </w:p>
           <w:p>
@@ -7653,27 +5807,7 @@
                 <w:szCs w:val="20"/>
                 <w:highlight w:val="green"/>
               </w:rPr>
-              <w:t xml:space="preserve">Modifier le titre de l’axe des y : « Nb. </w:t>
-            </w:r>
-            <w:proofErr w:type="gramStart"/>
-            <w:r>
-              <w:rPr>
-                <w:rFonts w:eastAsia="Times New Roman"/>
-                <w:sz w:val="20"/>
-                <w:szCs w:val="20"/>
-                <w:highlight w:val="green"/>
-              </w:rPr>
-              <w:t>dorés</w:t>
-            </w:r>
-            <w:proofErr w:type="gramEnd"/>
-            <w:r>
-              <w:rPr>
-                <w:rFonts w:eastAsia="Times New Roman"/>
-                <w:sz w:val="20"/>
-                <w:szCs w:val="20"/>
-                <w:highlight w:val="green"/>
-              </w:rPr>
-              <w:t xml:space="preserve"> jaunes échantillonnés »</w:t>
+              <w:t>Modifier le titre de l’axe des y : « Nb. dorés jaunes échantillonnés »</w:t>
             </w:r>
             <w:r>
               <w:rPr>
@@ -7717,7 +5851,6 @@
                 <w:lang w:val="en-CA"/>
               </w:rPr>
             </w:pPr>
-            <w:proofErr w:type="spellStart"/>
             <w:r>
               <w:rPr>
                 <w:sz w:val="20"/>
@@ -7725,20 +5858,8 @@
                 <w:highlight w:val="green"/>
                 <w:lang w:val="en-CA"/>
               </w:rPr>
-              <w:t>psd_</w:t>
-            </w:r>
-            <w:proofErr w:type="gramStart"/>
-            <w:r>
-              <w:rPr>
-                <w:sz w:val="20"/>
-                <w:szCs w:val="20"/>
-                <w:highlight w:val="green"/>
-                <w:lang w:val="en-CA"/>
-              </w:rPr>
-              <w:t>byclasse.R</w:t>
-            </w:r>
-            <w:proofErr w:type="spellEnd"/>
-            <w:proofErr w:type="gramEnd"/>
+              <w:t>psd_byclasse.R</w:t>
+            </w:r>
           </w:p>
           <w:p>
             <w:pPr>
@@ -7751,7 +5872,6 @@
                 <w:lang w:val="en-CA"/>
               </w:rPr>
             </w:pPr>
-            <w:proofErr w:type="spellStart"/>
             <w:r>
               <w:rPr>
                 <w:sz w:val="20"/>
@@ -7759,20 +5879,8 @@
                 <w:highlight w:val="green"/>
                 <w:lang w:val="en-CA"/>
               </w:rPr>
-              <w:t>psd_</w:t>
-            </w:r>
-            <w:proofErr w:type="gramStart"/>
-            <w:r>
-              <w:rPr>
-                <w:sz w:val="20"/>
-                <w:szCs w:val="20"/>
-                <w:highlight w:val="green"/>
-                <w:lang w:val="en-CA"/>
-              </w:rPr>
-              <w:t>indice.R</w:t>
-            </w:r>
-            <w:proofErr w:type="spellEnd"/>
-            <w:proofErr w:type="gramEnd"/>
+              <w:t>psd_indice.R</w:t>
+            </w:r>
           </w:p>
         </w:tc>
         <w:tc>
@@ -7805,51 +5913,7 @@
                 <w:szCs w:val="20"/>
                 <w:highlight w:val="green"/>
               </w:rPr>
-              <w:t xml:space="preserve">Il faut utiliser les données de </w:t>
-            </w:r>
-            <w:proofErr w:type="spellStart"/>
-            <w:r>
-              <w:rPr>
-                <w:rFonts w:cstheme="minorHAnsi"/>
-                <w:color w:val="70AD47" w:themeColor="accent6"/>
-                <w:sz w:val="20"/>
-                <w:szCs w:val="20"/>
-                <w:highlight w:val="green"/>
-              </w:rPr>
-              <w:t>specimen_</w:t>
-            </w:r>
-            <w:proofErr w:type="gramStart"/>
-            <w:r>
-              <w:rPr>
-                <w:rFonts w:cstheme="minorHAnsi"/>
-                <w:color w:val="70AD47" w:themeColor="accent6"/>
-                <w:sz w:val="20"/>
-                <w:szCs w:val="20"/>
-                <w:highlight w:val="green"/>
-              </w:rPr>
-              <w:t>valid</w:t>
-            </w:r>
-            <w:proofErr w:type="spellEnd"/>
-            <w:r>
-              <w:rPr>
-                <w:rFonts w:cstheme="minorHAnsi"/>
-                <w:color w:val="70AD47" w:themeColor="accent6"/>
-                <w:sz w:val="20"/>
-                <w:szCs w:val="20"/>
-                <w:highlight w:val="green"/>
-              </w:rPr>
-              <w:t>(</w:t>
-            </w:r>
-            <w:proofErr w:type="gramEnd"/>
-            <w:r>
-              <w:rPr>
-                <w:rFonts w:cstheme="minorHAnsi"/>
-                <w:color w:val="70AD47" w:themeColor="accent6"/>
-                <w:sz w:val="20"/>
-                <w:szCs w:val="20"/>
-                <w:highlight w:val="green"/>
-              </w:rPr>
-              <w:t>)</w:t>
+              <w:t>Il faut utiliser les données de specimen_valid()</w:t>
             </w:r>
           </w:p>
           <w:p>
@@ -7872,29 +5936,7 @@
                 <w:szCs w:val="20"/>
                 <w:highlight w:val="green"/>
               </w:rPr>
-              <w:t xml:space="preserve">[spécimens des stations valides, </w:t>
-            </w:r>
-            <w:proofErr w:type="spellStart"/>
-            <w:r>
-              <w:rPr>
-                <w:rFonts w:cstheme="minorHAnsi"/>
-                <w:color w:val="70AD47" w:themeColor="accent6"/>
-                <w:sz w:val="20"/>
-                <w:szCs w:val="20"/>
-                <w:highlight w:val="green"/>
-              </w:rPr>
-              <w:t>hasard+dirigés</w:t>
-            </w:r>
-            <w:proofErr w:type="spellEnd"/>
-            <w:r>
-              <w:rPr>
-                <w:rFonts w:cstheme="minorHAnsi"/>
-                <w:color w:val="70AD47" w:themeColor="accent6"/>
-                <w:sz w:val="20"/>
-                <w:szCs w:val="20"/>
-                <w:highlight w:val="green"/>
-              </w:rPr>
-              <w:t>)</w:t>
+              <w:t>[spécimens des stations valides, hasard+dirigés)</w:t>
             </w:r>
           </w:p>
         </w:tc>
@@ -7921,7 +5963,6 @@
                 <w:lang w:val="en-CA"/>
               </w:rPr>
             </w:pPr>
-            <w:proofErr w:type="spellStart"/>
             <w:r>
               <w:rPr>
                 <w:sz w:val="20"/>
@@ -7931,7 +5972,6 @@
               </w:rPr>
               <w:t>relation_masse</w:t>
             </w:r>
-            <w:proofErr w:type="spellEnd"/>
           </w:p>
           <w:p>
             <w:pPr>
@@ -7950,21 +5990,8 @@
                 <w:highlight w:val="green"/>
                 <w:lang w:val="en-CA"/>
               </w:rPr>
-              <w:t>_</w:t>
-            </w:r>
-            <w:proofErr w:type="spellStart"/>
-            <w:proofErr w:type="gramStart"/>
-            <w:r>
-              <w:rPr>
-                <w:sz w:val="20"/>
-                <w:szCs w:val="20"/>
-                <w:highlight w:val="green"/>
-                <w:lang w:val="en-CA"/>
-              </w:rPr>
-              <w:t>longueur.R</w:t>
-            </w:r>
-            <w:proofErr w:type="spellEnd"/>
-            <w:proofErr w:type="gramEnd"/>
+              <w:t>_longueur.R</w:t>
+            </w:r>
           </w:p>
         </w:tc>
         <w:tc>
@@ -7994,51 +6021,7 @@
                 <w:szCs w:val="20"/>
                 <w:highlight w:val="green"/>
               </w:rPr>
-              <w:t xml:space="preserve">Il faut utiliser la table source des </w:t>
-            </w:r>
-            <w:proofErr w:type="spellStart"/>
-            <w:r>
-              <w:rPr>
-                <w:rFonts w:cstheme="minorHAnsi"/>
-                <w:color w:val="70AD47" w:themeColor="accent6"/>
-                <w:sz w:val="20"/>
-                <w:szCs w:val="20"/>
-                <w:highlight w:val="green"/>
-              </w:rPr>
-              <w:t>specimens</w:t>
-            </w:r>
-            <w:proofErr w:type="spellEnd"/>
-            <w:r>
-              <w:rPr>
-                <w:rFonts w:cstheme="minorHAnsi"/>
-                <w:color w:val="70AD47" w:themeColor="accent6"/>
-                <w:sz w:val="20"/>
-                <w:szCs w:val="20"/>
-                <w:highlight w:val="green"/>
-              </w:rPr>
-              <w:t xml:space="preserve"> (tous les spécimens de toutes les stations, corrigé tel qu’inscrit dans </w:t>
-            </w:r>
-            <w:proofErr w:type="spellStart"/>
-            <w:r>
-              <w:rPr>
-                <w:rFonts w:cstheme="minorHAnsi"/>
-                <w:color w:val="70AD47" w:themeColor="accent6"/>
-                <w:sz w:val="20"/>
-                <w:szCs w:val="20"/>
-                <w:highlight w:val="green"/>
-              </w:rPr>
-              <w:t>load_specimen</w:t>
-            </w:r>
-            <w:proofErr w:type="spellEnd"/>
-            <w:r>
-              <w:rPr>
-                <w:rFonts w:cstheme="minorHAnsi"/>
-                <w:color w:val="70AD47" w:themeColor="accent6"/>
-                <w:sz w:val="20"/>
-                <w:szCs w:val="20"/>
-                <w:highlight w:val="green"/>
-              </w:rPr>
-              <w:t>)</w:t>
+              <w:t>Il faut utiliser la table source des specimens (tous les spécimens de toutes les stations, corrigé tel qu’inscrit dans load_specimen)</w:t>
             </w:r>
           </w:p>
           <w:p>
@@ -8159,7 +6142,6 @@
                 <w:lang w:val="en-CA"/>
               </w:rPr>
             </w:pPr>
-            <w:proofErr w:type="spellStart"/>
             <w:r>
               <w:rPr>
                 <w:sz w:val="20"/>
@@ -8168,20 +6150,8 @@
                 <w:lang w:val="en-CA"/>
               </w:rPr>
               <w:lastRenderedPageBreak/>
-              <w:t>table_</w:t>
-            </w:r>
-            <w:proofErr w:type="gramStart"/>
-            <w:r>
-              <w:rPr>
-                <w:sz w:val="20"/>
-                <w:szCs w:val="20"/>
-                <w:highlight w:val="green"/>
-                <w:lang w:val="en-CA"/>
-              </w:rPr>
-              <w:t>wri.R</w:t>
-            </w:r>
-            <w:proofErr w:type="spellEnd"/>
-            <w:proofErr w:type="gramEnd"/>
+              <w:t>table_wri.R</w:t>
+            </w:r>
           </w:p>
           <w:p>
             <w:pPr>
@@ -8194,7 +6164,6 @@
                 <w:lang w:val="en-CA"/>
               </w:rPr>
             </w:pPr>
-            <w:proofErr w:type="spellStart"/>
             <w:r>
               <w:rPr>
                 <w:sz w:val="20"/>
@@ -8202,20 +6171,8 @@
                 <w:highlight w:val="green"/>
                 <w:lang w:val="en-CA"/>
               </w:rPr>
-              <w:t>fig_wri_</w:t>
-            </w:r>
-            <w:proofErr w:type="gramStart"/>
-            <w:r>
-              <w:rPr>
-                <w:sz w:val="20"/>
-                <w:szCs w:val="20"/>
-                <w:highlight w:val="green"/>
-                <w:lang w:val="en-CA"/>
-              </w:rPr>
-              <w:t>byclass.R</w:t>
-            </w:r>
-            <w:proofErr w:type="spellEnd"/>
-            <w:proofErr w:type="gramEnd"/>
+              <w:t>fig_wri_byclass.R</w:t>
+            </w:r>
           </w:p>
           <w:p>
             <w:pPr>
@@ -8227,7 +6184,6 @@
                 <w:highlight w:val="green"/>
               </w:rPr>
             </w:pPr>
-            <w:proofErr w:type="spellStart"/>
             <w:r>
               <w:rPr>
                 <w:sz w:val="20"/>
@@ -8235,20 +6191,8 @@
                 <w:highlight w:val="green"/>
                 <w:lang w:val="en-CA"/>
               </w:rPr>
-              <w:t>fig_wri_</w:t>
-            </w:r>
-            <w:proofErr w:type="gramStart"/>
-            <w:r>
-              <w:rPr>
-                <w:sz w:val="20"/>
-                <w:szCs w:val="20"/>
-                <w:highlight w:val="green"/>
-                <w:lang w:val="en-CA"/>
-              </w:rPr>
-              <w:t>tous.R</w:t>
-            </w:r>
-            <w:proofErr w:type="spellEnd"/>
-            <w:proofErr w:type="gramEnd"/>
+              <w:t>fig_wri_tous.R</w:t>
+            </w:r>
           </w:p>
         </w:tc>
         <w:tc>
@@ -8279,51 +6223,7 @@
                 <w:szCs w:val="20"/>
                 <w:highlight w:val="green"/>
               </w:rPr>
-              <w:t xml:space="preserve">Il faut utiliser la table source des </w:t>
-            </w:r>
-            <w:proofErr w:type="spellStart"/>
-            <w:r>
-              <w:rPr>
-                <w:rFonts w:cstheme="minorHAnsi"/>
-                <w:color w:val="70AD47" w:themeColor="accent6"/>
-                <w:sz w:val="20"/>
-                <w:szCs w:val="20"/>
-                <w:highlight w:val="green"/>
-              </w:rPr>
-              <w:t>specimens</w:t>
-            </w:r>
-            <w:proofErr w:type="spellEnd"/>
-            <w:r>
-              <w:rPr>
-                <w:rFonts w:cstheme="minorHAnsi"/>
-                <w:color w:val="70AD47" w:themeColor="accent6"/>
-                <w:sz w:val="20"/>
-                <w:szCs w:val="20"/>
-                <w:highlight w:val="green"/>
-              </w:rPr>
-              <w:t xml:space="preserve"> (tous les spécimens de toutes les stations, corrigé tel qu’inscrit dans </w:t>
-            </w:r>
-            <w:proofErr w:type="spellStart"/>
-            <w:r>
-              <w:rPr>
-                <w:rFonts w:cstheme="minorHAnsi"/>
-                <w:color w:val="70AD47" w:themeColor="accent6"/>
-                <w:sz w:val="20"/>
-                <w:szCs w:val="20"/>
-                <w:highlight w:val="green"/>
-              </w:rPr>
-              <w:t>load_specimen</w:t>
-            </w:r>
-            <w:proofErr w:type="spellEnd"/>
-            <w:r>
-              <w:rPr>
-                <w:rFonts w:cstheme="minorHAnsi"/>
-                <w:color w:val="70AD47" w:themeColor="accent6"/>
-                <w:sz w:val="20"/>
-                <w:szCs w:val="20"/>
-                <w:highlight w:val="green"/>
-              </w:rPr>
-              <w:t>)</w:t>
+              <w:t>Il faut utiliser la table source des specimens (tous les spécimens de toutes les stations, corrigé tel qu’inscrit dans load_specimen)</w:t>
             </w:r>
           </w:p>
           <w:p>
@@ -8362,24 +6262,13 @@
                 <w:highlight w:val="green"/>
               </w:rPr>
             </w:pPr>
-            <w:proofErr w:type="spellStart"/>
-            <w:proofErr w:type="gramStart"/>
-            <w:r>
-              <w:rPr>
-                <w:sz w:val="20"/>
-                <w:szCs w:val="20"/>
-                <w:highlight w:val="green"/>
-              </w:rPr>
-              <w:t>courbe</w:t>
-            </w:r>
-            <w:proofErr w:type="gramEnd"/>
-            <w:r>
-              <w:rPr>
-                <w:sz w:val="20"/>
-                <w:szCs w:val="20"/>
-                <w:highlight w:val="green"/>
-              </w:rPr>
-              <w:t>_</w:t>
+            <w:r>
+              <w:rPr>
+                <w:sz w:val="20"/>
+                <w:szCs w:val="20"/>
+                <w:highlight w:val="green"/>
+              </w:rPr>
+              <w:t>courbe_</w:t>
             </w:r>
             <w:commentRangeStart w:id="3"/>
             <w:r>
@@ -8391,7 +6280,6 @@
               <w:t>croissance</w:t>
             </w:r>
             <w:commentRangeEnd w:id="3"/>
-            <w:proofErr w:type="spellEnd"/>
             <w:r>
               <w:rPr>
                 <w:rStyle w:val="Marquedecommentaire"/>
@@ -8422,20 +6310,8 @@
                 <w:szCs w:val="20"/>
                 <w:highlight w:val="green"/>
               </w:rPr>
-              <w:t>_</w:t>
-            </w:r>
-            <w:proofErr w:type="spellStart"/>
-            <w:proofErr w:type="gramStart"/>
-            <w:r>
-              <w:rPr>
-                <w:sz w:val="20"/>
-                <w:szCs w:val="20"/>
-                <w:highlight w:val="green"/>
-              </w:rPr>
-              <w:t>comparaison.R</w:t>
-            </w:r>
-            <w:proofErr w:type="spellEnd"/>
-            <w:proofErr w:type="gramEnd"/>
+              <w:t>_comparaison.R</w:t>
+            </w:r>
           </w:p>
         </w:tc>
         <w:tc>
@@ -8466,95 +6342,33 @@
                 <w:szCs w:val="20"/>
                 <w:highlight w:val="green"/>
               </w:rPr>
-              <w:t xml:space="preserve">Il faut utiliser la table source des </w:t>
-            </w:r>
-            <w:proofErr w:type="spellStart"/>
-            <w:r>
-              <w:rPr>
-                <w:rFonts w:cstheme="minorHAnsi"/>
-                <w:color w:val="70AD47" w:themeColor="accent6"/>
-                <w:sz w:val="20"/>
-                <w:szCs w:val="20"/>
-                <w:highlight w:val="green"/>
-              </w:rPr>
-              <w:t>specimens</w:t>
-            </w:r>
-            <w:proofErr w:type="spellEnd"/>
-            <w:r>
-              <w:rPr>
-                <w:rFonts w:cstheme="minorHAnsi"/>
-                <w:color w:val="70AD47" w:themeColor="accent6"/>
-                <w:sz w:val="20"/>
-                <w:szCs w:val="20"/>
-                <w:highlight w:val="green"/>
-              </w:rPr>
-              <w:t xml:space="preserve"> (tous les spécimens de toutes les stations, corrigé tel qu’inscrit dans </w:t>
-            </w:r>
-            <w:proofErr w:type="spellStart"/>
-            <w:r>
-              <w:rPr>
-                <w:rFonts w:cstheme="minorHAnsi"/>
-                <w:color w:val="70AD47" w:themeColor="accent6"/>
-                <w:sz w:val="20"/>
-                <w:szCs w:val="20"/>
-                <w:highlight w:val="green"/>
-              </w:rPr>
-              <w:t>load_specimen</w:t>
-            </w:r>
-            <w:proofErr w:type="spellEnd"/>
-            <w:r>
-              <w:rPr>
-                <w:rFonts w:cstheme="minorHAnsi"/>
-                <w:color w:val="70AD47" w:themeColor="accent6"/>
-                <w:sz w:val="20"/>
-                <w:szCs w:val="20"/>
-                <w:highlight w:val="green"/>
-              </w:rPr>
-              <w:t>)</w:t>
-            </w:r>
-          </w:p>
-          <w:p>
-            <w:pPr>
-              <w:rPr>
-                <w:sz w:val="20"/>
-                <w:szCs w:val="20"/>
-                <w:highlight w:val="green"/>
-              </w:rPr>
-            </w:pPr>
-          </w:p>
-          <w:p>
-            <w:pPr>
-              <w:rPr>
-                <w:sz w:val="20"/>
-                <w:szCs w:val="20"/>
-                <w:highlight w:val="green"/>
-              </w:rPr>
-            </w:pPr>
-            <w:r>
-              <w:rPr>
-                <w:sz w:val="20"/>
-                <w:szCs w:val="20"/>
-                <w:highlight w:val="green"/>
-              </w:rPr>
-              <w:t xml:space="preserve">Centrer les titres et les valeurs dans les colonnes (surtout </w:t>
-            </w:r>
-            <w:proofErr w:type="spellStart"/>
-            <w:r>
-              <w:rPr>
-                <w:sz w:val="20"/>
-                <w:szCs w:val="20"/>
-                <w:highlight w:val="green"/>
-              </w:rPr>
-              <w:t>Linf</w:t>
-            </w:r>
-            <w:proofErr w:type="spellEnd"/>
-            <w:r>
-              <w:rPr>
-                <w:sz w:val="20"/>
-                <w:szCs w:val="20"/>
-                <w:highlight w:val="green"/>
-              </w:rPr>
-              <w:t>, K, t0)</w:t>
+              <w:t>Il faut utiliser la table source des specimens (tous les spécimens de toutes les stations, corrigé tel qu’inscrit dans load_specimen)</w:t>
+            </w:r>
+          </w:p>
+          <w:p>
+            <w:pPr>
+              <w:rPr>
+                <w:sz w:val="20"/>
+                <w:szCs w:val="20"/>
+                <w:highlight w:val="green"/>
+              </w:rPr>
+            </w:pPr>
+          </w:p>
+          <w:p>
+            <w:pPr>
+              <w:rPr>
+                <w:sz w:val="20"/>
+                <w:szCs w:val="20"/>
+                <w:highlight w:val="green"/>
+              </w:rPr>
+            </w:pPr>
+            <w:r>
+              <w:rPr>
+                <w:sz w:val="20"/>
+                <w:szCs w:val="20"/>
+                <w:highlight w:val="green"/>
+              </w:rPr>
+              <w:t>Centrer les titres et les valeurs dans les colonnes (surtout Linf, K, t0)</w:t>
             </w:r>
           </w:p>
         </w:tc>
@@ -8580,26 +6394,14 @@
                 <w:highlight w:val="green"/>
               </w:rPr>
             </w:pPr>
-            <w:proofErr w:type="spellStart"/>
-            <w:proofErr w:type="gramStart"/>
-            <w:r>
-              <w:rPr>
-                <w:sz w:val="20"/>
-                <w:szCs w:val="20"/>
-                <w:highlight w:val="green"/>
-              </w:rPr>
-              <w:t>courbe</w:t>
-            </w:r>
-            <w:proofErr w:type="gramEnd"/>
-            <w:r>
-              <w:rPr>
-                <w:sz w:val="20"/>
-                <w:szCs w:val="20"/>
-                <w:highlight w:val="green"/>
-              </w:rPr>
-              <w:t>_croissance</w:t>
-            </w:r>
-            <w:proofErr w:type="spellEnd"/>
+            <w:r>
+              <w:rPr>
+                <w:sz w:val="20"/>
+                <w:szCs w:val="20"/>
+                <w:highlight w:val="green"/>
+              </w:rPr>
+              <w:t>courbe_croissance</w:t>
+            </w:r>
           </w:p>
           <w:p>
             <w:pPr>
@@ -8618,20 +6420,8 @@
                 <w:szCs w:val="20"/>
                 <w:highlight w:val="green"/>
               </w:rPr>
-              <w:t>_</w:t>
-            </w:r>
-            <w:proofErr w:type="spellStart"/>
-            <w:proofErr w:type="gramStart"/>
-            <w:r>
-              <w:rPr>
-                <w:sz w:val="20"/>
-                <w:szCs w:val="20"/>
-                <w:highlight w:val="green"/>
-              </w:rPr>
-              <w:t>comparaison.R</w:t>
-            </w:r>
-            <w:proofErr w:type="spellEnd"/>
-            <w:proofErr w:type="gramEnd"/>
+              <w:t>_comparaison.R</w:t>
+            </w:r>
           </w:p>
           <w:p>
             <w:pPr>
@@ -8650,18 +6440,8 @@
                 <w:szCs w:val="20"/>
                 <w:highlight w:val="green"/>
               </w:rPr>
-              <w:t>_</w:t>
-            </w:r>
-            <w:proofErr w:type="spellStart"/>
-            <w:r>
-              <w:rPr>
-                <w:sz w:val="20"/>
-                <w:szCs w:val="20"/>
-                <w:highlight w:val="green"/>
-              </w:rPr>
-              <w:t>ggVONBERT.R</w:t>
-            </w:r>
-            <w:proofErr w:type="spellEnd"/>
+              <w:t>_ggVONBERT.R</w:t>
+            </w:r>
           </w:p>
           <w:p>
             <w:pPr>
@@ -8680,18 +6460,8 @@
                 <w:szCs w:val="20"/>
                 <w:highlight w:val="green"/>
               </w:rPr>
-              <w:t>_</w:t>
-            </w:r>
-            <w:proofErr w:type="spellStart"/>
-            <w:r>
-              <w:rPr>
-                <w:sz w:val="20"/>
-                <w:szCs w:val="20"/>
-                <w:highlight w:val="green"/>
-              </w:rPr>
-              <w:t>ggGOMP.R</w:t>
-            </w:r>
-            <w:proofErr w:type="spellEnd"/>
+              <w:t>_ggGOMP.R</w:t>
+            </w:r>
           </w:p>
           <w:p>
             <w:pPr>
@@ -8710,18 +6480,8 @@
                 <w:szCs w:val="20"/>
                 <w:highlight w:val="green"/>
               </w:rPr>
-              <w:t>_</w:t>
-            </w:r>
-            <w:proofErr w:type="spellStart"/>
-            <w:r>
-              <w:rPr>
-                <w:sz w:val="20"/>
-                <w:szCs w:val="20"/>
-                <w:highlight w:val="green"/>
-              </w:rPr>
-              <w:t>ggLOGIST.R</w:t>
-            </w:r>
-            <w:proofErr w:type="spellEnd"/>
+              <w:t>_ggLOGIST.R</w:t>
+            </w:r>
           </w:p>
         </w:tc>
         <w:tc>
@@ -8774,25 +6534,7 @@
                 <w:szCs w:val="20"/>
                 <w:highlight w:val="green"/>
               </w:rPr>
-              <w:t>Aucun modèle de croissance ne fonctionne (</w:t>
-            </w:r>
-            <w:proofErr w:type="spellStart"/>
-            <w:r>
-              <w:rPr>
-                <w:sz w:val="20"/>
-                <w:szCs w:val="20"/>
-                <w:highlight w:val="green"/>
-              </w:rPr>
-              <w:t>Error</w:t>
-            </w:r>
-            <w:proofErr w:type="spellEnd"/>
-            <w:r>
-              <w:rPr>
-                <w:sz w:val="20"/>
-                <w:szCs w:val="20"/>
-                <w:highlight w:val="green"/>
-              </w:rPr>
-              <w:t> : objet ‘sv0’ introuvable. Éventuellement à vérifier :</w:t>
+              <w:t>Aucun modèle de croissance ne fonctionne (Error : objet ‘sv0’ introuvable. Éventuellement à vérifier :</w:t>
             </w:r>
           </w:p>
           <w:p>
@@ -8881,26 +6623,14 @@
                 <w:lang w:val="en-CA"/>
               </w:rPr>
             </w:pPr>
-            <w:proofErr w:type="spellStart"/>
             <w:r>
               <w:rPr>
                 <w:sz w:val="20"/>
                 <w:szCs w:val="20"/>
                 <w:lang w:val="en-CA"/>
               </w:rPr>
-              <w:t>mortalite_selection_</w:t>
-            </w:r>
-            <w:proofErr w:type="gramStart"/>
-            <w:r>
-              <w:rPr>
-                <w:sz w:val="20"/>
-                <w:szCs w:val="20"/>
-                <w:lang w:val="en-CA"/>
-              </w:rPr>
-              <w:t>modeles.R</w:t>
-            </w:r>
-            <w:proofErr w:type="spellEnd"/>
-            <w:proofErr w:type="gramEnd"/>
+              <w:t>mortalite_selection_modeles.R</w:t>
+            </w:r>
           </w:p>
           <w:p>
             <w:pPr>
@@ -8912,7 +6642,6 @@
                 <w:lang w:val="en-CA"/>
               </w:rPr>
             </w:pPr>
-            <w:proofErr w:type="spellStart"/>
             <w:r>
               <w:rPr>
                 <w:sz w:val="20"/>
@@ -8921,7 +6650,6 @@
               </w:rPr>
               <w:t>mortalite_ChapmanRobson.R</w:t>
             </w:r>
-            <w:proofErr w:type="spellEnd"/>
           </w:p>
         </w:tc>
         <w:tc>
@@ -8950,57 +6678,17 @@
                 <w:sz w:val="20"/>
                 <w:szCs w:val="20"/>
               </w:rPr>
-              <w:t xml:space="preserve">Il faut utiliser la table source des </w:t>
-            </w:r>
-            <w:proofErr w:type="spellStart"/>
-            <w:r>
+              <w:t>Il faut utiliser la table source des specimens (tous les spécimens de toutes les stations, corrigé tel qu’inscrit dans load_specimen)</w:t>
+            </w:r>
+          </w:p>
+          <w:p>
+            <w:pPr>
               <w:rPr>
                 <w:rFonts w:cstheme="minorHAnsi"/>
                 <w:color w:val="70AD47" w:themeColor="accent6"/>
                 <w:sz w:val="20"/>
                 <w:szCs w:val="20"/>
               </w:rPr>
-              <w:t>specimens</w:t>
-            </w:r>
-            <w:proofErr w:type="spellEnd"/>
-            <w:r>
-              <w:rPr>
-                <w:rFonts w:cstheme="minorHAnsi"/>
-                <w:color w:val="70AD47" w:themeColor="accent6"/>
-                <w:sz w:val="20"/>
-                <w:szCs w:val="20"/>
-              </w:rPr>
-              <w:t xml:space="preserve"> (tous les spécimens de toutes les stations, corrigé tel qu’inscrit dans </w:t>
-            </w:r>
-            <w:proofErr w:type="spellStart"/>
-            <w:r>
-              <w:rPr>
-                <w:rFonts w:cstheme="minorHAnsi"/>
-                <w:color w:val="70AD47" w:themeColor="accent6"/>
-                <w:sz w:val="20"/>
-                <w:szCs w:val="20"/>
-              </w:rPr>
-              <w:t>load_specimen</w:t>
-            </w:r>
-            <w:proofErr w:type="spellEnd"/>
-            <w:r>
-              <w:rPr>
-                <w:rFonts w:cstheme="minorHAnsi"/>
-                <w:color w:val="70AD47" w:themeColor="accent6"/>
-                <w:sz w:val="20"/>
-                <w:szCs w:val="20"/>
-              </w:rPr>
-              <w:t>)</w:t>
-            </w:r>
-          </w:p>
-          <w:p>
-            <w:pPr>
-              <w:rPr>
-                <w:rFonts w:cstheme="minorHAnsi"/>
-                <w:color w:val="70AD47" w:themeColor="accent6"/>
-                <w:sz w:val="20"/>
-                <w:szCs w:val="20"/>
-              </w:rPr>
             </w:pPr>
           </w:p>
           <w:p>
@@ -9018,13 +6706,8 @@
               </w:rPr>
               <w:t xml:space="preserve">Il faudrait vérifier si les modèles ont convergé avec </w:t>
             </w:r>
-            <w:proofErr w:type="spellStart"/>
-            <w:r>
-              <w:t>my_model_name$converged</w:t>
-            </w:r>
-            <w:proofErr w:type="spellEnd"/>
-            <w:r>
-              <w:t xml:space="preserve"> (TRUE or FALSE)</w:t>
+            <w:r>
+              <w:t>my_model_name$converged (TRUE or FALSE)</w:t>
             </w:r>
           </w:p>
           <w:p>
@@ -9087,35 +6770,7 @@
               <w:rPr>
                 <w:rFonts w:eastAsia="Times New Roman"/>
               </w:rPr>
-              <w:t xml:space="preserve">Pour le test </w:t>
-            </w:r>
-            <w:proofErr w:type="spellStart"/>
-            <w:r>
-              <w:rPr>
-                <w:rFonts w:eastAsia="Times New Roman"/>
-              </w:rPr>
-              <w:t>hnp</w:t>
-            </w:r>
-            <w:proofErr w:type="spellEnd"/>
-            <w:r>
-              <w:rPr>
-                <w:rFonts w:eastAsia="Times New Roman"/>
-              </w:rPr>
-              <w:t xml:space="preserve">, il y a déjà 2 simulations, ce qui est ok. Mais si le résultat est entre 10 et 15%, il faudrait faire 3 autres simulations et calculer la moyenne des 5 simulations (est-ce possible ?). Ensuite on ne conserve que si &lt; 15%, et on sélectionne selon l’AIC (ou </w:t>
-            </w:r>
-            <w:proofErr w:type="spellStart"/>
-            <w:r>
-              <w:rPr>
-                <w:rFonts w:eastAsia="Times New Roman"/>
-              </w:rPr>
-              <w:t>AICc</w:t>
-            </w:r>
-            <w:proofErr w:type="spellEnd"/>
-            <w:r>
-              <w:rPr>
-                <w:rFonts w:eastAsia="Times New Roman"/>
-              </w:rPr>
-              <w:t>)</w:t>
+              <w:t>Pour le test hnp, il y a déjà 2 simulations, ce qui est ok. Mais si le résultat est entre 10 et 15%, il faudrait faire 3 autres simulations et calculer la moyenne des 5 simulations (est-ce possible ?). Ensuite on ne conserve que si &lt; 15%, et on sélectionne selon l’AIC (ou AICc)</w:t>
             </w:r>
           </w:p>
           <w:bookmarkEnd w:id="4"/>
@@ -9161,39 +6816,7 @@
                 <w:sz w:val="20"/>
                 <w:szCs w:val="20"/>
               </w:rPr>
-              <w:t xml:space="preserve">Parmi les modèles qui s’ajustent bien aux données, le modèle ayant le plus bas </w:t>
-            </w:r>
-            <w:proofErr w:type="spellStart"/>
-            <w:r>
-              <w:rPr>
-                <w:sz w:val="20"/>
-                <w:szCs w:val="20"/>
-              </w:rPr>
-              <w:t>AICc</w:t>
-            </w:r>
-            <w:proofErr w:type="spellEnd"/>
-            <w:r>
-              <w:rPr>
-                <w:sz w:val="20"/>
-                <w:szCs w:val="20"/>
-              </w:rPr>
-              <w:t xml:space="preserve"> doit avoir le commentaire suivant : « Le modèle XX s’ajuste bien à vos données. Ce modèle est recommandé car son </w:t>
-            </w:r>
-            <w:proofErr w:type="spellStart"/>
-            <w:r>
-              <w:rPr>
-                <w:sz w:val="20"/>
-                <w:szCs w:val="20"/>
-              </w:rPr>
-              <w:t>AICc</w:t>
-            </w:r>
-            <w:proofErr w:type="spellEnd"/>
-            <w:r>
-              <w:rPr>
-                <w:sz w:val="20"/>
-                <w:szCs w:val="20"/>
-              </w:rPr>
-              <w:t xml:space="preserve"> est le plus faible »;</w:t>
+              <w:t>Parmi les modèles qui s’ajustent bien aux données, le modèle ayant le plus bas AICc doit avoir le commentaire suivant : « Le modèle XX s’ajuste bien à vos données. Ce modèle est recommandé car son AICc est le plus faible »;</w:t>
             </w:r>
           </w:p>
           <w:p>
@@ -9215,23 +6838,7 @@
                 <w:sz w:val="20"/>
                 <w:szCs w:val="20"/>
               </w:rPr>
-              <w:t xml:space="preserve">Si aucun modèle ne s’ajuste bien aux données, choisir le modèle ayant le plus bas </w:t>
-            </w:r>
-            <w:proofErr w:type="spellStart"/>
-            <w:r>
-              <w:rPr>
-                <w:sz w:val="20"/>
-                <w:szCs w:val="20"/>
-              </w:rPr>
-              <w:t>AICc</w:t>
-            </w:r>
-            <w:proofErr w:type="spellEnd"/>
-            <w:r>
-              <w:rPr>
-                <w:sz w:val="20"/>
-                <w:szCs w:val="20"/>
-              </w:rPr>
-              <w:t xml:space="preserve">. Le commentaire à ajouter serait donc : « Le modèle XX ne s’ajuste pas bien à vos données. Il s’agit toutefois du meilleur modèle parmi les options disponibles. » </w:t>
+              <w:t xml:space="preserve">Si aucun modèle ne s’ajuste bien aux données, choisir le modèle ayant le plus bas AICc. Le commentaire à ajouter serait donc : « Le modèle XX ne s’ajuste pas bien à vos données. Il s’agit toutefois du meilleur modèle parmi les options disponibles. » </w:t>
             </w:r>
           </w:p>
         </w:tc>
@@ -9397,47 +7004,7 @@
                 <w:sz w:val="20"/>
                 <w:szCs w:val="20"/>
               </w:rPr>
-              <w:t xml:space="preserve">Il faut utiliser la table source des </w:t>
-            </w:r>
-            <w:proofErr w:type="spellStart"/>
-            <w:r>
-              <w:rPr>
-                <w:rFonts w:cstheme="minorHAnsi"/>
-                <w:color w:val="70AD47" w:themeColor="accent6"/>
-                <w:sz w:val="20"/>
-                <w:szCs w:val="20"/>
-              </w:rPr>
-              <w:t>specimens</w:t>
-            </w:r>
-            <w:proofErr w:type="spellEnd"/>
-            <w:r>
-              <w:rPr>
-                <w:rFonts w:cstheme="minorHAnsi"/>
-                <w:color w:val="70AD47" w:themeColor="accent6"/>
-                <w:sz w:val="20"/>
-                <w:szCs w:val="20"/>
-              </w:rPr>
-              <w:t xml:space="preserve"> (tous les spécimens de toutes les stations, corrigé tel qu’inscrit dans </w:t>
-            </w:r>
-            <w:proofErr w:type="spellStart"/>
-            <w:r>
-              <w:rPr>
-                <w:rFonts w:cstheme="minorHAnsi"/>
-                <w:color w:val="70AD47" w:themeColor="accent6"/>
-                <w:sz w:val="20"/>
-                <w:szCs w:val="20"/>
-              </w:rPr>
-              <w:t>load_specimen</w:t>
-            </w:r>
-            <w:proofErr w:type="spellEnd"/>
-            <w:r>
-              <w:rPr>
-                <w:rFonts w:cstheme="minorHAnsi"/>
-                <w:color w:val="70AD47" w:themeColor="accent6"/>
-                <w:sz w:val="20"/>
-                <w:szCs w:val="20"/>
-              </w:rPr>
-              <w:t>)</w:t>
+              <w:t>Il faut utiliser la table source des specimens (tous les spécimens de toutes les stations, corrigé tel qu’inscrit dans load_specimen)</w:t>
             </w:r>
           </w:p>
           <w:p>
@@ -9505,7 +7072,6 @@
                 <w:lang w:val="en-CA"/>
               </w:rPr>
             </w:pPr>
-            <w:proofErr w:type="spellStart"/>
             <w:r>
               <w:rPr>
                 <w:sz w:val="20"/>
@@ -9513,20 +7079,8 @@
                 <w:highlight w:val="green"/>
                 <w:lang w:val="en-CA"/>
               </w:rPr>
-              <w:t>download_data_format_</w:t>
-            </w:r>
-            <w:proofErr w:type="gramStart"/>
-            <w:r>
-              <w:rPr>
-                <w:sz w:val="20"/>
-                <w:szCs w:val="20"/>
-                <w:highlight w:val="green"/>
-                <w:lang w:val="en-CA"/>
-              </w:rPr>
-              <w:t>xlsx.R</w:t>
-            </w:r>
-            <w:proofErr w:type="spellEnd"/>
-            <w:proofErr w:type="gramEnd"/>
+              <w:t>download_data_format_xlsx.R</w:t>
+            </w:r>
           </w:p>
         </w:tc>
         <w:tc>
@@ -9553,18 +7107,8 @@
                 <w:szCs w:val="20"/>
                 <w:highlight w:val="green"/>
               </w:rPr>
-              <w:t>On peut enlever le bouton de téléchargement de l’indice PSD et de Robson-</w:t>
-            </w:r>
-            <w:proofErr w:type="spellStart"/>
-            <w:r>
-              <w:rPr>
-                <w:sz w:val="20"/>
-                <w:szCs w:val="20"/>
-                <w:highlight w:val="green"/>
-              </w:rPr>
-              <w:t>chapman</w:t>
-            </w:r>
-            <w:proofErr w:type="spellEnd"/>
+              <w:t>On peut enlever le bouton de téléchargement de l’indice PSD et de Robson-chapman</w:t>
+            </w:r>
           </w:p>
           <w:p>
             <w:pPr>
@@ -9615,25 +7159,7 @@
                 <w:szCs w:val="20"/>
                 <w:highlight w:val="green"/>
               </w:rPr>
-              <w:t>Pour le tableau d’indice de condition, le nom des lignes est perdu à l’exportation (</w:t>
-            </w:r>
-            <w:proofErr w:type="spellStart"/>
-            <w:r>
-              <w:rPr>
-                <w:sz w:val="20"/>
-                <w:szCs w:val="20"/>
-                <w:highlight w:val="green"/>
-              </w:rPr>
-              <w:t>Wr</w:t>
-            </w:r>
-            <w:proofErr w:type="spellEnd"/>
-            <w:r>
-              <w:rPr>
-                <w:sz w:val="20"/>
-                <w:szCs w:val="20"/>
-                <w:highlight w:val="green"/>
-              </w:rPr>
-              <w:t>, IC95, n).</w:t>
+              <w:t>Pour le tableau d’indice de condition, le nom des lignes est perdu à l’exportation (Wr, IC95, n).</w:t>
             </w:r>
           </w:p>
           <w:p>
@@ -9702,19 +7228,18 @@
           <w:sz w:val="24"/>
           <w:szCs w:val="24"/>
         </w:rPr>
-        <w:t xml:space="preserve">bref, est-ce que </w:t>
-      </w:r>
-      <w:proofErr w:type="gramStart"/>
-      <w:r>
+        <w:t>bref, est-ce que ca bogue s’il manque une categorie ?</w:t>
+      </w:r>
+    </w:p>
+    <w:p>
+      <w:pPr>
         <w:rPr>
           <w:b/>
           <w:bCs/>
           <w:sz w:val="24"/>
           <w:szCs w:val="24"/>
         </w:rPr>
-        <w:t>ca</w:t>
-      </w:r>
-      <w:proofErr w:type="gramEnd"/>
+      </w:pPr>
       <w:r>
         <w:rPr>
           <w:b/>
@@ -9722,38 +7247,8 @@
           <w:sz w:val="24"/>
           <w:szCs w:val="24"/>
         </w:rPr>
-        <w:t xml:space="preserve"> bogue s’il manque une </w:t>
-      </w:r>
-      <w:proofErr w:type="spellStart"/>
-      <w:r>
-        <w:rPr>
-          <w:b/>
-          <w:bCs/>
-          <w:sz w:val="24"/>
-          <w:szCs w:val="24"/>
-        </w:rPr>
-        <w:t>categorie</w:t>
-      </w:r>
-      <w:proofErr w:type="spellEnd"/>
-      <w:r>
-        <w:rPr>
-          <w:b/>
-          <w:bCs/>
-          <w:sz w:val="24"/>
-          <w:szCs w:val="24"/>
-        </w:rPr>
-        <w:t xml:space="preserve"> ?</w:t>
-      </w:r>
-    </w:p>
-    <w:p>
-      <w:pPr>
-        <w:rPr>
-          <w:b/>
-          <w:bCs/>
-          <w:sz w:val="24"/>
-          <w:szCs w:val="24"/>
-        </w:rPr>
-      </w:pPr>
+        <w:t>Idem si on a pas d’age pour un inventaire</w:t>
+      </w:r>
     </w:p>
     <w:sectPr>
       <w:pgSz w:w="12240" w:h="15840"/>

</xml_diff>